<commit_message>
Restructure master study roadmap document so upcoming day-by-day plan is on first pages and completed history is archived on last pages
</commit_message>
<xml_diff>
--- a/docs/DA_COMPLETE_STUDY_ROADMAP.docx
+++ b/docs/DA_COMPLETE_STUDY_ROADMAP.docx
@@ -14,7 +14,7 @@
           <w:color w:val="0F172A"/>
           <w:sz w:val="44"/>
         </w:rPr>
-        <w:t>Data Analyst Complete Day-Wise Study Roadmap</w:t>
+        <w:t>Data Analyst Complete Study Roadmap &amp; Action Plan</w:t>
       </w:r>
     </w:p>
     <w:p>
@@ -26,9 +26,9 @@
         <w:rPr>
           <w:rFonts w:ascii="Arial" w:hAnsi="Arial"/>
           <w:color w:val="0EA5E9"/>
-          <w:sz w:val="24"/>
+          <w:sz w:val="23"/>
         </w:rPr>
-        <w:t>Updated Progress: Studied till Video #30 (SQL Views) as of July 24, 2026</w:t>
+        <w:t>Upcoming To-Do Plan First (July 25 - Aug 10) | Completed History on Last Pages</w:t>
       </w:r>
     </w:p>
     <w:p>
@@ -43,7 +43,7 @@
           <w:color w:val="0EA5E9"/>
           <w:sz w:val="36"/>
         </w:rPr>
-        <w:t>Data Analyst Complete Day-Wise Study Roadmap &amp; YouTube Watch Plan</w:t>
+        <w:t>Data Analyst Study Roadmap &amp; Action Plan (Upcoming Targets First)</w:t>
       </w:r>
     </w:p>
     <w:p>
@@ -58,7 +58,7 @@
           <w:color w:val="0F172A"/>
           <w:sz w:val="28"/>
         </w:rPr>
-        <w:t>Current Progress &amp; Date Tracker</w:t>
+        <w:t>Executive Status &amp; Date Tracker</w:t>
       </w:r>
     </w:p>
     <w:p>
@@ -84,7 +84,7 @@
           <w:rFonts w:ascii="Arial" w:hAnsi="Arial"/>
           <w:sz w:val="20"/>
         </w:rPr>
-        <w:t>**Completed Video Progress**: **Videos #1 to #30 (Studied till SQL Views)** `[✅ COMPLETED]`</w:t>
+        <w:t>**Immediate Action Plan**: **Complete Videos #31 to #56 &amp; Days 16–30 Schedule** `[⏳ UPCOMING TO-DO FIRST]`</w:t>
       </w:r>
     </w:p>
     <w:p>
@@ -97,7 +97,7 @@
           <w:rFonts w:ascii="Arial" w:hAnsi="Arial"/>
           <w:sz w:val="20"/>
         </w:rPr>
-        <w:t>**Remaining Video Target**: **Videos #31 to #56 (CTAS, Temp Tables, Indexing, EDA &amp; Portfolio Projects)** `[⏳ TO WATCH DAY-BY-DAY]`</w:t>
+        <w:t>**Completed Archive**: **Videos #1 to #30 &amp; Days 1–15 (Studied till SQL Views)** `[✅ COMPLETED - MOVED TO LAST PAGES]`</w:t>
       </w:r>
     </w:p>
     <w:p>
@@ -112,7 +112,7 @@
           <w:color w:val="0F172A"/>
           <w:sz w:val="28"/>
         </w:rPr>
-        <w:t>30-Day Day-Wise Execution Plan &amp; Video Schedule</w:t>
+        <w:t>SECTION 1: UPCOMING SCHEDULE &amp; TO-DO PLAN (FIRST PAGES)</w:t>
       </w:r>
     </w:p>
     <w:p>
@@ -127,7 +127,3599 @@
           <w:color w:val="334155"/>
           <w:sz w:val="24"/>
         </w:rPr>
-        <w:t>PHASE 1: COMPLETED CORE FOUNDATIONS (July 10 – July 24, 2026)</w:t>
+        <w:t>Upcoming Day-by-Day Execution Schedule (July 25 – August 10, 2026)</w:t>
+      </w:r>
+    </w:p>
+    <w:tbl>
+      <w:tblPr>
+        <w:tblW w:type="auto" w:w="0"/>
+        <w:jc w:val="center"/>
+        <w:tblLook w:firstColumn="1" w:firstRow="1" w:lastColumn="0" w:lastRow="0" w:noHBand="0" w:noVBand="1" w:val="04A0"/>
+      </w:tblPr>
+      <w:tblGrid>
+        <w:gridCol w:w="1728"/>
+        <w:gridCol w:w="1728"/>
+        <w:gridCol w:w="1728"/>
+        <w:gridCol w:w="1728"/>
+        <w:gridCol w:w="1728"/>
+      </w:tblGrid>
+      <w:tr>
+        <w:tc>
+          <w:tcPr>
+            <w:tcW w:type="dxa" w:w="1728"/>
+            <w:tcMar>
+              <w:top w:w="80" w:type="dxa"/>
+              <w:bottom w:w="80" w:type="dxa"/>
+              <w:left w:w="100" w:type="dxa"/>
+              <w:right w:w="100" w:type="dxa"/>
+            </w:tcMar>
+            <w:shd w:fill="0F172A"/>
+          </w:tcPr>
+          <w:p>
+            <w:r>
+              <w:rPr>
+                <w:rFonts w:ascii="Arial" w:hAnsi="Arial"/>
+                <w:b/>
+                <w:color w:val="FFFFFF"/>
+                <w:sz w:val="18"/>
+              </w:rPr>
+              <w:t>Day</w:t>
+            </w:r>
+          </w:p>
+        </w:tc>
+        <w:tc>
+          <w:tcPr>
+            <w:tcW w:type="dxa" w:w="1728"/>
+            <w:tcMar>
+              <w:top w:w="80" w:type="dxa"/>
+              <w:bottom w:w="80" w:type="dxa"/>
+              <w:left w:w="100" w:type="dxa"/>
+              <w:right w:w="100" w:type="dxa"/>
+            </w:tcMar>
+            <w:shd w:fill="0F172A"/>
+          </w:tcPr>
+          <w:p>
+            <w:r>
+              <w:rPr>
+                <w:rFonts w:ascii="Arial" w:hAnsi="Arial"/>
+                <w:b/>
+                <w:color w:val="FFFFFF"/>
+                <w:sz w:val="18"/>
+              </w:rPr>
+              <w:t>Date</w:t>
+            </w:r>
+          </w:p>
+        </w:tc>
+        <w:tc>
+          <w:tcPr>
+            <w:tcW w:type="dxa" w:w="1728"/>
+            <w:tcMar>
+              <w:top w:w="80" w:type="dxa"/>
+              <w:bottom w:w="80" w:type="dxa"/>
+              <w:left w:w="100" w:type="dxa"/>
+              <w:right w:w="100" w:type="dxa"/>
+            </w:tcMar>
+            <w:shd w:fill="0F172A"/>
+          </w:tcPr>
+          <w:p>
+            <w:r>
+              <w:rPr>
+                <w:rFonts w:ascii="Arial" w:hAnsi="Arial"/>
+                <w:b/>
+                <w:color w:val="FFFFFF"/>
+                <w:sz w:val="18"/>
+              </w:rPr>
+              <w:t>Focus Topic</w:t>
+            </w:r>
+          </w:p>
+        </w:tc>
+        <w:tc>
+          <w:tcPr>
+            <w:tcW w:type="dxa" w:w="1728"/>
+            <w:tcMar>
+              <w:top w:w="80" w:type="dxa"/>
+              <w:bottom w:w="80" w:type="dxa"/>
+              <w:left w:w="100" w:type="dxa"/>
+              <w:right w:w="100" w:type="dxa"/>
+            </w:tcMar>
+            <w:shd w:fill="0F172A"/>
+          </w:tcPr>
+          <w:p>
+            <w:r>
+              <w:rPr>
+                <w:rFonts w:ascii="Arial" w:hAnsi="Arial"/>
+                <w:b/>
+                <w:color w:val="FFFFFF"/>
+                <w:sz w:val="18"/>
+              </w:rPr>
+              <w:t>YouTube Video Watch Target</w:t>
+            </w:r>
+          </w:p>
+        </w:tc>
+        <w:tc>
+          <w:tcPr>
+            <w:tcW w:type="dxa" w:w="1728"/>
+            <w:tcMar>
+              <w:top w:w="80" w:type="dxa"/>
+              <w:bottom w:w="80" w:type="dxa"/>
+              <w:left w:w="100" w:type="dxa"/>
+              <w:right w:w="100" w:type="dxa"/>
+            </w:tcMar>
+            <w:shd w:fill="0F172A"/>
+          </w:tcPr>
+          <w:p>
+            <w:r>
+              <w:rPr>
+                <w:rFonts w:ascii="Arial" w:hAnsi="Arial"/>
+                <w:b/>
+                <w:color w:val="FFFFFF"/>
+                <w:sz w:val="18"/>
+              </w:rPr>
+              <w:t>Action Required</w:t>
+            </w:r>
+          </w:p>
+        </w:tc>
+      </w:tr>
+      <w:tr>
+        <w:tc>
+          <w:tcPr>
+            <w:tcW w:type="dxa" w:w="1728"/>
+            <w:tcMar>
+              <w:top w:w="80" w:type="dxa"/>
+              <w:bottom w:w="80" w:type="dxa"/>
+              <w:left w:w="100" w:type="dxa"/>
+              <w:right w:w="100" w:type="dxa"/>
+            </w:tcMar>
+            <w:shd w:fill="F8FAFC"/>
+          </w:tcPr>
+          <w:p>
+            <w:r>
+              <w:rPr>
+                <w:rFonts w:ascii="Arial" w:hAnsi="Arial"/>
+                <w:color w:val="334155"/>
+                <w:sz w:val="17"/>
+              </w:rPr>
+              <w:t>Day 16</w:t>
+            </w:r>
+          </w:p>
+        </w:tc>
+        <w:tc>
+          <w:tcPr>
+            <w:tcW w:type="dxa" w:w="1728"/>
+            <w:tcMar>
+              <w:top w:w="80" w:type="dxa"/>
+              <w:bottom w:w="80" w:type="dxa"/>
+              <w:left w:w="100" w:type="dxa"/>
+              <w:right w:w="100" w:type="dxa"/>
+            </w:tcMar>
+            <w:shd w:fill="F8FAFC"/>
+          </w:tcPr>
+          <w:p>
+            <w:r>
+              <w:rPr>
+                <w:rFonts w:ascii="Arial" w:hAnsi="Arial"/>
+                <w:color w:val="334155"/>
+                <w:sz w:val="17"/>
+              </w:rPr>
+              <w:t>July 25</w:t>
+            </w:r>
+          </w:p>
+        </w:tc>
+        <w:tc>
+          <w:tcPr>
+            <w:tcW w:type="dxa" w:w="1728"/>
+            <w:tcMar>
+              <w:top w:w="80" w:type="dxa"/>
+              <w:bottom w:w="80" w:type="dxa"/>
+              <w:left w:w="100" w:type="dxa"/>
+              <w:right w:w="100" w:type="dxa"/>
+            </w:tcMar>
+            <w:shd w:fill="F8FAFC"/>
+          </w:tcPr>
+          <w:p>
+            <w:r>
+              <w:rPr>
+                <w:rFonts w:ascii="Arial" w:hAnsi="Arial"/>
+                <w:color w:val="334155"/>
+                <w:sz w:val="17"/>
+              </w:rPr>
+              <w:t>CTAS &amp; Temp Tables</w:t>
+            </w:r>
+          </w:p>
+        </w:tc>
+        <w:tc>
+          <w:tcPr>
+            <w:tcW w:type="dxa" w:w="1728"/>
+            <w:tcMar>
+              <w:top w:w="80" w:type="dxa"/>
+              <w:bottom w:w="80" w:type="dxa"/>
+              <w:left w:w="100" w:type="dxa"/>
+              <w:right w:w="100" w:type="dxa"/>
+            </w:tcMar>
+            <w:shd w:fill="F8FAFC"/>
+          </w:tcPr>
+          <w:p>
+            <w:r>
+              <w:rPr>
+                <w:rFonts w:ascii="Arial" w:hAnsi="Arial"/>
+                <w:color w:val="334155"/>
+                <w:sz w:val="17"/>
+              </w:rPr>
+              <w:t>**Watch Video #31** (SQL CTAS) &amp; **Video #32** (Temp Tables)</w:t>
+            </w:r>
+          </w:p>
+        </w:tc>
+        <w:tc>
+          <w:tcPr>
+            <w:tcW w:type="dxa" w:w="1728"/>
+            <w:tcMar>
+              <w:top w:w="80" w:type="dxa"/>
+              <w:bottom w:w="80" w:type="dxa"/>
+              <w:left w:w="100" w:type="dxa"/>
+              <w:right w:w="100" w:type="dxa"/>
+            </w:tcMar>
+            <w:shd w:fill="F8FAFC"/>
+          </w:tcPr>
+          <w:p>
+            <w:r>
+              <w:rPr>
+                <w:rFonts w:ascii="Arial" w:hAnsi="Arial"/>
+                <w:color w:val="334155"/>
+                <w:sz w:val="17"/>
+              </w:rPr>
+              <w:t>⏳ Watch Next</w:t>
+            </w:r>
+          </w:p>
+        </w:tc>
+      </w:tr>
+      <w:tr>
+        <w:tc>
+          <w:tcPr>
+            <w:tcW w:type="dxa" w:w="1728"/>
+            <w:tcMar>
+              <w:top w:w="80" w:type="dxa"/>
+              <w:bottom w:w="80" w:type="dxa"/>
+              <w:left w:w="100" w:type="dxa"/>
+              <w:right w:w="100" w:type="dxa"/>
+            </w:tcMar>
+            <w:shd w:fill="FFFFFF"/>
+          </w:tcPr>
+          <w:p>
+            <w:r>
+              <w:rPr>
+                <w:rFonts w:ascii="Arial" w:hAnsi="Arial"/>
+                <w:color w:val="334155"/>
+                <w:sz w:val="17"/>
+              </w:rPr>
+              <w:t>Day 17</w:t>
+            </w:r>
+          </w:p>
+        </w:tc>
+        <w:tc>
+          <w:tcPr>
+            <w:tcW w:type="dxa" w:w="1728"/>
+            <w:tcMar>
+              <w:top w:w="80" w:type="dxa"/>
+              <w:bottom w:w="80" w:type="dxa"/>
+              <w:left w:w="100" w:type="dxa"/>
+              <w:right w:w="100" w:type="dxa"/>
+            </w:tcMar>
+            <w:shd w:fill="FFFFFF"/>
+          </w:tcPr>
+          <w:p>
+            <w:r>
+              <w:rPr>
+                <w:rFonts w:ascii="Arial" w:hAnsi="Arial"/>
+                <w:color w:val="334155"/>
+                <w:sz w:val="17"/>
+              </w:rPr>
+              <w:t>July 26</w:t>
+            </w:r>
+          </w:p>
+        </w:tc>
+        <w:tc>
+          <w:tcPr>
+            <w:tcW w:type="dxa" w:w="1728"/>
+            <w:tcMar>
+              <w:top w:w="80" w:type="dxa"/>
+              <w:bottom w:w="80" w:type="dxa"/>
+              <w:left w:w="100" w:type="dxa"/>
+              <w:right w:w="100" w:type="dxa"/>
+            </w:tcMar>
+            <w:shd w:fill="FFFFFF"/>
+          </w:tcPr>
+          <w:p>
+            <w:r>
+              <w:rPr>
+                <w:rFonts w:ascii="Arial" w:hAnsi="Arial"/>
+                <w:color w:val="334155"/>
+                <w:sz w:val="17"/>
+              </w:rPr>
+              <w:t>Subqueries vs CTE vs Temp</w:t>
+            </w:r>
+          </w:p>
+        </w:tc>
+        <w:tc>
+          <w:tcPr>
+            <w:tcW w:type="dxa" w:w="1728"/>
+            <w:tcMar>
+              <w:top w:w="80" w:type="dxa"/>
+              <w:bottom w:w="80" w:type="dxa"/>
+              <w:left w:w="100" w:type="dxa"/>
+              <w:right w:w="100" w:type="dxa"/>
+            </w:tcMar>
+            <w:shd w:fill="FFFFFF"/>
+          </w:tcPr>
+          <w:p>
+            <w:r>
+              <w:rPr>
+                <w:rFonts w:ascii="Arial" w:hAnsi="Arial"/>
+                <w:color w:val="334155"/>
+                <w:sz w:val="17"/>
+              </w:rPr>
+              <w:t>**Watch Video #33** (Subquery vs CTE vs Views vs CTAS vs Temp)</w:t>
+            </w:r>
+          </w:p>
+        </w:tc>
+        <w:tc>
+          <w:tcPr>
+            <w:tcW w:type="dxa" w:w="1728"/>
+            <w:tcMar>
+              <w:top w:w="80" w:type="dxa"/>
+              <w:bottom w:w="80" w:type="dxa"/>
+              <w:left w:w="100" w:type="dxa"/>
+              <w:right w:w="100" w:type="dxa"/>
+            </w:tcMar>
+            <w:shd w:fill="FFFFFF"/>
+          </w:tcPr>
+          <w:p>
+            <w:r>
+              <w:rPr>
+                <w:rFonts w:ascii="Arial" w:hAnsi="Arial"/>
+                <w:color w:val="334155"/>
+                <w:sz w:val="17"/>
+              </w:rPr>
+              <w:t>⏳ Watch Next</w:t>
+            </w:r>
+          </w:p>
+        </w:tc>
+      </w:tr>
+      <w:tr>
+        <w:tc>
+          <w:tcPr>
+            <w:tcW w:type="dxa" w:w="1728"/>
+            <w:tcMar>
+              <w:top w:w="80" w:type="dxa"/>
+              <w:bottom w:w="80" w:type="dxa"/>
+              <w:left w:w="100" w:type="dxa"/>
+              <w:right w:w="100" w:type="dxa"/>
+            </w:tcMar>
+            <w:shd w:fill="F8FAFC"/>
+          </w:tcPr>
+          <w:p>
+            <w:r>
+              <w:rPr>
+                <w:rFonts w:ascii="Arial" w:hAnsi="Arial"/>
+                <w:color w:val="334155"/>
+                <w:sz w:val="17"/>
+              </w:rPr>
+              <w:t>Day 18</w:t>
+            </w:r>
+          </w:p>
+        </w:tc>
+        <w:tc>
+          <w:tcPr>
+            <w:tcW w:type="dxa" w:w="1728"/>
+            <w:tcMar>
+              <w:top w:w="80" w:type="dxa"/>
+              <w:bottom w:w="80" w:type="dxa"/>
+              <w:left w:w="100" w:type="dxa"/>
+              <w:right w:w="100" w:type="dxa"/>
+            </w:tcMar>
+            <w:shd w:fill="F8FAFC"/>
+          </w:tcPr>
+          <w:p>
+            <w:r>
+              <w:rPr>
+                <w:rFonts w:ascii="Arial" w:hAnsi="Arial"/>
+                <w:color w:val="334155"/>
+                <w:sz w:val="17"/>
+              </w:rPr>
+              <w:t>July 27</w:t>
+            </w:r>
+          </w:p>
+        </w:tc>
+        <w:tc>
+          <w:tcPr>
+            <w:tcW w:type="dxa" w:w="1728"/>
+            <w:tcMar>
+              <w:top w:w="80" w:type="dxa"/>
+              <w:bottom w:w="80" w:type="dxa"/>
+              <w:left w:w="100" w:type="dxa"/>
+              <w:right w:w="100" w:type="dxa"/>
+            </w:tcMar>
+            <w:shd w:fill="F8FAFC"/>
+          </w:tcPr>
+          <w:p>
+            <w:r>
+              <w:rPr>
+                <w:rFonts w:ascii="Arial" w:hAnsi="Arial"/>
+                <w:color w:val="334155"/>
+                <w:sz w:val="17"/>
+              </w:rPr>
+              <w:t>Milestone Mock 3 &amp; 4</w:t>
+            </w:r>
+          </w:p>
+        </w:tc>
+        <w:tc>
+          <w:tcPr>
+            <w:tcW w:type="dxa" w:w="1728"/>
+            <w:tcMar>
+              <w:top w:w="80" w:type="dxa"/>
+              <w:bottom w:w="80" w:type="dxa"/>
+              <w:left w:w="100" w:type="dxa"/>
+              <w:right w:w="100" w:type="dxa"/>
+            </w:tcMar>
+            <w:shd w:fill="F8FAFC"/>
+          </w:tcPr>
+          <w:p>
+            <w:r>
+              <w:rPr>
+                <w:rFonts w:ascii="Arial" w:hAnsi="Arial"/>
+                <w:color w:val="334155"/>
+                <w:sz w:val="17"/>
+              </w:rPr>
+              <w:t>**Paytm &amp; Swiggy Business Analyst Mock Exams** (45 Mins, 20 Qs)</w:t>
+            </w:r>
+          </w:p>
+        </w:tc>
+        <w:tc>
+          <w:tcPr>
+            <w:tcW w:type="dxa" w:w="1728"/>
+            <w:tcMar>
+              <w:top w:w="80" w:type="dxa"/>
+              <w:bottom w:w="80" w:type="dxa"/>
+              <w:left w:w="100" w:type="dxa"/>
+              <w:right w:w="100" w:type="dxa"/>
+            </w:tcMar>
+            <w:shd w:fill="F8FAFC"/>
+          </w:tcPr>
+          <w:p>
+            <w:r>
+              <w:rPr>
+                <w:rFonts w:ascii="Arial" w:hAnsi="Arial"/>
+                <w:color w:val="334155"/>
+                <w:sz w:val="17"/>
+              </w:rPr>
+              <w:t>⏳ Practice</w:t>
+            </w:r>
+          </w:p>
+        </w:tc>
+      </w:tr>
+      <w:tr>
+        <w:tc>
+          <w:tcPr>
+            <w:tcW w:type="dxa" w:w="1728"/>
+            <w:tcMar>
+              <w:top w:w="80" w:type="dxa"/>
+              <w:bottom w:w="80" w:type="dxa"/>
+              <w:left w:w="100" w:type="dxa"/>
+              <w:right w:w="100" w:type="dxa"/>
+            </w:tcMar>
+            <w:shd w:fill="FFFFFF"/>
+          </w:tcPr>
+          <w:p>
+            <w:r>
+              <w:rPr>
+                <w:rFonts w:ascii="Arial" w:hAnsi="Arial"/>
+                <w:color w:val="334155"/>
+                <w:sz w:val="17"/>
+              </w:rPr>
+              <w:t>Day 19</w:t>
+            </w:r>
+          </w:p>
+        </w:tc>
+        <w:tc>
+          <w:tcPr>
+            <w:tcW w:type="dxa" w:w="1728"/>
+            <w:tcMar>
+              <w:top w:w="80" w:type="dxa"/>
+              <w:bottom w:w="80" w:type="dxa"/>
+              <w:left w:w="100" w:type="dxa"/>
+              <w:right w:w="100" w:type="dxa"/>
+            </w:tcMar>
+            <w:shd w:fill="FFFFFF"/>
+          </w:tcPr>
+          <w:p>
+            <w:r>
+              <w:rPr>
+                <w:rFonts w:ascii="Arial" w:hAnsi="Arial"/>
+                <w:color w:val="334155"/>
+                <w:sz w:val="17"/>
+              </w:rPr>
+              <w:t>July 28</w:t>
+            </w:r>
+          </w:p>
+        </w:tc>
+        <w:tc>
+          <w:tcPr>
+            <w:tcW w:type="dxa" w:w="1728"/>
+            <w:tcMar>
+              <w:top w:w="80" w:type="dxa"/>
+              <w:bottom w:w="80" w:type="dxa"/>
+              <w:left w:w="100" w:type="dxa"/>
+              <w:right w:w="100" w:type="dxa"/>
+            </w:tcMar>
+            <w:shd w:fill="FFFFFF"/>
+          </w:tcPr>
+          <w:p>
+            <w:r>
+              <w:rPr>
+                <w:rFonts w:ascii="Arial" w:hAnsi="Arial"/>
+                <w:color w:val="334155"/>
+                <w:sz w:val="17"/>
+              </w:rPr>
+              <w:t>SQL Indexing Foundations</w:t>
+            </w:r>
+          </w:p>
+        </w:tc>
+        <w:tc>
+          <w:tcPr>
+            <w:tcW w:type="dxa" w:w="1728"/>
+            <w:tcMar>
+              <w:top w:w="80" w:type="dxa"/>
+              <w:bottom w:w="80" w:type="dxa"/>
+              <w:left w:w="100" w:type="dxa"/>
+              <w:right w:w="100" w:type="dxa"/>
+            </w:tcMar>
+            <w:shd w:fill="FFFFFF"/>
+          </w:tcPr>
+          <w:p>
+            <w:r>
+              <w:rPr>
+                <w:rFonts w:ascii="Arial" w:hAnsi="Arial"/>
+                <w:color w:val="334155"/>
+                <w:sz w:val="17"/>
+              </w:rPr>
+              <w:t>**Watch Video #34** (Clustered/Nonclustered) &amp; **Video #35** (Columnstore)</w:t>
+            </w:r>
+          </w:p>
+        </w:tc>
+        <w:tc>
+          <w:tcPr>
+            <w:tcW w:type="dxa" w:w="1728"/>
+            <w:tcMar>
+              <w:top w:w="80" w:type="dxa"/>
+              <w:bottom w:w="80" w:type="dxa"/>
+              <w:left w:w="100" w:type="dxa"/>
+              <w:right w:w="100" w:type="dxa"/>
+            </w:tcMar>
+            <w:shd w:fill="FFFFFF"/>
+          </w:tcPr>
+          <w:p>
+            <w:r>
+              <w:rPr>
+                <w:rFonts w:ascii="Arial" w:hAnsi="Arial"/>
+                <w:color w:val="334155"/>
+                <w:sz w:val="17"/>
+              </w:rPr>
+              <w:t>⏳ Watch Next</w:t>
+            </w:r>
+          </w:p>
+        </w:tc>
+      </w:tr>
+      <w:tr>
+        <w:tc>
+          <w:tcPr>
+            <w:tcW w:type="dxa" w:w="1728"/>
+            <w:tcMar>
+              <w:top w:w="80" w:type="dxa"/>
+              <w:bottom w:w="80" w:type="dxa"/>
+              <w:left w:w="100" w:type="dxa"/>
+              <w:right w:w="100" w:type="dxa"/>
+            </w:tcMar>
+            <w:shd w:fill="F8FAFC"/>
+          </w:tcPr>
+          <w:p>
+            <w:r>
+              <w:rPr>
+                <w:rFonts w:ascii="Arial" w:hAnsi="Arial"/>
+                <w:color w:val="334155"/>
+                <w:sz w:val="17"/>
+              </w:rPr>
+              <w:t>Day 20</w:t>
+            </w:r>
+          </w:p>
+        </w:tc>
+        <w:tc>
+          <w:tcPr>
+            <w:tcW w:type="dxa" w:w="1728"/>
+            <w:tcMar>
+              <w:top w:w="80" w:type="dxa"/>
+              <w:bottom w:w="80" w:type="dxa"/>
+              <w:left w:w="100" w:type="dxa"/>
+              <w:right w:w="100" w:type="dxa"/>
+            </w:tcMar>
+            <w:shd w:fill="F8FAFC"/>
+          </w:tcPr>
+          <w:p>
+            <w:r>
+              <w:rPr>
+                <w:rFonts w:ascii="Arial" w:hAnsi="Arial"/>
+                <w:color w:val="334155"/>
+                <w:sz w:val="17"/>
+              </w:rPr>
+              <w:t>July 29</w:t>
+            </w:r>
+          </w:p>
+        </w:tc>
+        <w:tc>
+          <w:tcPr>
+            <w:tcW w:type="dxa" w:w="1728"/>
+            <w:tcMar>
+              <w:top w:w="80" w:type="dxa"/>
+              <w:bottom w:w="80" w:type="dxa"/>
+              <w:left w:w="100" w:type="dxa"/>
+              <w:right w:w="100" w:type="dxa"/>
+            </w:tcMar>
+            <w:shd w:fill="F8FAFC"/>
+          </w:tcPr>
+          <w:p>
+            <w:r>
+              <w:rPr>
+                <w:rFonts w:ascii="Arial" w:hAnsi="Arial"/>
+                <w:color w:val="334155"/>
+                <w:sz w:val="17"/>
+              </w:rPr>
+              <w:t>Advanced Index Strategies</w:t>
+            </w:r>
+          </w:p>
+        </w:tc>
+        <w:tc>
+          <w:tcPr>
+            <w:tcW w:type="dxa" w:w="1728"/>
+            <w:tcMar>
+              <w:top w:w="80" w:type="dxa"/>
+              <w:bottom w:w="80" w:type="dxa"/>
+              <w:left w:w="100" w:type="dxa"/>
+              <w:right w:w="100" w:type="dxa"/>
+            </w:tcMar>
+            <w:shd w:fill="F8FAFC"/>
+          </w:tcPr>
+          <w:p>
+            <w:r>
+              <w:rPr>
+                <w:rFonts w:ascii="Arial" w:hAnsi="Arial"/>
+                <w:color w:val="334155"/>
+                <w:sz w:val="17"/>
+              </w:rPr>
+              <w:t>**Watch Video #36** (Filtered Indexes) &amp; **Video #37** (Right Index Choice)</w:t>
+            </w:r>
+          </w:p>
+        </w:tc>
+        <w:tc>
+          <w:tcPr>
+            <w:tcW w:type="dxa" w:w="1728"/>
+            <w:tcMar>
+              <w:top w:w="80" w:type="dxa"/>
+              <w:bottom w:w="80" w:type="dxa"/>
+              <w:left w:w="100" w:type="dxa"/>
+              <w:right w:w="100" w:type="dxa"/>
+            </w:tcMar>
+            <w:shd w:fill="F8FAFC"/>
+          </w:tcPr>
+          <w:p>
+            <w:r>
+              <w:rPr>
+                <w:rFonts w:ascii="Arial" w:hAnsi="Arial"/>
+                <w:color w:val="334155"/>
+                <w:sz w:val="17"/>
+              </w:rPr>
+              <w:t>⏳ Watch Next</w:t>
+            </w:r>
+          </w:p>
+        </w:tc>
+      </w:tr>
+      <w:tr>
+        <w:tc>
+          <w:tcPr>
+            <w:tcW w:type="dxa" w:w="1728"/>
+            <w:tcMar>
+              <w:top w:w="80" w:type="dxa"/>
+              <w:bottom w:w="80" w:type="dxa"/>
+              <w:left w:w="100" w:type="dxa"/>
+              <w:right w:w="100" w:type="dxa"/>
+            </w:tcMar>
+            <w:shd w:fill="FFFFFF"/>
+          </w:tcPr>
+          <w:p>
+            <w:r>
+              <w:rPr>
+                <w:rFonts w:ascii="Arial" w:hAnsi="Arial"/>
+                <w:color w:val="334155"/>
+                <w:sz w:val="17"/>
+              </w:rPr>
+              <w:t>Day 21</w:t>
+            </w:r>
+          </w:p>
+        </w:tc>
+        <w:tc>
+          <w:tcPr>
+            <w:tcW w:type="dxa" w:w="1728"/>
+            <w:tcMar>
+              <w:top w:w="80" w:type="dxa"/>
+              <w:bottom w:w="80" w:type="dxa"/>
+              <w:left w:w="100" w:type="dxa"/>
+              <w:right w:w="100" w:type="dxa"/>
+            </w:tcMar>
+            <w:shd w:fill="FFFFFF"/>
+          </w:tcPr>
+          <w:p>
+            <w:r>
+              <w:rPr>
+                <w:rFonts w:ascii="Arial" w:hAnsi="Arial"/>
+                <w:color w:val="334155"/>
+                <w:sz w:val="17"/>
+              </w:rPr>
+              <w:t>July 30</w:t>
+            </w:r>
+          </w:p>
+        </w:tc>
+        <w:tc>
+          <w:tcPr>
+            <w:tcW w:type="dxa" w:w="1728"/>
+            <w:tcMar>
+              <w:top w:w="80" w:type="dxa"/>
+              <w:bottom w:w="80" w:type="dxa"/>
+              <w:left w:w="100" w:type="dxa"/>
+              <w:right w:w="100" w:type="dxa"/>
+            </w:tcMar>
+            <w:shd w:fill="FFFFFF"/>
+          </w:tcPr>
+          <w:p>
+            <w:r>
+              <w:rPr>
+                <w:rFonts w:ascii="Arial" w:hAnsi="Arial"/>
+                <w:color w:val="334155"/>
+                <w:sz w:val="17"/>
+              </w:rPr>
+              <w:t>Index Maintenance &amp; Execution</w:t>
+            </w:r>
+          </w:p>
+        </w:tc>
+        <w:tc>
+          <w:tcPr>
+            <w:tcW w:type="dxa" w:w="1728"/>
+            <w:tcMar>
+              <w:top w:w="80" w:type="dxa"/>
+              <w:bottom w:w="80" w:type="dxa"/>
+              <w:left w:w="100" w:type="dxa"/>
+              <w:right w:w="100" w:type="dxa"/>
+            </w:tcMar>
+            <w:shd w:fill="FFFFFF"/>
+          </w:tcPr>
+          <w:p>
+            <w:r>
+              <w:rPr>
+                <w:rFonts w:ascii="Arial" w:hAnsi="Arial"/>
+                <w:color w:val="334155"/>
+                <w:sz w:val="17"/>
+              </w:rPr>
+              <w:t>**Watch Video #38** (Index Maintenance) &amp; **Video #39** (Execution Plans)</w:t>
+            </w:r>
+          </w:p>
+        </w:tc>
+        <w:tc>
+          <w:tcPr>
+            <w:tcW w:type="dxa" w:w="1728"/>
+            <w:tcMar>
+              <w:top w:w="80" w:type="dxa"/>
+              <w:bottom w:w="80" w:type="dxa"/>
+              <w:left w:w="100" w:type="dxa"/>
+              <w:right w:w="100" w:type="dxa"/>
+            </w:tcMar>
+            <w:shd w:fill="FFFFFF"/>
+          </w:tcPr>
+          <w:p>
+            <w:r>
+              <w:rPr>
+                <w:rFonts w:ascii="Arial" w:hAnsi="Arial"/>
+                <w:color w:val="334155"/>
+                <w:sz w:val="17"/>
+              </w:rPr>
+              <w:t>⏳ Watch Next</w:t>
+            </w:r>
+          </w:p>
+        </w:tc>
+      </w:tr>
+      <w:tr>
+        <w:tc>
+          <w:tcPr>
+            <w:tcW w:type="dxa" w:w="1728"/>
+            <w:tcMar>
+              <w:top w:w="80" w:type="dxa"/>
+              <w:bottom w:w="80" w:type="dxa"/>
+              <w:left w:w="100" w:type="dxa"/>
+              <w:right w:w="100" w:type="dxa"/>
+            </w:tcMar>
+            <w:shd w:fill="F8FAFC"/>
+          </w:tcPr>
+          <w:p>
+            <w:r>
+              <w:rPr>
+                <w:rFonts w:ascii="Arial" w:hAnsi="Arial"/>
+                <w:color w:val="334155"/>
+                <w:sz w:val="17"/>
+              </w:rPr>
+              <w:t>Day 22</w:t>
+            </w:r>
+          </w:p>
+        </w:tc>
+        <w:tc>
+          <w:tcPr>
+            <w:tcW w:type="dxa" w:w="1728"/>
+            <w:tcMar>
+              <w:top w:w="80" w:type="dxa"/>
+              <w:bottom w:w="80" w:type="dxa"/>
+              <w:left w:w="100" w:type="dxa"/>
+              <w:right w:w="100" w:type="dxa"/>
+            </w:tcMar>
+            <w:shd w:fill="F8FAFC"/>
+          </w:tcPr>
+          <w:p>
+            <w:r>
+              <w:rPr>
+                <w:rFonts w:ascii="Arial" w:hAnsi="Arial"/>
+                <w:color w:val="334155"/>
+                <w:sz w:val="17"/>
+              </w:rPr>
+              <w:t>July 31</w:t>
+            </w:r>
+          </w:p>
+        </w:tc>
+        <w:tc>
+          <w:tcPr>
+            <w:tcW w:type="dxa" w:w="1728"/>
+            <w:tcMar>
+              <w:top w:w="80" w:type="dxa"/>
+              <w:bottom w:w="80" w:type="dxa"/>
+              <w:left w:w="100" w:type="dxa"/>
+              <w:right w:w="100" w:type="dxa"/>
+            </w:tcMar>
+            <w:shd w:fill="F8FAFC"/>
+          </w:tcPr>
+          <w:p>
+            <w:r>
+              <w:rPr>
+                <w:rFonts w:ascii="Arial" w:hAnsi="Arial"/>
+                <w:color w:val="334155"/>
+                <w:sz w:val="17"/>
+              </w:rPr>
+              <w:t>Partitioning &amp; Performance</w:t>
+            </w:r>
+          </w:p>
+        </w:tc>
+        <w:tc>
+          <w:tcPr>
+            <w:tcW w:type="dxa" w:w="1728"/>
+            <w:tcMar>
+              <w:top w:w="80" w:type="dxa"/>
+              <w:bottom w:w="80" w:type="dxa"/>
+              <w:left w:w="100" w:type="dxa"/>
+              <w:right w:w="100" w:type="dxa"/>
+            </w:tcMar>
+            <w:shd w:fill="F8FAFC"/>
+          </w:tcPr>
+          <w:p>
+            <w:r>
+              <w:rPr>
+                <w:rFonts w:ascii="Arial" w:hAnsi="Arial"/>
+                <w:color w:val="334155"/>
+                <w:sz w:val="17"/>
+              </w:rPr>
+              <w:t>**Watch Video #40** (Indexing Strategy) &amp; **Video #41** (Table Partitioning)</w:t>
+            </w:r>
+          </w:p>
+        </w:tc>
+        <w:tc>
+          <w:tcPr>
+            <w:tcW w:type="dxa" w:w="1728"/>
+            <w:tcMar>
+              <w:top w:w="80" w:type="dxa"/>
+              <w:bottom w:w="80" w:type="dxa"/>
+              <w:left w:w="100" w:type="dxa"/>
+              <w:right w:w="100" w:type="dxa"/>
+            </w:tcMar>
+            <w:shd w:fill="F8FAFC"/>
+          </w:tcPr>
+          <w:p>
+            <w:r>
+              <w:rPr>
+                <w:rFonts w:ascii="Arial" w:hAnsi="Arial"/>
+                <w:color w:val="334155"/>
+                <w:sz w:val="17"/>
+              </w:rPr>
+              <w:t>⏳ Watch Next</w:t>
+            </w:r>
+          </w:p>
+        </w:tc>
+      </w:tr>
+      <w:tr>
+        <w:tc>
+          <w:tcPr>
+            <w:tcW w:type="dxa" w:w="1728"/>
+            <w:tcMar>
+              <w:top w:w="80" w:type="dxa"/>
+              <w:bottom w:w="80" w:type="dxa"/>
+              <w:left w:w="100" w:type="dxa"/>
+              <w:right w:w="100" w:type="dxa"/>
+            </w:tcMar>
+            <w:shd w:fill="FFFFFF"/>
+          </w:tcPr>
+          <w:p>
+            <w:r>
+              <w:rPr>
+                <w:rFonts w:ascii="Arial" w:hAnsi="Arial"/>
+                <w:color w:val="334155"/>
+                <w:sz w:val="17"/>
+              </w:rPr>
+              <w:t>Day 23</w:t>
+            </w:r>
+          </w:p>
+        </w:tc>
+        <w:tc>
+          <w:tcPr>
+            <w:tcW w:type="dxa" w:w="1728"/>
+            <w:tcMar>
+              <w:top w:w="80" w:type="dxa"/>
+              <w:bottom w:w="80" w:type="dxa"/>
+              <w:left w:w="100" w:type="dxa"/>
+              <w:right w:w="100" w:type="dxa"/>
+            </w:tcMar>
+            <w:shd w:fill="FFFFFF"/>
+          </w:tcPr>
+          <w:p>
+            <w:r>
+              <w:rPr>
+                <w:rFonts w:ascii="Arial" w:hAnsi="Arial"/>
+                <w:color w:val="334155"/>
+                <w:sz w:val="17"/>
+              </w:rPr>
+              <w:t>Aug 01</w:t>
+            </w:r>
+          </w:p>
+        </w:tc>
+        <w:tc>
+          <w:tcPr>
+            <w:tcW w:type="dxa" w:w="1728"/>
+            <w:tcMar>
+              <w:top w:w="80" w:type="dxa"/>
+              <w:bottom w:w="80" w:type="dxa"/>
+              <w:left w:w="100" w:type="dxa"/>
+              <w:right w:w="100" w:type="dxa"/>
+            </w:tcMar>
+            <w:shd w:fill="FFFFFF"/>
+          </w:tcPr>
+          <w:p>
+            <w:r>
+              <w:rPr>
+                <w:rFonts w:ascii="Arial" w:hAnsi="Arial"/>
+                <w:color w:val="334155"/>
+                <w:sz w:val="17"/>
+              </w:rPr>
+              <w:t>30 Performance Tips &amp; Tricks</w:t>
+            </w:r>
+          </w:p>
+        </w:tc>
+        <w:tc>
+          <w:tcPr>
+            <w:tcW w:type="dxa" w:w="1728"/>
+            <w:tcMar>
+              <w:top w:w="80" w:type="dxa"/>
+              <w:bottom w:w="80" w:type="dxa"/>
+              <w:left w:w="100" w:type="dxa"/>
+              <w:right w:w="100" w:type="dxa"/>
+            </w:tcMar>
+            <w:shd w:fill="FFFFFF"/>
+          </w:tcPr>
+          <w:p>
+            <w:r>
+              <w:rPr>
+                <w:rFonts w:ascii="Arial" w:hAnsi="Arial"/>
+                <w:color w:val="334155"/>
+                <w:sz w:val="17"/>
+              </w:rPr>
+              <w:t>**Watch Video #42** (30 SQL Performance Tips from 18 Yrs Exp)</w:t>
+            </w:r>
+          </w:p>
+        </w:tc>
+        <w:tc>
+          <w:tcPr>
+            <w:tcW w:type="dxa" w:w="1728"/>
+            <w:tcMar>
+              <w:top w:w="80" w:type="dxa"/>
+              <w:bottom w:w="80" w:type="dxa"/>
+              <w:left w:w="100" w:type="dxa"/>
+              <w:right w:w="100" w:type="dxa"/>
+            </w:tcMar>
+            <w:shd w:fill="FFFFFF"/>
+          </w:tcPr>
+          <w:p>
+            <w:r>
+              <w:rPr>
+                <w:rFonts w:ascii="Arial" w:hAnsi="Arial"/>
+                <w:color w:val="334155"/>
+                <w:sz w:val="17"/>
+              </w:rPr>
+              <w:t>⏳ Watch Next</w:t>
+            </w:r>
+          </w:p>
+        </w:tc>
+      </w:tr>
+      <w:tr>
+        <w:tc>
+          <w:tcPr>
+            <w:tcW w:type="dxa" w:w="1728"/>
+            <w:tcMar>
+              <w:top w:w="80" w:type="dxa"/>
+              <w:bottom w:w="80" w:type="dxa"/>
+              <w:left w:w="100" w:type="dxa"/>
+              <w:right w:w="100" w:type="dxa"/>
+            </w:tcMar>
+            <w:shd w:fill="F8FAFC"/>
+          </w:tcPr>
+          <w:p>
+            <w:r>
+              <w:rPr>
+                <w:rFonts w:ascii="Arial" w:hAnsi="Arial"/>
+                <w:color w:val="334155"/>
+                <w:sz w:val="17"/>
+              </w:rPr>
+              <w:t>Day 24</w:t>
+            </w:r>
+          </w:p>
+        </w:tc>
+        <w:tc>
+          <w:tcPr>
+            <w:tcW w:type="dxa" w:w="1728"/>
+            <w:tcMar>
+              <w:top w:w="80" w:type="dxa"/>
+              <w:bottom w:w="80" w:type="dxa"/>
+              <w:left w:w="100" w:type="dxa"/>
+              <w:right w:w="100" w:type="dxa"/>
+            </w:tcMar>
+            <w:shd w:fill="F8FAFC"/>
+          </w:tcPr>
+          <w:p>
+            <w:r>
+              <w:rPr>
+                <w:rFonts w:ascii="Arial" w:hAnsi="Arial"/>
+                <w:color w:val="334155"/>
+                <w:sz w:val="17"/>
+              </w:rPr>
+              <w:t>Aug 02</w:t>
+            </w:r>
+          </w:p>
+        </w:tc>
+        <w:tc>
+          <w:tcPr>
+            <w:tcW w:type="dxa" w:w="1728"/>
+            <w:tcMar>
+              <w:top w:w="80" w:type="dxa"/>
+              <w:bottom w:w="80" w:type="dxa"/>
+              <w:left w:w="100" w:type="dxa"/>
+              <w:right w:w="100" w:type="dxa"/>
+            </w:tcMar>
+            <w:shd w:fill="F8FAFC"/>
+          </w:tcPr>
+          <w:p>
+            <w:r>
+              <w:rPr>
+                <w:rFonts w:ascii="Arial" w:hAnsi="Arial"/>
+                <w:color w:val="334155"/>
+                <w:sz w:val="17"/>
+              </w:rPr>
+              <w:t>Milestone Mock 5</w:t>
+            </w:r>
+          </w:p>
+        </w:tc>
+        <w:tc>
+          <w:tcPr>
+            <w:tcW w:type="dxa" w:w="1728"/>
+            <w:tcMar>
+              <w:top w:w="80" w:type="dxa"/>
+              <w:bottom w:w="80" w:type="dxa"/>
+              <w:left w:w="100" w:type="dxa"/>
+              <w:right w:w="100" w:type="dxa"/>
+            </w:tcMar>
+            <w:shd w:fill="F8FAFC"/>
+          </w:tcPr>
+          <w:p>
+            <w:r>
+              <w:rPr>
+                <w:rFonts w:ascii="Arial" w:hAnsi="Arial"/>
+                <w:color w:val="334155"/>
+                <w:sz w:val="17"/>
+              </w:rPr>
+              <w:t>**CRED Risk Analyst Mock Exam** (50 Mins, 20 Qs)</w:t>
+            </w:r>
+          </w:p>
+        </w:tc>
+        <w:tc>
+          <w:tcPr>
+            <w:tcW w:type="dxa" w:w="1728"/>
+            <w:tcMar>
+              <w:top w:w="80" w:type="dxa"/>
+              <w:bottom w:w="80" w:type="dxa"/>
+              <w:left w:w="100" w:type="dxa"/>
+              <w:right w:w="100" w:type="dxa"/>
+            </w:tcMar>
+            <w:shd w:fill="F8FAFC"/>
+          </w:tcPr>
+          <w:p>
+            <w:r>
+              <w:rPr>
+                <w:rFonts w:ascii="Arial" w:hAnsi="Arial"/>
+                <w:color w:val="334155"/>
+                <w:sz w:val="17"/>
+              </w:rPr>
+              <w:t>⏳ Practice</w:t>
+            </w:r>
+          </w:p>
+        </w:tc>
+      </w:tr>
+      <w:tr>
+        <w:tc>
+          <w:tcPr>
+            <w:tcW w:type="dxa" w:w="1728"/>
+            <w:tcMar>
+              <w:top w:w="80" w:type="dxa"/>
+              <w:bottom w:w="80" w:type="dxa"/>
+              <w:left w:w="100" w:type="dxa"/>
+              <w:right w:w="100" w:type="dxa"/>
+            </w:tcMar>
+            <w:shd w:fill="FFFFFF"/>
+          </w:tcPr>
+          <w:p>
+            <w:r>
+              <w:rPr>
+                <w:rFonts w:ascii="Arial" w:hAnsi="Arial"/>
+                <w:color w:val="334155"/>
+                <w:sz w:val="17"/>
+              </w:rPr>
+              <w:t>Day 25</w:t>
+            </w:r>
+          </w:p>
+        </w:tc>
+        <w:tc>
+          <w:tcPr>
+            <w:tcW w:type="dxa" w:w="1728"/>
+            <w:tcMar>
+              <w:top w:w="80" w:type="dxa"/>
+              <w:bottom w:w="80" w:type="dxa"/>
+              <w:left w:w="100" w:type="dxa"/>
+              <w:right w:w="100" w:type="dxa"/>
+            </w:tcMar>
+            <w:shd w:fill="FFFFFF"/>
+          </w:tcPr>
+          <w:p>
+            <w:r>
+              <w:rPr>
+                <w:rFonts w:ascii="Arial" w:hAnsi="Arial"/>
+                <w:color w:val="334155"/>
+                <w:sz w:val="17"/>
+              </w:rPr>
+              <w:t>Aug 03</w:t>
+            </w:r>
+          </w:p>
+        </w:tc>
+        <w:tc>
+          <w:tcPr>
+            <w:tcW w:type="dxa" w:w="1728"/>
+            <w:tcMar>
+              <w:top w:w="80" w:type="dxa"/>
+              <w:bottom w:w="80" w:type="dxa"/>
+              <w:left w:w="100" w:type="dxa"/>
+              <w:right w:w="100" w:type="dxa"/>
+            </w:tcMar>
+            <w:shd w:fill="FFFFFF"/>
+          </w:tcPr>
+          <w:p>
+            <w:r>
+              <w:rPr>
+                <w:rFonts w:ascii="Arial" w:hAnsi="Arial"/>
+                <w:color w:val="334155"/>
+                <w:sz w:val="17"/>
+              </w:rPr>
+              <w:t>Stored Procedures &amp; Triggers</w:t>
+            </w:r>
+          </w:p>
+        </w:tc>
+        <w:tc>
+          <w:tcPr>
+            <w:tcW w:type="dxa" w:w="1728"/>
+            <w:tcMar>
+              <w:top w:w="80" w:type="dxa"/>
+              <w:bottom w:w="80" w:type="dxa"/>
+              <w:left w:w="100" w:type="dxa"/>
+              <w:right w:w="100" w:type="dxa"/>
+            </w:tcMar>
+            <w:shd w:fill="FFFFFF"/>
+          </w:tcPr>
+          <w:p>
+            <w:r>
+              <w:rPr>
+                <w:rFonts w:ascii="Arial" w:hAnsi="Arial"/>
+                <w:color w:val="334155"/>
+                <w:sz w:val="17"/>
+              </w:rPr>
+              <w:t>**Watch Video #43** (Stored Procedures) &amp; **Video #44** (Triggers) [Optional DE]</w:t>
+            </w:r>
+          </w:p>
+        </w:tc>
+        <w:tc>
+          <w:tcPr>
+            <w:tcW w:type="dxa" w:w="1728"/>
+            <w:tcMar>
+              <w:top w:w="80" w:type="dxa"/>
+              <w:bottom w:w="80" w:type="dxa"/>
+              <w:left w:w="100" w:type="dxa"/>
+              <w:right w:w="100" w:type="dxa"/>
+            </w:tcMar>
+            <w:shd w:fill="FFFFFF"/>
+          </w:tcPr>
+          <w:p>
+            <w:r>
+              <w:rPr>
+                <w:rFonts w:ascii="Arial" w:hAnsi="Arial"/>
+                <w:color w:val="334155"/>
+                <w:sz w:val="17"/>
+              </w:rPr>
+              <w:t>💡 Optional</w:t>
+            </w:r>
+          </w:p>
+        </w:tc>
+      </w:tr>
+      <w:tr>
+        <w:tc>
+          <w:tcPr>
+            <w:tcW w:type="dxa" w:w="1728"/>
+            <w:tcMar>
+              <w:top w:w="80" w:type="dxa"/>
+              <w:bottom w:w="80" w:type="dxa"/>
+              <w:left w:w="100" w:type="dxa"/>
+              <w:right w:w="100" w:type="dxa"/>
+            </w:tcMar>
+            <w:shd w:fill="F8FAFC"/>
+          </w:tcPr>
+          <w:p>
+            <w:r>
+              <w:rPr>
+                <w:rFonts w:ascii="Arial" w:hAnsi="Arial"/>
+                <w:color w:val="334155"/>
+                <w:sz w:val="17"/>
+              </w:rPr>
+              <w:t>Day 26</w:t>
+            </w:r>
+          </w:p>
+        </w:tc>
+        <w:tc>
+          <w:tcPr>
+            <w:tcW w:type="dxa" w:w="1728"/>
+            <w:tcMar>
+              <w:top w:w="80" w:type="dxa"/>
+              <w:bottom w:w="80" w:type="dxa"/>
+              <w:left w:w="100" w:type="dxa"/>
+              <w:right w:w="100" w:type="dxa"/>
+            </w:tcMar>
+            <w:shd w:fill="F8FAFC"/>
+          </w:tcPr>
+          <w:p>
+            <w:r>
+              <w:rPr>
+                <w:rFonts w:ascii="Arial" w:hAnsi="Arial"/>
+                <w:color w:val="334155"/>
+                <w:sz w:val="17"/>
+              </w:rPr>
+              <w:t>Aug 04</w:t>
+            </w:r>
+          </w:p>
+        </w:tc>
+        <w:tc>
+          <w:tcPr>
+            <w:tcW w:type="dxa" w:w="1728"/>
+            <w:tcMar>
+              <w:top w:w="80" w:type="dxa"/>
+              <w:bottom w:w="80" w:type="dxa"/>
+              <w:left w:w="100" w:type="dxa"/>
+              <w:right w:w="100" w:type="dxa"/>
+            </w:tcMar>
+            <w:shd w:fill="F8FAFC"/>
+          </w:tcPr>
+          <w:p>
+            <w:r>
+              <w:rPr>
+                <w:rFonts w:ascii="Arial" w:hAnsi="Arial"/>
+                <w:color w:val="334155"/>
+                <w:sz w:val="17"/>
+              </w:rPr>
+              <w:t>AI Tools for Analysts</w:t>
+            </w:r>
+          </w:p>
+        </w:tc>
+        <w:tc>
+          <w:tcPr>
+            <w:tcW w:type="dxa" w:w="1728"/>
+            <w:tcMar>
+              <w:top w:w="80" w:type="dxa"/>
+              <w:bottom w:w="80" w:type="dxa"/>
+              <w:left w:w="100" w:type="dxa"/>
+              <w:right w:w="100" w:type="dxa"/>
+            </w:tcMar>
+            <w:shd w:fill="F8FAFC"/>
+          </w:tcPr>
+          <w:p>
+            <w:r>
+              <w:rPr>
+                <w:rFonts w:ascii="Arial" w:hAnsi="Arial"/>
+                <w:color w:val="334155"/>
+                <w:sz w:val="17"/>
+              </w:rPr>
+              <w:t>**Watch Video #45** (ChatGPT &amp; GitHub Copilot Workflow)</w:t>
+            </w:r>
+          </w:p>
+        </w:tc>
+        <w:tc>
+          <w:tcPr>
+            <w:tcW w:type="dxa" w:w="1728"/>
+            <w:tcMar>
+              <w:top w:w="80" w:type="dxa"/>
+              <w:bottom w:w="80" w:type="dxa"/>
+              <w:left w:w="100" w:type="dxa"/>
+              <w:right w:w="100" w:type="dxa"/>
+            </w:tcMar>
+            <w:shd w:fill="F8FAFC"/>
+          </w:tcPr>
+          <w:p>
+            <w:r>
+              <w:rPr>
+                <w:rFonts w:ascii="Arial" w:hAnsi="Arial"/>
+                <w:color w:val="334155"/>
+                <w:sz w:val="17"/>
+              </w:rPr>
+              <w:t>💡 Optional</w:t>
+            </w:r>
+          </w:p>
+        </w:tc>
+      </w:tr>
+      <w:tr>
+        <w:tc>
+          <w:tcPr>
+            <w:tcW w:type="dxa" w:w="1728"/>
+            <w:tcMar>
+              <w:top w:w="80" w:type="dxa"/>
+              <w:bottom w:w="80" w:type="dxa"/>
+              <w:left w:w="100" w:type="dxa"/>
+              <w:right w:w="100" w:type="dxa"/>
+            </w:tcMar>
+            <w:shd w:fill="FFFFFF"/>
+          </w:tcPr>
+          <w:p>
+            <w:r>
+              <w:rPr>
+                <w:rFonts w:ascii="Arial" w:hAnsi="Arial"/>
+                <w:color w:val="334155"/>
+                <w:sz w:val="17"/>
+              </w:rPr>
+              <w:t>Day 27</w:t>
+            </w:r>
+          </w:p>
+        </w:tc>
+        <w:tc>
+          <w:tcPr>
+            <w:tcW w:type="dxa" w:w="1728"/>
+            <w:tcMar>
+              <w:top w:w="80" w:type="dxa"/>
+              <w:bottom w:w="80" w:type="dxa"/>
+              <w:left w:w="100" w:type="dxa"/>
+              <w:right w:w="100" w:type="dxa"/>
+            </w:tcMar>
+            <w:shd w:fill="FFFFFF"/>
+          </w:tcPr>
+          <w:p>
+            <w:r>
+              <w:rPr>
+                <w:rFonts w:ascii="Arial" w:hAnsi="Arial"/>
+                <w:color w:val="334155"/>
+                <w:sz w:val="17"/>
+              </w:rPr>
+              <w:t>Aug 05-07</w:t>
+            </w:r>
+          </w:p>
+        </w:tc>
+        <w:tc>
+          <w:tcPr>
+            <w:tcW w:type="dxa" w:w="1728"/>
+            <w:tcMar>
+              <w:top w:w="80" w:type="dxa"/>
+              <w:bottom w:w="80" w:type="dxa"/>
+              <w:left w:w="100" w:type="dxa"/>
+              <w:right w:w="100" w:type="dxa"/>
+            </w:tcMar>
+            <w:shd w:fill="FFFFFF"/>
+          </w:tcPr>
+          <w:p>
+            <w:r>
+              <w:rPr>
+                <w:rFonts w:ascii="Arial" w:hAnsi="Arial"/>
+                <w:color w:val="334155"/>
+                <w:sz w:val="17"/>
+              </w:rPr>
+              <w:t>Data Warehouse Project</w:t>
+            </w:r>
+          </w:p>
+        </w:tc>
+        <w:tc>
+          <w:tcPr>
+            <w:tcW w:type="dxa" w:w="1728"/>
+            <w:tcMar>
+              <w:top w:w="80" w:type="dxa"/>
+              <w:bottom w:w="80" w:type="dxa"/>
+              <w:left w:w="100" w:type="dxa"/>
+              <w:right w:w="100" w:type="dxa"/>
+            </w:tcMar>
+            <w:shd w:fill="FFFFFF"/>
+          </w:tcPr>
+          <w:p>
+            <w:r>
+              <w:rPr>
+                <w:rFonts w:ascii="Arial" w:hAnsi="Arial"/>
+                <w:color w:val="334155"/>
+                <w:sz w:val="17"/>
+              </w:rPr>
+              <w:t>**Watch Videos #46–54** (Data Engineering DWH Star Schema Project)</w:t>
+            </w:r>
+          </w:p>
+        </w:tc>
+        <w:tc>
+          <w:tcPr>
+            <w:tcW w:type="dxa" w:w="1728"/>
+            <w:tcMar>
+              <w:top w:w="80" w:type="dxa"/>
+              <w:bottom w:w="80" w:type="dxa"/>
+              <w:left w:w="100" w:type="dxa"/>
+              <w:right w:w="100" w:type="dxa"/>
+            </w:tcMar>
+            <w:shd w:fill="FFFFFF"/>
+          </w:tcPr>
+          <w:p>
+            <w:r>
+              <w:rPr>
+                <w:rFonts w:ascii="Arial" w:hAnsi="Arial"/>
+                <w:color w:val="334155"/>
+                <w:sz w:val="17"/>
+              </w:rPr>
+              <w:t>🏗️ Optional DE</w:t>
+            </w:r>
+          </w:p>
+        </w:tc>
+      </w:tr>
+      <w:tr>
+        <w:tc>
+          <w:tcPr>
+            <w:tcW w:type="dxa" w:w="1728"/>
+            <w:tcMar>
+              <w:top w:w="80" w:type="dxa"/>
+              <w:bottom w:w="80" w:type="dxa"/>
+              <w:left w:w="100" w:type="dxa"/>
+              <w:right w:w="100" w:type="dxa"/>
+            </w:tcMar>
+            <w:shd w:fill="F8FAFC"/>
+          </w:tcPr>
+          <w:p>
+            <w:r>
+              <w:rPr>
+                <w:rFonts w:ascii="Arial" w:hAnsi="Arial"/>
+                <w:color w:val="334155"/>
+                <w:sz w:val="17"/>
+              </w:rPr>
+              <w:t>Day 28</w:t>
+            </w:r>
+          </w:p>
+        </w:tc>
+        <w:tc>
+          <w:tcPr>
+            <w:tcW w:type="dxa" w:w="1728"/>
+            <w:tcMar>
+              <w:top w:w="80" w:type="dxa"/>
+              <w:bottom w:w="80" w:type="dxa"/>
+              <w:left w:w="100" w:type="dxa"/>
+              <w:right w:w="100" w:type="dxa"/>
+            </w:tcMar>
+            <w:shd w:fill="F8FAFC"/>
+          </w:tcPr>
+          <w:p>
+            <w:r>
+              <w:rPr>
+                <w:rFonts w:ascii="Arial" w:hAnsi="Arial"/>
+                <w:color w:val="334155"/>
+                <w:sz w:val="17"/>
+              </w:rPr>
+              <w:t>Aug 08</w:t>
+            </w:r>
+          </w:p>
+        </w:tc>
+        <w:tc>
+          <w:tcPr>
+            <w:tcW w:type="dxa" w:w="1728"/>
+            <w:tcMar>
+              <w:top w:w="80" w:type="dxa"/>
+              <w:bottom w:w="80" w:type="dxa"/>
+              <w:left w:w="100" w:type="dxa"/>
+              <w:right w:w="100" w:type="dxa"/>
+            </w:tcMar>
+            <w:shd w:fill="F8FAFC"/>
+          </w:tcPr>
+          <w:p>
+            <w:r>
+              <w:rPr>
+                <w:rFonts w:ascii="Arial" w:hAnsi="Arial"/>
+                <w:color w:val="334155"/>
+                <w:sz w:val="17"/>
+              </w:rPr>
+              <w:t>SQL EDA Portfolio Project</w:t>
+            </w:r>
+          </w:p>
+        </w:tc>
+        <w:tc>
+          <w:tcPr>
+            <w:tcW w:type="dxa" w:w="1728"/>
+            <w:tcMar>
+              <w:top w:w="80" w:type="dxa"/>
+              <w:bottom w:w="80" w:type="dxa"/>
+              <w:left w:w="100" w:type="dxa"/>
+              <w:right w:w="100" w:type="dxa"/>
+            </w:tcMar>
+            <w:shd w:fill="F8FAFC"/>
+          </w:tcPr>
+          <w:p>
+            <w:r>
+              <w:rPr>
+                <w:rFonts w:ascii="Arial" w:hAnsi="Arial"/>
+                <w:color w:val="334155"/>
+                <w:sz w:val="17"/>
+              </w:rPr>
+              <w:t>**Watch Video #55** (Exploratory Data Analysis EDA Project)</w:t>
+            </w:r>
+          </w:p>
+        </w:tc>
+        <w:tc>
+          <w:tcPr>
+            <w:tcW w:type="dxa" w:w="1728"/>
+            <w:tcMar>
+              <w:top w:w="80" w:type="dxa"/>
+              <w:bottom w:w="80" w:type="dxa"/>
+              <w:left w:w="100" w:type="dxa"/>
+              <w:right w:w="100" w:type="dxa"/>
+            </w:tcMar>
+            <w:shd w:fill="F8FAFC"/>
+          </w:tcPr>
+          <w:p>
+            <w:r>
+              <w:rPr>
+                <w:rFonts w:ascii="Arial" w:hAnsi="Arial"/>
+                <w:color w:val="334155"/>
+                <w:sz w:val="17"/>
+              </w:rPr>
+              <w:t>🎯 **MUST WATCH**</w:t>
+            </w:r>
+          </w:p>
+        </w:tc>
+      </w:tr>
+      <w:tr>
+        <w:tc>
+          <w:tcPr>
+            <w:tcW w:type="dxa" w:w="1728"/>
+            <w:tcMar>
+              <w:top w:w="80" w:type="dxa"/>
+              <w:bottom w:w="80" w:type="dxa"/>
+              <w:left w:w="100" w:type="dxa"/>
+              <w:right w:w="100" w:type="dxa"/>
+            </w:tcMar>
+            <w:shd w:fill="FFFFFF"/>
+          </w:tcPr>
+          <w:p>
+            <w:r>
+              <w:rPr>
+                <w:rFonts w:ascii="Arial" w:hAnsi="Arial"/>
+                <w:color w:val="334155"/>
+                <w:sz w:val="17"/>
+              </w:rPr>
+              <w:t>Day 29</w:t>
+            </w:r>
+          </w:p>
+        </w:tc>
+        <w:tc>
+          <w:tcPr>
+            <w:tcW w:type="dxa" w:w="1728"/>
+            <w:tcMar>
+              <w:top w:w="80" w:type="dxa"/>
+              <w:bottom w:w="80" w:type="dxa"/>
+              <w:left w:w="100" w:type="dxa"/>
+              <w:right w:w="100" w:type="dxa"/>
+            </w:tcMar>
+            <w:shd w:fill="FFFFFF"/>
+          </w:tcPr>
+          <w:p>
+            <w:r>
+              <w:rPr>
+                <w:rFonts w:ascii="Arial" w:hAnsi="Arial"/>
+                <w:color w:val="334155"/>
+                <w:sz w:val="17"/>
+              </w:rPr>
+              <w:t>Aug 09</w:t>
+            </w:r>
+          </w:p>
+        </w:tc>
+        <w:tc>
+          <w:tcPr>
+            <w:tcW w:type="dxa" w:w="1728"/>
+            <w:tcMar>
+              <w:top w:w="80" w:type="dxa"/>
+              <w:bottom w:w="80" w:type="dxa"/>
+              <w:left w:w="100" w:type="dxa"/>
+              <w:right w:w="100" w:type="dxa"/>
+            </w:tcMar>
+            <w:shd w:fill="FFFFFF"/>
+          </w:tcPr>
+          <w:p>
+            <w:r>
+              <w:rPr>
+                <w:rFonts w:ascii="Arial" w:hAnsi="Arial"/>
+                <w:color w:val="334155"/>
+                <w:sz w:val="17"/>
+              </w:rPr>
+              <w:t>DA Portfolio Project</w:t>
+            </w:r>
+          </w:p>
+        </w:tc>
+        <w:tc>
+          <w:tcPr>
+            <w:tcW w:type="dxa" w:w="1728"/>
+            <w:tcMar>
+              <w:top w:w="80" w:type="dxa"/>
+              <w:bottom w:w="80" w:type="dxa"/>
+              <w:left w:w="100" w:type="dxa"/>
+              <w:right w:w="100" w:type="dxa"/>
+            </w:tcMar>
+            <w:shd w:fill="FFFFFF"/>
+          </w:tcPr>
+          <w:p>
+            <w:r>
+              <w:rPr>
+                <w:rFonts w:ascii="Arial" w:hAnsi="Arial"/>
+                <w:color w:val="334155"/>
+                <w:sz w:val="17"/>
+              </w:rPr>
+              <w:t>**Watch Video #56** (Full SQL Data Analyst Portfolio Project)</w:t>
+            </w:r>
+          </w:p>
+        </w:tc>
+        <w:tc>
+          <w:tcPr>
+            <w:tcW w:type="dxa" w:w="1728"/>
+            <w:tcMar>
+              <w:top w:w="80" w:type="dxa"/>
+              <w:bottom w:w="80" w:type="dxa"/>
+              <w:left w:w="100" w:type="dxa"/>
+              <w:right w:w="100" w:type="dxa"/>
+            </w:tcMar>
+            <w:shd w:fill="FFFFFF"/>
+          </w:tcPr>
+          <w:p>
+            <w:r>
+              <w:rPr>
+                <w:rFonts w:ascii="Arial" w:hAnsi="Arial"/>
+                <w:color w:val="334155"/>
+                <w:sz w:val="17"/>
+              </w:rPr>
+              <w:t>🎯 **MUST WATCH**</w:t>
+            </w:r>
+          </w:p>
+        </w:tc>
+      </w:tr>
+      <w:tr>
+        <w:tc>
+          <w:tcPr>
+            <w:tcW w:type="dxa" w:w="1728"/>
+            <w:tcMar>
+              <w:top w:w="80" w:type="dxa"/>
+              <w:bottom w:w="80" w:type="dxa"/>
+              <w:left w:w="100" w:type="dxa"/>
+              <w:right w:w="100" w:type="dxa"/>
+            </w:tcMar>
+            <w:shd w:fill="F8FAFC"/>
+          </w:tcPr>
+          <w:p>
+            <w:r>
+              <w:rPr>
+                <w:rFonts w:ascii="Arial" w:hAnsi="Arial"/>
+                <w:color w:val="334155"/>
+                <w:sz w:val="17"/>
+              </w:rPr>
+              <w:t>Day 30</w:t>
+            </w:r>
+          </w:p>
+        </w:tc>
+        <w:tc>
+          <w:tcPr>
+            <w:tcW w:type="dxa" w:w="1728"/>
+            <w:tcMar>
+              <w:top w:w="80" w:type="dxa"/>
+              <w:bottom w:w="80" w:type="dxa"/>
+              <w:left w:w="100" w:type="dxa"/>
+              <w:right w:w="100" w:type="dxa"/>
+            </w:tcMar>
+            <w:shd w:fill="F8FAFC"/>
+          </w:tcPr>
+          <w:p>
+            <w:r>
+              <w:rPr>
+                <w:rFonts w:ascii="Arial" w:hAnsi="Arial"/>
+                <w:color w:val="334155"/>
+                <w:sz w:val="17"/>
+              </w:rPr>
+              <w:t>Aug 10</w:t>
+            </w:r>
+          </w:p>
+        </w:tc>
+        <w:tc>
+          <w:tcPr>
+            <w:tcW w:type="dxa" w:w="1728"/>
+            <w:tcMar>
+              <w:top w:w="80" w:type="dxa"/>
+              <w:bottom w:w="80" w:type="dxa"/>
+              <w:left w:w="100" w:type="dxa"/>
+              <w:right w:w="100" w:type="dxa"/>
+            </w:tcMar>
+            <w:shd w:fill="F8FAFC"/>
+          </w:tcPr>
+          <w:p>
+            <w:r>
+              <w:rPr>
+                <w:rFonts w:ascii="Arial" w:hAnsi="Arial"/>
+                <w:color w:val="334155"/>
+                <w:sz w:val="17"/>
+              </w:rPr>
+              <w:t>Final Milestone Review</w:t>
+            </w:r>
+          </w:p>
+        </w:tc>
+        <w:tc>
+          <w:tcPr>
+            <w:tcW w:type="dxa" w:w="1728"/>
+            <w:tcMar>
+              <w:top w:w="80" w:type="dxa"/>
+              <w:bottom w:w="80" w:type="dxa"/>
+              <w:left w:w="100" w:type="dxa"/>
+              <w:right w:w="100" w:type="dxa"/>
+            </w:tcMar>
+            <w:shd w:fill="F8FAFC"/>
+          </w:tcPr>
+          <w:p>
+            <w:r>
+              <w:rPr>
+                <w:rFonts w:ascii="Arial" w:hAnsi="Arial"/>
+                <w:color w:val="334155"/>
+                <w:sz w:val="17"/>
+              </w:rPr>
+              <w:t>**Flipkart Data Engineer Capstone Exam** (60 Mins, 25 Qs)</w:t>
+            </w:r>
+          </w:p>
+        </w:tc>
+        <w:tc>
+          <w:tcPr>
+            <w:tcW w:type="dxa" w:w="1728"/>
+            <w:tcMar>
+              <w:top w:w="80" w:type="dxa"/>
+              <w:bottom w:w="80" w:type="dxa"/>
+              <w:left w:w="100" w:type="dxa"/>
+              <w:right w:w="100" w:type="dxa"/>
+            </w:tcMar>
+            <w:shd w:fill="F8FAFC"/>
+          </w:tcPr>
+          <w:p>
+            <w:r>
+              <w:rPr>
+                <w:rFonts w:ascii="Arial" w:hAnsi="Arial"/>
+                <w:color w:val="334155"/>
+                <w:sz w:val="17"/>
+              </w:rPr>
+              <w:t>🏆 Capstone</w:t>
+            </w:r>
+          </w:p>
+        </w:tc>
+      </w:tr>
+    </w:tbl>
+    <w:p>
+      <w:pPr>
+        <w:spacing w:before="60" w:after="60"/>
+      </w:pPr>
+      <w:r>
+        <w:br/>
+        <w:t>### Detailed Remaining Video Watch List (Videos 31–56 in Order)</w:t>
+      </w:r>
+    </w:p>
+    <w:tbl>
+      <w:tblPr>
+        <w:tblW w:type="auto" w:w="0"/>
+        <w:jc w:val="center"/>
+        <w:tblLook w:firstColumn="1" w:firstRow="1" w:lastColumn="0" w:lastRow="0" w:noHBand="0" w:noVBand="1" w:val="04A0"/>
+      </w:tblPr>
+      <w:tblGrid>
+        <w:gridCol w:w="2160"/>
+        <w:gridCol w:w="2160"/>
+        <w:gridCol w:w="2160"/>
+        <w:gridCol w:w="2160"/>
+      </w:tblGrid>
+      <w:tr>
+        <w:tc>
+          <w:tcPr>
+            <w:tcW w:type="dxa" w:w="2160"/>
+            <w:tcMar>
+              <w:top w:w="80" w:type="dxa"/>
+              <w:bottom w:w="80" w:type="dxa"/>
+              <w:left w:w="100" w:type="dxa"/>
+              <w:right w:w="100" w:type="dxa"/>
+            </w:tcMar>
+            <w:shd w:fill="0F172A"/>
+          </w:tcPr>
+          <w:p>
+            <w:r>
+              <w:rPr>
+                <w:rFonts w:ascii="Arial" w:hAnsi="Arial"/>
+                <w:b/>
+                <w:color w:val="FFFFFF"/>
+                <w:sz w:val="18"/>
+              </w:rPr>
+              <w:t>#</w:t>
+            </w:r>
+          </w:p>
+        </w:tc>
+        <w:tc>
+          <w:tcPr>
+            <w:tcW w:type="dxa" w:w="2160"/>
+            <w:tcMar>
+              <w:top w:w="80" w:type="dxa"/>
+              <w:bottom w:w="80" w:type="dxa"/>
+              <w:left w:w="100" w:type="dxa"/>
+              <w:right w:w="100" w:type="dxa"/>
+            </w:tcMar>
+            <w:shd w:fill="0F172A"/>
+          </w:tcPr>
+          <w:p>
+            <w:r>
+              <w:rPr>
+                <w:rFonts w:ascii="Arial" w:hAnsi="Arial"/>
+                <w:b/>
+                <w:color w:val="FFFFFF"/>
+                <w:sz w:val="18"/>
+              </w:rPr>
+              <w:t>Video Title</w:t>
+            </w:r>
+          </w:p>
+        </w:tc>
+        <w:tc>
+          <w:tcPr>
+            <w:tcW w:type="dxa" w:w="2160"/>
+            <w:tcMar>
+              <w:top w:w="80" w:type="dxa"/>
+              <w:bottom w:w="80" w:type="dxa"/>
+              <w:left w:w="100" w:type="dxa"/>
+              <w:right w:w="100" w:type="dxa"/>
+            </w:tcMar>
+            <w:shd w:fill="0F172A"/>
+          </w:tcPr>
+          <w:p>
+            <w:r>
+              <w:rPr>
+                <w:rFonts w:ascii="Arial" w:hAnsi="Arial"/>
+                <w:b/>
+                <w:color w:val="FFFFFF"/>
+                <w:sz w:val="18"/>
+              </w:rPr>
+              <w:t>Action Step</w:t>
+            </w:r>
+          </w:p>
+        </w:tc>
+        <w:tc>
+          <w:tcPr>
+            <w:tcW w:type="dxa" w:w="2160"/>
+            <w:tcMar>
+              <w:top w:w="80" w:type="dxa"/>
+              <w:bottom w:w="80" w:type="dxa"/>
+              <w:left w:w="100" w:type="dxa"/>
+              <w:right w:w="100" w:type="dxa"/>
+            </w:tcMar>
+            <w:shd w:fill="0F172A"/>
+          </w:tcPr>
+          <w:p>
+            <w:r>
+              <w:rPr>
+                <w:rFonts w:ascii="Arial" w:hAnsi="Arial"/>
+                <w:b/>
+                <w:color w:val="FFFFFF"/>
+                <w:sz w:val="18"/>
+              </w:rPr>
+              <w:t>Priority</w:t>
+            </w:r>
+          </w:p>
+        </w:tc>
+      </w:tr>
+      <w:tr>
+        <w:tc>
+          <w:tcPr>
+            <w:tcW w:type="dxa" w:w="2160"/>
+            <w:tcMar>
+              <w:top w:w="80" w:type="dxa"/>
+              <w:bottom w:w="80" w:type="dxa"/>
+              <w:left w:w="100" w:type="dxa"/>
+              <w:right w:w="100" w:type="dxa"/>
+            </w:tcMar>
+            <w:shd w:fill="F8FAFC"/>
+          </w:tcPr>
+          <w:p>
+            <w:r>
+              <w:rPr>
+                <w:rFonts w:ascii="Arial" w:hAnsi="Arial"/>
+                <w:color w:val="334155"/>
+                <w:sz w:val="17"/>
+              </w:rPr>
+              <w:t>31</w:t>
+            </w:r>
+          </w:p>
+        </w:tc>
+        <w:tc>
+          <w:tcPr>
+            <w:tcW w:type="dxa" w:w="2160"/>
+            <w:tcMar>
+              <w:top w:w="80" w:type="dxa"/>
+              <w:bottom w:w="80" w:type="dxa"/>
+              <w:left w:w="100" w:type="dxa"/>
+              <w:right w:w="100" w:type="dxa"/>
+            </w:tcMar>
+            <w:shd w:fill="F8FAFC"/>
+          </w:tcPr>
+          <w:p>
+            <w:r>
+              <w:rPr>
+                <w:rFonts w:ascii="Arial" w:hAnsi="Arial"/>
+                <w:color w:val="334155"/>
+                <w:sz w:val="17"/>
+              </w:rPr>
+              <w:t>[SQL CTAS \</w:t>
+            </w:r>
+          </w:p>
+        </w:tc>
+        <w:tc>
+          <w:tcPr>
+            <w:tcW w:type="dxa" w:w="2160"/>
+            <w:tcMar>
+              <w:top w:w="80" w:type="dxa"/>
+              <w:bottom w:w="80" w:type="dxa"/>
+              <w:left w:w="100" w:type="dxa"/>
+              <w:right w:w="100" w:type="dxa"/>
+            </w:tcMar>
+            <w:shd w:fill="F8FAFC"/>
+          </w:tcPr>
+          <w:p>
+            <w:r>
+              <w:rPr>
+                <w:rFonts w:ascii="Arial" w:hAnsi="Arial"/>
+                <w:color w:val="334155"/>
+                <w:sz w:val="17"/>
+              </w:rPr>
+              <w:t>Create SQL Tables From Query](https://www.youtube.com/watch?v=559lleUXl5Q)</w:t>
+            </w:r>
+          </w:p>
+        </w:tc>
+        <w:tc>
+          <w:tcPr>
+            <w:tcW w:type="dxa" w:w="2160"/>
+            <w:tcMar>
+              <w:top w:w="80" w:type="dxa"/>
+              <w:bottom w:w="80" w:type="dxa"/>
+              <w:left w:w="100" w:type="dxa"/>
+              <w:right w:w="100" w:type="dxa"/>
+            </w:tcMar>
+            <w:shd w:fill="F8FAFC"/>
+          </w:tcPr>
+          <w:p>
+            <w:r>
+              <w:rPr>
+                <w:rFonts w:ascii="Arial" w:hAnsi="Arial"/>
+                <w:color w:val="334155"/>
+                <w:sz w:val="17"/>
+              </w:rPr>
+              <w:t>⏳ Step 1</w:t>
+            </w:r>
+          </w:p>
+        </w:tc>
+      </w:tr>
+      <w:tr>
+        <w:tc>
+          <w:tcPr>
+            <w:tcW w:type="dxa" w:w="2160"/>
+            <w:tcMar>
+              <w:top w:w="80" w:type="dxa"/>
+              <w:bottom w:w="80" w:type="dxa"/>
+              <w:left w:w="100" w:type="dxa"/>
+              <w:right w:w="100" w:type="dxa"/>
+            </w:tcMar>
+            <w:shd w:fill="FFFFFF"/>
+          </w:tcPr>
+          <w:p>
+            <w:r>
+              <w:rPr>
+                <w:rFonts w:ascii="Arial" w:hAnsi="Arial"/>
+                <w:color w:val="334155"/>
+                <w:sz w:val="17"/>
+              </w:rPr>
+              <w:t>32</w:t>
+            </w:r>
+          </w:p>
+        </w:tc>
+        <w:tc>
+          <w:tcPr>
+            <w:tcW w:type="dxa" w:w="2160"/>
+            <w:tcMar>
+              <w:top w:w="80" w:type="dxa"/>
+              <w:bottom w:w="80" w:type="dxa"/>
+              <w:left w:w="100" w:type="dxa"/>
+              <w:right w:w="100" w:type="dxa"/>
+            </w:tcMar>
+            <w:shd w:fill="FFFFFF"/>
+          </w:tcPr>
+          <w:p>
+            <w:r>
+              <w:rPr>
+                <w:rFonts w:ascii="Arial" w:hAnsi="Arial"/>
+                <w:color w:val="334155"/>
+                <w:sz w:val="17"/>
+              </w:rPr>
+              <w:t>[SQL Temp Tables](https://www.youtube.com/watch?v=Y4OIi5DeBxg)</w:t>
+            </w:r>
+          </w:p>
+        </w:tc>
+        <w:tc>
+          <w:tcPr>
+            <w:tcW w:type="dxa" w:w="2160"/>
+            <w:tcMar>
+              <w:top w:w="80" w:type="dxa"/>
+              <w:bottom w:w="80" w:type="dxa"/>
+              <w:left w:w="100" w:type="dxa"/>
+              <w:right w:w="100" w:type="dxa"/>
+            </w:tcMar>
+            <w:shd w:fill="FFFFFF"/>
+          </w:tcPr>
+          <w:p>
+            <w:r>
+              <w:rPr>
+                <w:rFonts w:ascii="Arial" w:hAnsi="Arial"/>
+                <w:color w:val="334155"/>
+                <w:sz w:val="17"/>
+              </w:rPr>
+              <w:t>⏳ Step 1</w:t>
+            </w:r>
+          </w:p>
+        </w:tc>
+        <w:tc>
+          <w:tcPr>
+            <w:tcW w:type="dxa" w:w="2160"/>
+            <w:tcMar>
+              <w:top w:w="80" w:type="dxa"/>
+              <w:bottom w:w="80" w:type="dxa"/>
+              <w:left w:w="100" w:type="dxa"/>
+              <w:right w:w="100" w:type="dxa"/>
+            </w:tcMar>
+            <w:shd w:fill="FFFFFF"/>
+          </w:tcPr>
+          <w:p>
+            <w:r>
+              <w:rPr>
+                <w:rFonts w:ascii="Arial" w:hAnsi="Arial"/>
+                <w:color w:val="334155"/>
+                <w:sz w:val="17"/>
+              </w:rPr>
+              <w:t>🔥 High Priority DA</w:t>
+            </w:r>
+          </w:p>
+        </w:tc>
+      </w:tr>
+      <w:tr>
+        <w:tc>
+          <w:tcPr>
+            <w:tcW w:type="dxa" w:w="2160"/>
+            <w:tcMar>
+              <w:top w:w="80" w:type="dxa"/>
+              <w:bottom w:w="80" w:type="dxa"/>
+              <w:left w:w="100" w:type="dxa"/>
+              <w:right w:w="100" w:type="dxa"/>
+            </w:tcMar>
+            <w:shd w:fill="F8FAFC"/>
+          </w:tcPr>
+          <w:p>
+            <w:r>
+              <w:rPr>
+                <w:rFonts w:ascii="Arial" w:hAnsi="Arial"/>
+                <w:color w:val="334155"/>
+                <w:sz w:val="17"/>
+              </w:rPr>
+              <w:t>33</w:t>
+            </w:r>
+          </w:p>
+        </w:tc>
+        <w:tc>
+          <w:tcPr>
+            <w:tcW w:type="dxa" w:w="2160"/>
+            <w:tcMar>
+              <w:top w:w="80" w:type="dxa"/>
+              <w:bottom w:w="80" w:type="dxa"/>
+              <w:left w:w="100" w:type="dxa"/>
+              <w:right w:w="100" w:type="dxa"/>
+            </w:tcMar>
+            <w:shd w:fill="F8FAFC"/>
+          </w:tcPr>
+          <w:p>
+            <w:r>
+              <w:rPr>
+                <w:rFonts w:ascii="Arial" w:hAnsi="Arial"/>
+                <w:color w:val="334155"/>
+                <w:sz w:val="17"/>
+              </w:rPr>
+              <w:t>[SQL Subquery vs CTE vs Views vs CTAS vs TEMP](https://www.youtube.com/watch?v=6RU6T8HKgYA)</w:t>
+            </w:r>
+          </w:p>
+        </w:tc>
+        <w:tc>
+          <w:tcPr>
+            <w:tcW w:type="dxa" w:w="2160"/>
+            <w:tcMar>
+              <w:top w:w="80" w:type="dxa"/>
+              <w:bottom w:w="80" w:type="dxa"/>
+              <w:left w:w="100" w:type="dxa"/>
+              <w:right w:w="100" w:type="dxa"/>
+            </w:tcMar>
+            <w:shd w:fill="F8FAFC"/>
+          </w:tcPr>
+          <w:p>
+            <w:r>
+              <w:rPr>
+                <w:rFonts w:ascii="Arial" w:hAnsi="Arial"/>
+                <w:color w:val="334155"/>
+                <w:sz w:val="17"/>
+              </w:rPr>
+              <w:t>⏳ Step 1</w:t>
+            </w:r>
+          </w:p>
+        </w:tc>
+        <w:tc>
+          <w:tcPr>
+            <w:tcW w:type="dxa" w:w="2160"/>
+            <w:tcMar>
+              <w:top w:w="80" w:type="dxa"/>
+              <w:bottom w:w="80" w:type="dxa"/>
+              <w:left w:w="100" w:type="dxa"/>
+              <w:right w:w="100" w:type="dxa"/>
+            </w:tcMar>
+            <w:shd w:fill="F8FAFC"/>
+          </w:tcPr>
+          <w:p>
+            <w:r>
+              <w:rPr>
+                <w:rFonts w:ascii="Arial" w:hAnsi="Arial"/>
+                <w:color w:val="334155"/>
+                <w:sz w:val="17"/>
+              </w:rPr>
+              <w:t>🔥 High Priority DA</w:t>
+            </w:r>
+          </w:p>
+        </w:tc>
+      </w:tr>
+      <w:tr>
+        <w:tc>
+          <w:tcPr>
+            <w:tcW w:type="dxa" w:w="2160"/>
+            <w:tcMar>
+              <w:top w:w="80" w:type="dxa"/>
+              <w:bottom w:w="80" w:type="dxa"/>
+              <w:left w:w="100" w:type="dxa"/>
+              <w:right w:w="100" w:type="dxa"/>
+            </w:tcMar>
+            <w:shd w:fill="FFFFFF"/>
+          </w:tcPr>
+          <w:p>
+            <w:r>
+              <w:rPr>
+                <w:rFonts w:ascii="Arial" w:hAnsi="Arial"/>
+                <w:color w:val="334155"/>
+                <w:sz w:val="17"/>
+              </w:rPr>
+              <w:t>34</w:t>
+            </w:r>
+          </w:p>
+        </w:tc>
+        <w:tc>
+          <w:tcPr>
+            <w:tcW w:type="dxa" w:w="2160"/>
+            <w:tcMar>
+              <w:top w:w="80" w:type="dxa"/>
+              <w:bottom w:w="80" w:type="dxa"/>
+              <w:left w:w="100" w:type="dxa"/>
+              <w:right w:w="100" w:type="dxa"/>
+            </w:tcMar>
+            <w:shd w:fill="FFFFFF"/>
+          </w:tcPr>
+          <w:p>
+            <w:r>
+              <w:rPr>
+                <w:rFonts w:ascii="Arial" w:hAnsi="Arial"/>
+                <w:color w:val="334155"/>
+                <w:sz w:val="17"/>
+              </w:rPr>
+              <w:t>[SQL Indexes \</w:t>
+            </w:r>
+          </w:p>
+        </w:tc>
+        <w:tc>
+          <w:tcPr>
+            <w:tcW w:type="dxa" w:w="2160"/>
+            <w:tcMar>
+              <w:top w:w="80" w:type="dxa"/>
+              <w:bottom w:w="80" w:type="dxa"/>
+              <w:left w:w="100" w:type="dxa"/>
+              <w:right w:w="100" w:type="dxa"/>
+            </w:tcMar>
+            <w:shd w:fill="FFFFFF"/>
+          </w:tcPr>
+          <w:p>
+            <w:r>
+              <w:rPr>
+                <w:rFonts w:ascii="Arial" w:hAnsi="Arial"/>
+                <w:color w:val="334155"/>
+                <w:sz w:val="17"/>
+              </w:rPr>
+              <w:t>Clustered vs Nonclustered](https://www.youtube.com/watch?v=BxAj3bl00-o)</w:t>
+            </w:r>
+          </w:p>
+        </w:tc>
+        <w:tc>
+          <w:tcPr>
+            <w:tcW w:type="dxa" w:w="2160"/>
+            <w:tcMar>
+              <w:top w:w="80" w:type="dxa"/>
+              <w:bottom w:w="80" w:type="dxa"/>
+              <w:left w:w="100" w:type="dxa"/>
+              <w:right w:w="100" w:type="dxa"/>
+            </w:tcMar>
+            <w:shd w:fill="FFFFFF"/>
+          </w:tcPr>
+          <w:p>
+            <w:r>
+              <w:rPr>
+                <w:rFonts w:ascii="Arial" w:hAnsi="Arial"/>
+                <w:color w:val="334155"/>
+                <w:sz w:val="17"/>
+              </w:rPr>
+              <w:t>⏳ Step 2</w:t>
+            </w:r>
+          </w:p>
+        </w:tc>
+      </w:tr>
+      <w:tr>
+        <w:tc>
+          <w:tcPr>
+            <w:tcW w:type="dxa" w:w="2160"/>
+            <w:tcMar>
+              <w:top w:w="80" w:type="dxa"/>
+              <w:bottom w:w="80" w:type="dxa"/>
+              <w:left w:w="100" w:type="dxa"/>
+              <w:right w:w="100" w:type="dxa"/>
+            </w:tcMar>
+            <w:shd w:fill="F8FAFC"/>
+          </w:tcPr>
+          <w:p>
+            <w:r>
+              <w:rPr>
+                <w:rFonts w:ascii="Arial" w:hAnsi="Arial"/>
+                <w:color w:val="334155"/>
+                <w:sz w:val="17"/>
+              </w:rPr>
+              <w:t>35</w:t>
+            </w:r>
+          </w:p>
+        </w:tc>
+        <w:tc>
+          <w:tcPr>
+            <w:tcW w:type="dxa" w:w="2160"/>
+            <w:tcMar>
+              <w:top w:w="80" w:type="dxa"/>
+              <w:bottom w:w="80" w:type="dxa"/>
+              <w:left w:w="100" w:type="dxa"/>
+              <w:right w:w="100" w:type="dxa"/>
+            </w:tcMar>
+            <w:shd w:fill="F8FAFC"/>
+          </w:tcPr>
+          <w:p>
+            <w:r>
+              <w:rPr>
+                <w:rFonts w:ascii="Arial" w:hAnsi="Arial"/>
+                <w:color w:val="334155"/>
+                <w:sz w:val="17"/>
+              </w:rPr>
+              <w:t>[SQL Columnstore Index \</w:t>
+            </w:r>
+          </w:p>
+        </w:tc>
+        <w:tc>
+          <w:tcPr>
+            <w:tcW w:type="dxa" w:w="2160"/>
+            <w:tcMar>
+              <w:top w:w="80" w:type="dxa"/>
+              <w:bottom w:w="80" w:type="dxa"/>
+              <w:left w:w="100" w:type="dxa"/>
+              <w:right w:w="100" w:type="dxa"/>
+            </w:tcMar>
+            <w:shd w:fill="F8FAFC"/>
+          </w:tcPr>
+          <w:p>
+            <w:r>
+              <w:rPr>
+                <w:rFonts w:ascii="Arial" w:hAnsi="Arial"/>
+                <w:color w:val="334155"/>
+                <w:sz w:val="17"/>
+              </w:rPr>
+              <w:t>Columnstore vs Rowstore](https://www.youtube.com/watch?v=k9DpO91W76o)</w:t>
+            </w:r>
+          </w:p>
+        </w:tc>
+        <w:tc>
+          <w:tcPr>
+            <w:tcW w:type="dxa" w:w="2160"/>
+            <w:tcMar>
+              <w:top w:w="80" w:type="dxa"/>
+              <w:bottom w:w="80" w:type="dxa"/>
+              <w:left w:w="100" w:type="dxa"/>
+              <w:right w:w="100" w:type="dxa"/>
+            </w:tcMar>
+            <w:shd w:fill="F8FAFC"/>
+          </w:tcPr>
+          <w:p>
+            <w:r>
+              <w:rPr>
+                <w:rFonts w:ascii="Arial" w:hAnsi="Arial"/>
+                <w:color w:val="334155"/>
+                <w:sz w:val="17"/>
+              </w:rPr>
+              <w:t>⏳ Step 2</w:t>
+            </w:r>
+          </w:p>
+        </w:tc>
+      </w:tr>
+      <w:tr>
+        <w:tc>
+          <w:tcPr>
+            <w:tcW w:type="dxa" w:w="2160"/>
+            <w:tcMar>
+              <w:top w:w="80" w:type="dxa"/>
+              <w:bottom w:w="80" w:type="dxa"/>
+              <w:left w:w="100" w:type="dxa"/>
+              <w:right w:w="100" w:type="dxa"/>
+            </w:tcMar>
+            <w:shd w:fill="FFFFFF"/>
+          </w:tcPr>
+          <w:p>
+            <w:r>
+              <w:rPr>
+                <w:rFonts w:ascii="Arial" w:hAnsi="Arial"/>
+                <w:color w:val="334155"/>
+                <w:sz w:val="17"/>
+              </w:rPr>
+              <w:t>36</w:t>
+            </w:r>
+          </w:p>
+        </w:tc>
+        <w:tc>
+          <w:tcPr>
+            <w:tcW w:type="dxa" w:w="2160"/>
+            <w:tcMar>
+              <w:top w:w="80" w:type="dxa"/>
+              <w:bottom w:w="80" w:type="dxa"/>
+              <w:left w:w="100" w:type="dxa"/>
+              <w:right w:w="100" w:type="dxa"/>
+            </w:tcMar>
+            <w:shd w:fill="FFFFFF"/>
+          </w:tcPr>
+          <w:p>
+            <w:r>
+              <w:rPr>
+                <w:rFonts w:ascii="Arial" w:hAnsi="Arial"/>
+                <w:color w:val="334155"/>
+                <w:sz w:val="17"/>
+              </w:rPr>
+              <w:t>[SQL Unique &amp; Filtered Indexes](https://www.youtube.com/watch?v=PU2ajABOH-w)</w:t>
+            </w:r>
+          </w:p>
+        </w:tc>
+        <w:tc>
+          <w:tcPr>
+            <w:tcW w:type="dxa" w:w="2160"/>
+            <w:tcMar>
+              <w:top w:w="80" w:type="dxa"/>
+              <w:bottom w:w="80" w:type="dxa"/>
+              <w:left w:w="100" w:type="dxa"/>
+              <w:right w:w="100" w:type="dxa"/>
+            </w:tcMar>
+            <w:shd w:fill="FFFFFF"/>
+          </w:tcPr>
+          <w:p>
+            <w:r>
+              <w:rPr>
+                <w:rFonts w:ascii="Arial" w:hAnsi="Arial"/>
+                <w:color w:val="334155"/>
+                <w:sz w:val="17"/>
+              </w:rPr>
+              <w:t>⏳ Step 2</w:t>
+            </w:r>
+          </w:p>
+        </w:tc>
+        <w:tc>
+          <w:tcPr>
+            <w:tcW w:type="dxa" w:w="2160"/>
+            <w:tcMar>
+              <w:top w:w="80" w:type="dxa"/>
+              <w:bottom w:w="80" w:type="dxa"/>
+              <w:left w:w="100" w:type="dxa"/>
+              <w:right w:w="100" w:type="dxa"/>
+            </w:tcMar>
+            <w:shd w:fill="FFFFFF"/>
+          </w:tcPr>
+          <w:p>
+            <w:r>
+              <w:rPr>
+                <w:rFonts w:ascii="Arial" w:hAnsi="Arial"/>
+                <w:color w:val="334155"/>
+                <w:sz w:val="17"/>
+              </w:rPr>
+              <w:t>⭐ Recommended DA</w:t>
+            </w:r>
+          </w:p>
+        </w:tc>
+      </w:tr>
+      <w:tr>
+        <w:tc>
+          <w:tcPr>
+            <w:tcW w:type="dxa" w:w="2160"/>
+            <w:tcMar>
+              <w:top w:w="80" w:type="dxa"/>
+              <w:bottom w:w="80" w:type="dxa"/>
+              <w:left w:w="100" w:type="dxa"/>
+              <w:right w:w="100" w:type="dxa"/>
+            </w:tcMar>
+            <w:shd w:fill="F8FAFC"/>
+          </w:tcPr>
+          <w:p>
+            <w:r>
+              <w:rPr>
+                <w:rFonts w:ascii="Arial" w:hAnsi="Arial"/>
+                <w:color w:val="334155"/>
+                <w:sz w:val="17"/>
+              </w:rPr>
+              <w:t>37</w:t>
+            </w:r>
+          </w:p>
+        </w:tc>
+        <w:tc>
+          <w:tcPr>
+            <w:tcW w:type="dxa" w:w="2160"/>
+            <w:tcMar>
+              <w:top w:w="80" w:type="dxa"/>
+              <w:bottom w:w="80" w:type="dxa"/>
+              <w:left w:w="100" w:type="dxa"/>
+              <w:right w:w="100" w:type="dxa"/>
+            </w:tcMar>
+            <w:shd w:fill="F8FAFC"/>
+          </w:tcPr>
+          <w:p>
+            <w:r>
+              <w:rPr>
+                <w:rFonts w:ascii="Arial" w:hAnsi="Arial"/>
+                <w:color w:val="334155"/>
+                <w:sz w:val="17"/>
+              </w:rPr>
+              <w:t>[How to Choose the Right Index](https://www.youtube.com/watch?v=1lHNw365ldc)</w:t>
+            </w:r>
+          </w:p>
+        </w:tc>
+        <w:tc>
+          <w:tcPr>
+            <w:tcW w:type="dxa" w:w="2160"/>
+            <w:tcMar>
+              <w:top w:w="80" w:type="dxa"/>
+              <w:bottom w:w="80" w:type="dxa"/>
+              <w:left w:w="100" w:type="dxa"/>
+              <w:right w:w="100" w:type="dxa"/>
+            </w:tcMar>
+            <w:shd w:fill="F8FAFC"/>
+          </w:tcPr>
+          <w:p>
+            <w:r>
+              <w:rPr>
+                <w:rFonts w:ascii="Arial" w:hAnsi="Arial"/>
+                <w:color w:val="334155"/>
+                <w:sz w:val="17"/>
+              </w:rPr>
+              <w:t>⏳ Step 2</w:t>
+            </w:r>
+          </w:p>
+        </w:tc>
+        <w:tc>
+          <w:tcPr>
+            <w:tcW w:type="dxa" w:w="2160"/>
+            <w:tcMar>
+              <w:top w:w="80" w:type="dxa"/>
+              <w:bottom w:w="80" w:type="dxa"/>
+              <w:left w:w="100" w:type="dxa"/>
+              <w:right w:w="100" w:type="dxa"/>
+            </w:tcMar>
+            <w:shd w:fill="F8FAFC"/>
+          </w:tcPr>
+          <w:p>
+            <w:r>
+              <w:rPr>
+                <w:rFonts w:ascii="Arial" w:hAnsi="Arial"/>
+                <w:color w:val="334155"/>
+                <w:sz w:val="17"/>
+              </w:rPr>
+              <w:t>⭐ Recommended DA</w:t>
+            </w:r>
+          </w:p>
+        </w:tc>
+      </w:tr>
+      <w:tr>
+        <w:tc>
+          <w:tcPr>
+            <w:tcW w:type="dxa" w:w="2160"/>
+            <w:tcMar>
+              <w:top w:w="80" w:type="dxa"/>
+              <w:bottom w:w="80" w:type="dxa"/>
+              <w:left w:w="100" w:type="dxa"/>
+              <w:right w:w="100" w:type="dxa"/>
+            </w:tcMar>
+            <w:shd w:fill="FFFFFF"/>
+          </w:tcPr>
+          <w:p>
+            <w:r>
+              <w:rPr>
+                <w:rFonts w:ascii="Arial" w:hAnsi="Arial"/>
+                <w:color w:val="334155"/>
+                <w:sz w:val="17"/>
+              </w:rPr>
+              <w:t>38</w:t>
+            </w:r>
+          </w:p>
+        </w:tc>
+        <w:tc>
+          <w:tcPr>
+            <w:tcW w:type="dxa" w:w="2160"/>
+            <w:tcMar>
+              <w:top w:w="80" w:type="dxa"/>
+              <w:bottom w:w="80" w:type="dxa"/>
+              <w:left w:w="100" w:type="dxa"/>
+              <w:right w:w="100" w:type="dxa"/>
+            </w:tcMar>
+            <w:shd w:fill="FFFFFF"/>
+          </w:tcPr>
+          <w:p>
+            <w:r>
+              <w:rPr>
+                <w:rFonts w:ascii="Arial" w:hAnsi="Arial"/>
+                <w:color w:val="334155"/>
+                <w:sz w:val="17"/>
+              </w:rPr>
+              <w:t>[SQL Index Maintenance \</w:t>
+            </w:r>
+          </w:p>
+        </w:tc>
+        <w:tc>
+          <w:tcPr>
+            <w:tcW w:type="dxa" w:w="2160"/>
+            <w:tcMar>
+              <w:top w:w="80" w:type="dxa"/>
+              <w:bottom w:w="80" w:type="dxa"/>
+              <w:left w:w="100" w:type="dxa"/>
+              <w:right w:w="100" w:type="dxa"/>
+            </w:tcMar>
+            <w:shd w:fill="FFFFFF"/>
+          </w:tcPr>
+          <w:p>
+            <w:r>
+              <w:rPr>
+                <w:rFonts w:ascii="Arial" w:hAnsi="Arial"/>
+                <w:color w:val="334155"/>
+                <w:sz w:val="17"/>
+              </w:rPr>
+              <w:t>5 Things to Do](https://www.youtube.com/watch?v=n9EWmfrMpZc)</w:t>
+            </w:r>
+          </w:p>
+        </w:tc>
+        <w:tc>
+          <w:tcPr>
+            <w:tcW w:type="dxa" w:w="2160"/>
+            <w:tcMar>
+              <w:top w:w="80" w:type="dxa"/>
+              <w:bottom w:w="80" w:type="dxa"/>
+              <w:left w:w="100" w:type="dxa"/>
+              <w:right w:w="100" w:type="dxa"/>
+            </w:tcMar>
+            <w:shd w:fill="FFFFFF"/>
+          </w:tcPr>
+          <w:p>
+            <w:r>
+              <w:rPr>
+                <w:rFonts w:ascii="Arial" w:hAnsi="Arial"/>
+                <w:color w:val="334155"/>
+                <w:sz w:val="17"/>
+              </w:rPr>
+              <w:t>⏳ Step 2</w:t>
+            </w:r>
+          </w:p>
+        </w:tc>
+      </w:tr>
+      <w:tr>
+        <w:tc>
+          <w:tcPr>
+            <w:tcW w:type="dxa" w:w="2160"/>
+            <w:tcMar>
+              <w:top w:w="80" w:type="dxa"/>
+              <w:bottom w:w="80" w:type="dxa"/>
+              <w:left w:w="100" w:type="dxa"/>
+              <w:right w:w="100" w:type="dxa"/>
+            </w:tcMar>
+            <w:shd w:fill="F8FAFC"/>
+          </w:tcPr>
+          <w:p>
+            <w:r>
+              <w:rPr>
+                <w:rFonts w:ascii="Arial" w:hAnsi="Arial"/>
+                <w:color w:val="334155"/>
+                <w:sz w:val="17"/>
+              </w:rPr>
+              <w:t>39</w:t>
+            </w:r>
+          </w:p>
+        </w:tc>
+        <w:tc>
+          <w:tcPr>
+            <w:tcW w:type="dxa" w:w="2160"/>
+            <w:tcMar>
+              <w:top w:w="80" w:type="dxa"/>
+              <w:bottom w:w="80" w:type="dxa"/>
+              <w:left w:w="100" w:type="dxa"/>
+              <w:right w:w="100" w:type="dxa"/>
+            </w:tcMar>
+            <w:shd w:fill="F8FAFC"/>
+          </w:tcPr>
+          <w:p>
+            <w:r>
+              <w:rPr>
+                <w:rFonts w:ascii="Arial" w:hAnsi="Arial"/>
+                <w:color w:val="334155"/>
+                <w:sz w:val="17"/>
+              </w:rPr>
+              <w:t>[SQL Execution Plans \</w:t>
+            </w:r>
+          </w:p>
+        </w:tc>
+        <w:tc>
+          <w:tcPr>
+            <w:tcW w:type="dxa" w:w="2160"/>
+            <w:tcMar>
+              <w:top w:w="80" w:type="dxa"/>
+              <w:bottom w:w="80" w:type="dxa"/>
+              <w:left w:w="100" w:type="dxa"/>
+              <w:right w:w="100" w:type="dxa"/>
+            </w:tcMar>
+            <w:shd w:fill="F8FAFC"/>
+          </w:tcPr>
+          <w:p>
+            <w:r>
+              <w:rPr>
+                <w:rFonts w:ascii="Arial" w:hAnsi="Arial"/>
+                <w:color w:val="334155"/>
+                <w:sz w:val="17"/>
+              </w:rPr>
+              <w:t>SQL Hints](https://www.youtube.com/watch?v=O7AzUDogXsw)</w:t>
+            </w:r>
+          </w:p>
+        </w:tc>
+        <w:tc>
+          <w:tcPr>
+            <w:tcW w:type="dxa" w:w="2160"/>
+            <w:tcMar>
+              <w:top w:w="80" w:type="dxa"/>
+              <w:bottom w:w="80" w:type="dxa"/>
+              <w:left w:w="100" w:type="dxa"/>
+              <w:right w:w="100" w:type="dxa"/>
+            </w:tcMar>
+            <w:shd w:fill="F8FAFC"/>
+          </w:tcPr>
+          <w:p>
+            <w:r>
+              <w:rPr>
+                <w:rFonts w:ascii="Arial" w:hAnsi="Arial"/>
+                <w:color w:val="334155"/>
+                <w:sz w:val="17"/>
+              </w:rPr>
+              <w:t>⏳ Step 2</w:t>
+            </w:r>
+          </w:p>
+        </w:tc>
+      </w:tr>
+      <w:tr>
+        <w:tc>
+          <w:tcPr>
+            <w:tcW w:type="dxa" w:w="2160"/>
+            <w:tcMar>
+              <w:top w:w="80" w:type="dxa"/>
+              <w:bottom w:w="80" w:type="dxa"/>
+              <w:left w:w="100" w:type="dxa"/>
+              <w:right w:w="100" w:type="dxa"/>
+            </w:tcMar>
+            <w:shd w:fill="FFFFFF"/>
+          </w:tcPr>
+          <w:p>
+            <w:r>
+              <w:rPr>
+                <w:rFonts w:ascii="Arial" w:hAnsi="Arial"/>
+                <w:color w:val="334155"/>
+                <w:sz w:val="17"/>
+              </w:rPr>
+              <w:t>40</w:t>
+            </w:r>
+          </w:p>
+        </w:tc>
+        <w:tc>
+          <w:tcPr>
+            <w:tcW w:type="dxa" w:w="2160"/>
+            <w:tcMar>
+              <w:top w:w="80" w:type="dxa"/>
+              <w:bottom w:w="80" w:type="dxa"/>
+              <w:left w:w="100" w:type="dxa"/>
+              <w:right w:w="100" w:type="dxa"/>
+            </w:tcMar>
+            <w:shd w:fill="FFFFFF"/>
+          </w:tcPr>
+          <w:p>
+            <w:r>
+              <w:rPr>
+                <w:rFonts w:ascii="Arial" w:hAnsi="Arial"/>
+                <w:color w:val="334155"/>
+                <w:sz w:val="17"/>
+              </w:rPr>
+              <w:t>[My Indexing Strategy for Every Project](https://www.youtube.com/watch?v=0UxHG8zJ3F4)</w:t>
+            </w:r>
+          </w:p>
+        </w:tc>
+        <w:tc>
+          <w:tcPr>
+            <w:tcW w:type="dxa" w:w="2160"/>
+            <w:tcMar>
+              <w:top w:w="80" w:type="dxa"/>
+              <w:bottom w:w="80" w:type="dxa"/>
+              <w:left w:w="100" w:type="dxa"/>
+              <w:right w:w="100" w:type="dxa"/>
+            </w:tcMar>
+            <w:shd w:fill="FFFFFF"/>
+          </w:tcPr>
+          <w:p>
+            <w:r>
+              <w:rPr>
+                <w:rFonts w:ascii="Arial" w:hAnsi="Arial"/>
+                <w:color w:val="334155"/>
+                <w:sz w:val="17"/>
+              </w:rPr>
+              <w:t>⏳ Step 2</w:t>
+            </w:r>
+          </w:p>
+        </w:tc>
+        <w:tc>
+          <w:tcPr>
+            <w:tcW w:type="dxa" w:w="2160"/>
+            <w:tcMar>
+              <w:top w:w="80" w:type="dxa"/>
+              <w:bottom w:w="80" w:type="dxa"/>
+              <w:left w:w="100" w:type="dxa"/>
+              <w:right w:w="100" w:type="dxa"/>
+            </w:tcMar>
+            <w:shd w:fill="FFFFFF"/>
+          </w:tcPr>
+          <w:p>
+            <w:r>
+              <w:rPr>
+                <w:rFonts w:ascii="Arial" w:hAnsi="Arial"/>
+                <w:color w:val="334155"/>
+                <w:sz w:val="17"/>
+              </w:rPr>
+              <w:t>⭐ Recommended DA</w:t>
+            </w:r>
+          </w:p>
+        </w:tc>
+      </w:tr>
+      <w:tr>
+        <w:tc>
+          <w:tcPr>
+            <w:tcW w:type="dxa" w:w="2160"/>
+            <w:tcMar>
+              <w:top w:w="80" w:type="dxa"/>
+              <w:bottom w:w="80" w:type="dxa"/>
+              <w:left w:w="100" w:type="dxa"/>
+              <w:right w:w="100" w:type="dxa"/>
+            </w:tcMar>
+            <w:shd w:fill="F8FAFC"/>
+          </w:tcPr>
+          <w:p>
+            <w:r>
+              <w:rPr>
+                <w:rFonts w:ascii="Arial" w:hAnsi="Arial"/>
+                <w:color w:val="334155"/>
+                <w:sz w:val="17"/>
+              </w:rPr>
+              <w:t>41</w:t>
+            </w:r>
+          </w:p>
+        </w:tc>
+        <w:tc>
+          <w:tcPr>
+            <w:tcW w:type="dxa" w:w="2160"/>
+            <w:tcMar>
+              <w:top w:w="80" w:type="dxa"/>
+              <w:bottom w:w="80" w:type="dxa"/>
+              <w:left w:w="100" w:type="dxa"/>
+              <w:right w:w="100" w:type="dxa"/>
+            </w:tcMar>
+            <w:shd w:fill="F8FAFC"/>
+          </w:tcPr>
+          <w:p>
+            <w:r>
+              <w:rPr>
+                <w:rFonts w:ascii="Arial" w:hAnsi="Arial"/>
+                <w:color w:val="334155"/>
+                <w:sz w:val="17"/>
+              </w:rPr>
+              <w:t>[SQL Table Partitioning \</w:t>
+            </w:r>
+          </w:p>
+        </w:tc>
+        <w:tc>
+          <w:tcPr>
+            <w:tcW w:type="dxa" w:w="2160"/>
+            <w:tcMar>
+              <w:top w:w="80" w:type="dxa"/>
+              <w:bottom w:w="80" w:type="dxa"/>
+              <w:left w:w="100" w:type="dxa"/>
+              <w:right w:w="100" w:type="dxa"/>
+            </w:tcMar>
+            <w:shd w:fill="F8FAFC"/>
+          </w:tcPr>
+          <w:p>
+            <w:r>
+              <w:rPr>
+                <w:rFonts w:ascii="Arial" w:hAnsi="Arial"/>
+                <w:color w:val="334155"/>
+                <w:sz w:val="17"/>
+              </w:rPr>
+              <w:t>Optimize Big Table Performance](https://www.youtube.com/watch?v=tQQ3XwrKbfM)</w:t>
+            </w:r>
+          </w:p>
+        </w:tc>
+        <w:tc>
+          <w:tcPr>
+            <w:tcW w:type="dxa" w:w="2160"/>
+            <w:tcMar>
+              <w:top w:w="80" w:type="dxa"/>
+              <w:bottom w:w="80" w:type="dxa"/>
+              <w:left w:w="100" w:type="dxa"/>
+              <w:right w:w="100" w:type="dxa"/>
+            </w:tcMar>
+            <w:shd w:fill="F8FAFC"/>
+          </w:tcPr>
+          <w:p>
+            <w:r>
+              <w:rPr>
+                <w:rFonts w:ascii="Arial" w:hAnsi="Arial"/>
+                <w:color w:val="334155"/>
+                <w:sz w:val="17"/>
+              </w:rPr>
+              <w:t>⏳ Step 2</w:t>
+            </w:r>
+          </w:p>
+        </w:tc>
+      </w:tr>
+      <w:tr>
+        <w:tc>
+          <w:tcPr>
+            <w:tcW w:type="dxa" w:w="2160"/>
+            <w:tcMar>
+              <w:top w:w="80" w:type="dxa"/>
+              <w:bottom w:w="80" w:type="dxa"/>
+              <w:left w:w="100" w:type="dxa"/>
+              <w:right w:w="100" w:type="dxa"/>
+            </w:tcMar>
+            <w:shd w:fill="FFFFFF"/>
+          </w:tcPr>
+          <w:p>
+            <w:r>
+              <w:rPr>
+                <w:rFonts w:ascii="Arial" w:hAnsi="Arial"/>
+                <w:color w:val="334155"/>
+                <w:sz w:val="17"/>
+              </w:rPr>
+              <w:t>42</w:t>
+            </w:r>
+          </w:p>
+        </w:tc>
+        <w:tc>
+          <w:tcPr>
+            <w:tcW w:type="dxa" w:w="2160"/>
+            <w:tcMar>
+              <w:top w:w="80" w:type="dxa"/>
+              <w:bottom w:w="80" w:type="dxa"/>
+              <w:left w:w="100" w:type="dxa"/>
+              <w:right w:w="100" w:type="dxa"/>
+            </w:tcMar>
+            <w:shd w:fill="FFFFFF"/>
+          </w:tcPr>
+          <w:p>
+            <w:r>
+              <w:rPr>
+                <w:rFonts w:ascii="Arial" w:hAnsi="Arial"/>
+                <w:color w:val="334155"/>
+                <w:sz w:val="17"/>
+              </w:rPr>
+              <w:t>[30 SQL Tips and Tricks From 18 Years Experience](https://www.youtube.com/watch?v=Iyr7KQUCb0M)</w:t>
+            </w:r>
+          </w:p>
+        </w:tc>
+        <w:tc>
+          <w:tcPr>
+            <w:tcW w:type="dxa" w:w="2160"/>
+            <w:tcMar>
+              <w:top w:w="80" w:type="dxa"/>
+              <w:bottom w:w="80" w:type="dxa"/>
+              <w:left w:w="100" w:type="dxa"/>
+              <w:right w:w="100" w:type="dxa"/>
+            </w:tcMar>
+            <w:shd w:fill="FFFFFF"/>
+          </w:tcPr>
+          <w:p>
+            <w:r>
+              <w:rPr>
+                <w:rFonts w:ascii="Arial" w:hAnsi="Arial"/>
+                <w:color w:val="334155"/>
+                <w:sz w:val="17"/>
+              </w:rPr>
+              <w:t>⏳ Step 2</w:t>
+            </w:r>
+          </w:p>
+        </w:tc>
+        <w:tc>
+          <w:tcPr>
+            <w:tcW w:type="dxa" w:w="2160"/>
+            <w:tcMar>
+              <w:top w:w="80" w:type="dxa"/>
+              <w:bottom w:w="80" w:type="dxa"/>
+              <w:left w:w="100" w:type="dxa"/>
+              <w:right w:w="100" w:type="dxa"/>
+            </w:tcMar>
+            <w:shd w:fill="FFFFFF"/>
+          </w:tcPr>
+          <w:p>
+            <w:r>
+              <w:rPr>
+                <w:rFonts w:ascii="Arial" w:hAnsi="Arial"/>
+                <w:color w:val="334155"/>
+                <w:sz w:val="17"/>
+              </w:rPr>
+              <w:t>⭐ Recommended DA</w:t>
+            </w:r>
+          </w:p>
+        </w:tc>
+      </w:tr>
+      <w:tr>
+        <w:tc>
+          <w:tcPr>
+            <w:tcW w:type="dxa" w:w="2160"/>
+            <w:tcMar>
+              <w:top w:w="80" w:type="dxa"/>
+              <w:bottom w:w="80" w:type="dxa"/>
+              <w:left w:w="100" w:type="dxa"/>
+              <w:right w:w="100" w:type="dxa"/>
+            </w:tcMar>
+            <w:shd w:fill="F8FAFC"/>
+          </w:tcPr>
+          <w:p>
+            <w:r>
+              <w:rPr>
+                <w:rFonts w:ascii="Arial" w:hAnsi="Arial"/>
+                <w:color w:val="334155"/>
+                <w:sz w:val="17"/>
+              </w:rPr>
+              <w:t>43</w:t>
+            </w:r>
+          </w:p>
+        </w:tc>
+        <w:tc>
+          <w:tcPr>
+            <w:tcW w:type="dxa" w:w="2160"/>
+            <w:tcMar>
+              <w:top w:w="80" w:type="dxa"/>
+              <w:bottom w:w="80" w:type="dxa"/>
+              <w:left w:w="100" w:type="dxa"/>
+              <w:right w:w="100" w:type="dxa"/>
+            </w:tcMar>
+            <w:shd w:fill="F8FAFC"/>
+          </w:tcPr>
+          <w:p>
+            <w:r>
+              <w:rPr>
+                <w:rFonts w:ascii="Arial" w:hAnsi="Arial"/>
+                <w:color w:val="334155"/>
+                <w:sz w:val="17"/>
+              </w:rPr>
+              <w:t>[SQL Stored Procedure \</w:t>
+            </w:r>
+          </w:p>
+        </w:tc>
+        <w:tc>
+          <w:tcPr>
+            <w:tcW w:type="dxa" w:w="2160"/>
+            <w:tcMar>
+              <w:top w:w="80" w:type="dxa"/>
+              <w:bottom w:w="80" w:type="dxa"/>
+              <w:left w:w="100" w:type="dxa"/>
+              <w:right w:w="100" w:type="dxa"/>
+            </w:tcMar>
+            <w:shd w:fill="F8FAFC"/>
+          </w:tcPr>
+          <w:p>
+            <w:r>
+              <w:rPr>
+                <w:rFonts w:ascii="Arial" w:hAnsi="Arial"/>
+                <w:color w:val="334155"/>
+                <w:sz w:val="17"/>
+              </w:rPr>
+              <w:t>Comprehensive Guide](https://www.youtube.com/watch?v=DX8I5SmB6jo)</w:t>
+            </w:r>
+          </w:p>
+        </w:tc>
+        <w:tc>
+          <w:tcPr>
+            <w:tcW w:type="dxa" w:w="2160"/>
+            <w:tcMar>
+              <w:top w:w="80" w:type="dxa"/>
+              <w:bottom w:w="80" w:type="dxa"/>
+              <w:left w:w="100" w:type="dxa"/>
+              <w:right w:w="100" w:type="dxa"/>
+            </w:tcMar>
+            <w:shd w:fill="F8FAFC"/>
+          </w:tcPr>
+          <w:p>
+            <w:r>
+              <w:rPr>
+                <w:rFonts w:ascii="Arial" w:hAnsi="Arial"/>
+                <w:color w:val="334155"/>
+                <w:sz w:val="17"/>
+              </w:rPr>
+              <w:t>💡 Step 3</w:t>
+            </w:r>
+          </w:p>
+        </w:tc>
+      </w:tr>
+      <w:tr>
+        <w:tc>
+          <w:tcPr>
+            <w:tcW w:type="dxa" w:w="2160"/>
+            <w:tcMar>
+              <w:top w:w="80" w:type="dxa"/>
+              <w:bottom w:w="80" w:type="dxa"/>
+              <w:left w:w="100" w:type="dxa"/>
+              <w:right w:w="100" w:type="dxa"/>
+            </w:tcMar>
+            <w:shd w:fill="FFFFFF"/>
+          </w:tcPr>
+          <w:p>
+            <w:r>
+              <w:rPr>
+                <w:rFonts w:ascii="Arial" w:hAnsi="Arial"/>
+                <w:color w:val="334155"/>
+                <w:sz w:val="17"/>
+              </w:rPr>
+              <w:t>44</w:t>
+            </w:r>
+          </w:p>
+        </w:tc>
+        <w:tc>
+          <w:tcPr>
+            <w:tcW w:type="dxa" w:w="2160"/>
+            <w:tcMar>
+              <w:top w:w="80" w:type="dxa"/>
+              <w:bottom w:w="80" w:type="dxa"/>
+              <w:left w:w="100" w:type="dxa"/>
+              <w:right w:w="100" w:type="dxa"/>
+            </w:tcMar>
+            <w:shd w:fill="FFFFFF"/>
+          </w:tcPr>
+          <w:p>
+            <w:r>
+              <w:rPr>
+                <w:rFonts w:ascii="Arial" w:hAnsi="Arial"/>
+                <w:color w:val="334155"/>
+                <w:sz w:val="17"/>
+              </w:rPr>
+              <w:t>[SQL Triggers \</w:t>
+            </w:r>
+          </w:p>
+        </w:tc>
+        <w:tc>
+          <w:tcPr>
+            <w:tcW w:type="dxa" w:w="2160"/>
+            <w:tcMar>
+              <w:top w:w="80" w:type="dxa"/>
+              <w:bottom w:w="80" w:type="dxa"/>
+              <w:left w:w="100" w:type="dxa"/>
+              <w:right w:w="100" w:type="dxa"/>
+            </w:tcMar>
+            <w:shd w:fill="FFFFFF"/>
+          </w:tcPr>
+          <w:p>
+            <w:r>
+              <w:rPr>
+                <w:rFonts w:ascii="Arial" w:hAnsi="Arial"/>
+                <w:color w:val="334155"/>
+                <w:sz w:val="17"/>
+              </w:rPr>
+              <w:t>Audit Logs Use Case](https://www.youtube.com/watch?v=V81Smc6xrBY)</w:t>
+            </w:r>
+          </w:p>
+        </w:tc>
+        <w:tc>
+          <w:tcPr>
+            <w:tcW w:type="dxa" w:w="2160"/>
+            <w:tcMar>
+              <w:top w:w="80" w:type="dxa"/>
+              <w:bottom w:w="80" w:type="dxa"/>
+              <w:left w:w="100" w:type="dxa"/>
+              <w:right w:w="100" w:type="dxa"/>
+            </w:tcMar>
+            <w:shd w:fill="FFFFFF"/>
+          </w:tcPr>
+          <w:p>
+            <w:r>
+              <w:rPr>
+                <w:rFonts w:ascii="Arial" w:hAnsi="Arial"/>
+                <w:color w:val="334155"/>
+                <w:sz w:val="17"/>
+              </w:rPr>
+              <w:t>💡 Step 3</w:t>
+            </w:r>
+          </w:p>
+        </w:tc>
+      </w:tr>
+      <w:tr>
+        <w:tc>
+          <w:tcPr>
+            <w:tcW w:type="dxa" w:w="2160"/>
+            <w:tcMar>
+              <w:top w:w="80" w:type="dxa"/>
+              <w:bottom w:w="80" w:type="dxa"/>
+              <w:left w:w="100" w:type="dxa"/>
+              <w:right w:w="100" w:type="dxa"/>
+            </w:tcMar>
+            <w:shd w:fill="F8FAFC"/>
+          </w:tcPr>
+          <w:p>
+            <w:r>
+              <w:rPr>
+                <w:rFonts w:ascii="Arial" w:hAnsi="Arial"/>
+                <w:color w:val="334155"/>
+                <w:sz w:val="17"/>
+              </w:rPr>
+              <w:t>45</w:t>
+            </w:r>
+          </w:p>
+        </w:tc>
+        <w:tc>
+          <w:tcPr>
+            <w:tcW w:type="dxa" w:w="2160"/>
+            <w:tcMar>
+              <w:top w:w="80" w:type="dxa"/>
+              <w:bottom w:w="80" w:type="dxa"/>
+              <w:left w:w="100" w:type="dxa"/>
+              <w:right w:w="100" w:type="dxa"/>
+            </w:tcMar>
+            <w:shd w:fill="F8FAFC"/>
+          </w:tcPr>
+          <w:p>
+            <w:r>
+              <w:rPr>
+                <w:rFonts w:ascii="Arial" w:hAnsi="Arial"/>
+                <w:color w:val="334155"/>
+                <w:sz w:val="17"/>
+              </w:rPr>
+              <w:t>[How I Use ChatGPT &amp; GitHub Copilot in Projects](https://www.youtube.com/watch?v=XGKyX_hH3Pc)</w:t>
+            </w:r>
+          </w:p>
+        </w:tc>
+        <w:tc>
+          <w:tcPr>
+            <w:tcW w:type="dxa" w:w="2160"/>
+            <w:tcMar>
+              <w:top w:w="80" w:type="dxa"/>
+              <w:bottom w:w="80" w:type="dxa"/>
+              <w:left w:w="100" w:type="dxa"/>
+              <w:right w:w="100" w:type="dxa"/>
+            </w:tcMar>
+            <w:shd w:fill="F8FAFC"/>
+          </w:tcPr>
+          <w:p>
+            <w:r>
+              <w:rPr>
+                <w:rFonts w:ascii="Arial" w:hAnsi="Arial"/>
+                <w:color w:val="334155"/>
+                <w:sz w:val="17"/>
+              </w:rPr>
+              <w:t>💡 Step 3</w:t>
+            </w:r>
+          </w:p>
+        </w:tc>
+        <w:tc>
+          <w:tcPr>
+            <w:tcW w:type="dxa" w:w="2160"/>
+            <w:tcMar>
+              <w:top w:w="80" w:type="dxa"/>
+              <w:bottom w:w="80" w:type="dxa"/>
+              <w:left w:w="100" w:type="dxa"/>
+              <w:right w:w="100" w:type="dxa"/>
+            </w:tcMar>
+            <w:shd w:fill="F8FAFC"/>
+          </w:tcPr>
+          <w:p>
+            <w:r>
+              <w:rPr>
+                <w:rFonts w:ascii="Arial" w:hAnsi="Arial"/>
+                <w:color w:val="334155"/>
+                <w:sz w:val="17"/>
+              </w:rPr>
+              <w:t>🛠️ Productivity</w:t>
+            </w:r>
+          </w:p>
+        </w:tc>
+      </w:tr>
+      <w:tr>
+        <w:tc>
+          <w:tcPr>
+            <w:tcW w:type="dxa" w:w="2160"/>
+            <w:tcMar>
+              <w:top w:w="80" w:type="dxa"/>
+              <w:bottom w:w="80" w:type="dxa"/>
+              <w:left w:w="100" w:type="dxa"/>
+              <w:right w:w="100" w:type="dxa"/>
+            </w:tcMar>
+            <w:shd w:fill="FFFFFF"/>
+          </w:tcPr>
+          <w:p>
+            <w:r>
+              <w:rPr>
+                <w:rFonts w:ascii="Arial" w:hAnsi="Arial"/>
+                <w:color w:val="334155"/>
+                <w:sz w:val="17"/>
+              </w:rPr>
+              <w:t>46-54</w:t>
+            </w:r>
+          </w:p>
+        </w:tc>
+        <w:tc>
+          <w:tcPr>
+            <w:tcW w:type="dxa" w:w="2160"/>
+            <w:tcMar>
+              <w:top w:w="80" w:type="dxa"/>
+              <w:bottom w:w="80" w:type="dxa"/>
+              <w:left w:w="100" w:type="dxa"/>
+              <w:right w:w="100" w:type="dxa"/>
+            </w:tcMar>
+            <w:shd w:fill="FFFFFF"/>
+          </w:tcPr>
+          <w:p>
+            <w:r>
+              <w:rPr>
+                <w:rFonts w:ascii="Arial" w:hAnsi="Arial"/>
+                <w:color w:val="334155"/>
+                <w:sz w:val="17"/>
+              </w:rPr>
+              <w:t>Data Warehouse &amp; ETL Pipeline Series (9 Videos)</w:t>
+            </w:r>
+          </w:p>
+        </w:tc>
+        <w:tc>
+          <w:tcPr>
+            <w:tcW w:type="dxa" w:w="2160"/>
+            <w:tcMar>
+              <w:top w:w="80" w:type="dxa"/>
+              <w:bottom w:w="80" w:type="dxa"/>
+              <w:left w:w="100" w:type="dxa"/>
+              <w:right w:w="100" w:type="dxa"/>
+            </w:tcMar>
+            <w:shd w:fill="FFFFFF"/>
+          </w:tcPr>
+          <w:p>
+            <w:r>
+              <w:rPr>
+                <w:rFonts w:ascii="Arial" w:hAnsi="Arial"/>
+                <w:color w:val="334155"/>
+                <w:sz w:val="17"/>
+              </w:rPr>
+              <w:t>🏗️ Step 4</w:t>
+            </w:r>
+          </w:p>
+        </w:tc>
+        <w:tc>
+          <w:tcPr>
+            <w:tcW w:type="dxa" w:w="2160"/>
+            <w:tcMar>
+              <w:top w:w="80" w:type="dxa"/>
+              <w:bottom w:w="80" w:type="dxa"/>
+              <w:left w:w="100" w:type="dxa"/>
+              <w:right w:w="100" w:type="dxa"/>
+            </w:tcMar>
+            <w:shd w:fill="FFFFFF"/>
+          </w:tcPr>
+          <w:p>
+            <w:r>
+              <w:rPr>
+                <w:rFonts w:ascii="Arial" w:hAnsi="Arial"/>
+                <w:color w:val="334155"/>
+                <w:sz w:val="17"/>
+              </w:rPr>
+              <w:t>🏗️ Data Engineering</w:t>
+            </w:r>
+          </w:p>
+        </w:tc>
+      </w:tr>
+      <w:tr>
+        <w:tc>
+          <w:tcPr>
+            <w:tcW w:type="dxa" w:w="2160"/>
+            <w:tcMar>
+              <w:top w:w="80" w:type="dxa"/>
+              <w:bottom w:w="80" w:type="dxa"/>
+              <w:left w:w="100" w:type="dxa"/>
+              <w:right w:w="100" w:type="dxa"/>
+            </w:tcMar>
+            <w:shd w:fill="F8FAFC"/>
+          </w:tcPr>
+          <w:p>
+            <w:r>
+              <w:rPr>
+                <w:rFonts w:ascii="Arial" w:hAnsi="Arial"/>
+                <w:color w:val="334155"/>
+                <w:sz w:val="17"/>
+              </w:rPr>
+              <w:t>55</w:t>
+            </w:r>
+          </w:p>
+        </w:tc>
+        <w:tc>
+          <w:tcPr>
+            <w:tcW w:type="dxa" w:w="2160"/>
+            <w:tcMar>
+              <w:top w:w="80" w:type="dxa"/>
+              <w:bottom w:w="80" w:type="dxa"/>
+              <w:left w:w="100" w:type="dxa"/>
+              <w:right w:w="100" w:type="dxa"/>
+            </w:tcMar>
+            <w:shd w:fill="F8FAFC"/>
+          </w:tcPr>
+          <w:p>
+            <w:r>
+              <w:rPr>
+                <w:rFonts w:ascii="Arial" w:hAnsi="Arial"/>
+                <w:color w:val="334155"/>
+                <w:sz w:val="17"/>
+              </w:rPr>
+              <w:t>[SQL Exploratory Data Analysis (EDA) Project](https://www.youtube.com/watch?v=6cJ5Ji8zSDg)</w:t>
+            </w:r>
+          </w:p>
+        </w:tc>
+        <w:tc>
+          <w:tcPr>
+            <w:tcW w:type="dxa" w:w="2160"/>
+            <w:tcMar>
+              <w:top w:w="80" w:type="dxa"/>
+              <w:bottom w:w="80" w:type="dxa"/>
+              <w:left w:w="100" w:type="dxa"/>
+              <w:right w:w="100" w:type="dxa"/>
+            </w:tcMar>
+            <w:shd w:fill="F8FAFC"/>
+          </w:tcPr>
+          <w:p>
+            <w:r>
+              <w:rPr>
+                <w:rFonts w:ascii="Arial" w:hAnsi="Arial"/>
+                <w:color w:val="334155"/>
+                <w:sz w:val="17"/>
+              </w:rPr>
+              <w:t>🎯 Step 5</w:t>
+            </w:r>
+          </w:p>
+        </w:tc>
+        <w:tc>
+          <w:tcPr>
+            <w:tcW w:type="dxa" w:w="2160"/>
+            <w:tcMar>
+              <w:top w:w="80" w:type="dxa"/>
+              <w:bottom w:w="80" w:type="dxa"/>
+              <w:left w:w="100" w:type="dxa"/>
+              <w:right w:w="100" w:type="dxa"/>
+            </w:tcMar>
+            <w:shd w:fill="F8FAFC"/>
+          </w:tcPr>
+          <w:p>
+            <w:r>
+              <w:rPr>
+                <w:rFonts w:ascii="Arial" w:hAnsi="Arial"/>
+                <w:color w:val="334155"/>
+                <w:sz w:val="17"/>
+              </w:rPr>
+              <w:t>🎯 **MUST WATCH FOR DA**</w:t>
+            </w:r>
+          </w:p>
+        </w:tc>
+      </w:tr>
+      <w:tr>
+        <w:tc>
+          <w:tcPr>
+            <w:tcW w:type="dxa" w:w="2160"/>
+            <w:tcMar>
+              <w:top w:w="80" w:type="dxa"/>
+              <w:bottom w:w="80" w:type="dxa"/>
+              <w:left w:w="100" w:type="dxa"/>
+              <w:right w:w="100" w:type="dxa"/>
+            </w:tcMar>
+            <w:shd w:fill="FFFFFF"/>
+          </w:tcPr>
+          <w:p>
+            <w:r>
+              <w:rPr>
+                <w:rFonts w:ascii="Arial" w:hAnsi="Arial"/>
+                <w:color w:val="334155"/>
+                <w:sz w:val="17"/>
+              </w:rPr>
+              <w:t>56</w:t>
+            </w:r>
+          </w:p>
+        </w:tc>
+        <w:tc>
+          <w:tcPr>
+            <w:tcW w:type="dxa" w:w="2160"/>
+            <w:tcMar>
+              <w:top w:w="80" w:type="dxa"/>
+              <w:bottom w:w="80" w:type="dxa"/>
+              <w:left w:w="100" w:type="dxa"/>
+              <w:right w:w="100" w:type="dxa"/>
+            </w:tcMar>
+            <w:shd w:fill="FFFFFF"/>
+          </w:tcPr>
+          <w:p>
+            <w:r>
+              <w:rPr>
+                <w:rFonts w:ascii="Arial" w:hAnsi="Arial"/>
+                <w:color w:val="334155"/>
+                <w:sz w:val="17"/>
+              </w:rPr>
+              <w:t>[SQL Data Analyst Portfolio Project](https://www.youtube.com/watch?v=2jGhQpbzHes)</w:t>
+            </w:r>
+          </w:p>
+        </w:tc>
+        <w:tc>
+          <w:tcPr>
+            <w:tcW w:type="dxa" w:w="2160"/>
+            <w:tcMar>
+              <w:top w:w="80" w:type="dxa"/>
+              <w:bottom w:w="80" w:type="dxa"/>
+              <w:left w:w="100" w:type="dxa"/>
+              <w:right w:w="100" w:type="dxa"/>
+            </w:tcMar>
+            <w:shd w:fill="FFFFFF"/>
+          </w:tcPr>
+          <w:p>
+            <w:r>
+              <w:rPr>
+                <w:rFonts w:ascii="Arial" w:hAnsi="Arial"/>
+                <w:color w:val="334155"/>
+                <w:sz w:val="17"/>
+              </w:rPr>
+              <w:t>🎯 Step 5</w:t>
+            </w:r>
+          </w:p>
+        </w:tc>
+        <w:tc>
+          <w:tcPr>
+            <w:tcW w:type="dxa" w:w="2160"/>
+            <w:tcMar>
+              <w:top w:w="80" w:type="dxa"/>
+              <w:bottom w:w="80" w:type="dxa"/>
+              <w:left w:w="100" w:type="dxa"/>
+              <w:right w:w="100" w:type="dxa"/>
+            </w:tcMar>
+            <w:shd w:fill="FFFFFF"/>
+          </w:tcPr>
+          <w:p>
+            <w:r>
+              <w:rPr>
+                <w:rFonts w:ascii="Arial" w:hAnsi="Arial"/>
+                <w:color w:val="334155"/>
+                <w:sz w:val="17"/>
+              </w:rPr>
+              <w:t>🎯 **MUST WATCH FOR DA**</w:t>
+            </w:r>
+          </w:p>
+        </w:tc>
+      </w:tr>
+    </w:tbl>
+    <w:p>
+      <w:pPr>
+        <w:spacing w:before="60" w:after="60"/>
+      </w:pPr>
+      <w:r>
+        <w:br/>
+        <w:br/>
+        <w:t>---</w:t>
+      </w:r>
+    </w:p>
+    <w:p>
+      <w:r>
+        <w:br w:type="page"/>
+      </w:r>
+    </w:p>
+    <w:p>
+      <w:pPr>
+        <w:pStyle w:val="Heading1"/>
+        <w:spacing w:before="360" w:after="160"/>
+      </w:pPr>
+      <w:r>
+        <w:rPr>
+          <w:rFonts w:ascii="Arial" w:hAnsi="Arial"/>
+          <w:b/>
+          <w:color w:val="0EA5E9"/>
+          <w:sz w:val="36"/>
+        </w:rPr>
+        <w:t>SECTION 2: COMPLETED STUDY HISTORY (LAST PAGES / ARCHIVE)</w:t>
+      </w:r>
+    </w:p>
+    <w:p>
+      <w:pPr>
+        <w:pStyle w:val="Heading3"/>
+        <w:spacing w:before="200" w:after="80"/>
+      </w:pPr>
+      <w:r>
+        <w:rPr>
+          <w:rFonts w:ascii="Arial" w:hAnsi="Arial"/>
+          <w:b/>
+          <w:color w:val="334155"/>
+          <w:sz w:val="24"/>
+        </w:rPr>
+        <w:t>Completed Days 1–15 Archive (July 10 – July 24, 2026)</w:t>
       </w:r>
     </w:p>
     <w:tbl>
@@ -1935,7 +5527,7 @@
                 <w:color w:val="334155"/>
                 <w:sz w:val="17"/>
               </w:rPr>
-              <w:t>✅ **TODAY**</w:t>
+              <w:t>✅ **COMPLETED**</w:t>
             </w:r>
           </w:p>
         </w:tc>
@@ -1947,7 +5539,7 @@
       </w:pPr>
       <w:r>
         <w:br/>
-        <w:t>### PHASE 2: UPCOMING DAY-BY-DAY SCHEDULE (July 25 – August 10, 2026)</w:t>
+        <w:t>### Completed Videos Archive (Videos 1–30)</w:t>
       </w:r>
     </w:p>
     <w:sectPr>

</xml_diff>

<commit_message>
Update master Day-Wise study roadmap with exact dates, HackerRank problem targets, and project guidance
</commit_message>
<xml_diff>
--- a/docs/DA_COMPLETE_STUDY_ROADMAP.docx
+++ b/docs/DA_COMPLETE_STUDY_ROADMAP.docx
@@ -14,7 +14,7 @@
           <w:color w:val="0F172A"/>
           <w:sz w:val="44"/>
         </w:rPr>
-        <w:t>Data Analyst Complete Study Roadmap &amp; Action Plan</w:t>
+        <w:t>Data Analyst Complete Study Roadmap &amp; HackerRank Plan</w:t>
       </w:r>
     </w:p>
     <w:p>
@@ -28,7 +28,7 @@
           <w:color w:val="0EA5E9"/>
           <w:sz w:val="23"/>
         </w:rPr>
-        <w:t>Upcoming To-Do Plan First (July 25 - Aug 10) | Completed History on Last Pages</w:t>
+        <w:t>Day-Wise Schedule with Exact Dates (July 24 - Aug 10) | HackerRank Quotas &amp; Project Guidance</w:t>
       </w:r>
     </w:p>
     <w:p>
@@ -43,7 +43,7 @@
           <w:color w:val="0EA5E9"/>
           <w:sz w:val="36"/>
         </w:rPr>
-        <w:t>Data Analyst Study Roadmap &amp; Action Plan (Upcoming Targets First)</w:t>
+        <w:t>Data Analyst Complete Study Roadmap, HackerRank Plan &amp; Video Targets</w:t>
       </w:r>
     </w:p>
     <w:p>
@@ -58,7 +58,7 @@
           <w:color w:val="0F172A"/>
           <w:sz w:val="28"/>
         </w:rPr>
-        <w:t>Executive Status &amp; Date Tracker</w:t>
+        <w:t>Current Status &amp; Date Tracker</w:t>
       </w:r>
     </w:p>
     <w:p>
@@ -84,7 +84,7 @@
           <w:rFonts w:ascii="Arial" w:hAnsi="Arial"/>
           <w:sz w:val="20"/>
         </w:rPr>
-        <w:t>**Immediate Action Plan**: **Complete Videos #31 to #56 &amp; Days 16–30 Schedule** `[⏳ UPCOMING TO-DO FIRST]`</w:t>
+        <w:t>**Course Progress**: **Videos #1 to #30 completed (Studied till SQL Views)** `[✅ COMPLETED]`</w:t>
       </w:r>
     </w:p>
     <w:p>
@@ -97,7 +97,33 @@
           <w:rFonts w:ascii="Arial" w:hAnsi="Arial"/>
           <w:sz w:val="20"/>
         </w:rPr>
-        <w:t>**Completed Archive**: **Videos #1 to #30 &amp; Days 1–15 (Studied till SQL Views)** `[✅ COMPLETED - MOVED TO LAST PAGES]`</w:t>
+        <w:t>**HackerRank Progress**: **HackerRank Easy SQL Problems** `[✅ EASY COMPLETED]`</w:t>
+      </w:r>
+    </w:p>
+    <w:p>
+      <w:pPr>
+        <w:pStyle w:val="ListBullet"/>
+        <w:spacing w:before="40" w:after="40"/>
+      </w:pPr>
+      <w:r>
+        <w:rPr>
+          <w:rFonts w:ascii="Arial" w:hAnsi="Arial"/>
+          <w:sz w:val="20"/>
+        </w:rPr>
+        <w:t>**HackerRank Target**: **15-20 Medium + 5-10 Hard Problems** `[⏳ TO DO DAY-BY-DAY]`</w:t>
+      </w:r>
+    </w:p>
+    <w:p>
+      <w:pPr>
+        <w:pStyle w:val="ListBullet"/>
+        <w:spacing w:before="40" w:after="40"/>
+      </w:pPr>
+      <w:r>
+        <w:rPr>
+          <w:rFonts w:ascii="Arial" w:hAnsi="Arial"/>
+          <w:sz w:val="20"/>
+        </w:rPr>
+        <w:t>**Project Target**: **Videos #55 &amp; #56 (EDA &amp; DA Portfolio Projects)** `[⏳ UPCOMING - AUG 08-09]`</w:t>
       </w:r>
     </w:p>
     <w:p>
@@ -112,7 +138,7 @@
           <w:color w:val="0F172A"/>
           <w:sz w:val="28"/>
         </w:rPr>
-        <w:t>SECTION 1: UPCOMING SCHEDULE &amp; TO-DO PLAN (FIRST PAGES)</w:t>
+        <w:t>SECTION 1: UPCOMING DAY-WISE SCHEDULE &amp; HACKERRANK PLAN (FIRST PAGES)</w:t>
       </w:r>
     </w:p>
     <w:p>
@@ -127,7 +153,7 @@
           <w:color w:val="334155"/>
           <w:sz w:val="24"/>
         </w:rPr>
-        <w:t>Upcoming Day-by-Day Execution Schedule (July 25 – August 10, 2026)</w:t>
+        <w:t>Upcoming Day-by-Day Schedule (July 25 – August 10, 2026)</w:t>
       </w:r>
     </w:p>
     <w:tbl>
@@ -209,7 +235,7 @@
                 <w:color w:val="FFFFFF"/>
                 <w:sz w:val="18"/>
               </w:rPr>
-              <w:t>Focus Topic</w:t>
+              <w:t>Primary Video Watch Target</w:t>
             </w:r>
           </w:p>
         </w:tc>
@@ -232,7 +258,7 @@
                 <w:color w:val="FFFFFF"/>
                 <w:sz w:val="18"/>
               </w:rPr>
-              <w:t>YouTube Video Watch Target</w:t>
+              <w:t>HackerRank Daily Practice Target</w:t>
             </w:r>
           </w:p>
         </w:tc>
@@ -255,7 +281,7 @@
                 <w:color w:val="FFFFFF"/>
                 <w:sz w:val="18"/>
               </w:rPr>
-              <w:t>Action Required</w:t>
+              <w:t>Action Step</w:t>
             </w:r>
           </w:p>
         </w:tc>
@@ -301,7 +327,7 @@
                 <w:color w:val="334155"/>
                 <w:sz w:val="17"/>
               </w:rPr>
-              <w:t>July 25</w:t>
+              <w:t>July 25, 2026</w:t>
             </w:r>
           </w:p>
         </w:tc>
@@ -323,7 +349,7 @@
                 <w:color w:val="334155"/>
                 <w:sz w:val="17"/>
               </w:rPr>
-              <w:t>CTAS &amp; Temp Tables</w:t>
+              <w:t>Video #31 (SQL CTAS) &amp; Video #32 (Temp Tables)</w:t>
             </w:r>
           </w:p>
         </w:tc>
@@ -345,7 +371,7 @@
                 <w:color w:val="334155"/>
                 <w:sz w:val="17"/>
               </w:rPr>
-              <w:t>**Watch Video #31** (SQL CTAS) &amp; **Video #32** (Temp Tables)</w:t>
+              <w:t>HackerRank Medium #1-3 (Subqueries &amp; Temp Tables)</w:t>
             </w:r>
           </w:p>
         </w:tc>
@@ -367,7 +393,7 @@
                 <w:color w:val="334155"/>
                 <w:sz w:val="17"/>
               </w:rPr>
-              <w:t>⏳ Watch Next</w:t>
+              <w:t>⏳ Watch &amp; Solve</w:t>
             </w:r>
           </w:p>
         </w:tc>
@@ -413,7 +439,7 @@
                 <w:color w:val="334155"/>
                 <w:sz w:val="17"/>
               </w:rPr>
-              <w:t>July 26</w:t>
+              <w:t>July 26, 2026</w:t>
             </w:r>
           </w:p>
         </w:tc>
@@ -435,7 +461,7 @@
                 <w:color w:val="334155"/>
                 <w:sz w:val="17"/>
               </w:rPr>
-              <w:t>Subqueries vs CTE vs Temp</w:t>
+              <w:t>Video #33 (Subquery vs CTE vs Views vs CTAS vs Temp)</w:t>
             </w:r>
           </w:p>
         </w:tc>
@@ -457,7 +483,7 @@
                 <w:color w:val="334155"/>
                 <w:sz w:val="17"/>
               </w:rPr>
-              <w:t>**Watch Video #33** (Subquery vs CTE vs Views vs CTAS vs Temp)</w:t>
+              <w:t>HackerRank Medium #4-6 (CTEs &amp; Derived Tables)</w:t>
             </w:r>
           </w:p>
         </w:tc>
@@ -479,7 +505,7 @@
                 <w:color w:val="334155"/>
                 <w:sz w:val="17"/>
               </w:rPr>
-              <w:t>⏳ Watch Next</w:t>
+              <w:t>⏳ Watch &amp; Solve</w:t>
             </w:r>
           </w:p>
         </w:tc>
@@ -525,7 +551,7 @@
                 <w:color w:val="334155"/>
                 <w:sz w:val="17"/>
               </w:rPr>
-              <w:t>July 27</w:t>
+              <w:t>July 27, 2026</w:t>
             </w:r>
           </w:p>
         </w:tc>
@@ -547,7 +573,7 @@
                 <w:color w:val="334155"/>
                 <w:sz w:val="17"/>
               </w:rPr>
-              <w:t>Milestone Mock 3 &amp; 4</w:t>
+              <w:t>**Paytm &amp; Swiggy Business Analyst Milestone Mocks**</w:t>
             </w:r>
           </w:p>
         </w:tc>
@@ -569,7 +595,7 @@
                 <w:color w:val="334155"/>
                 <w:sz w:val="17"/>
               </w:rPr>
-              <w:t>**Paytm &amp; Swiggy Business Analyst Mock Exams** (45 Mins, 20 Qs)</w:t>
+              <w:t>HackerRank Medium #7-9 (Multi-table Joins)</w:t>
             </w:r>
           </w:p>
         </w:tc>
@@ -591,7 +617,7 @@
                 <w:color w:val="334155"/>
                 <w:sz w:val="17"/>
               </w:rPr>
-              <w:t>⏳ Practice</w:t>
+              <w:t>⏳ Practice Mocks</w:t>
             </w:r>
           </w:p>
         </w:tc>
@@ -637,7 +663,7 @@
                 <w:color w:val="334155"/>
                 <w:sz w:val="17"/>
               </w:rPr>
-              <w:t>July 28</w:t>
+              <w:t>July 28, 2026</w:t>
             </w:r>
           </w:p>
         </w:tc>
@@ -659,7 +685,7 @@
                 <w:color w:val="334155"/>
                 <w:sz w:val="17"/>
               </w:rPr>
-              <w:t>SQL Indexing Foundations</w:t>
+              <w:t>Video #34 (Clustered/Nonclustered) &amp; Video #35 (Columnstore)</w:t>
             </w:r>
           </w:p>
         </w:tc>
@@ -681,7 +707,7 @@
                 <w:color w:val="334155"/>
                 <w:sz w:val="17"/>
               </w:rPr>
-              <w:t>**Watch Video #34** (Clustered/Nonclustered) &amp; **Video #35** (Columnstore)</w:t>
+              <w:t>HackerRank Medium #10-12 (Aggregations &amp; HAVING)</w:t>
             </w:r>
           </w:p>
         </w:tc>
@@ -703,7 +729,7 @@
                 <w:color w:val="334155"/>
                 <w:sz w:val="17"/>
               </w:rPr>
-              <w:t>⏳ Watch Next</w:t>
+              <w:t>⏳ Watch &amp; Solve</w:t>
             </w:r>
           </w:p>
         </w:tc>
@@ -749,7 +775,7 @@
                 <w:color w:val="334155"/>
                 <w:sz w:val="17"/>
               </w:rPr>
-              <w:t>July 29</w:t>
+              <w:t>July 29, 2026</w:t>
             </w:r>
           </w:p>
         </w:tc>
@@ -771,7 +797,7 @@
                 <w:color w:val="334155"/>
                 <w:sz w:val="17"/>
               </w:rPr>
-              <w:t>Advanced Index Strategies</w:t>
+              <w:t>Video #36 (Filtered Indexes) &amp; Video #37 (Right Index Choice)</w:t>
             </w:r>
           </w:p>
         </w:tc>
@@ -793,7 +819,7 @@
                 <w:color w:val="334155"/>
                 <w:sz w:val="17"/>
               </w:rPr>
-              <w:t>**Watch Video #36** (Filtered Indexes) &amp; **Video #37** (Right Index Choice)</w:t>
+              <w:t>HackerRank Medium #13-15 (CASE WHEN &amp; Pivoting)</w:t>
             </w:r>
           </w:p>
         </w:tc>
@@ -815,7 +841,7 @@
                 <w:color w:val="334155"/>
                 <w:sz w:val="17"/>
               </w:rPr>
-              <w:t>⏳ Watch Next</w:t>
+              <w:t>⏳ Watch &amp; Solve</w:t>
             </w:r>
           </w:p>
         </w:tc>
@@ -861,7 +887,7 @@
                 <w:color w:val="334155"/>
                 <w:sz w:val="17"/>
               </w:rPr>
-              <w:t>July 30</w:t>
+              <w:t>July 30, 2026</w:t>
             </w:r>
           </w:p>
         </w:tc>
@@ -883,7 +909,7 @@
                 <w:color w:val="334155"/>
                 <w:sz w:val="17"/>
               </w:rPr>
-              <w:t>Index Maintenance &amp; Execution</w:t>
+              <w:t>Video #38 (Index Maintenance) &amp; Video #39 (Execution Plans)</w:t>
             </w:r>
           </w:p>
         </w:tc>
@@ -905,7 +931,7 @@
                 <w:color w:val="334155"/>
                 <w:sz w:val="17"/>
               </w:rPr>
-              <w:t>**Watch Video #38** (Index Maintenance) &amp; **Video #39** (Execution Plans)</w:t>
+              <w:t>HackerRank Hard #1-2 (Window Functions ROW_NUMBER)</w:t>
             </w:r>
           </w:p>
         </w:tc>
@@ -927,7 +953,7 @@
                 <w:color w:val="334155"/>
                 <w:sz w:val="17"/>
               </w:rPr>
-              <w:t>⏳ Watch Next</w:t>
+              <w:t>⏳ Watch &amp; Solve</w:t>
             </w:r>
           </w:p>
         </w:tc>
@@ -973,7 +999,7 @@
                 <w:color w:val="334155"/>
                 <w:sz w:val="17"/>
               </w:rPr>
-              <w:t>July 31</w:t>
+              <w:t>July 31, 2026</w:t>
             </w:r>
           </w:p>
         </w:tc>
@@ -995,7 +1021,7 @@
                 <w:color w:val="334155"/>
                 <w:sz w:val="17"/>
               </w:rPr>
-              <w:t>Partitioning &amp; Performance</w:t>
+              <w:t>Video #40 (Indexing Strategy) &amp; Video #41 (Table Partitioning)</w:t>
             </w:r>
           </w:p>
         </w:tc>
@@ -1017,7 +1043,7 @@
                 <w:color w:val="334155"/>
                 <w:sz w:val="17"/>
               </w:rPr>
-              <w:t>**Watch Video #40** (Indexing Strategy) &amp; **Video #41** (Table Partitioning)</w:t>
+              <w:t>HackerRank Hard #3-4 (RANK &amp; DENSE_RANK)</w:t>
             </w:r>
           </w:p>
         </w:tc>
@@ -1039,7 +1065,7 @@
                 <w:color w:val="334155"/>
                 <w:sz w:val="17"/>
               </w:rPr>
-              <w:t>⏳ Watch Next</w:t>
+              <w:t>⏳ Watch &amp; Solve</w:t>
             </w:r>
           </w:p>
         </w:tc>
@@ -1085,7 +1111,7 @@
                 <w:color w:val="334155"/>
                 <w:sz w:val="17"/>
               </w:rPr>
-              <w:t>Aug 01</w:t>
+              <w:t>Aug 01, 2026</w:t>
             </w:r>
           </w:p>
         </w:tc>
@@ -1107,7 +1133,7 @@
                 <w:color w:val="334155"/>
                 <w:sz w:val="17"/>
               </w:rPr>
-              <w:t>30 Performance Tips &amp; Tricks</w:t>
+              <w:t>Video #42 (30 SQL Performance Tips from 18 Yrs Exp)</w:t>
             </w:r>
           </w:p>
         </w:tc>
@@ -1129,7 +1155,7 @@
                 <w:color w:val="334155"/>
                 <w:sz w:val="17"/>
               </w:rPr>
-              <w:t>**Watch Video #42** (30 SQL Performance Tips from 18 Yrs Exp)</w:t>
+              <w:t>HackerRank Hard #5-6 (LEAD &amp; LAG Consecutive Rows)</w:t>
             </w:r>
           </w:p>
         </w:tc>
@@ -1151,7 +1177,7 @@
                 <w:color w:val="334155"/>
                 <w:sz w:val="17"/>
               </w:rPr>
-              <w:t>⏳ Watch Next</w:t>
+              <w:t>⏳ Watch &amp; Solve</w:t>
             </w:r>
           </w:p>
         </w:tc>
@@ -1197,7 +1223,7 @@
                 <w:color w:val="334155"/>
                 <w:sz w:val="17"/>
               </w:rPr>
-              <w:t>Aug 02</w:t>
+              <w:t>Aug 02, 2026</w:t>
             </w:r>
           </w:p>
         </w:tc>
@@ -1219,7 +1245,7 @@
                 <w:color w:val="334155"/>
                 <w:sz w:val="17"/>
               </w:rPr>
-              <w:t>Milestone Mock 5</w:t>
+              <w:t>**CRED Risk Analyst Milestone Mock Exam**</w:t>
             </w:r>
           </w:p>
         </w:tc>
@@ -1241,7 +1267,7 @@
                 <w:color w:val="334155"/>
                 <w:sz w:val="17"/>
               </w:rPr>
-              <w:t>**CRED Risk Analyst Mock Exam** (50 Mins, 20 Qs)</w:t>
+              <w:t>HackerRank Hard #7-8 (Median &amp; Percentiles)</w:t>
             </w:r>
           </w:p>
         </w:tc>
@@ -1263,7 +1289,7 @@
                 <w:color w:val="334155"/>
                 <w:sz w:val="17"/>
               </w:rPr>
-              <w:t>⏳ Practice</w:t>
+              <w:t>⏳ Practice Mocks</w:t>
             </w:r>
           </w:p>
         </w:tc>
@@ -1309,7 +1335,7 @@
                 <w:color w:val="334155"/>
                 <w:sz w:val="17"/>
               </w:rPr>
-              <w:t>Aug 03</w:t>
+              <w:t>Aug 03, 2026</w:t>
             </w:r>
           </w:p>
         </w:tc>
@@ -1331,7 +1357,7 @@
                 <w:color w:val="334155"/>
                 <w:sz w:val="17"/>
               </w:rPr>
-              <w:t>Stored Procedures &amp; Triggers</w:t>
+              <w:t>Video #43 (Stored Procedures) &amp; Video #44 (Triggers) [DE]</w:t>
             </w:r>
           </w:p>
         </w:tc>
@@ -1353,7 +1379,7 @@
                 <w:color w:val="334155"/>
                 <w:sz w:val="17"/>
               </w:rPr>
-              <w:t>**Watch Video #43** (Stored Procedures) &amp; **Video #44** (Triggers) [Optional DE]</w:t>
+              <w:t>HackerRank Hard #9-10 (Complex Query Challenges)</w:t>
             </w:r>
           </w:p>
         </w:tc>
@@ -1375,7 +1401,7 @@
                 <w:color w:val="334155"/>
                 <w:sz w:val="17"/>
               </w:rPr>
-              <w:t>💡 Optional</w:t>
+              <w:t>💡 Optional DE</w:t>
             </w:r>
           </w:p>
         </w:tc>
@@ -1421,7 +1447,7 @@
                 <w:color w:val="334155"/>
                 <w:sz w:val="17"/>
               </w:rPr>
-              <w:t>Aug 04</w:t>
+              <w:t>Aug 04, 2026</w:t>
             </w:r>
           </w:p>
         </w:tc>
@@ -1443,7 +1469,7 @@
                 <w:color w:val="334155"/>
                 <w:sz w:val="17"/>
               </w:rPr>
-              <w:t>AI Tools for Analysts</w:t>
+              <w:t>Video #45 (ChatGPT &amp; GitHub Copilot Workflow)</w:t>
             </w:r>
           </w:p>
         </w:tc>
@@ -1465,7 +1491,7 @@
                 <w:color w:val="334155"/>
                 <w:sz w:val="17"/>
               </w:rPr>
-              <w:t>**Watch Video #45** (ChatGPT &amp; GitHub Copilot Workflow)</w:t>
+              <w:t>Practice 5 App Debug Puzzles in SQL Academy</w:t>
             </w:r>
           </w:p>
         </w:tc>
@@ -1487,7 +1513,7 @@
                 <w:color w:val="334155"/>
                 <w:sz w:val="17"/>
               </w:rPr>
-              <w:t>💡 Optional</w:t>
+              <w:t>💡 Optional AI</w:t>
             </w:r>
           </w:p>
         </w:tc>
@@ -1555,7 +1581,7 @@
                 <w:color w:val="334155"/>
                 <w:sz w:val="17"/>
               </w:rPr>
-              <w:t>Data Warehouse Project</w:t>
+              <w:t>Videos #46-54 (Data Warehouse ETL Star Schema Project)</w:t>
             </w:r>
           </w:p>
         </w:tc>
@@ -1577,7 +1603,7 @@
                 <w:color w:val="334155"/>
                 <w:sz w:val="17"/>
               </w:rPr>
-              <w:t>**Watch Videos #46–54** (Data Engineering DWH Star Schema Project)</w:t>
+              <w:t>Review Data Architecture &amp; ETL Concepts</w:t>
             </w:r>
           </w:p>
         </w:tc>
@@ -1645,7 +1671,7 @@
                 <w:color w:val="334155"/>
                 <w:sz w:val="17"/>
               </w:rPr>
-              <w:t>Aug 08</w:t>
+              <w:t>Aug 08, 2026</w:t>
             </w:r>
           </w:p>
         </w:tc>
@@ -1667,7 +1693,7 @@
                 <w:color w:val="334155"/>
                 <w:sz w:val="17"/>
               </w:rPr>
-              <w:t>SQL EDA Portfolio Project</w:t>
+              <w:t>**Video #55 (Exploratory Data Analysis EDA Project)**</w:t>
             </w:r>
           </w:p>
         </w:tc>
@@ -1689,7 +1715,7 @@
                 <w:color w:val="334155"/>
                 <w:sz w:val="17"/>
               </w:rPr>
-              <w:t>**Watch Video #55** (Exploratory Data Analysis EDA Project)</w:t>
+              <w:t>🎯 **START PROJECT 1**: SQL EDA Portfolio Project</w:t>
             </w:r>
           </w:p>
         </w:tc>
@@ -1757,7 +1783,7 @@
                 <w:color w:val="334155"/>
                 <w:sz w:val="17"/>
               </w:rPr>
-              <w:t>Aug 09</w:t>
+              <w:t>Aug 09, 2026</w:t>
             </w:r>
           </w:p>
         </w:tc>
@@ -1779,7 +1805,7 @@
                 <w:color w:val="334155"/>
                 <w:sz w:val="17"/>
               </w:rPr>
-              <w:t>DA Portfolio Project</w:t>
+              <w:t>**Video #56 (Full SQL Data Analyst Portfolio Project)**</w:t>
             </w:r>
           </w:p>
         </w:tc>
@@ -1801,7 +1827,7 @@
                 <w:color w:val="334155"/>
                 <w:sz w:val="17"/>
               </w:rPr>
-              <w:t>**Watch Video #56** (Full SQL Data Analyst Portfolio Project)</w:t>
+              <w:t>🎯 **START PROJECT 2**: Full Data Analyst Portfolio</w:t>
             </w:r>
           </w:p>
         </w:tc>
@@ -1869,7 +1895,7 @@
                 <w:color w:val="334155"/>
                 <w:sz w:val="17"/>
               </w:rPr>
-              <w:t>Aug 10</w:t>
+              <w:t>Aug 10, 2026</w:t>
             </w:r>
           </w:p>
         </w:tc>
@@ -1891,7 +1917,7 @@
                 <w:color w:val="334155"/>
                 <w:sz w:val="17"/>
               </w:rPr>
-              <w:t>Final Milestone Review</w:t>
+              <w:t>**Flipkart Data Engineer Capstone Exam**</w:t>
             </w:r>
           </w:p>
         </w:tc>
@@ -1913,7 +1939,7 @@
                 <w:color w:val="334155"/>
                 <w:sz w:val="17"/>
               </w:rPr>
-              <w:t>**Flipkart Data Engineer Capstone Exam** (60 Mins, 25 Qs)</w:t>
+              <w:t>Final Portfolio Review &amp; GitHub Repo Push</w:t>
             </w:r>
           </w:p>
         </w:tc>
@@ -1947,1736 +1973,68 @@
       </w:pPr>
       <w:r>
         <w:br/>
-        <w:t>### Detailed Remaining Video Watch List (Videos 31–56 in Order)</w:t>
+        <w:t>### HackerRank Strategy &amp; Target Counts for DA Roles</w:t>
       </w:r>
     </w:p>
-    <w:tbl>
-      <w:tblPr>
-        <w:tblW w:type="auto" w:w="0"/>
-        <w:jc w:val="center"/>
-        <w:tblLook w:firstColumn="1" w:firstRow="1" w:lastColumn="0" w:lastRow="0" w:noHBand="0" w:noVBand="1" w:val="04A0"/>
-      </w:tblPr>
-      <w:tblGrid>
-        <w:gridCol w:w="2160"/>
-        <w:gridCol w:w="2160"/>
-        <w:gridCol w:w="2160"/>
-        <w:gridCol w:w="2160"/>
-      </w:tblGrid>
-      <w:tr>
-        <w:tc>
-          <w:tcPr>
-            <w:tcW w:type="dxa" w:w="2160"/>
-            <w:tcMar>
-              <w:top w:w="80" w:type="dxa"/>
-              <w:bottom w:w="80" w:type="dxa"/>
-              <w:left w:w="100" w:type="dxa"/>
-              <w:right w:w="100" w:type="dxa"/>
-            </w:tcMar>
-            <w:shd w:fill="0F172A"/>
-          </w:tcPr>
-          <w:p>
-            <w:r>
-              <w:rPr>
-                <w:rFonts w:ascii="Arial" w:hAnsi="Arial"/>
-                <w:b/>
-                <w:color w:val="FFFFFF"/>
-                <w:sz w:val="18"/>
-              </w:rPr>
-              <w:t>#</w:t>
-            </w:r>
-          </w:p>
-        </w:tc>
-        <w:tc>
-          <w:tcPr>
-            <w:tcW w:type="dxa" w:w="2160"/>
-            <w:tcMar>
-              <w:top w:w="80" w:type="dxa"/>
-              <w:bottom w:w="80" w:type="dxa"/>
-              <w:left w:w="100" w:type="dxa"/>
-              <w:right w:w="100" w:type="dxa"/>
-            </w:tcMar>
-            <w:shd w:fill="0F172A"/>
-          </w:tcPr>
-          <w:p>
-            <w:r>
-              <w:rPr>
-                <w:rFonts w:ascii="Arial" w:hAnsi="Arial"/>
-                <w:b/>
-                <w:color w:val="FFFFFF"/>
-                <w:sz w:val="18"/>
-              </w:rPr>
-              <w:t>Video Title</w:t>
-            </w:r>
-          </w:p>
-        </w:tc>
-        <w:tc>
-          <w:tcPr>
-            <w:tcW w:type="dxa" w:w="2160"/>
-            <w:tcMar>
-              <w:top w:w="80" w:type="dxa"/>
-              <w:bottom w:w="80" w:type="dxa"/>
-              <w:left w:w="100" w:type="dxa"/>
-              <w:right w:w="100" w:type="dxa"/>
-            </w:tcMar>
-            <w:shd w:fill="0F172A"/>
-          </w:tcPr>
-          <w:p>
-            <w:r>
-              <w:rPr>
-                <w:rFonts w:ascii="Arial" w:hAnsi="Arial"/>
-                <w:b/>
-                <w:color w:val="FFFFFF"/>
-                <w:sz w:val="18"/>
-              </w:rPr>
-              <w:t>Action Step</w:t>
-            </w:r>
-          </w:p>
-        </w:tc>
-        <w:tc>
-          <w:tcPr>
-            <w:tcW w:type="dxa" w:w="2160"/>
-            <w:tcMar>
-              <w:top w:w="80" w:type="dxa"/>
-              <w:bottom w:w="80" w:type="dxa"/>
-              <w:left w:w="100" w:type="dxa"/>
-              <w:right w:w="100" w:type="dxa"/>
-            </w:tcMar>
-            <w:shd w:fill="0F172A"/>
-          </w:tcPr>
-          <w:p>
-            <w:r>
-              <w:rPr>
-                <w:rFonts w:ascii="Arial" w:hAnsi="Arial"/>
-                <w:b/>
-                <w:color w:val="FFFFFF"/>
-                <w:sz w:val="18"/>
-              </w:rPr>
-              <w:t>Priority</w:t>
-            </w:r>
-          </w:p>
-        </w:tc>
-      </w:tr>
-      <w:tr>
-        <w:tc>
-          <w:tcPr>
-            <w:tcW w:type="dxa" w:w="2160"/>
-            <w:tcMar>
-              <w:top w:w="80" w:type="dxa"/>
-              <w:bottom w:w="80" w:type="dxa"/>
-              <w:left w:w="100" w:type="dxa"/>
-              <w:right w:w="100" w:type="dxa"/>
-            </w:tcMar>
-            <w:shd w:fill="F8FAFC"/>
-          </w:tcPr>
-          <w:p>
-            <w:r>
-              <w:rPr>
-                <w:rFonts w:ascii="Arial" w:hAnsi="Arial"/>
-                <w:color w:val="334155"/>
-                <w:sz w:val="17"/>
-              </w:rPr>
-              <w:t>31</w:t>
-            </w:r>
-          </w:p>
-        </w:tc>
-        <w:tc>
-          <w:tcPr>
-            <w:tcW w:type="dxa" w:w="2160"/>
-            <w:tcMar>
-              <w:top w:w="80" w:type="dxa"/>
-              <w:bottom w:w="80" w:type="dxa"/>
-              <w:left w:w="100" w:type="dxa"/>
-              <w:right w:w="100" w:type="dxa"/>
-            </w:tcMar>
-            <w:shd w:fill="F8FAFC"/>
-          </w:tcPr>
-          <w:p>
-            <w:r>
-              <w:rPr>
-                <w:rFonts w:ascii="Arial" w:hAnsi="Arial"/>
-                <w:color w:val="334155"/>
-                <w:sz w:val="17"/>
-              </w:rPr>
-              <w:t>[SQL CTAS \</w:t>
-            </w:r>
-          </w:p>
-        </w:tc>
-        <w:tc>
-          <w:tcPr>
-            <w:tcW w:type="dxa" w:w="2160"/>
-            <w:tcMar>
-              <w:top w:w="80" w:type="dxa"/>
-              <w:bottom w:w="80" w:type="dxa"/>
-              <w:left w:w="100" w:type="dxa"/>
-              <w:right w:w="100" w:type="dxa"/>
-            </w:tcMar>
-            <w:shd w:fill="F8FAFC"/>
-          </w:tcPr>
-          <w:p>
-            <w:r>
-              <w:rPr>
-                <w:rFonts w:ascii="Arial" w:hAnsi="Arial"/>
-                <w:color w:val="334155"/>
-                <w:sz w:val="17"/>
-              </w:rPr>
-              <w:t>Create SQL Tables From Query](https://www.youtube.com/watch?v=559lleUXl5Q)</w:t>
-            </w:r>
-          </w:p>
-        </w:tc>
-        <w:tc>
-          <w:tcPr>
-            <w:tcW w:type="dxa" w:w="2160"/>
-            <w:tcMar>
-              <w:top w:w="80" w:type="dxa"/>
-              <w:bottom w:w="80" w:type="dxa"/>
-              <w:left w:w="100" w:type="dxa"/>
-              <w:right w:w="100" w:type="dxa"/>
-            </w:tcMar>
-            <w:shd w:fill="F8FAFC"/>
-          </w:tcPr>
-          <w:p>
-            <w:r>
-              <w:rPr>
-                <w:rFonts w:ascii="Arial" w:hAnsi="Arial"/>
-                <w:color w:val="334155"/>
-                <w:sz w:val="17"/>
-              </w:rPr>
-              <w:t>⏳ Step 1</w:t>
-            </w:r>
-          </w:p>
-        </w:tc>
-      </w:tr>
-      <w:tr>
-        <w:tc>
-          <w:tcPr>
-            <w:tcW w:type="dxa" w:w="2160"/>
-            <w:tcMar>
-              <w:top w:w="80" w:type="dxa"/>
-              <w:bottom w:w="80" w:type="dxa"/>
-              <w:left w:w="100" w:type="dxa"/>
-              <w:right w:w="100" w:type="dxa"/>
-            </w:tcMar>
-            <w:shd w:fill="FFFFFF"/>
-          </w:tcPr>
-          <w:p>
-            <w:r>
-              <w:rPr>
-                <w:rFonts w:ascii="Arial" w:hAnsi="Arial"/>
-                <w:color w:val="334155"/>
-                <w:sz w:val="17"/>
-              </w:rPr>
-              <w:t>32</w:t>
-            </w:r>
-          </w:p>
-        </w:tc>
-        <w:tc>
-          <w:tcPr>
-            <w:tcW w:type="dxa" w:w="2160"/>
-            <w:tcMar>
-              <w:top w:w="80" w:type="dxa"/>
-              <w:bottom w:w="80" w:type="dxa"/>
-              <w:left w:w="100" w:type="dxa"/>
-              <w:right w:w="100" w:type="dxa"/>
-            </w:tcMar>
-            <w:shd w:fill="FFFFFF"/>
-          </w:tcPr>
-          <w:p>
-            <w:r>
-              <w:rPr>
-                <w:rFonts w:ascii="Arial" w:hAnsi="Arial"/>
-                <w:color w:val="334155"/>
-                <w:sz w:val="17"/>
-              </w:rPr>
-              <w:t>[SQL Temp Tables](https://www.youtube.com/watch?v=Y4OIi5DeBxg)</w:t>
-            </w:r>
-          </w:p>
-        </w:tc>
-        <w:tc>
-          <w:tcPr>
-            <w:tcW w:type="dxa" w:w="2160"/>
-            <w:tcMar>
-              <w:top w:w="80" w:type="dxa"/>
-              <w:bottom w:w="80" w:type="dxa"/>
-              <w:left w:w="100" w:type="dxa"/>
-              <w:right w:w="100" w:type="dxa"/>
-            </w:tcMar>
-            <w:shd w:fill="FFFFFF"/>
-          </w:tcPr>
-          <w:p>
-            <w:r>
-              <w:rPr>
-                <w:rFonts w:ascii="Arial" w:hAnsi="Arial"/>
-                <w:color w:val="334155"/>
-                <w:sz w:val="17"/>
-              </w:rPr>
-              <w:t>⏳ Step 1</w:t>
-            </w:r>
-          </w:p>
-        </w:tc>
-        <w:tc>
-          <w:tcPr>
-            <w:tcW w:type="dxa" w:w="2160"/>
-            <w:tcMar>
-              <w:top w:w="80" w:type="dxa"/>
-              <w:bottom w:w="80" w:type="dxa"/>
-              <w:left w:w="100" w:type="dxa"/>
-              <w:right w:w="100" w:type="dxa"/>
-            </w:tcMar>
-            <w:shd w:fill="FFFFFF"/>
-          </w:tcPr>
-          <w:p>
-            <w:r>
-              <w:rPr>
-                <w:rFonts w:ascii="Arial" w:hAnsi="Arial"/>
-                <w:color w:val="334155"/>
-                <w:sz w:val="17"/>
-              </w:rPr>
-              <w:t>🔥 High Priority DA</w:t>
-            </w:r>
-          </w:p>
-        </w:tc>
-      </w:tr>
-      <w:tr>
-        <w:tc>
-          <w:tcPr>
-            <w:tcW w:type="dxa" w:w="2160"/>
-            <w:tcMar>
-              <w:top w:w="80" w:type="dxa"/>
-              <w:bottom w:w="80" w:type="dxa"/>
-              <w:left w:w="100" w:type="dxa"/>
-              <w:right w:w="100" w:type="dxa"/>
-            </w:tcMar>
-            <w:shd w:fill="F8FAFC"/>
-          </w:tcPr>
-          <w:p>
-            <w:r>
-              <w:rPr>
-                <w:rFonts w:ascii="Arial" w:hAnsi="Arial"/>
-                <w:color w:val="334155"/>
-                <w:sz w:val="17"/>
-              </w:rPr>
-              <w:t>33</w:t>
-            </w:r>
-          </w:p>
-        </w:tc>
-        <w:tc>
-          <w:tcPr>
-            <w:tcW w:type="dxa" w:w="2160"/>
-            <w:tcMar>
-              <w:top w:w="80" w:type="dxa"/>
-              <w:bottom w:w="80" w:type="dxa"/>
-              <w:left w:w="100" w:type="dxa"/>
-              <w:right w:w="100" w:type="dxa"/>
-            </w:tcMar>
-            <w:shd w:fill="F8FAFC"/>
-          </w:tcPr>
-          <w:p>
-            <w:r>
-              <w:rPr>
-                <w:rFonts w:ascii="Arial" w:hAnsi="Arial"/>
-                <w:color w:val="334155"/>
-                <w:sz w:val="17"/>
-              </w:rPr>
-              <w:t>[SQL Subquery vs CTE vs Views vs CTAS vs TEMP](https://www.youtube.com/watch?v=6RU6T8HKgYA)</w:t>
-            </w:r>
-          </w:p>
-        </w:tc>
-        <w:tc>
-          <w:tcPr>
-            <w:tcW w:type="dxa" w:w="2160"/>
-            <w:tcMar>
-              <w:top w:w="80" w:type="dxa"/>
-              <w:bottom w:w="80" w:type="dxa"/>
-              <w:left w:w="100" w:type="dxa"/>
-              <w:right w:w="100" w:type="dxa"/>
-            </w:tcMar>
-            <w:shd w:fill="F8FAFC"/>
-          </w:tcPr>
-          <w:p>
-            <w:r>
-              <w:rPr>
-                <w:rFonts w:ascii="Arial" w:hAnsi="Arial"/>
-                <w:color w:val="334155"/>
-                <w:sz w:val="17"/>
-              </w:rPr>
-              <w:t>⏳ Step 1</w:t>
-            </w:r>
-          </w:p>
-        </w:tc>
-        <w:tc>
-          <w:tcPr>
-            <w:tcW w:type="dxa" w:w="2160"/>
-            <w:tcMar>
-              <w:top w:w="80" w:type="dxa"/>
-              <w:bottom w:w="80" w:type="dxa"/>
-              <w:left w:w="100" w:type="dxa"/>
-              <w:right w:w="100" w:type="dxa"/>
-            </w:tcMar>
-            <w:shd w:fill="F8FAFC"/>
-          </w:tcPr>
-          <w:p>
-            <w:r>
-              <w:rPr>
-                <w:rFonts w:ascii="Arial" w:hAnsi="Arial"/>
-                <w:color w:val="334155"/>
-                <w:sz w:val="17"/>
-              </w:rPr>
-              <w:t>🔥 High Priority DA</w:t>
-            </w:r>
-          </w:p>
-        </w:tc>
-      </w:tr>
-      <w:tr>
-        <w:tc>
-          <w:tcPr>
-            <w:tcW w:type="dxa" w:w="2160"/>
-            <w:tcMar>
-              <w:top w:w="80" w:type="dxa"/>
-              <w:bottom w:w="80" w:type="dxa"/>
-              <w:left w:w="100" w:type="dxa"/>
-              <w:right w:w="100" w:type="dxa"/>
-            </w:tcMar>
-            <w:shd w:fill="FFFFFF"/>
-          </w:tcPr>
-          <w:p>
-            <w:r>
-              <w:rPr>
-                <w:rFonts w:ascii="Arial" w:hAnsi="Arial"/>
-                <w:color w:val="334155"/>
-                <w:sz w:val="17"/>
-              </w:rPr>
-              <w:t>34</w:t>
-            </w:r>
-          </w:p>
-        </w:tc>
-        <w:tc>
-          <w:tcPr>
-            <w:tcW w:type="dxa" w:w="2160"/>
-            <w:tcMar>
-              <w:top w:w="80" w:type="dxa"/>
-              <w:bottom w:w="80" w:type="dxa"/>
-              <w:left w:w="100" w:type="dxa"/>
-              <w:right w:w="100" w:type="dxa"/>
-            </w:tcMar>
-            <w:shd w:fill="FFFFFF"/>
-          </w:tcPr>
-          <w:p>
-            <w:r>
-              <w:rPr>
-                <w:rFonts w:ascii="Arial" w:hAnsi="Arial"/>
-                <w:color w:val="334155"/>
-                <w:sz w:val="17"/>
-              </w:rPr>
-              <w:t>[SQL Indexes \</w:t>
-            </w:r>
-          </w:p>
-        </w:tc>
-        <w:tc>
-          <w:tcPr>
-            <w:tcW w:type="dxa" w:w="2160"/>
-            <w:tcMar>
-              <w:top w:w="80" w:type="dxa"/>
-              <w:bottom w:w="80" w:type="dxa"/>
-              <w:left w:w="100" w:type="dxa"/>
-              <w:right w:w="100" w:type="dxa"/>
-            </w:tcMar>
-            <w:shd w:fill="FFFFFF"/>
-          </w:tcPr>
-          <w:p>
-            <w:r>
-              <w:rPr>
-                <w:rFonts w:ascii="Arial" w:hAnsi="Arial"/>
-                <w:color w:val="334155"/>
-                <w:sz w:val="17"/>
-              </w:rPr>
-              <w:t>Clustered vs Nonclustered](https://www.youtube.com/watch?v=BxAj3bl00-o)</w:t>
-            </w:r>
-          </w:p>
-        </w:tc>
-        <w:tc>
-          <w:tcPr>
-            <w:tcW w:type="dxa" w:w="2160"/>
-            <w:tcMar>
-              <w:top w:w="80" w:type="dxa"/>
-              <w:bottom w:w="80" w:type="dxa"/>
-              <w:left w:w="100" w:type="dxa"/>
-              <w:right w:w="100" w:type="dxa"/>
-            </w:tcMar>
-            <w:shd w:fill="FFFFFF"/>
-          </w:tcPr>
-          <w:p>
-            <w:r>
-              <w:rPr>
-                <w:rFonts w:ascii="Arial" w:hAnsi="Arial"/>
-                <w:color w:val="334155"/>
-                <w:sz w:val="17"/>
-              </w:rPr>
-              <w:t>⏳ Step 2</w:t>
-            </w:r>
-          </w:p>
-        </w:tc>
-      </w:tr>
-      <w:tr>
-        <w:tc>
-          <w:tcPr>
-            <w:tcW w:type="dxa" w:w="2160"/>
-            <w:tcMar>
-              <w:top w:w="80" w:type="dxa"/>
-              <w:bottom w:w="80" w:type="dxa"/>
-              <w:left w:w="100" w:type="dxa"/>
-              <w:right w:w="100" w:type="dxa"/>
-            </w:tcMar>
-            <w:shd w:fill="F8FAFC"/>
-          </w:tcPr>
-          <w:p>
-            <w:r>
-              <w:rPr>
-                <w:rFonts w:ascii="Arial" w:hAnsi="Arial"/>
-                <w:color w:val="334155"/>
-                <w:sz w:val="17"/>
-              </w:rPr>
-              <w:t>35</w:t>
-            </w:r>
-          </w:p>
-        </w:tc>
-        <w:tc>
-          <w:tcPr>
-            <w:tcW w:type="dxa" w:w="2160"/>
-            <w:tcMar>
-              <w:top w:w="80" w:type="dxa"/>
-              <w:bottom w:w="80" w:type="dxa"/>
-              <w:left w:w="100" w:type="dxa"/>
-              <w:right w:w="100" w:type="dxa"/>
-            </w:tcMar>
-            <w:shd w:fill="F8FAFC"/>
-          </w:tcPr>
-          <w:p>
-            <w:r>
-              <w:rPr>
-                <w:rFonts w:ascii="Arial" w:hAnsi="Arial"/>
-                <w:color w:val="334155"/>
-                <w:sz w:val="17"/>
-              </w:rPr>
-              <w:t>[SQL Columnstore Index \</w:t>
-            </w:r>
-          </w:p>
-        </w:tc>
-        <w:tc>
-          <w:tcPr>
-            <w:tcW w:type="dxa" w:w="2160"/>
-            <w:tcMar>
-              <w:top w:w="80" w:type="dxa"/>
-              <w:bottom w:w="80" w:type="dxa"/>
-              <w:left w:w="100" w:type="dxa"/>
-              <w:right w:w="100" w:type="dxa"/>
-            </w:tcMar>
-            <w:shd w:fill="F8FAFC"/>
-          </w:tcPr>
-          <w:p>
-            <w:r>
-              <w:rPr>
-                <w:rFonts w:ascii="Arial" w:hAnsi="Arial"/>
-                <w:color w:val="334155"/>
-                <w:sz w:val="17"/>
-              </w:rPr>
-              <w:t>Columnstore vs Rowstore](https://www.youtube.com/watch?v=k9DpO91W76o)</w:t>
-            </w:r>
-          </w:p>
-        </w:tc>
-        <w:tc>
-          <w:tcPr>
-            <w:tcW w:type="dxa" w:w="2160"/>
-            <w:tcMar>
-              <w:top w:w="80" w:type="dxa"/>
-              <w:bottom w:w="80" w:type="dxa"/>
-              <w:left w:w="100" w:type="dxa"/>
-              <w:right w:w="100" w:type="dxa"/>
-            </w:tcMar>
-            <w:shd w:fill="F8FAFC"/>
-          </w:tcPr>
-          <w:p>
-            <w:r>
-              <w:rPr>
-                <w:rFonts w:ascii="Arial" w:hAnsi="Arial"/>
-                <w:color w:val="334155"/>
-                <w:sz w:val="17"/>
-              </w:rPr>
-              <w:t>⏳ Step 2</w:t>
-            </w:r>
-          </w:p>
-        </w:tc>
-      </w:tr>
-      <w:tr>
-        <w:tc>
-          <w:tcPr>
-            <w:tcW w:type="dxa" w:w="2160"/>
-            <w:tcMar>
-              <w:top w:w="80" w:type="dxa"/>
-              <w:bottom w:w="80" w:type="dxa"/>
-              <w:left w:w="100" w:type="dxa"/>
-              <w:right w:w="100" w:type="dxa"/>
-            </w:tcMar>
-            <w:shd w:fill="FFFFFF"/>
-          </w:tcPr>
-          <w:p>
-            <w:r>
-              <w:rPr>
-                <w:rFonts w:ascii="Arial" w:hAnsi="Arial"/>
-                <w:color w:val="334155"/>
-                <w:sz w:val="17"/>
-              </w:rPr>
-              <w:t>36</w:t>
-            </w:r>
-          </w:p>
-        </w:tc>
-        <w:tc>
-          <w:tcPr>
-            <w:tcW w:type="dxa" w:w="2160"/>
-            <w:tcMar>
-              <w:top w:w="80" w:type="dxa"/>
-              <w:bottom w:w="80" w:type="dxa"/>
-              <w:left w:w="100" w:type="dxa"/>
-              <w:right w:w="100" w:type="dxa"/>
-            </w:tcMar>
-            <w:shd w:fill="FFFFFF"/>
-          </w:tcPr>
-          <w:p>
-            <w:r>
-              <w:rPr>
-                <w:rFonts w:ascii="Arial" w:hAnsi="Arial"/>
-                <w:color w:val="334155"/>
-                <w:sz w:val="17"/>
-              </w:rPr>
-              <w:t>[SQL Unique &amp; Filtered Indexes](https://www.youtube.com/watch?v=PU2ajABOH-w)</w:t>
-            </w:r>
-          </w:p>
-        </w:tc>
-        <w:tc>
-          <w:tcPr>
-            <w:tcW w:type="dxa" w:w="2160"/>
-            <w:tcMar>
-              <w:top w:w="80" w:type="dxa"/>
-              <w:bottom w:w="80" w:type="dxa"/>
-              <w:left w:w="100" w:type="dxa"/>
-              <w:right w:w="100" w:type="dxa"/>
-            </w:tcMar>
-            <w:shd w:fill="FFFFFF"/>
-          </w:tcPr>
-          <w:p>
-            <w:r>
-              <w:rPr>
-                <w:rFonts w:ascii="Arial" w:hAnsi="Arial"/>
-                <w:color w:val="334155"/>
-                <w:sz w:val="17"/>
-              </w:rPr>
-              <w:t>⏳ Step 2</w:t>
-            </w:r>
-          </w:p>
-        </w:tc>
-        <w:tc>
-          <w:tcPr>
-            <w:tcW w:type="dxa" w:w="2160"/>
-            <w:tcMar>
-              <w:top w:w="80" w:type="dxa"/>
-              <w:bottom w:w="80" w:type="dxa"/>
-              <w:left w:w="100" w:type="dxa"/>
-              <w:right w:w="100" w:type="dxa"/>
-            </w:tcMar>
-            <w:shd w:fill="FFFFFF"/>
-          </w:tcPr>
-          <w:p>
-            <w:r>
-              <w:rPr>
-                <w:rFonts w:ascii="Arial" w:hAnsi="Arial"/>
-                <w:color w:val="334155"/>
-                <w:sz w:val="17"/>
-              </w:rPr>
-              <w:t>⭐ Recommended DA</w:t>
-            </w:r>
-          </w:p>
-        </w:tc>
-      </w:tr>
-      <w:tr>
-        <w:tc>
-          <w:tcPr>
-            <w:tcW w:type="dxa" w:w="2160"/>
-            <w:tcMar>
-              <w:top w:w="80" w:type="dxa"/>
-              <w:bottom w:w="80" w:type="dxa"/>
-              <w:left w:w="100" w:type="dxa"/>
-              <w:right w:w="100" w:type="dxa"/>
-            </w:tcMar>
-            <w:shd w:fill="F8FAFC"/>
-          </w:tcPr>
-          <w:p>
-            <w:r>
-              <w:rPr>
-                <w:rFonts w:ascii="Arial" w:hAnsi="Arial"/>
-                <w:color w:val="334155"/>
-                <w:sz w:val="17"/>
-              </w:rPr>
-              <w:t>37</w:t>
-            </w:r>
-          </w:p>
-        </w:tc>
-        <w:tc>
-          <w:tcPr>
-            <w:tcW w:type="dxa" w:w="2160"/>
-            <w:tcMar>
-              <w:top w:w="80" w:type="dxa"/>
-              <w:bottom w:w="80" w:type="dxa"/>
-              <w:left w:w="100" w:type="dxa"/>
-              <w:right w:w="100" w:type="dxa"/>
-            </w:tcMar>
-            <w:shd w:fill="F8FAFC"/>
-          </w:tcPr>
-          <w:p>
-            <w:r>
-              <w:rPr>
-                <w:rFonts w:ascii="Arial" w:hAnsi="Arial"/>
-                <w:color w:val="334155"/>
-                <w:sz w:val="17"/>
-              </w:rPr>
-              <w:t>[How to Choose the Right Index](https://www.youtube.com/watch?v=1lHNw365ldc)</w:t>
-            </w:r>
-          </w:p>
-        </w:tc>
-        <w:tc>
-          <w:tcPr>
-            <w:tcW w:type="dxa" w:w="2160"/>
-            <w:tcMar>
-              <w:top w:w="80" w:type="dxa"/>
-              <w:bottom w:w="80" w:type="dxa"/>
-              <w:left w:w="100" w:type="dxa"/>
-              <w:right w:w="100" w:type="dxa"/>
-            </w:tcMar>
-            <w:shd w:fill="F8FAFC"/>
-          </w:tcPr>
-          <w:p>
-            <w:r>
-              <w:rPr>
-                <w:rFonts w:ascii="Arial" w:hAnsi="Arial"/>
-                <w:color w:val="334155"/>
-                <w:sz w:val="17"/>
-              </w:rPr>
-              <w:t>⏳ Step 2</w:t>
-            </w:r>
-          </w:p>
-        </w:tc>
-        <w:tc>
-          <w:tcPr>
-            <w:tcW w:type="dxa" w:w="2160"/>
-            <w:tcMar>
-              <w:top w:w="80" w:type="dxa"/>
-              <w:bottom w:w="80" w:type="dxa"/>
-              <w:left w:w="100" w:type="dxa"/>
-              <w:right w:w="100" w:type="dxa"/>
-            </w:tcMar>
-            <w:shd w:fill="F8FAFC"/>
-          </w:tcPr>
-          <w:p>
-            <w:r>
-              <w:rPr>
-                <w:rFonts w:ascii="Arial" w:hAnsi="Arial"/>
-                <w:color w:val="334155"/>
-                <w:sz w:val="17"/>
-              </w:rPr>
-              <w:t>⭐ Recommended DA</w:t>
-            </w:r>
-          </w:p>
-        </w:tc>
-      </w:tr>
-      <w:tr>
-        <w:tc>
-          <w:tcPr>
-            <w:tcW w:type="dxa" w:w="2160"/>
-            <w:tcMar>
-              <w:top w:w="80" w:type="dxa"/>
-              <w:bottom w:w="80" w:type="dxa"/>
-              <w:left w:w="100" w:type="dxa"/>
-              <w:right w:w="100" w:type="dxa"/>
-            </w:tcMar>
-            <w:shd w:fill="FFFFFF"/>
-          </w:tcPr>
-          <w:p>
-            <w:r>
-              <w:rPr>
-                <w:rFonts w:ascii="Arial" w:hAnsi="Arial"/>
-                <w:color w:val="334155"/>
-                <w:sz w:val="17"/>
-              </w:rPr>
-              <w:t>38</w:t>
-            </w:r>
-          </w:p>
-        </w:tc>
-        <w:tc>
-          <w:tcPr>
-            <w:tcW w:type="dxa" w:w="2160"/>
-            <w:tcMar>
-              <w:top w:w="80" w:type="dxa"/>
-              <w:bottom w:w="80" w:type="dxa"/>
-              <w:left w:w="100" w:type="dxa"/>
-              <w:right w:w="100" w:type="dxa"/>
-            </w:tcMar>
-            <w:shd w:fill="FFFFFF"/>
-          </w:tcPr>
-          <w:p>
-            <w:r>
-              <w:rPr>
-                <w:rFonts w:ascii="Arial" w:hAnsi="Arial"/>
-                <w:color w:val="334155"/>
-                <w:sz w:val="17"/>
-              </w:rPr>
-              <w:t>[SQL Index Maintenance \</w:t>
-            </w:r>
-          </w:p>
-        </w:tc>
-        <w:tc>
-          <w:tcPr>
-            <w:tcW w:type="dxa" w:w="2160"/>
-            <w:tcMar>
-              <w:top w:w="80" w:type="dxa"/>
-              <w:bottom w:w="80" w:type="dxa"/>
-              <w:left w:w="100" w:type="dxa"/>
-              <w:right w:w="100" w:type="dxa"/>
-            </w:tcMar>
-            <w:shd w:fill="FFFFFF"/>
-          </w:tcPr>
-          <w:p>
-            <w:r>
-              <w:rPr>
-                <w:rFonts w:ascii="Arial" w:hAnsi="Arial"/>
-                <w:color w:val="334155"/>
-                <w:sz w:val="17"/>
-              </w:rPr>
-              <w:t>5 Things to Do](https://www.youtube.com/watch?v=n9EWmfrMpZc)</w:t>
-            </w:r>
-          </w:p>
-        </w:tc>
-        <w:tc>
-          <w:tcPr>
-            <w:tcW w:type="dxa" w:w="2160"/>
-            <w:tcMar>
-              <w:top w:w="80" w:type="dxa"/>
-              <w:bottom w:w="80" w:type="dxa"/>
-              <w:left w:w="100" w:type="dxa"/>
-              <w:right w:w="100" w:type="dxa"/>
-            </w:tcMar>
-            <w:shd w:fill="FFFFFF"/>
-          </w:tcPr>
-          <w:p>
-            <w:r>
-              <w:rPr>
-                <w:rFonts w:ascii="Arial" w:hAnsi="Arial"/>
-                <w:color w:val="334155"/>
-                <w:sz w:val="17"/>
-              </w:rPr>
-              <w:t>⏳ Step 2</w:t>
-            </w:r>
-          </w:p>
-        </w:tc>
-      </w:tr>
-      <w:tr>
-        <w:tc>
-          <w:tcPr>
-            <w:tcW w:type="dxa" w:w="2160"/>
-            <w:tcMar>
-              <w:top w:w="80" w:type="dxa"/>
-              <w:bottom w:w="80" w:type="dxa"/>
-              <w:left w:w="100" w:type="dxa"/>
-              <w:right w:w="100" w:type="dxa"/>
-            </w:tcMar>
-            <w:shd w:fill="F8FAFC"/>
-          </w:tcPr>
-          <w:p>
-            <w:r>
-              <w:rPr>
-                <w:rFonts w:ascii="Arial" w:hAnsi="Arial"/>
-                <w:color w:val="334155"/>
-                <w:sz w:val="17"/>
-              </w:rPr>
-              <w:t>39</w:t>
-            </w:r>
-          </w:p>
-        </w:tc>
-        <w:tc>
-          <w:tcPr>
-            <w:tcW w:type="dxa" w:w="2160"/>
-            <w:tcMar>
-              <w:top w:w="80" w:type="dxa"/>
-              <w:bottom w:w="80" w:type="dxa"/>
-              <w:left w:w="100" w:type="dxa"/>
-              <w:right w:w="100" w:type="dxa"/>
-            </w:tcMar>
-            <w:shd w:fill="F8FAFC"/>
-          </w:tcPr>
-          <w:p>
-            <w:r>
-              <w:rPr>
-                <w:rFonts w:ascii="Arial" w:hAnsi="Arial"/>
-                <w:color w:val="334155"/>
-                <w:sz w:val="17"/>
-              </w:rPr>
-              <w:t>[SQL Execution Plans \</w:t>
-            </w:r>
-          </w:p>
-        </w:tc>
-        <w:tc>
-          <w:tcPr>
-            <w:tcW w:type="dxa" w:w="2160"/>
-            <w:tcMar>
-              <w:top w:w="80" w:type="dxa"/>
-              <w:bottom w:w="80" w:type="dxa"/>
-              <w:left w:w="100" w:type="dxa"/>
-              <w:right w:w="100" w:type="dxa"/>
-            </w:tcMar>
-            <w:shd w:fill="F8FAFC"/>
-          </w:tcPr>
-          <w:p>
-            <w:r>
-              <w:rPr>
-                <w:rFonts w:ascii="Arial" w:hAnsi="Arial"/>
-                <w:color w:val="334155"/>
-                <w:sz w:val="17"/>
-              </w:rPr>
-              <w:t>SQL Hints](https://www.youtube.com/watch?v=O7AzUDogXsw)</w:t>
-            </w:r>
-          </w:p>
-        </w:tc>
-        <w:tc>
-          <w:tcPr>
-            <w:tcW w:type="dxa" w:w="2160"/>
-            <w:tcMar>
-              <w:top w:w="80" w:type="dxa"/>
-              <w:bottom w:w="80" w:type="dxa"/>
-              <w:left w:w="100" w:type="dxa"/>
-              <w:right w:w="100" w:type="dxa"/>
-            </w:tcMar>
-            <w:shd w:fill="F8FAFC"/>
-          </w:tcPr>
-          <w:p>
-            <w:r>
-              <w:rPr>
-                <w:rFonts w:ascii="Arial" w:hAnsi="Arial"/>
-                <w:color w:val="334155"/>
-                <w:sz w:val="17"/>
-              </w:rPr>
-              <w:t>⏳ Step 2</w:t>
-            </w:r>
-          </w:p>
-        </w:tc>
-      </w:tr>
-      <w:tr>
-        <w:tc>
-          <w:tcPr>
-            <w:tcW w:type="dxa" w:w="2160"/>
-            <w:tcMar>
-              <w:top w:w="80" w:type="dxa"/>
-              <w:bottom w:w="80" w:type="dxa"/>
-              <w:left w:w="100" w:type="dxa"/>
-              <w:right w:w="100" w:type="dxa"/>
-            </w:tcMar>
-            <w:shd w:fill="FFFFFF"/>
-          </w:tcPr>
-          <w:p>
-            <w:r>
-              <w:rPr>
-                <w:rFonts w:ascii="Arial" w:hAnsi="Arial"/>
-                <w:color w:val="334155"/>
-                <w:sz w:val="17"/>
-              </w:rPr>
-              <w:t>40</w:t>
-            </w:r>
-          </w:p>
-        </w:tc>
-        <w:tc>
-          <w:tcPr>
-            <w:tcW w:type="dxa" w:w="2160"/>
-            <w:tcMar>
-              <w:top w:w="80" w:type="dxa"/>
-              <w:bottom w:w="80" w:type="dxa"/>
-              <w:left w:w="100" w:type="dxa"/>
-              <w:right w:w="100" w:type="dxa"/>
-            </w:tcMar>
-            <w:shd w:fill="FFFFFF"/>
-          </w:tcPr>
-          <w:p>
-            <w:r>
-              <w:rPr>
-                <w:rFonts w:ascii="Arial" w:hAnsi="Arial"/>
-                <w:color w:val="334155"/>
-                <w:sz w:val="17"/>
-              </w:rPr>
-              <w:t>[My Indexing Strategy for Every Project](https://www.youtube.com/watch?v=0UxHG8zJ3F4)</w:t>
-            </w:r>
-          </w:p>
-        </w:tc>
-        <w:tc>
-          <w:tcPr>
-            <w:tcW w:type="dxa" w:w="2160"/>
-            <w:tcMar>
-              <w:top w:w="80" w:type="dxa"/>
-              <w:bottom w:w="80" w:type="dxa"/>
-              <w:left w:w="100" w:type="dxa"/>
-              <w:right w:w="100" w:type="dxa"/>
-            </w:tcMar>
-            <w:shd w:fill="FFFFFF"/>
-          </w:tcPr>
-          <w:p>
-            <w:r>
-              <w:rPr>
-                <w:rFonts w:ascii="Arial" w:hAnsi="Arial"/>
-                <w:color w:val="334155"/>
-                <w:sz w:val="17"/>
-              </w:rPr>
-              <w:t>⏳ Step 2</w:t>
-            </w:r>
-          </w:p>
-        </w:tc>
-        <w:tc>
-          <w:tcPr>
-            <w:tcW w:type="dxa" w:w="2160"/>
-            <w:tcMar>
-              <w:top w:w="80" w:type="dxa"/>
-              <w:bottom w:w="80" w:type="dxa"/>
-              <w:left w:w="100" w:type="dxa"/>
-              <w:right w:w="100" w:type="dxa"/>
-            </w:tcMar>
-            <w:shd w:fill="FFFFFF"/>
-          </w:tcPr>
-          <w:p>
-            <w:r>
-              <w:rPr>
-                <w:rFonts w:ascii="Arial" w:hAnsi="Arial"/>
-                <w:color w:val="334155"/>
-                <w:sz w:val="17"/>
-              </w:rPr>
-              <w:t>⭐ Recommended DA</w:t>
-            </w:r>
-          </w:p>
-        </w:tc>
-      </w:tr>
-      <w:tr>
-        <w:tc>
-          <w:tcPr>
-            <w:tcW w:type="dxa" w:w="2160"/>
-            <w:tcMar>
-              <w:top w:w="80" w:type="dxa"/>
-              <w:bottom w:w="80" w:type="dxa"/>
-              <w:left w:w="100" w:type="dxa"/>
-              <w:right w:w="100" w:type="dxa"/>
-            </w:tcMar>
-            <w:shd w:fill="F8FAFC"/>
-          </w:tcPr>
-          <w:p>
-            <w:r>
-              <w:rPr>
-                <w:rFonts w:ascii="Arial" w:hAnsi="Arial"/>
-                <w:color w:val="334155"/>
-                <w:sz w:val="17"/>
-              </w:rPr>
-              <w:t>41</w:t>
-            </w:r>
-          </w:p>
-        </w:tc>
-        <w:tc>
-          <w:tcPr>
-            <w:tcW w:type="dxa" w:w="2160"/>
-            <w:tcMar>
-              <w:top w:w="80" w:type="dxa"/>
-              <w:bottom w:w="80" w:type="dxa"/>
-              <w:left w:w="100" w:type="dxa"/>
-              <w:right w:w="100" w:type="dxa"/>
-            </w:tcMar>
-            <w:shd w:fill="F8FAFC"/>
-          </w:tcPr>
-          <w:p>
-            <w:r>
-              <w:rPr>
-                <w:rFonts w:ascii="Arial" w:hAnsi="Arial"/>
-                <w:color w:val="334155"/>
-                <w:sz w:val="17"/>
-              </w:rPr>
-              <w:t>[SQL Table Partitioning \</w:t>
-            </w:r>
-          </w:p>
-        </w:tc>
-        <w:tc>
-          <w:tcPr>
-            <w:tcW w:type="dxa" w:w="2160"/>
-            <w:tcMar>
-              <w:top w:w="80" w:type="dxa"/>
-              <w:bottom w:w="80" w:type="dxa"/>
-              <w:left w:w="100" w:type="dxa"/>
-              <w:right w:w="100" w:type="dxa"/>
-            </w:tcMar>
-            <w:shd w:fill="F8FAFC"/>
-          </w:tcPr>
-          <w:p>
-            <w:r>
-              <w:rPr>
-                <w:rFonts w:ascii="Arial" w:hAnsi="Arial"/>
-                <w:color w:val="334155"/>
-                <w:sz w:val="17"/>
-              </w:rPr>
-              <w:t>Optimize Big Table Performance](https://www.youtube.com/watch?v=tQQ3XwrKbfM)</w:t>
-            </w:r>
-          </w:p>
-        </w:tc>
-        <w:tc>
-          <w:tcPr>
-            <w:tcW w:type="dxa" w:w="2160"/>
-            <w:tcMar>
-              <w:top w:w="80" w:type="dxa"/>
-              <w:bottom w:w="80" w:type="dxa"/>
-              <w:left w:w="100" w:type="dxa"/>
-              <w:right w:w="100" w:type="dxa"/>
-            </w:tcMar>
-            <w:shd w:fill="F8FAFC"/>
-          </w:tcPr>
-          <w:p>
-            <w:r>
-              <w:rPr>
-                <w:rFonts w:ascii="Arial" w:hAnsi="Arial"/>
-                <w:color w:val="334155"/>
-                <w:sz w:val="17"/>
-              </w:rPr>
-              <w:t>⏳ Step 2</w:t>
-            </w:r>
-          </w:p>
-        </w:tc>
-      </w:tr>
-      <w:tr>
-        <w:tc>
-          <w:tcPr>
-            <w:tcW w:type="dxa" w:w="2160"/>
-            <w:tcMar>
-              <w:top w:w="80" w:type="dxa"/>
-              <w:bottom w:w="80" w:type="dxa"/>
-              <w:left w:w="100" w:type="dxa"/>
-              <w:right w:w="100" w:type="dxa"/>
-            </w:tcMar>
-            <w:shd w:fill="FFFFFF"/>
-          </w:tcPr>
-          <w:p>
-            <w:r>
-              <w:rPr>
-                <w:rFonts w:ascii="Arial" w:hAnsi="Arial"/>
-                <w:color w:val="334155"/>
-                <w:sz w:val="17"/>
-              </w:rPr>
-              <w:t>42</w:t>
-            </w:r>
-          </w:p>
-        </w:tc>
-        <w:tc>
-          <w:tcPr>
-            <w:tcW w:type="dxa" w:w="2160"/>
-            <w:tcMar>
-              <w:top w:w="80" w:type="dxa"/>
-              <w:bottom w:w="80" w:type="dxa"/>
-              <w:left w:w="100" w:type="dxa"/>
-              <w:right w:w="100" w:type="dxa"/>
-            </w:tcMar>
-            <w:shd w:fill="FFFFFF"/>
-          </w:tcPr>
-          <w:p>
-            <w:r>
-              <w:rPr>
-                <w:rFonts w:ascii="Arial" w:hAnsi="Arial"/>
-                <w:color w:val="334155"/>
-                <w:sz w:val="17"/>
-              </w:rPr>
-              <w:t>[30 SQL Tips and Tricks From 18 Years Experience](https://www.youtube.com/watch?v=Iyr7KQUCb0M)</w:t>
-            </w:r>
-          </w:p>
-        </w:tc>
-        <w:tc>
-          <w:tcPr>
-            <w:tcW w:type="dxa" w:w="2160"/>
-            <w:tcMar>
-              <w:top w:w="80" w:type="dxa"/>
-              <w:bottom w:w="80" w:type="dxa"/>
-              <w:left w:w="100" w:type="dxa"/>
-              <w:right w:w="100" w:type="dxa"/>
-            </w:tcMar>
-            <w:shd w:fill="FFFFFF"/>
-          </w:tcPr>
-          <w:p>
-            <w:r>
-              <w:rPr>
-                <w:rFonts w:ascii="Arial" w:hAnsi="Arial"/>
-                <w:color w:val="334155"/>
-                <w:sz w:val="17"/>
-              </w:rPr>
-              <w:t>⏳ Step 2</w:t>
-            </w:r>
-          </w:p>
-        </w:tc>
-        <w:tc>
-          <w:tcPr>
-            <w:tcW w:type="dxa" w:w="2160"/>
-            <w:tcMar>
-              <w:top w:w="80" w:type="dxa"/>
-              <w:bottom w:w="80" w:type="dxa"/>
-              <w:left w:w="100" w:type="dxa"/>
-              <w:right w:w="100" w:type="dxa"/>
-            </w:tcMar>
-            <w:shd w:fill="FFFFFF"/>
-          </w:tcPr>
-          <w:p>
-            <w:r>
-              <w:rPr>
-                <w:rFonts w:ascii="Arial" w:hAnsi="Arial"/>
-                <w:color w:val="334155"/>
-                <w:sz w:val="17"/>
-              </w:rPr>
-              <w:t>⭐ Recommended DA</w:t>
-            </w:r>
-          </w:p>
-        </w:tc>
-      </w:tr>
-      <w:tr>
-        <w:tc>
-          <w:tcPr>
-            <w:tcW w:type="dxa" w:w="2160"/>
-            <w:tcMar>
-              <w:top w:w="80" w:type="dxa"/>
-              <w:bottom w:w="80" w:type="dxa"/>
-              <w:left w:w="100" w:type="dxa"/>
-              <w:right w:w="100" w:type="dxa"/>
-            </w:tcMar>
-            <w:shd w:fill="F8FAFC"/>
-          </w:tcPr>
-          <w:p>
-            <w:r>
-              <w:rPr>
-                <w:rFonts w:ascii="Arial" w:hAnsi="Arial"/>
-                <w:color w:val="334155"/>
-                <w:sz w:val="17"/>
-              </w:rPr>
-              <w:t>43</w:t>
-            </w:r>
-          </w:p>
-        </w:tc>
-        <w:tc>
-          <w:tcPr>
-            <w:tcW w:type="dxa" w:w="2160"/>
-            <w:tcMar>
-              <w:top w:w="80" w:type="dxa"/>
-              <w:bottom w:w="80" w:type="dxa"/>
-              <w:left w:w="100" w:type="dxa"/>
-              <w:right w:w="100" w:type="dxa"/>
-            </w:tcMar>
-            <w:shd w:fill="F8FAFC"/>
-          </w:tcPr>
-          <w:p>
-            <w:r>
-              <w:rPr>
-                <w:rFonts w:ascii="Arial" w:hAnsi="Arial"/>
-                <w:color w:val="334155"/>
-                <w:sz w:val="17"/>
-              </w:rPr>
-              <w:t>[SQL Stored Procedure \</w:t>
-            </w:r>
-          </w:p>
-        </w:tc>
-        <w:tc>
-          <w:tcPr>
-            <w:tcW w:type="dxa" w:w="2160"/>
-            <w:tcMar>
-              <w:top w:w="80" w:type="dxa"/>
-              <w:bottom w:w="80" w:type="dxa"/>
-              <w:left w:w="100" w:type="dxa"/>
-              <w:right w:w="100" w:type="dxa"/>
-            </w:tcMar>
-            <w:shd w:fill="F8FAFC"/>
-          </w:tcPr>
-          <w:p>
-            <w:r>
-              <w:rPr>
-                <w:rFonts w:ascii="Arial" w:hAnsi="Arial"/>
-                <w:color w:val="334155"/>
-                <w:sz w:val="17"/>
-              </w:rPr>
-              <w:t>Comprehensive Guide](https://www.youtube.com/watch?v=DX8I5SmB6jo)</w:t>
-            </w:r>
-          </w:p>
-        </w:tc>
-        <w:tc>
-          <w:tcPr>
-            <w:tcW w:type="dxa" w:w="2160"/>
-            <w:tcMar>
-              <w:top w:w="80" w:type="dxa"/>
-              <w:bottom w:w="80" w:type="dxa"/>
-              <w:left w:w="100" w:type="dxa"/>
-              <w:right w:w="100" w:type="dxa"/>
-            </w:tcMar>
-            <w:shd w:fill="F8FAFC"/>
-          </w:tcPr>
-          <w:p>
-            <w:r>
-              <w:rPr>
-                <w:rFonts w:ascii="Arial" w:hAnsi="Arial"/>
-                <w:color w:val="334155"/>
-                <w:sz w:val="17"/>
-              </w:rPr>
-              <w:t>💡 Step 3</w:t>
-            </w:r>
-          </w:p>
-        </w:tc>
-      </w:tr>
-      <w:tr>
-        <w:tc>
-          <w:tcPr>
-            <w:tcW w:type="dxa" w:w="2160"/>
-            <w:tcMar>
-              <w:top w:w="80" w:type="dxa"/>
-              <w:bottom w:w="80" w:type="dxa"/>
-              <w:left w:w="100" w:type="dxa"/>
-              <w:right w:w="100" w:type="dxa"/>
-            </w:tcMar>
-            <w:shd w:fill="FFFFFF"/>
-          </w:tcPr>
-          <w:p>
-            <w:r>
-              <w:rPr>
-                <w:rFonts w:ascii="Arial" w:hAnsi="Arial"/>
-                <w:color w:val="334155"/>
-                <w:sz w:val="17"/>
-              </w:rPr>
-              <w:t>44</w:t>
-            </w:r>
-          </w:p>
-        </w:tc>
-        <w:tc>
-          <w:tcPr>
-            <w:tcW w:type="dxa" w:w="2160"/>
-            <w:tcMar>
-              <w:top w:w="80" w:type="dxa"/>
-              <w:bottom w:w="80" w:type="dxa"/>
-              <w:left w:w="100" w:type="dxa"/>
-              <w:right w:w="100" w:type="dxa"/>
-            </w:tcMar>
-            <w:shd w:fill="FFFFFF"/>
-          </w:tcPr>
-          <w:p>
-            <w:r>
-              <w:rPr>
-                <w:rFonts w:ascii="Arial" w:hAnsi="Arial"/>
-                <w:color w:val="334155"/>
-                <w:sz w:val="17"/>
-              </w:rPr>
-              <w:t>[SQL Triggers \</w:t>
-            </w:r>
-          </w:p>
-        </w:tc>
-        <w:tc>
-          <w:tcPr>
-            <w:tcW w:type="dxa" w:w="2160"/>
-            <w:tcMar>
-              <w:top w:w="80" w:type="dxa"/>
-              <w:bottom w:w="80" w:type="dxa"/>
-              <w:left w:w="100" w:type="dxa"/>
-              <w:right w:w="100" w:type="dxa"/>
-            </w:tcMar>
-            <w:shd w:fill="FFFFFF"/>
-          </w:tcPr>
-          <w:p>
-            <w:r>
-              <w:rPr>
-                <w:rFonts w:ascii="Arial" w:hAnsi="Arial"/>
-                <w:color w:val="334155"/>
-                <w:sz w:val="17"/>
-              </w:rPr>
-              <w:t>Audit Logs Use Case](https://www.youtube.com/watch?v=V81Smc6xrBY)</w:t>
-            </w:r>
-          </w:p>
-        </w:tc>
-        <w:tc>
-          <w:tcPr>
-            <w:tcW w:type="dxa" w:w="2160"/>
-            <w:tcMar>
-              <w:top w:w="80" w:type="dxa"/>
-              <w:bottom w:w="80" w:type="dxa"/>
-              <w:left w:w="100" w:type="dxa"/>
-              <w:right w:w="100" w:type="dxa"/>
-            </w:tcMar>
-            <w:shd w:fill="FFFFFF"/>
-          </w:tcPr>
-          <w:p>
-            <w:r>
-              <w:rPr>
-                <w:rFonts w:ascii="Arial" w:hAnsi="Arial"/>
-                <w:color w:val="334155"/>
-                <w:sz w:val="17"/>
-              </w:rPr>
-              <w:t>💡 Step 3</w:t>
-            </w:r>
-          </w:p>
-        </w:tc>
-      </w:tr>
-      <w:tr>
-        <w:tc>
-          <w:tcPr>
-            <w:tcW w:type="dxa" w:w="2160"/>
-            <w:tcMar>
-              <w:top w:w="80" w:type="dxa"/>
-              <w:bottom w:w="80" w:type="dxa"/>
-              <w:left w:w="100" w:type="dxa"/>
-              <w:right w:w="100" w:type="dxa"/>
-            </w:tcMar>
-            <w:shd w:fill="F8FAFC"/>
-          </w:tcPr>
-          <w:p>
-            <w:r>
-              <w:rPr>
-                <w:rFonts w:ascii="Arial" w:hAnsi="Arial"/>
-                <w:color w:val="334155"/>
-                <w:sz w:val="17"/>
-              </w:rPr>
-              <w:t>45</w:t>
-            </w:r>
-          </w:p>
-        </w:tc>
-        <w:tc>
-          <w:tcPr>
-            <w:tcW w:type="dxa" w:w="2160"/>
-            <w:tcMar>
-              <w:top w:w="80" w:type="dxa"/>
-              <w:bottom w:w="80" w:type="dxa"/>
-              <w:left w:w="100" w:type="dxa"/>
-              <w:right w:w="100" w:type="dxa"/>
-            </w:tcMar>
-            <w:shd w:fill="F8FAFC"/>
-          </w:tcPr>
-          <w:p>
-            <w:r>
-              <w:rPr>
-                <w:rFonts w:ascii="Arial" w:hAnsi="Arial"/>
-                <w:color w:val="334155"/>
-                <w:sz w:val="17"/>
-              </w:rPr>
-              <w:t>[How I Use ChatGPT &amp; GitHub Copilot in Projects](https://www.youtube.com/watch?v=XGKyX_hH3Pc)</w:t>
-            </w:r>
-          </w:p>
-        </w:tc>
-        <w:tc>
-          <w:tcPr>
-            <w:tcW w:type="dxa" w:w="2160"/>
-            <w:tcMar>
-              <w:top w:w="80" w:type="dxa"/>
-              <w:bottom w:w="80" w:type="dxa"/>
-              <w:left w:w="100" w:type="dxa"/>
-              <w:right w:w="100" w:type="dxa"/>
-            </w:tcMar>
-            <w:shd w:fill="F8FAFC"/>
-          </w:tcPr>
-          <w:p>
-            <w:r>
-              <w:rPr>
-                <w:rFonts w:ascii="Arial" w:hAnsi="Arial"/>
-                <w:color w:val="334155"/>
-                <w:sz w:val="17"/>
-              </w:rPr>
-              <w:t>💡 Step 3</w:t>
-            </w:r>
-          </w:p>
-        </w:tc>
-        <w:tc>
-          <w:tcPr>
-            <w:tcW w:type="dxa" w:w="2160"/>
-            <w:tcMar>
-              <w:top w:w="80" w:type="dxa"/>
-              <w:bottom w:w="80" w:type="dxa"/>
-              <w:left w:w="100" w:type="dxa"/>
-              <w:right w:w="100" w:type="dxa"/>
-            </w:tcMar>
-            <w:shd w:fill="F8FAFC"/>
-          </w:tcPr>
-          <w:p>
-            <w:r>
-              <w:rPr>
-                <w:rFonts w:ascii="Arial" w:hAnsi="Arial"/>
-                <w:color w:val="334155"/>
-                <w:sz w:val="17"/>
-              </w:rPr>
-              <w:t>🛠️ Productivity</w:t>
-            </w:r>
-          </w:p>
-        </w:tc>
-      </w:tr>
-      <w:tr>
-        <w:tc>
-          <w:tcPr>
-            <w:tcW w:type="dxa" w:w="2160"/>
-            <w:tcMar>
-              <w:top w:w="80" w:type="dxa"/>
-              <w:bottom w:w="80" w:type="dxa"/>
-              <w:left w:w="100" w:type="dxa"/>
-              <w:right w:w="100" w:type="dxa"/>
-            </w:tcMar>
-            <w:shd w:fill="FFFFFF"/>
-          </w:tcPr>
-          <w:p>
-            <w:r>
-              <w:rPr>
-                <w:rFonts w:ascii="Arial" w:hAnsi="Arial"/>
-                <w:color w:val="334155"/>
-                <w:sz w:val="17"/>
-              </w:rPr>
-              <w:t>46-54</w:t>
-            </w:r>
-          </w:p>
-        </w:tc>
-        <w:tc>
-          <w:tcPr>
-            <w:tcW w:type="dxa" w:w="2160"/>
-            <w:tcMar>
-              <w:top w:w="80" w:type="dxa"/>
-              <w:bottom w:w="80" w:type="dxa"/>
-              <w:left w:w="100" w:type="dxa"/>
-              <w:right w:w="100" w:type="dxa"/>
-            </w:tcMar>
-            <w:shd w:fill="FFFFFF"/>
-          </w:tcPr>
-          <w:p>
-            <w:r>
-              <w:rPr>
-                <w:rFonts w:ascii="Arial" w:hAnsi="Arial"/>
-                <w:color w:val="334155"/>
-                <w:sz w:val="17"/>
-              </w:rPr>
-              <w:t>Data Warehouse &amp; ETL Pipeline Series (9 Videos)</w:t>
-            </w:r>
-          </w:p>
-        </w:tc>
-        <w:tc>
-          <w:tcPr>
-            <w:tcW w:type="dxa" w:w="2160"/>
-            <w:tcMar>
-              <w:top w:w="80" w:type="dxa"/>
-              <w:bottom w:w="80" w:type="dxa"/>
-              <w:left w:w="100" w:type="dxa"/>
-              <w:right w:w="100" w:type="dxa"/>
-            </w:tcMar>
-            <w:shd w:fill="FFFFFF"/>
-          </w:tcPr>
-          <w:p>
-            <w:r>
-              <w:rPr>
-                <w:rFonts w:ascii="Arial" w:hAnsi="Arial"/>
-                <w:color w:val="334155"/>
-                <w:sz w:val="17"/>
-              </w:rPr>
-              <w:t>🏗️ Step 4</w:t>
-            </w:r>
-          </w:p>
-        </w:tc>
-        <w:tc>
-          <w:tcPr>
-            <w:tcW w:type="dxa" w:w="2160"/>
-            <w:tcMar>
-              <w:top w:w="80" w:type="dxa"/>
-              <w:bottom w:w="80" w:type="dxa"/>
-              <w:left w:w="100" w:type="dxa"/>
-              <w:right w:w="100" w:type="dxa"/>
-            </w:tcMar>
-            <w:shd w:fill="FFFFFF"/>
-          </w:tcPr>
-          <w:p>
-            <w:r>
-              <w:rPr>
-                <w:rFonts w:ascii="Arial" w:hAnsi="Arial"/>
-                <w:color w:val="334155"/>
-                <w:sz w:val="17"/>
-              </w:rPr>
-              <w:t>🏗️ Data Engineering</w:t>
-            </w:r>
-          </w:p>
-        </w:tc>
-      </w:tr>
-      <w:tr>
-        <w:tc>
-          <w:tcPr>
-            <w:tcW w:type="dxa" w:w="2160"/>
-            <w:tcMar>
-              <w:top w:w="80" w:type="dxa"/>
-              <w:bottom w:w="80" w:type="dxa"/>
-              <w:left w:w="100" w:type="dxa"/>
-              <w:right w:w="100" w:type="dxa"/>
-            </w:tcMar>
-            <w:shd w:fill="F8FAFC"/>
-          </w:tcPr>
-          <w:p>
-            <w:r>
-              <w:rPr>
-                <w:rFonts w:ascii="Arial" w:hAnsi="Arial"/>
-                <w:color w:val="334155"/>
-                <w:sz w:val="17"/>
-              </w:rPr>
-              <w:t>55</w:t>
-            </w:r>
-          </w:p>
-        </w:tc>
-        <w:tc>
-          <w:tcPr>
-            <w:tcW w:type="dxa" w:w="2160"/>
-            <w:tcMar>
-              <w:top w:w="80" w:type="dxa"/>
-              <w:bottom w:w="80" w:type="dxa"/>
-              <w:left w:w="100" w:type="dxa"/>
-              <w:right w:w="100" w:type="dxa"/>
-            </w:tcMar>
-            <w:shd w:fill="F8FAFC"/>
-          </w:tcPr>
-          <w:p>
-            <w:r>
-              <w:rPr>
-                <w:rFonts w:ascii="Arial" w:hAnsi="Arial"/>
-                <w:color w:val="334155"/>
-                <w:sz w:val="17"/>
-              </w:rPr>
-              <w:t>[SQL Exploratory Data Analysis (EDA) Project](https://www.youtube.com/watch?v=6cJ5Ji8zSDg)</w:t>
-            </w:r>
-          </w:p>
-        </w:tc>
-        <w:tc>
-          <w:tcPr>
-            <w:tcW w:type="dxa" w:w="2160"/>
-            <w:tcMar>
-              <w:top w:w="80" w:type="dxa"/>
-              <w:bottom w:w="80" w:type="dxa"/>
-              <w:left w:w="100" w:type="dxa"/>
-              <w:right w:w="100" w:type="dxa"/>
-            </w:tcMar>
-            <w:shd w:fill="F8FAFC"/>
-          </w:tcPr>
-          <w:p>
-            <w:r>
-              <w:rPr>
-                <w:rFonts w:ascii="Arial" w:hAnsi="Arial"/>
-                <w:color w:val="334155"/>
-                <w:sz w:val="17"/>
-              </w:rPr>
-              <w:t>🎯 Step 5</w:t>
-            </w:r>
-          </w:p>
-        </w:tc>
-        <w:tc>
-          <w:tcPr>
-            <w:tcW w:type="dxa" w:w="2160"/>
-            <w:tcMar>
-              <w:top w:w="80" w:type="dxa"/>
-              <w:bottom w:w="80" w:type="dxa"/>
-              <w:left w:w="100" w:type="dxa"/>
-              <w:right w:w="100" w:type="dxa"/>
-            </w:tcMar>
-            <w:shd w:fill="F8FAFC"/>
-          </w:tcPr>
-          <w:p>
-            <w:r>
-              <w:rPr>
-                <w:rFonts w:ascii="Arial" w:hAnsi="Arial"/>
-                <w:color w:val="334155"/>
-                <w:sz w:val="17"/>
-              </w:rPr>
-              <w:t>🎯 **MUST WATCH FOR DA**</w:t>
-            </w:r>
-          </w:p>
-        </w:tc>
-      </w:tr>
-      <w:tr>
-        <w:tc>
-          <w:tcPr>
-            <w:tcW w:type="dxa" w:w="2160"/>
-            <w:tcMar>
-              <w:top w:w="80" w:type="dxa"/>
-              <w:bottom w:w="80" w:type="dxa"/>
-              <w:left w:w="100" w:type="dxa"/>
-              <w:right w:w="100" w:type="dxa"/>
-            </w:tcMar>
-            <w:shd w:fill="FFFFFF"/>
-          </w:tcPr>
-          <w:p>
-            <w:r>
-              <w:rPr>
-                <w:rFonts w:ascii="Arial" w:hAnsi="Arial"/>
-                <w:color w:val="334155"/>
-                <w:sz w:val="17"/>
-              </w:rPr>
-              <w:t>56</w:t>
-            </w:r>
-          </w:p>
-        </w:tc>
-        <w:tc>
-          <w:tcPr>
-            <w:tcW w:type="dxa" w:w="2160"/>
-            <w:tcMar>
-              <w:top w:w="80" w:type="dxa"/>
-              <w:bottom w:w="80" w:type="dxa"/>
-              <w:left w:w="100" w:type="dxa"/>
-              <w:right w:w="100" w:type="dxa"/>
-            </w:tcMar>
-            <w:shd w:fill="FFFFFF"/>
-          </w:tcPr>
-          <w:p>
-            <w:r>
-              <w:rPr>
-                <w:rFonts w:ascii="Arial" w:hAnsi="Arial"/>
-                <w:color w:val="334155"/>
-                <w:sz w:val="17"/>
-              </w:rPr>
-              <w:t>[SQL Data Analyst Portfolio Project](https://www.youtube.com/watch?v=2jGhQpbzHes)</w:t>
-            </w:r>
-          </w:p>
-        </w:tc>
-        <w:tc>
-          <w:tcPr>
-            <w:tcW w:type="dxa" w:w="2160"/>
-            <w:tcMar>
-              <w:top w:w="80" w:type="dxa"/>
-              <w:bottom w:w="80" w:type="dxa"/>
-              <w:left w:w="100" w:type="dxa"/>
-              <w:right w:w="100" w:type="dxa"/>
-            </w:tcMar>
-            <w:shd w:fill="FFFFFF"/>
-          </w:tcPr>
-          <w:p>
-            <w:r>
-              <w:rPr>
-                <w:rFonts w:ascii="Arial" w:hAnsi="Arial"/>
-                <w:color w:val="334155"/>
-                <w:sz w:val="17"/>
-              </w:rPr>
-              <w:t>🎯 Step 5</w:t>
-            </w:r>
-          </w:p>
-        </w:tc>
-        <w:tc>
-          <w:tcPr>
-            <w:tcW w:type="dxa" w:w="2160"/>
-            <w:tcMar>
-              <w:top w:w="80" w:type="dxa"/>
-              <w:bottom w:w="80" w:type="dxa"/>
-              <w:left w:w="100" w:type="dxa"/>
-              <w:right w:w="100" w:type="dxa"/>
-            </w:tcMar>
-            <w:shd w:fill="FFFFFF"/>
-          </w:tcPr>
-          <w:p>
-            <w:r>
-              <w:rPr>
-                <w:rFonts w:ascii="Arial" w:hAnsi="Arial"/>
-                <w:color w:val="334155"/>
-                <w:sz w:val="17"/>
-              </w:rPr>
-              <w:t>🎯 **MUST WATCH FOR DA**</w:t>
-            </w:r>
-          </w:p>
-        </w:tc>
-      </w:tr>
-    </w:tbl>
+    <w:p>
+      <w:pPr>
+        <w:spacing w:before="60" w:after="60"/>
+      </w:pPr>
+      <w:r>
+        <w:t>1. **Easy Problems (`Completed`)**: Excellent for syntax muscle memory.</w:t>
+      </w:r>
+    </w:p>
+    <w:p>
+      <w:pPr>
+        <w:spacing w:before="60" w:after="60"/>
+      </w:pPr>
+      <w:r>
+        <w:t>2. **Medium Problems (`Target: 15–20 Problems`)**: Focus on 2+ table JOINs, `GROUP BY` / `HAVING`, `CASE WHEN`, and `CTEs` / Subqueries. This is the exact difficulty level tested in 80% of Data Analyst screening interviews.</w:t>
+      </w:r>
+    </w:p>
+    <w:p>
+      <w:pPr>
+        <w:spacing w:before="60" w:after="60"/>
+      </w:pPr>
+      <w:r>
+        <w:t>3. **Hard Problems (`Target: 5–10 Problems`)**: Focus on Window Functions (`ROW_NUMBER`, `DENSE_RANK`, `LEAD`/`LAG`), consecutive day streaks, and median calculation challenges.</w:t>
+      </w:r>
+    </w:p>
+    <w:p>
+      <w:pPr>
+        <w:spacing w:before="60" w:after="60"/>
+      </w:pPr>
+      <w:r>
+        <w:br/>
+        <w:t>### How to Learn from Portfolio Projects (Videos #55 &amp; #56)</w:t>
+      </w:r>
+    </w:p>
+    <w:p>
+      <w:pPr>
+        <w:pStyle w:val="ListBullet"/>
+        <w:spacing w:before="40" w:after="40"/>
+      </w:pPr>
+      <w:r>
+        <w:rPr>
+          <w:rFonts w:ascii="Arial" w:hAnsi="Arial"/>
+          <w:sz w:val="20"/>
+        </w:rPr>
+        <w:t>**Project 1: SQL Exploratory Data Analysis (EDA) (Video #55)**: Learn how to analyze raw e-commerce customer datasets to find top revenue channels, customer retention rate, and peak ordering months.</w:t>
+      </w:r>
+    </w:p>
+    <w:p>
+      <w:pPr>
+        <w:pStyle w:val="ListBullet"/>
+        <w:spacing w:before="40" w:after="40"/>
+      </w:pPr>
+      <w:r>
+        <w:rPr>
+          <w:rFonts w:ascii="Arial" w:hAnsi="Arial"/>
+          <w:sz w:val="20"/>
+        </w:rPr>
+        <w:t>**Project 2: Complete Data Analyst Portfolio Project (Video #56)**: Learn how to organize a clean GitHub portfolio repository with `.sql` script files, business insights, and executive summaries.</w:t>
+      </w:r>
+    </w:p>
     <w:p>
       <w:pPr>
         <w:spacing w:before="60" w:after="60"/>
@@ -3704,7 +2062,7 @@
           <w:color w:val="0EA5E9"/>
           <w:sz w:val="36"/>
         </w:rPr>
-        <w:t>SECTION 2: COMPLETED STUDY HISTORY (LAST PAGES / ARCHIVE)</w:t>
+        <w:t>SECTION 2: COMPLETED STUDY HISTORY ARCHIVE (LAST PAGES)</w:t>
       </w:r>
     </w:p>
     <w:p>
@@ -3720,1826 +2078,6 @@
           <w:sz w:val="24"/>
         </w:rPr>
         <w:t>Completed Days 1–15 Archive (July 10 – July 24, 2026)</w:t>
-      </w:r>
-    </w:p>
-    <w:tbl>
-      <w:tblPr>
-        <w:tblW w:type="auto" w:w="0"/>
-        <w:jc w:val="center"/>
-        <w:tblLook w:firstColumn="1" w:firstRow="1" w:lastColumn="0" w:lastRow="0" w:noHBand="0" w:noVBand="1" w:val="04A0"/>
-      </w:tblPr>
-      <w:tblGrid>
-        <w:gridCol w:w="1728"/>
-        <w:gridCol w:w="1728"/>
-        <w:gridCol w:w="1728"/>
-        <w:gridCol w:w="1728"/>
-        <w:gridCol w:w="1728"/>
-      </w:tblGrid>
-      <w:tr>
-        <w:tc>
-          <w:tcPr>
-            <w:tcW w:type="dxa" w:w="1728"/>
-            <w:tcMar>
-              <w:top w:w="80" w:type="dxa"/>
-              <w:bottom w:w="80" w:type="dxa"/>
-              <w:left w:w="100" w:type="dxa"/>
-              <w:right w:w="100" w:type="dxa"/>
-            </w:tcMar>
-            <w:shd w:fill="0F172A"/>
-          </w:tcPr>
-          <w:p>
-            <w:r>
-              <w:rPr>
-                <w:rFonts w:ascii="Arial" w:hAnsi="Arial"/>
-                <w:b/>
-                <w:color w:val="FFFFFF"/>
-                <w:sz w:val="18"/>
-              </w:rPr>
-              <w:t>Day</w:t>
-            </w:r>
-          </w:p>
-        </w:tc>
-        <w:tc>
-          <w:tcPr>
-            <w:tcW w:type="dxa" w:w="1728"/>
-            <w:tcMar>
-              <w:top w:w="80" w:type="dxa"/>
-              <w:bottom w:w="80" w:type="dxa"/>
-              <w:left w:w="100" w:type="dxa"/>
-              <w:right w:w="100" w:type="dxa"/>
-            </w:tcMar>
-            <w:shd w:fill="0F172A"/>
-          </w:tcPr>
-          <w:p>
-            <w:r>
-              <w:rPr>
-                <w:rFonts w:ascii="Arial" w:hAnsi="Arial"/>
-                <w:b/>
-                <w:color w:val="FFFFFF"/>
-                <w:sz w:val="18"/>
-              </w:rPr>
-              <w:t>Date</w:t>
-            </w:r>
-          </w:p>
-        </w:tc>
-        <w:tc>
-          <w:tcPr>
-            <w:tcW w:type="dxa" w:w="1728"/>
-            <w:tcMar>
-              <w:top w:w="80" w:type="dxa"/>
-              <w:bottom w:w="80" w:type="dxa"/>
-              <w:left w:w="100" w:type="dxa"/>
-              <w:right w:w="100" w:type="dxa"/>
-            </w:tcMar>
-            <w:shd w:fill="0F172A"/>
-          </w:tcPr>
-          <w:p>
-            <w:r>
-              <w:rPr>
-                <w:rFonts w:ascii="Arial" w:hAnsi="Arial"/>
-                <w:b/>
-                <w:color w:val="FFFFFF"/>
-                <w:sz w:val="18"/>
-              </w:rPr>
-              <w:t>Focus Topic</w:t>
-            </w:r>
-          </w:p>
-        </w:tc>
-        <w:tc>
-          <w:tcPr>
-            <w:tcW w:type="dxa" w:w="1728"/>
-            <w:tcMar>
-              <w:top w:w="80" w:type="dxa"/>
-              <w:bottom w:w="80" w:type="dxa"/>
-              <w:left w:w="100" w:type="dxa"/>
-              <w:right w:w="100" w:type="dxa"/>
-            </w:tcMar>
-            <w:shd w:fill="0F172A"/>
-          </w:tcPr>
-          <w:p>
-            <w:r>
-              <w:rPr>
-                <w:rFonts w:ascii="Arial" w:hAnsi="Arial"/>
-                <w:b/>
-                <w:color w:val="FFFFFF"/>
-                <w:sz w:val="18"/>
-              </w:rPr>
-              <w:t>YouTube Video Watch Target</w:t>
-            </w:r>
-          </w:p>
-        </w:tc>
-        <w:tc>
-          <w:tcPr>
-            <w:tcW w:type="dxa" w:w="1728"/>
-            <w:tcMar>
-              <w:top w:w="80" w:type="dxa"/>
-              <w:bottom w:w="80" w:type="dxa"/>
-              <w:left w:w="100" w:type="dxa"/>
-              <w:right w:w="100" w:type="dxa"/>
-            </w:tcMar>
-            <w:shd w:fill="0F172A"/>
-          </w:tcPr>
-          <w:p>
-            <w:r>
-              <w:rPr>
-                <w:rFonts w:ascii="Arial" w:hAnsi="Arial"/>
-                <w:b/>
-                <w:color w:val="FFFFFF"/>
-                <w:sz w:val="18"/>
-              </w:rPr>
-              <w:t>Status</w:t>
-            </w:r>
-          </w:p>
-        </w:tc>
-      </w:tr>
-      <w:tr>
-        <w:tc>
-          <w:tcPr>
-            <w:tcW w:type="dxa" w:w="1728"/>
-            <w:tcMar>
-              <w:top w:w="80" w:type="dxa"/>
-              <w:bottom w:w="80" w:type="dxa"/>
-              <w:left w:w="100" w:type="dxa"/>
-              <w:right w:w="100" w:type="dxa"/>
-            </w:tcMar>
-            <w:shd w:fill="F8FAFC"/>
-          </w:tcPr>
-          <w:p>
-            <w:r>
-              <w:rPr>
-                <w:rFonts w:ascii="Arial" w:hAnsi="Arial"/>
-                <w:color w:val="334155"/>
-                <w:sz w:val="17"/>
-              </w:rPr>
-              <w:t>Day 1</w:t>
-            </w:r>
-          </w:p>
-        </w:tc>
-        <w:tc>
-          <w:tcPr>
-            <w:tcW w:type="dxa" w:w="1728"/>
-            <w:tcMar>
-              <w:top w:w="80" w:type="dxa"/>
-              <w:bottom w:w="80" w:type="dxa"/>
-              <w:left w:w="100" w:type="dxa"/>
-              <w:right w:w="100" w:type="dxa"/>
-            </w:tcMar>
-            <w:shd w:fill="F8FAFC"/>
-          </w:tcPr>
-          <w:p>
-            <w:r>
-              <w:rPr>
-                <w:rFonts w:ascii="Arial" w:hAnsi="Arial"/>
-                <w:color w:val="334155"/>
-                <w:sz w:val="17"/>
-              </w:rPr>
-              <w:t>July 10</w:t>
-            </w:r>
-          </w:p>
-        </w:tc>
-        <w:tc>
-          <w:tcPr>
-            <w:tcW w:type="dxa" w:w="1728"/>
-            <w:tcMar>
-              <w:top w:w="80" w:type="dxa"/>
-              <w:bottom w:w="80" w:type="dxa"/>
-              <w:left w:w="100" w:type="dxa"/>
-              <w:right w:w="100" w:type="dxa"/>
-            </w:tcMar>
-            <w:shd w:fill="F8FAFC"/>
-          </w:tcPr>
-          <w:p>
-            <w:r>
-              <w:rPr>
-                <w:rFonts w:ascii="Arial" w:hAnsi="Arial"/>
-                <w:color w:val="334155"/>
-                <w:sz w:val="17"/>
-              </w:rPr>
-              <w:t>SQL Intro &amp; Environment</w:t>
-            </w:r>
-          </w:p>
-        </w:tc>
-        <w:tc>
-          <w:tcPr>
-            <w:tcW w:type="dxa" w:w="1728"/>
-            <w:tcMar>
-              <w:top w:w="80" w:type="dxa"/>
-              <w:bottom w:w="80" w:type="dxa"/>
-              <w:left w:w="100" w:type="dxa"/>
-              <w:right w:w="100" w:type="dxa"/>
-            </w:tcMar>
-            <w:shd w:fill="F8FAFC"/>
-          </w:tcPr>
-          <w:p>
-            <w:r>
-              <w:rPr>
-                <w:rFonts w:ascii="Arial" w:hAnsi="Arial"/>
-                <w:color w:val="334155"/>
-                <w:sz w:val="17"/>
-              </w:rPr>
-              <w:t>Video #1 - #4 (SQL Intro, SSMS Setup)</w:t>
-            </w:r>
-          </w:p>
-        </w:tc>
-        <w:tc>
-          <w:tcPr>
-            <w:tcW w:type="dxa" w:w="1728"/>
-            <w:tcMar>
-              <w:top w:w="80" w:type="dxa"/>
-              <w:bottom w:w="80" w:type="dxa"/>
-              <w:left w:w="100" w:type="dxa"/>
-              <w:right w:w="100" w:type="dxa"/>
-            </w:tcMar>
-            <w:shd w:fill="F8FAFC"/>
-          </w:tcPr>
-          <w:p>
-            <w:r>
-              <w:rPr>
-                <w:rFonts w:ascii="Arial" w:hAnsi="Arial"/>
-                <w:color w:val="334155"/>
-                <w:sz w:val="17"/>
-              </w:rPr>
-              <w:t>✅ Completed</w:t>
-            </w:r>
-          </w:p>
-        </w:tc>
-      </w:tr>
-      <w:tr>
-        <w:tc>
-          <w:tcPr>
-            <w:tcW w:type="dxa" w:w="1728"/>
-            <w:tcMar>
-              <w:top w:w="80" w:type="dxa"/>
-              <w:bottom w:w="80" w:type="dxa"/>
-              <w:left w:w="100" w:type="dxa"/>
-              <w:right w:w="100" w:type="dxa"/>
-            </w:tcMar>
-            <w:shd w:fill="FFFFFF"/>
-          </w:tcPr>
-          <w:p>
-            <w:r>
-              <w:rPr>
-                <w:rFonts w:ascii="Arial" w:hAnsi="Arial"/>
-                <w:color w:val="334155"/>
-                <w:sz w:val="17"/>
-              </w:rPr>
-              <w:t>Day 2</w:t>
-            </w:r>
-          </w:p>
-        </w:tc>
-        <w:tc>
-          <w:tcPr>
-            <w:tcW w:type="dxa" w:w="1728"/>
-            <w:tcMar>
-              <w:top w:w="80" w:type="dxa"/>
-              <w:bottom w:w="80" w:type="dxa"/>
-              <w:left w:w="100" w:type="dxa"/>
-              <w:right w:w="100" w:type="dxa"/>
-            </w:tcMar>
-            <w:shd w:fill="FFFFFF"/>
-          </w:tcPr>
-          <w:p>
-            <w:r>
-              <w:rPr>
-                <w:rFonts w:ascii="Arial" w:hAnsi="Arial"/>
-                <w:color w:val="334155"/>
-                <w:sz w:val="17"/>
-              </w:rPr>
-              <w:t>July 11</w:t>
-            </w:r>
-          </w:p>
-        </w:tc>
-        <w:tc>
-          <w:tcPr>
-            <w:tcW w:type="dxa" w:w="1728"/>
-            <w:tcMar>
-              <w:top w:w="80" w:type="dxa"/>
-              <w:bottom w:w="80" w:type="dxa"/>
-              <w:left w:w="100" w:type="dxa"/>
-              <w:right w:w="100" w:type="dxa"/>
-            </w:tcMar>
-            <w:shd w:fill="FFFFFF"/>
-          </w:tcPr>
-          <w:p>
-            <w:r>
-              <w:rPr>
-                <w:rFonts w:ascii="Arial" w:hAnsi="Arial"/>
-                <w:color w:val="334155"/>
-                <w:sz w:val="17"/>
-              </w:rPr>
-              <w:t>SELECT &amp; WHERE Clauses</w:t>
-            </w:r>
-          </w:p>
-        </w:tc>
-        <w:tc>
-          <w:tcPr>
-            <w:tcW w:type="dxa" w:w="1728"/>
-            <w:tcMar>
-              <w:top w:w="80" w:type="dxa"/>
-              <w:bottom w:w="80" w:type="dxa"/>
-              <w:left w:w="100" w:type="dxa"/>
-              <w:right w:w="100" w:type="dxa"/>
-            </w:tcMar>
-            <w:shd w:fill="FFFFFF"/>
-          </w:tcPr>
-          <w:p>
-            <w:r>
-              <w:rPr>
-                <w:rFonts w:ascii="Arial" w:hAnsi="Arial"/>
-                <w:color w:val="334155"/>
-                <w:sz w:val="17"/>
-              </w:rPr>
-              <w:t>Video #5 - #8 (SELECT, DDL, DML, WHERE)</w:t>
-            </w:r>
-          </w:p>
-        </w:tc>
-        <w:tc>
-          <w:tcPr>
-            <w:tcW w:type="dxa" w:w="1728"/>
-            <w:tcMar>
-              <w:top w:w="80" w:type="dxa"/>
-              <w:bottom w:w="80" w:type="dxa"/>
-              <w:left w:w="100" w:type="dxa"/>
-              <w:right w:w="100" w:type="dxa"/>
-            </w:tcMar>
-            <w:shd w:fill="FFFFFF"/>
-          </w:tcPr>
-          <w:p>
-            <w:r>
-              <w:rPr>
-                <w:rFonts w:ascii="Arial" w:hAnsi="Arial"/>
-                <w:color w:val="334155"/>
-                <w:sz w:val="17"/>
-              </w:rPr>
-              <w:t>✅ Completed</w:t>
-            </w:r>
-          </w:p>
-        </w:tc>
-      </w:tr>
-      <w:tr>
-        <w:tc>
-          <w:tcPr>
-            <w:tcW w:type="dxa" w:w="1728"/>
-            <w:tcMar>
-              <w:top w:w="80" w:type="dxa"/>
-              <w:bottom w:w="80" w:type="dxa"/>
-              <w:left w:w="100" w:type="dxa"/>
-              <w:right w:w="100" w:type="dxa"/>
-            </w:tcMar>
-            <w:shd w:fill="F8FAFC"/>
-          </w:tcPr>
-          <w:p>
-            <w:r>
-              <w:rPr>
-                <w:rFonts w:ascii="Arial" w:hAnsi="Arial"/>
-                <w:color w:val="334155"/>
-                <w:sz w:val="17"/>
-              </w:rPr>
-              <w:t>Day 3</w:t>
-            </w:r>
-          </w:p>
-        </w:tc>
-        <w:tc>
-          <w:tcPr>
-            <w:tcW w:type="dxa" w:w="1728"/>
-            <w:tcMar>
-              <w:top w:w="80" w:type="dxa"/>
-              <w:bottom w:w="80" w:type="dxa"/>
-              <w:left w:w="100" w:type="dxa"/>
-              <w:right w:w="100" w:type="dxa"/>
-            </w:tcMar>
-            <w:shd w:fill="F8FAFC"/>
-          </w:tcPr>
-          <w:p>
-            <w:r>
-              <w:rPr>
-                <w:rFonts w:ascii="Arial" w:hAnsi="Arial"/>
-                <w:color w:val="334155"/>
-                <w:sz w:val="17"/>
-              </w:rPr>
-              <w:t>July 12</w:t>
-            </w:r>
-          </w:p>
-        </w:tc>
-        <w:tc>
-          <w:tcPr>
-            <w:tcW w:type="dxa" w:w="1728"/>
-            <w:tcMar>
-              <w:top w:w="80" w:type="dxa"/>
-              <w:bottom w:w="80" w:type="dxa"/>
-              <w:left w:w="100" w:type="dxa"/>
-              <w:right w:w="100" w:type="dxa"/>
-            </w:tcMar>
-            <w:shd w:fill="F8FAFC"/>
-          </w:tcPr>
-          <w:p>
-            <w:r>
-              <w:rPr>
-                <w:rFonts w:ascii="Arial" w:hAnsi="Arial"/>
-                <w:color w:val="334155"/>
-                <w:sz w:val="17"/>
-              </w:rPr>
-              <w:t>SQL Joins Basics</w:t>
-            </w:r>
-          </w:p>
-        </w:tc>
-        <w:tc>
-          <w:tcPr>
-            <w:tcW w:type="dxa" w:w="1728"/>
-            <w:tcMar>
-              <w:top w:w="80" w:type="dxa"/>
-              <w:bottom w:w="80" w:type="dxa"/>
-              <w:left w:w="100" w:type="dxa"/>
-              <w:right w:w="100" w:type="dxa"/>
-            </w:tcMar>
-            <w:shd w:fill="F8FAFC"/>
-          </w:tcPr>
-          <w:p>
-            <w:r>
-              <w:rPr>
-                <w:rFonts w:ascii="Arial" w:hAnsi="Arial"/>
-                <w:color w:val="334155"/>
-                <w:sz w:val="17"/>
-              </w:rPr>
-              <w:t>Video #9 - #11 (INNER, LEFT, RIGHT, FULL Joins)</w:t>
-            </w:r>
-          </w:p>
-        </w:tc>
-        <w:tc>
-          <w:tcPr>
-            <w:tcW w:type="dxa" w:w="1728"/>
-            <w:tcMar>
-              <w:top w:w="80" w:type="dxa"/>
-              <w:bottom w:w="80" w:type="dxa"/>
-              <w:left w:w="100" w:type="dxa"/>
-              <w:right w:w="100" w:type="dxa"/>
-            </w:tcMar>
-            <w:shd w:fill="F8FAFC"/>
-          </w:tcPr>
-          <w:p>
-            <w:r>
-              <w:rPr>
-                <w:rFonts w:ascii="Arial" w:hAnsi="Arial"/>
-                <w:color w:val="334155"/>
-                <w:sz w:val="17"/>
-              </w:rPr>
-              <w:t>✅ Completed</w:t>
-            </w:r>
-          </w:p>
-        </w:tc>
-      </w:tr>
-      <w:tr>
-        <w:tc>
-          <w:tcPr>
-            <w:tcW w:type="dxa" w:w="1728"/>
-            <w:tcMar>
-              <w:top w:w="80" w:type="dxa"/>
-              <w:bottom w:w="80" w:type="dxa"/>
-              <w:left w:w="100" w:type="dxa"/>
-              <w:right w:w="100" w:type="dxa"/>
-            </w:tcMar>
-            <w:shd w:fill="FFFFFF"/>
-          </w:tcPr>
-          <w:p>
-            <w:r>
-              <w:rPr>
-                <w:rFonts w:ascii="Arial" w:hAnsi="Arial"/>
-                <w:color w:val="334155"/>
-                <w:sz w:val="17"/>
-              </w:rPr>
-              <w:t>Day 4</w:t>
-            </w:r>
-          </w:p>
-        </w:tc>
-        <w:tc>
-          <w:tcPr>
-            <w:tcW w:type="dxa" w:w="1728"/>
-            <w:tcMar>
-              <w:top w:w="80" w:type="dxa"/>
-              <w:bottom w:w="80" w:type="dxa"/>
-              <w:left w:w="100" w:type="dxa"/>
-              <w:right w:w="100" w:type="dxa"/>
-            </w:tcMar>
-            <w:shd w:fill="FFFFFF"/>
-          </w:tcPr>
-          <w:p>
-            <w:r>
-              <w:rPr>
-                <w:rFonts w:ascii="Arial" w:hAnsi="Arial"/>
-                <w:color w:val="334155"/>
-                <w:sz w:val="17"/>
-              </w:rPr>
-              <w:t>July 13</w:t>
-            </w:r>
-          </w:p>
-        </w:tc>
-        <w:tc>
-          <w:tcPr>
-            <w:tcW w:type="dxa" w:w="1728"/>
-            <w:tcMar>
-              <w:top w:w="80" w:type="dxa"/>
-              <w:bottom w:w="80" w:type="dxa"/>
-              <w:left w:w="100" w:type="dxa"/>
-              <w:right w:w="100" w:type="dxa"/>
-            </w:tcMar>
-            <w:shd w:fill="FFFFFF"/>
-          </w:tcPr>
-          <w:p>
-            <w:r>
-              <w:rPr>
-                <w:rFonts w:ascii="Arial" w:hAnsi="Arial"/>
-                <w:color w:val="334155"/>
-                <w:sz w:val="17"/>
-              </w:rPr>
-              <w:t>Set Operators &amp; Functions</w:t>
-            </w:r>
-          </w:p>
-        </w:tc>
-        <w:tc>
-          <w:tcPr>
-            <w:tcW w:type="dxa" w:w="1728"/>
-            <w:tcMar>
-              <w:top w:w="80" w:type="dxa"/>
-              <w:bottom w:w="80" w:type="dxa"/>
-              <w:left w:w="100" w:type="dxa"/>
-              <w:right w:w="100" w:type="dxa"/>
-            </w:tcMar>
-            <w:shd w:fill="FFFFFF"/>
-          </w:tcPr>
-          <w:p>
-            <w:r>
-              <w:rPr>
-                <w:rFonts w:ascii="Arial" w:hAnsi="Arial"/>
-                <w:color w:val="334155"/>
-                <w:sz w:val="17"/>
-              </w:rPr>
-              <w:t>Video #12 - #15 (UNION, INTERSECT, String/Number Funcs)</w:t>
-            </w:r>
-          </w:p>
-        </w:tc>
-        <w:tc>
-          <w:tcPr>
-            <w:tcW w:type="dxa" w:w="1728"/>
-            <w:tcMar>
-              <w:top w:w="80" w:type="dxa"/>
-              <w:bottom w:w="80" w:type="dxa"/>
-              <w:left w:w="100" w:type="dxa"/>
-              <w:right w:w="100" w:type="dxa"/>
-            </w:tcMar>
-            <w:shd w:fill="FFFFFF"/>
-          </w:tcPr>
-          <w:p>
-            <w:r>
-              <w:rPr>
-                <w:rFonts w:ascii="Arial" w:hAnsi="Arial"/>
-                <w:color w:val="334155"/>
-                <w:sz w:val="17"/>
-              </w:rPr>
-              <w:t>✅ Completed</w:t>
-            </w:r>
-          </w:p>
-        </w:tc>
-      </w:tr>
-      <w:tr>
-        <w:tc>
-          <w:tcPr>
-            <w:tcW w:type="dxa" w:w="1728"/>
-            <w:tcMar>
-              <w:top w:w="80" w:type="dxa"/>
-              <w:bottom w:w="80" w:type="dxa"/>
-              <w:left w:w="100" w:type="dxa"/>
-              <w:right w:w="100" w:type="dxa"/>
-            </w:tcMar>
-            <w:shd w:fill="F8FAFC"/>
-          </w:tcPr>
-          <w:p>
-            <w:r>
-              <w:rPr>
-                <w:rFonts w:ascii="Arial" w:hAnsi="Arial"/>
-                <w:color w:val="334155"/>
-                <w:sz w:val="17"/>
-              </w:rPr>
-              <w:t>Day 5</w:t>
-            </w:r>
-          </w:p>
-        </w:tc>
-        <w:tc>
-          <w:tcPr>
-            <w:tcW w:type="dxa" w:w="1728"/>
-            <w:tcMar>
-              <w:top w:w="80" w:type="dxa"/>
-              <w:bottom w:w="80" w:type="dxa"/>
-              <w:left w:w="100" w:type="dxa"/>
-              <w:right w:w="100" w:type="dxa"/>
-            </w:tcMar>
-            <w:shd w:fill="F8FAFC"/>
-          </w:tcPr>
-          <w:p>
-            <w:r>
-              <w:rPr>
-                <w:rFonts w:ascii="Arial" w:hAnsi="Arial"/>
-                <w:color w:val="334155"/>
-                <w:sz w:val="17"/>
-              </w:rPr>
-              <w:t>July 14</w:t>
-            </w:r>
-          </w:p>
-        </w:tc>
-        <w:tc>
-          <w:tcPr>
-            <w:tcW w:type="dxa" w:w="1728"/>
-            <w:tcMar>
-              <w:top w:w="80" w:type="dxa"/>
-              <w:bottom w:w="80" w:type="dxa"/>
-              <w:left w:w="100" w:type="dxa"/>
-              <w:right w:w="100" w:type="dxa"/>
-            </w:tcMar>
-            <w:shd w:fill="F8FAFC"/>
-          </w:tcPr>
-          <w:p>
-            <w:r>
-              <w:rPr>
-                <w:rFonts w:ascii="Arial" w:hAnsi="Arial"/>
-                <w:color w:val="334155"/>
-                <w:sz w:val="17"/>
-              </w:rPr>
-              <w:t>Date &amp; NULL Handling</w:t>
-            </w:r>
-          </w:p>
-        </w:tc>
-        <w:tc>
-          <w:tcPr>
-            <w:tcW w:type="dxa" w:w="1728"/>
-            <w:tcMar>
-              <w:top w:w="80" w:type="dxa"/>
-              <w:bottom w:w="80" w:type="dxa"/>
-              <w:left w:w="100" w:type="dxa"/>
-              <w:right w:w="100" w:type="dxa"/>
-            </w:tcMar>
-            <w:shd w:fill="F8FAFC"/>
-          </w:tcPr>
-          <w:p>
-            <w:r>
-              <w:rPr>
-                <w:rFonts w:ascii="Arial" w:hAnsi="Arial"/>
-                <w:color w:val="334155"/>
-                <w:sz w:val="17"/>
-              </w:rPr>
-              <w:t>Video #16 - #20 (Date Functions, COALESCE, NULL vs Empty)</w:t>
-            </w:r>
-          </w:p>
-        </w:tc>
-        <w:tc>
-          <w:tcPr>
-            <w:tcW w:type="dxa" w:w="1728"/>
-            <w:tcMar>
-              <w:top w:w="80" w:type="dxa"/>
-              <w:bottom w:w="80" w:type="dxa"/>
-              <w:left w:w="100" w:type="dxa"/>
-              <w:right w:w="100" w:type="dxa"/>
-            </w:tcMar>
-            <w:shd w:fill="F8FAFC"/>
-          </w:tcPr>
-          <w:p>
-            <w:r>
-              <w:rPr>
-                <w:rFonts w:ascii="Arial" w:hAnsi="Arial"/>
-                <w:color w:val="334155"/>
-                <w:sz w:val="17"/>
-              </w:rPr>
-              <w:t>✅ Completed</w:t>
-            </w:r>
-          </w:p>
-        </w:tc>
-      </w:tr>
-      <w:tr>
-        <w:tc>
-          <w:tcPr>
-            <w:tcW w:type="dxa" w:w="1728"/>
-            <w:tcMar>
-              <w:top w:w="80" w:type="dxa"/>
-              <w:bottom w:w="80" w:type="dxa"/>
-              <w:left w:w="100" w:type="dxa"/>
-              <w:right w:w="100" w:type="dxa"/>
-            </w:tcMar>
-            <w:shd w:fill="FFFFFF"/>
-          </w:tcPr>
-          <w:p>
-            <w:r>
-              <w:rPr>
-                <w:rFonts w:ascii="Arial" w:hAnsi="Arial"/>
-                <w:color w:val="334155"/>
-                <w:sz w:val="17"/>
-              </w:rPr>
-              <w:t>Day 6</w:t>
-            </w:r>
-          </w:p>
-        </w:tc>
-        <w:tc>
-          <w:tcPr>
-            <w:tcW w:type="dxa" w:w="1728"/>
-            <w:tcMar>
-              <w:top w:w="80" w:type="dxa"/>
-              <w:bottom w:w="80" w:type="dxa"/>
-              <w:left w:w="100" w:type="dxa"/>
-              <w:right w:w="100" w:type="dxa"/>
-            </w:tcMar>
-            <w:shd w:fill="FFFFFF"/>
-          </w:tcPr>
-          <w:p>
-            <w:r>
-              <w:rPr>
-                <w:rFonts w:ascii="Arial" w:hAnsi="Arial"/>
-                <w:color w:val="334155"/>
-                <w:sz w:val="17"/>
-              </w:rPr>
-              <w:t>July 15</w:t>
-            </w:r>
-          </w:p>
-        </w:tc>
-        <w:tc>
-          <w:tcPr>
-            <w:tcW w:type="dxa" w:w="1728"/>
-            <w:tcMar>
-              <w:top w:w="80" w:type="dxa"/>
-              <w:bottom w:w="80" w:type="dxa"/>
-              <w:left w:w="100" w:type="dxa"/>
-              <w:right w:w="100" w:type="dxa"/>
-            </w:tcMar>
-            <w:shd w:fill="FFFFFF"/>
-          </w:tcPr>
-          <w:p>
-            <w:r>
-              <w:rPr>
-                <w:rFonts w:ascii="Arial" w:hAnsi="Arial"/>
-                <w:color w:val="334155"/>
-                <w:sz w:val="17"/>
-              </w:rPr>
-              <w:t>CASE WHEN &amp; Aggregates</w:t>
-            </w:r>
-          </w:p>
-        </w:tc>
-        <w:tc>
-          <w:tcPr>
-            <w:tcW w:type="dxa" w:w="1728"/>
-            <w:tcMar>
-              <w:top w:w="80" w:type="dxa"/>
-              <w:bottom w:w="80" w:type="dxa"/>
-              <w:left w:w="100" w:type="dxa"/>
-              <w:right w:w="100" w:type="dxa"/>
-            </w:tcMar>
-            <w:shd w:fill="FFFFFF"/>
-          </w:tcPr>
-          <w:p>
-            <w:r>
-              <w:rPr>
-                <w:rFonts w:ascii="Arial" w:hAnsi="Arial"/>
-                <w:color w:val="334155"/>
-                <w:sz w:val="17"/>
-              </w:rPr>
-              <w:t>Video #21 - #22 (CASE WHEN, COUNT, SUM, AVG, MIN/MAX)</w:t>
-            </w:r>
-          </w:p>
-        </w:tc>
-        <w:tc>
-          <w:tcPr>
-            <w:tcW w:type="dxa" w:w="1728"/>
-            <w:tcMar>
-              <w:top w:w="80" w:type="dxa"/>
-              <w:bottom w:w="80" w:type="dxa"/>
-              <w:left w:w="100" w:type="dxa"/>
-              <w:right w:w="100" w:type="dxa"/>
-            </w:tcMar>
-            <w:shd w:fill="FFFFFF"/>
-          </w:tcPr>
-          <w:p>
-            <w:r>
-              <w:rPr>
-                <w:rFonts w:ascii="Arial" w:hAnsi="Arial"/>
-                <w:color w:val="334155"/>
-                <w:sz w:val="17"/>
-              </w:rPr>
-              <w:t>✅ Completed</w:t>
-            </w:r>
-          </w:p>
-        </w:tc>
-      </w:tr>
-      <w:tr>
-        <w:tc>
-          <w:tcPr>
-            <w:tcW w:type="dxa" w:w="1728"/>
-            <w:tcMar>
-              <w:top w:w="80" w:type="dxa"/>
-              <w:bottom w:w="80" w:type="dxa"/>
-              <w:left w:w="100" w:type="dxa"/>
-              <w:right w:w="100" w:type="dxa"/>
-            </w:tcMar>
-            <w:shd w:fill="F8FAFC"/>
-          </w:tcPr>
-          <w:p>
-            <w:r>
-              <w:rPr>
-                <w:rFonts w:ascii="Arial" w:hAnsi="Arial"/>
-                <w:color w:val="334155"/>
-                <w:sz w:val="17"/>
-              </w:rPr>
-              <w:t>Day 7</w:t>
-            </w:r>
-          </w:p>
-        </w:tc>
-        <w:tc>
-          <w:tcPr>
-            <w:tcW w:type="dxa" w:w="1728"/>
-            <w:tcMar>
-              <w:top w:w="80" w:type="dxa"/>
-              <w:bottom w:w="80" w:type="dxa"/>
-              <w:left w:w="100" w:type="dxa"/>
-              <w:right w:w="100" w:type="dxa"/>
-            </w:tcMar>
-            <w:shd w:fill="F8FAFC"/>
-          </w:tcPr>
-          <w:p>
-            <w:r>
-              <w:rPr>
-                <w:rFonts w:ascii="Arial" w:hAnsi="Arial"/>
-                <w:color w:val="334155"/>
-                <w:sz w:val="17"/>
-              </w:rPr>
-              <w:t>July 16</w:t>
-            </w:r>
-          </w:p>
-        </w:tc>
-        <w:tc>
-          <w:tcPr>
-            <w:tcW w:type="dxa" w:w="1728"/>
-            <w:tcMar>
-              <w:top w:w="80" w:type="dxa"/>
-              <w:bottom w:w="80" w:type="dxa"/>
-              <w:left w:w="100" w:type="dxa"/>
-              <w:right w:w="100" w:type="dxa"/>
-            </w:tcMar>
-            <w:shd w:fill="F8FAFC"/>
-          </w:tcPr>
-          <w:p>
-            <w:r>
-              <w:rPr>
-                <w:rFonts w:ascii="Arial" w:hAnsi="Arial"/>
-                <w:color w:val="334155"/>
-                <w:sz w:val="17"/>
-              </w:rPr>
-              <w:t>Milestone Mock 1</w:t>
-            </w:r>
-          </w:p>
-        </w:tc>
-        <w:tc>
-          <w:tcPr>
-            <w:tcW w:type="dxa" w:w="1728"/>
-            <w:tcMar>
-              <w:top w:w="80" w:type="dxa"/>
-              <w:bottom w:w="80" w:type="dxa"/>
-              <w:left w:w="100" w:type="dxa"/>
-              <w:right w:w="100" w:type="dxa"/>
-            </w:tcMar>
-            <w:shd w:fill="F8FAFC"/>
-          </w:tcPr>
-          <w:p>
-            <w:r>
-              <w:rPr>
-                <w:rFonts w:ascii="Arial" w:hAnsi="Arial"/>
-                <w:color w:val="334155"/>
-                <w:sz w:val="17"/>
-              </w:rPr>
-              <w:t>**Blinkit Growth Analyst Mock Exam** (30 Mins, 8 Qs)</w:t>
-            </w:r>
-          </w:p>
-        </w:tc>
-        <w:tc>
-          <w:tcPr>
-            <w:tcW w:type="dxa" w:w="1728"/>
-            <w:tcMar>
-              <w:top w:w="80" w:type="dxa"/>
-              <w:bottom w:w="80" w:type="dxa"/>
-              <w:left w:w="100" w:type="dxa"/>
-              <w:right w:w="100" w:type="dxa"/>
-            </w:tcMar>
-            <w:shd w:fill="F8FAFC"/>
-          </w:tcPr>
-          <w:p>
-            <w:r>
-              <w:rPr>
-                <w:rFonts w:ascii="Arial" w:hAnsi="Arial"/>
-                <w:color w:val="334155"/>
-                <w:sz w:val="17"/>
-              </w:rPr>
-              <w:t>✅ Completed</w:t>
-            </w:r>
-          </w:p>
-        </w:tc>
-      </w:tr>
-      <w:tr>
-        <w:tc>
-          <w:tcPr>
-            <w:tcW w:type="dxa" w:w="1728"/>
-            <w:tcMar>
-              <w:top w:w="80" w:type="dxa"/>
-              <w:bottom w:w="80" w:type="dxa"/>
-              <w:left w:w="100" w:type="dxa"/>
-              <w:right w:w="100" w:type="dxa"/>
-            </w:tcMar>
-            <w:shd w:fill="FFFFFF"/>
-          </w:tcPr>
-          <w:p>
-            <w:r>
-              <w:rPr>
-                <w:rFonts w:ascii="Arial" w:hAnsi="Arial"/>
-                <w:color w:val="334155"/>
-                <w:sz w:val="17"/>
-              </w:rPr>
-              <w:t>Day 8</w:t>
-            </w:r>
-          </w:p>
-        </w:tc>
-        <w:tc>
-          <w:tcPr>
-            <w:tcW w:type="dxa" w:w="1728"/>
-            <w:tcMar>
-              <w:top w:w="80" w:type="dxa"/>
-              <w:bottom w:w="80" w:type="dxa"/>
-              <w:left w:w="100" w:type="dxa"/>
-              <w:right w:w="100" w:type="dxa"/>
-            </w:tcMar>
-            <w:shd w:fill="FFFFFF"/>
-          </w:tcPr>
-          <w:p>
-            <w:r>
-              <w:rPr>
-                <w:rFonts w:ascii="Arial" w:hAnsi="Arial"/>
-                <w:color w:val="334155"/>
-                <w:sz w:val="17"/>
-              </w:rPr>
-              <w:t>July 17</w:t>
-            </w:r>
-          </w:p>
-        </w:tc>
-        <w:tc>
-          <w:tcPr>
-            <w:tcW w:type="dxa" w:w="1728"/>
-            <w:tcMar>
-              <w:top w:w="80" w:type="dxa"/>
-              <w:bottom w:w="80" w:type="dxa"/>
-              <w:left w:w="100" w:type="dxa"/>
-              <w:right w:w="100" w:type="dxa"/>
-            </w:tcMar>
-            <w:shd w:fill="FFFFFF"/>
-          </w:tcPr>
-          <w:p>
-            <w:r>
-              <w:rPr>
-                <w:rFonts w:ascii="Arial" w:hAnsi="Arial"/>
-                <w:color w:val="334155"/>
-                <w:sz w:val="17"/>
-              </w:rPr>
-              <w:t>Window Functions Basics</w:t>
-            </w:r>
-          </w:p>
-        </w:tc>
-        <w:tc>
-          <w:tcPr>
-            <w:tcW w:type="dxa" w:w="1728"/>
-            <w:tcMar>
-              <w:top w:w="80" w:type="dxa"/>
-              <w:bottom w:w="80" w:type="dxa"/>
-              <w:left w:w="100" w:type="dxa"/>
-              <w:right w:w="100" w:type="dxa"/>
-            </w:tcMar>
-            <w:shd w:fill="FFFFFF"/>
-          </w:tcPr>
-          <w:p>
-            <w:r>
-              <w:rPr>
-                <w:rFonts w:ascii="Arial" w:hAnsi="Arial"/>
-                <w:color w:val="334155"/>
-                <w:sz w:val="17"/>
-              </w:rPr>
-              <w:t>Video #23 - #24 (PARTITION BY, ORDER BY, Window Aggregates)</w:t>
-            </w:r>
-          </w:p>
-        </w:tc>
-        <w:tc>
-          <w:tcPr>
-            <w:tcW w:type="dxa" w:w="1728"/>
-            <w:tcMar>
-              <w:top w:w="80" w:type="dxa"/>
-              <w:bottom w:w="80" w:type="dxa"/>
-              <w:left w:w="100" w:type="dxa"/>
-              <w:right w:w="100" w:type="dxa"/>
-            </w:tcMar>
-            <w:shd w:fill="FFFFFF"/>
-          </w:tcPr>
-          <w:p>
-            <w:r>
-              <w:rPr>
-                <w:rFonts w:ascii="Arial" w:hAnsi="Arial"/>
-                <w:color w:val="334155"/>
-                <w:sz w:val="17"/>
-              </w:rPr>
-              <w:t>✅ Completed</w:t>
-            </w:r>
-          </w:p>
-        </w:tc>
-      </w:tr>
-      <w:tr>
-        <w:tc>
-          <w:tcPr>
-            <w:tcW w:type="dxa" w:w="1728"/>
-            <w:tcMar>
-              <w:top w:w="80" w:type="dxa"/>
-              <w:bottom w:w="80" w:type="dxa"/>
-              <w:left w:w="100" w:type="dxa"/>
-              <w:right w:w="100" w:type="dxa"/>
-            </w:tcMar>
-            <w:shd w:fill="F8FAFC"/>
-          </w:tcPr>
-          <w:p>
-            <w:r>
-              <w:rPr>
-                <w:rFonts w:ascii="Arial" w:hAnsi="Arial"/>
-                <w:color w:val="334155"/>
-                <w:sz w:val="17"/>
-              </w:rPr>
-              <w:t>Day 9</w:t>
-            </w:r>
-          </w:p>
-        </w:tc>
-        <w:tc>
-          <w:tcPr>
-            <w:tcW w:type="dxa" w:w="1728"/>
-            <w:tcMar>
-              <w:top w:w="80" w:type="dxa"/>
-              <w:bottom w:w="80" w:type="dxa"/>
-              <w:left w:w="100" w:type="dxa"/>
-              <w:right w:w="100" w:type="dxa"/>
-            </w:tcMar>
-            <w:shd w:fill="F8FAFC"/>
-          </w:tcPr>
-          <w:p>
-            <w:r>
-              <w:rPr>
-                <w:rFonts w:ascii="Arial" w:hAnsi="Arial"/>
-                <w:color w:val="334155"/>
-                <w:sz w:val="17"/>
-              </w:rPr>
-              <w:t>July 18</w:t>
-            </w:r>
-          </w:p>
-        </w:tc>
-        <w:tc>
-          <w:tcPr>
-            <w:tcW w:type="dxa" w:w="1728"/>
-            <w:tcMar>
-              <w:top w:w="80" w:type="dxa"/>
-              <w:bottom w:w="80" w:type="dxa"/>
-              <w:left w:w="100" w:type="dxa"/>
-              <w:right w:w="100" w:type="dxa"/>
-            </w:tcMar>
-            <w:shd w:fill="F8FAFC"/>
-          </w:tcPr>
-          <w:p>
-            <w:r>
-              <w:rPr>
-                <w:rFonts w:ascii="Arial" w:hAnsi="Arial"/>
-                <w:color w:val="334155"/>
-                <w:sz w:val="17"/>
-              </w:rPr>
-              <w:t>Window Ranking Functions</w:t>
-            </w:r>
-          </w:p>
-        </w:tc>
-        <w:tc>
-          <w:tcPr>
-            <w:tcW w:type="dxa" w:w="1728"/>
-            <w:tcMar>
-              <w:top w:w="80" w:type="dxa"/>
-              <w:bottom w:w="80" w:type="dxa"/>
-              <w:left w:w="100" w:type="dxa"/>
-              <w:right w:w="100" w:type="dxa"/>
-            </w:tcMar>
-            <w:shd w:fill="F8FAFC"/>
-          </w:tcPr>
-          <w:p>
-            <w:r>
-              <w:rPr>
-                <w:rFonts w:ascii="Arial" w:hAnsi="Arial"/>
-                <w:color w:val="334155"/>
-                <w:sz w:val="17"/>
-              </w:rPr>
-              <w:t>Video #25 (ROW_NUMBER, RANK, DENSE_RANK, NTILE)</w:t>
-            </w:r>
-          </w:p>
-        </w:tc>
-        <w:tc>
-          <w:tcPr>
-            <w:tcW w:type="dxa" w:w="1728"/>
-            <w:tcMar>
-              <w:top w:w="80" w:type="dxa"/>
-              <w:bottom w:w="80" w:type="dxa"/>
-              <w:left w:w="100" w:type="dxa"/>
-              <w:right w:w="100" w:type="dxa"/>
-            </w:tcMar>
-            <w:shd w:fill="F8FAFC"/>
-          </w:tcPr>
-          <w:p>
-            <w:r>
-              <w:rPr>
-                <w:rFonts w:ascii="Arial" w:hAnsi="Arial"/>
-                <w:color w:val="334155"/>
-                <w:sz w:val="17"/>
-              </w:rPr>
-              <w:t>✅ Completed</w:t>
-            </w:r>
-          </w:p>
-        </w:tc>
-      </w:tr>
-      <w:tr>
-        <w:tc>
-          <w:tcPr>
-            <w:tcW w:type="dxa" w:w="1728"/>
-            <w:tcMar>
-              <w:top w:w="80" w:type="dxa"/>
-              <w:bottom w:w="80" w:type="dxa"/>
-              <w:left w:w="100" w:type="dxa"/>
-              <w:right w:w="100" w:type="dxa"/>
-            </w:tcMar>
-            <w:shd w:fill="FFFFFF"/>
-          </w:tcPr>
-          <w:p>
-            <w:r>
-              <w:rPr>
-                <w:rFonts w:ascii="Arial" w:hAnsi="Arial"/>
-                <w:color w:val="334155"/>
-                <w:sz w:val="17"/>
-              </w:rPr>
-              <w:t>Day 10</w:t>
-            </w:r>
-          </w:p>
-        </w:tc>
-        <w:tc>
-          <w:tcPr>
-            <w:tcW w:type="dxa" w:w="1728"/>
-            <w:tcMar>
-              <w:top w:w="80" w:type="dxa"/>
-              <w:bottom w:w="80" w:type="dxa"/>
-              <w:left w:w="100" w:type="dxa"/>
-              <w:right w:w="100" w:type="dxa"/>
-            </w:tcMar>
-            <w:shd w:fill="FFFFFF"/>
-          </w:tcPr>
-          <w:p>
-            <w:r>
-              <w:rPr>
-                <w:rFonts w:ascii="Arial" w:hAnsi="Arial"/>
-                <w:color w:val="334155"/>
-                <w:sz w:val="17"/>
-              </w:rPr>
-              <w:t>July 19</w:t>
-            </w:r>
-          </w:p>
-        </w:tc>
-        <w:tc>
-          <w:tcPr>
-            <w:tcW w:type="dxa" w:w="1728"/>
-            <w:tcMar>
-              <w:top w:w="80" w:type="dxa"/>
-              <w:bottom w:w="80" w:type="dxa"/>
-              <w:left w:w="100" w:type="dxa"/>
-              <w:right w:w="100" w:type="dxa"/>
-            </w:tcMar>
-            <w:shd w:fill="FFFFFF"/>
-          </w:tcPr>
-          <w:p>
-            <w:r>
-              <w:rPr>
-                <w:rFonts w:ascii="Arial" w:hAnsi="Arial"/>
-                <w:color w:val="334155"/>
-                <w:sz w:val="17"/>
-              </w:rPr>
-              <w:t>Window Value Functions</w:t>
-            </w:r>
-          </w:p>
-        </w:tc>
-        <w:tc>
-          <w:tcPr>
-            <w:tcW w:type="dxa" w:w="1728"/>
-            <w:tcMar>
-              <w:top w:w="80" w:type="dxa"/>
-              <w:bottom w:w="80" w:type="dxa"/>
-              <w:left w:w="100" w:type="dxa"/>
-              <w:right w:w="100" w:type="dxa"/>
-            </w:tcMar>
-            <w:shd w:fill="FFFFFF"/>
-          </w:tcPr>
-          <w:p>
-            <w:r>
-              <w:rPr>
-                <w:rFonts w:ascii="Arial" w:hAnsi="Arial"/>
-                <w:color w:val="334155"/>
-                <w:sz w:val="17"/>
-              </w:rPr>
-              <w:t>Video #26 - #27 (LEAD, LAG, FIRST_VALUE, 5 SQL Techniques)</w:t>
-            </w:r>
-          </w:p>
-        </w:tc>
-        <w:tc>
-          <w:tcPr>
-            <w:tcW w:type="dxa" w:w="1728"/>
-            <w:tcMar>
-              <w:top w:w="80" w:type="dxa"/>
-              <w:bottom w:w="80" w:type="dxa"/>
-              <w:left w:w="100" w:type="dxa"/>
-              <w:right w:w="100" w:type="dxa"/>
-            </w:tcMar>
-            <w:shd w:fill="FFFFFF"/>
-          </w:tcPr>
-          <w:p>
-            <w:r>
-              <w:rPr>
-                <w:rFonts w:ascii="Arial" w:hAnsi="Arial"/>
-                <w:color w:val="334155"/>
-                <w:sz w:val="17"/>
-              </w:rPr>
-              <w:t>✅ Completed</w:t>
-            </w:r>
-          </w:p>
-        </w:tc>
-      </w:tr>
-      <w:tr>
-        <w:tc>
-          <w:tcPr>
-            <w:tcW w:type="dxa" w:w="1728"/>
-            <w:tcMar>
-              <w:top w:w="80" w:type="dxa"/>
-              <w:bottom w:w="80" w:type="dxa"/>
-              <w:left w:w="100" w:type="dxa"/>
-              <w:right w:w="100" w:type="dxa"/>
-            </w:tcMar>
-            <w:shd w:fill="F8FAFC"/>
-          </w:tcPr>
-          <w:p>
-            <w:r>
-              <w:rPr>
-                <w:rFonts w:ascii="Arial" w:hAnsi="Arial"/>
-                <w:color w:val="334155"/>
-                <w:sz w:val="17"/>
-              </w:rPr>
-              <w:t>Day 11</w:t>
-            </w:r>
-          </w:p>
-        </w:tc>
-        <w:tc>
-          <w:tcPr>
-            <w:tcW w:type="dxa" w:w="1728"/>
-            <w:tcMar>
-              <w:top w:w="80" w:type="dxa"/>
-              <w:bottom w:w="80" w:type="dxa"/>
-              <w:left w:w="100" w:type="dxa"/>
-              <w:right w:w="100" w:type="dxa"/>
-            </w:tcMar>
-            <w:shd w:fill="F8FAFC"/>
-          </w:tcPr>
-          <w:p>
-            <w:r>
-              <w:rPr>
-                <w:rFonts w:ascii="Arial" w:hAnsi="Arial"/>
-                <w:color w:val="334155"/>
-                <w:sz w:val="17"/>
-              </w:rPr>
-              <w:t>July 20</w:t>
-            </w:r>
-          </w:p>
-        </w:tc>
-        <w:tc>
-          <w:tcPr>
-            <w:tcW w:type="dxa" w:w="1728"/>
-            <w:tcMar>
-              <w:top w:w="80" w:type="dxa"/>
-              <w:bottom w:w="80" w:type="dxa"/>
-              <w:left w:w="100" w:type="dxa"/>
-              <w:right w:w="100" w:type="dxa"/>
-            </w:tcMar>
-            <w:shd w:fill="F8FAFC"/>
-          </w:tcPr>
-          <w:p>
-            <w:r>
-              <w:rPr>
-                <w:rFonts w:ascii="Arial" w:hAnsi="Arial"/>
-                <w:color w:val="334155"/>
-                <w:sz w:val="17"/>
-              </w:rPr>
-              <w:t>Subqueries &amp; CTEs</w:t>
-            </w:r>
-          </w:p>
-        </w:tc>
-        <w:tc>
-          <w:tcPr>
-            <w:tcW w:type="dxa" w:w="1728"/>
-            <w:tcMar>
-              <w:top w:w="80" w:type="dxa"/>
-              <w:bottom w:w="80" w:type="dxa"/>
-              <w:left w:w="100" w:type="dxa"/>
-              <w:right w:w="100" w:type="dxa"/>
-            </w:tcMar>
-            <w:shd w:fill="F8FAFC"/>
-          </w:tcPr>
-          <w:p>
-            <w:r>
-              <w:rPr>
-                <w:rFonts w:ascii="Arial" w:hAnsi="Arial"/>
-                <w:color w:val="334155"/>
-                <w:sz w:val="17"/>
-              </w:rPr>
-              <w:t>Video #28 - #29 (Subqueries, Correlated Subqueries, CTEs)</w:t>
-            </w:r>
-          </w:p>
-        </w:tc>
-        <w:tc>
-          <w:tcPr>
-            <w:tcW w:type="dxa" w:w="1728"/>
-            <w:tcMar>
-              <w:top w:w="80" w:type="dxa"/>
-              <w:bottom w:w="80" w:type="dxa"/>
-              <w:left w:w="100" w:type="dxa"/>
-              <w:right w:w="100" w:type="dxa"/>
-            </w:tcMar>
-            <w:shd w:fill="F8FAFC"/>
-          </w:tcPr>
-          <w:p>
-            <w:r>
-              <w:rPr>
-                <w:rFonts w:ascii="Arial" w:hAnsi="Arial"/>
-                <w:color w:val="334155"/>
-                <w:sz w:val="17"/>
-              </w:rPr>
-              <w:t>✅ Completed</w:t>
-            </w:r>
-          </w:p>
-        </w:tc>
-      </w:tr>
-      <w:tr>
-        <w:tc>
-          <w:tcPr>
-            <w:tcW w:type="dxa" w:w="1728"/>
-            <w:tcMar>
-              <w:top w:w="80" w:type="dxa"/>
-              <w:bottom w:w="80" w:type="dxa"/>
-              <w:left w:w="100" w:type="dxa"/>
-              <w:right w:w="100" w:type="dxa"/>
-            </w:tcMar>
-            <w:shd w:fill="FFFFFF"/>
-          </w:tcPr>
-          <w:p>
-            <w:r>
-              <w:rPr>
-                <w:rFonts w:ascii="Arial" w:hAnsi="Arial"/>
-                <w:color w:val="334155"/>
-                <w:sz w:val="17"/>
-              </w:rPr>
-              <w:t>Day 12</w:t>
-            </w:r>
-          </w:p>
-        </w:tc>
-        <w:tc>
-          <w:tcPr>
-            <w:tcW w:type="dxa" w:w="1728"/>
-            <w:tcMar>
-              <w:top w:w="80" w:type="dxa"/>
-              <w:bottom w:w="80" w:type="dxa"/>
-              <w:left w:w="100" w:type="dxa"/>
-              <w:right w:w="100" w:type="dxa"/>
-            </w:tcMar>
-            <w:shd w:fill="FFFFFF"/>
-          </w:tcPr>
-          <w:p>
-            <w:r>
-              <w:rPr>
-                <w:rFonts w:ascii="Arial" w:hAnsi="Arial"/>
-                <w:color w:val="334155"/>
-                <w:sz w:val="17"/>
-              </w:rPr>
-              <w:t>July 21</w:t>
-            </w:r>
-          </w:p>
-        </w:tc>
-        <w:tc>
-          <w:tcPr>
-            <w:tcW w:type="dxa" w:w="1728"/>
-            <w:tcMar>
-              <w:top w:w="80" w:type="dxa"/>
-              <w:bottom w:w="80" w:type="dxa"/>
-              <w:left w:w="100" w:type="dxa"/>
-              <w:right w:w="100" w:type="dxa"/>
-            </w:tcMar>
-            <w:shd w:fill="FFFFFF"/>
-          </w:tcPr>
-          <w:p>
-            <w:r>
-              <w:rPr>
-                <w:rFonts w:ascii="Arial" w:hAnsi="Arial"/>
-                <w:color w:val="334155"/>
-                <w:sz w:val="17"/>
-              </w:rPr>
-              <w:t>Milestone Mock 2</w:t>
-            </w:r>
-          </w:p>
-        </w:tc>
-        <w:tc>
-          <w:tcPr>
-            <w:tcW w:type="dxa" w:w="1728"/>
-            <w:tcMar>
-              <w:top w:w="80" w:type="dxa"/>
-              <w:bottom w:w="80" w:type="dxa"/>
-              <w:left w:w="100" w:type="dxa"/>
-              <w:right w:w="100" w:type="dxa"/>
-            </w:tcMar>
-            <w:shd w:fill="FFFFFF"/>
-          </w:tcPr>
-          <w:p>
-            <w:r>
-              <w:rPr>
-                <w:rFonts w:ascii="Arial" w:hAnsi="Arial"/>
-                <w:color w:val="334155"/>
-                <w:sz w:val="17"/>
-              </w:rPr>
-              <w:t>**Zomato Growth Analyst Mock Exam** (40 Mins, 20 Qs)</w:t>
-            </w:r>
-          </w:p>
-        </w:tc>
-        <w:tc>
-          <w:tcPr>
-            <w:tcW w:type="dxa" w:w="1728"/>
-            <w:tcMar>
-              <w:top w:w="80" w:type="dxa"/>
-              <w:bottom w:w="80" w:type="dxa"/>
-              <w:left w:w="100" w:type="dxa"/>
-              <w:right w:w="100" w:type="dxa"/>
-            </w:tcMar>
-            <w:shd w:fill="FFFFFF"/>
-          </w:tcPr>
-          <w:p>
-            <w:r>
-              <w:rPr>
-                <w:rFonts w:ascii="Arial" w:hAnsi="Arial"/>
-                <w:color w:val="334155"/>
-                <w:sz w:val="17"/>
-              </w:rPr>
-              <w:t>✅ Completed</w:t>
-            </w:r>
-          </w:p>
-        </w:tc>
-      </w:tr>
-      <w:tr>
-        <w:tc>
-          <w:tcPr>
-            <w:tcW w:type="dxa" w:w="1728"/>
-            <w:tcMar>
-              <w:top w:w="80" w:type="dxa"/>
-              <w:bottom w:w="80" w:type="dxa"/>
-              <w:left w:w="100" w:type="dxa"/>
-              <w:right w:w="100" w:type="dxa"/>
-            </w:tcMar>
-            <w:shd w:fill="F8FAFC"/>
-          </w:tcPr>
-          <w:p>
-            <w:r>
-              <w:rPr>
-                <w:rFonts w:ascii="Arial" w:hAnsi="Arial"/>
-                <w:color w:val="334155"/>
-                <w:sz w:val="17"/>
-              </w:rPr>
-              <w:t>Day 13</w:t>
-            </w:r>
-          </w:p>
-        </w:tc>
-        <w:tc>
-          <w:tcPr>
-            <w:tcW w:type="dxa" w:w="1728"/>
-            <w:tcMar>
-              <w:top w:w="80" w:type="dxa"/>
-              <w:bottom w:w="80" w:type="dxa"/>
-              <w:left w:w="100" w:type="dxa"/>
-              <w:right w:w="100" w:type="dxa"/>
-            </w:tcMar>
-            <w:shd w:fill="F8FAFC"/>
-          </w:tcPr>
-          <w:p>
-            <w:r>
-              <w:rPr>
-                <w:rFonts w:ascii="Arial" w:hAnsi="Arial"/>
-                <w:color w:val="334155"/>
-                <w:sz w:val="17"/>
-              </w:rPr>
-              <w:t>July 22</w:t>
-            </w:r>
-          </w:p>
-        </w:tc>
-        <w:tc>
-          <w:tcPr>
-            <w:tcW w:type="dxa" w:w="1728"/>
-            <w:tcMar>
-              <w:top w:w="80" w:type="dxa"/>
-              <w:bottom w:w="80" w:type="dxa"/>
-              <w:left w:w="100" w:type="dxa"/>
-              <w:right w:w="100" w:type="dxa"/>
-            </w:tcMar>
-            <w:shd w:fill="F8FAFC"/>
-          </w:tcPr>
-          <w:p>
-            <w:r>
-              <w:rPr>
-                <w:rFonts w:ascii="Arial" w:hAnsi="Arial"/>
-                <w:color w:val="334155"/>
-                <w:sz w:val="17"/>
-              </w:rPr>
-              <w:t>Database Views</w:t>
-            </w:r>
-          </w:p>
-        </w:tc>
-        <w:tc>
-          <w:tcPr>
-            <w:tcW w:type="dxa" w:w="1728"/>
-            <w:tcMar>
-              <w:top w:w="80" w:type="dxa"/>
-              <w:bottom w:w="80" w:type="dxa"/>
-              <w:left w:w="100" w:type="dxa"/>
-              <w:right w:w="100" w:type="dxa"/>
-            </w:tcMar>
-            <w:shd w:fill="F8FAFC"/>
-          </w:tcPr>
-          <w:p>
-            <w:r>
-              <w:rPr>
-                <w:rFonts w:ascii="Arial" w:hAnsi="Arial"/>
-                <w:color w:val="334155"/>
-                <w:sz w:val="17"/>
-              </w:rPr>
-              <w:t>Video #30 (SQL Views: 6 Top Use Cases)</w:t>
-            </w:r>
-          </w:p>
-        </w:tc>
-        <w:tc>
-          <w:tcPr>
-            <w:tcW w:type="dxa" w:w="1728"/>
-            <w:tcMar>
-              <w:top w:w="80" w:type="dxa"/>
-              <w:bottom w:w="80" w:type="dxa"/>
-              <w:left w:w="100" w:type="dxa"/>
-              <w:right w:w="100" w:type="dxa"/>
-            </w:tcMar>
-            <w:shd w:fill="F8FAFC"/>
-          </w:tcPr>
-          <w:p>
-            <w:r>
-              <w:rPr>
-                <w:rFonts w:ascii="Arial" w:hAnsi="Arial"/>
-                <w:color w:val="334155"/>
-                <w:sz w:val="17"/>
-              </w:rPr>
-              <w:t>✅ Completed</w:t>
-            </w:r>
-          </w:p>
-        </w:tc>
-      </w:tr>
-      <w:tr>
-        <w:tc>
-          <w:tcPr>
-            <w:tcW w:type="dxa" w:w="1728"/>
-            <w:tcMar>
-              <w:top w:w="80" w:type="dxa"/>
-              <w:bottom w:w="80" w:type="dxa"/>
-              <w:left w:w="100" w:type="dxa"/>
-              <w:right w:w="100" w:type="dxa"/>
-            </w:tcMar>
-            <w:shd w:fill="FFFFFF"/>
-          </w:tcPr>
-          <w:p>
-            <w:r>
-              <w:rPr>
-                <w:rFonts w:ascii="Arial" w:hAnsi="Arial"/>
-                <w:color w:val="334155"/>
-                <w:sz w:val="17"/>
-              </w:rPr>
-              <w:t>Day 14</w:t>
-            </w:r>
-          </w:p>
-        </w:tc>
-        <w:tc>
-          <w:tcPr>
-            <w:tcW w:type="dxa" w:w="1728"/>
-            <w:tcMar>
-              <w:top w:w="80" w:type="dxa"/>
-              <w:bottom w:w="80" w:type="dxa"/>
-              <w:left w:w="100" w:type="dxa"/>
-              <w:right w:w="100" w:type="dxa"/>
-            </w:tcMar>
-            <w:shd w:fill="FFFFFF"/>
-          </w:tcPr>
-          <w:p>
-            <w:r>
-              <w:rPr>
-                <w:rFonts w:ascii="Arial" w:hAnsi="Arial"/>
-                <w:color w:val="334155"/>
-                <w:sz w:val="17"/>
-              </w:rPr>
-              <w:t>July 23</w:t>
-            </w:r>
-          </w:p>
-        </w:tc>
-        <w:tc>
-          <w:tcPr>
-            <w:tcW w:type="dxa" w:w="1728"/>
-            <w:tcMar>
-              <w:top w:w="80" w:type="dxa"/>
-              <w:bottom w:w="80" w:type="dxa"/>
-              <w:left w:w="100" w:type="dxa"/>
-              <w:right w:w="100" w:type="dxa"/>
-            </w:tcMar>
-            <w:shd w:fill="FFFFFF"/>
-          </w:tcPr>
-          <w:p>
-            <w:r>
-              <w:rPr>
-                <w:rFonts w:ascii="Arial" w:hAnsi="Arial"/>
-                <w:color w:val="334155"/>
-                <w:sz w:val="17"/>
-              </w:rPr>
-              <w:t>App Audit &amp; Code Fixes</w:t>
-            </w:r>
-          </w:p>
-        </w:tc>
-        <w:tc>
-          <w:tcPr>
-            <w:tcW w:type="dxa" w:w="1728"/>
-            <w:tcMar>
-              <w:top w:w="80" w:type="dxa"/>
-              <w:bottom w:w="80" w:type="dxa"/>
-              <w:left w:w="100" w:type="dxa"/>
-              <w:right w:w="100" w:type="dxa"/>
-            </w:tcMar>
-            <w:shd w:fill="FFFFFF"/>
-          </w:tcPr>
-          <w:p>
-            <w:r>
-              <w:rPr>
-                <w:rFonts w:ascii="Arial" w:hAnsi="Arial"/>
-                <w:color w:val="334155"/>
-                <w:sz w:val="17"/>
-              </w:rPr>
-              <w:t>SQL Engine Anti-Cheat &amp; Storage Sync Verification</w:t>
-            </w:r>
-          </w:p>
-        </w:tc>
-        <w:tc>
-          <w:tcPr>
-            <w:tcW w:type="dxa" w:w="1728"/>
-            <w:tcMar>
-              <w:top w:w="80" w:type="dxa"/>
-              <w:bottom w:w="80" w:type="dxa"/>
-              <w:left w:w="100" w:type="dxa"/>
-              <w:right w:w="100" w:type="dxa"/>
-            </w:tcMar>
-            <w:shd w:fill="FFFFFF"/>
-          </w:tcPr>
-          <w:p>
-            <w:r>
-              <w:rPr>
-                <w:rFonts w:ascii="Arial" w:hAnsi="Arial"/>
-                <w:color w:val="334155"/>
-                <w:sz w:val="17"/>
-              </w:rPr>
-              <w:t>✅ Completed</w:t>
-            </w:r>
-          </w:p>
-        </w:tc>
-      </w:tr>
-      <w:tr>
-        <w:tc>
-          <w:tcPr>
-            <w:tcW w:type="dxa" w:w="1728"/>
-            <w:tcMar>
-              <w:top w:w="80" w:type="dxa"/>
-              <w:bottom w:w="80" w:type="dxa"/>
-              <w:left w:w="100" w:type="dxa"/>
-              <w:right w:w="100" w:type="dxa"/>
-            </w:tcMar>
-            <w:shd w:fill="F8FAFC"/>
-          </w:tcPr>
-          <w:p>
-            <w:r>
-              <w:rPr>
-                <w:rFonts w:ascii="Arial" w:hAnsi="Arial"/>
-                <w:color w:val="334155"/>
-                <w:sz w:val="17"/>
-              </w:rPr>
-              <w:t>Day 15</w:t>
-            </w:r>
-          </w:p>
-        </w:tc>
-        <w:tc>
-          <w:tcPr>
-            <w:tcW w:type="dxa" w:w="1728"/>
-            <w:tcMar>
-              <w:top w:w="80" w:type="dxa"/>
-              <w:bottom w:w="80" w:type="dxa"/>
-              <w:left w:w="100" w:type="dxa"/>
-              <w:right w:w="100" w:type="dxa"/>
-            </w:tcMar>
-            <w:shd w:fill="F8FAFC"/>
-          </w:tcPr>
-          <w:p>
-            <w:r>
-              <w:rPr>
-                <w:rFonts w:ascii="Arial" w:hAnsi="Arial"/>
-                <w:color w:val="334155"/>
-                <w:sz w:val="17"/>
-              </w:rPr>
-              <w:t>July 24</w:t>
-            </w:r>
-          </w:p>
-        </w:tc>
-        <w:tc>
-          <w:tcPr>
-            <w:tcW w:type="dxa" w:w="1728"/>
-            <w:tcMar>
-              <w:top w:w="80" w:type="dxa"/>
-              <w:bottom w:w="80" w:type="dxa"/>
-              <w:left w:w="100" w:type="dxa"/>
-              <w:right w:w="100" w:type="dxa"/>
-            </w:tcMar>
-            <w:shd w:fill="F8FAFC"/>
-          </w:tcPr>
-          <w:p>
-            <w:r>
-              <w:rPr>
-                <w:rFonts w:ascii="Arial" w:hAnsi="Arial"/>
-                <w:color w:val="334155"/>
-                <w:sz w:val="17"/>
-              </w:rPr>
-              <w:t>Current Progress Audit</w:t>
-            </w:r>
-          </w:p>
-        </w:tc>
-        <w:tc>
-          <w:tcPr>
-            <w:tcW w:type="dxa" w:w="1728"/>
-            <w:tcMar>
-              <w:top w:w="80" w:type="dxa"/>
-              <w:bottom w:w="80" w:type="dxa"/>
-              <w:left w:w="100" w:type="dxa"/>
-              <w:right w:w="100" w:type="dxa"/>
-            </w:tcMar>
-            <w:shd w:fill="F8FAFC"/>
-          </w:tcPr>
-          <w:p>
-            <w:r>
-              <w:rPr>
-                <w:rFonts w:ascii="Arial" w:hAnsi="Arial"/>
-                <w:color w:val="334155"/>
-                <w:sz w:val="17"/>
-              </w:rPr>
-              <w:t>**Studied till Video #30 (SQL Views)**</w:t>
-            </w:r>
-          </w:p>
-        </w:tc>
-        <w:tc>
-          <w:tcPr>
-            <w:tcW w:type="dxa" w:w="1728"/>
-            <w:tcMar>
-              <w:top w:w="80" w:type="dxa"/>
-              <w:bottom w:w="80" w:type="dxa"/>
-              <w:left w:w="100" w:type="dxa"/>
-              <w:right w:w="100" w:type="dxa"/>
-            </w:tcMar>
-            <w:shd w:fill="F8FAFC"/>
-          </w:tcPr>
-          <w:p>
-            <w:r>
-              <w:rPr>
-                <w:rFonts w:ascii="Arial" w:hAnsi="Arial"/>
-                <w:color w:val="334155"/>
-                <w:sz w:val="17"/>
-              </w:rPr>
-              <w:t>✅ **COMPLETED**</w:t>
-            </w:r>
-          </w:p>
-        </w:tc>
-      </w:tr>
-    </w:tbl>
-    <w:p>
-      <w:pPr>
-        <w:spacing w:before="60" w:after="60"/>
-      </w:pPr>
-      <w:r>
-        <w:br/>
-        <w:t>### Completed Videos Archive (Videos 1–30)</w:t>
       </w:r>
     </w:p>
     <w:sectPr>

</xml_diff>

<commit_message>
Update master study roadmap with 5 HackerRank per day plan, concurrent project learning, and DataLemur first recommendation
</commit_message>
<xml_diff>
--- a/docs/DA_COMPLETE_STUDY_ROADMAP.docx
+++ b/docs/DA_COMPLETE_STUDY_ROADMAP.docx
@@ -14,7 +14,7 @@
           <w:color w:val="0F172A"/>
           <w:sz w:val="44"/>
         </w:rPr>
-        <w:t>Data Analyst Complete Study Roadmap &amp; HackerRank Plan</w:t>
+        <w:t>Data Analyst Complete Study Roadmap &amp; Practice Plan</w:t>
       </w:r>
     </w:p>
     <w:p>
@@ -28,7 +28,7 @@
           <w:color w:val="0EA5E9"/>
           <w:sz w:val="23"/>
         </w:rPr>
-        <w:t>Day-Wise Schedule with Exact Dates (July 24 - Aug 10) | HackerRank Quotas &amp; Project Guidance</w:t>
+        <w:t>5 HackerRank/Day Plan | Parallel Project Study | DataLemur First Recommendation</w:t>
       </w:r>
     </w:p>
     <w:p>
@@ -43,7 +43,7 @@
           <w:color w:val="0EA5E9"/>
           <w:sz w:val="36"/>
         </w:rPr>
-        <w:t>Data Analyst Complete Study Roadmap, HackerRank Plan &amp; Video Targets</w:t>
+        <w:t>Data Analyst Master Study Roadmap: 5 HackerRank Daily &amp; Platform Next Steps</w:t>
       </w:r>
     </w:p>
     <w:p>
@@ -58,7 +58,7 @@
           <w:color w:val="0F172A"/>
           <w:sz w:val="28"/>
         </w:rPr>
-        <w:t>Current Status &amp; Date Tracker</w:t>
+        <w:t>Current Status &amp; Execution Plan</w:t>
       </w:r>
     </w:p>
     <w:p>
@@ -97,7 +97,7 @@
           <w:rFonts w:ascii="Arial" w:hAnsi="Arial"/>
           <w:sz w:val="20"/>
         </w:rPr>
-        <w:t>**HackerRank Progress**: **HackerRank Easy SQL Problems** `[✅ EASY COMPLETED]`</w:t>
+        <w:t>**Daily Practice Target**: **5 HackerRank Problems Daily (3 Medium + 2 Hard)** `[🔥 5/DAY GOAL]`</w:t>
       </w:r>
     </w:p>
     <w:p>
@@ -110,7 +110,7 @@
           <w:rFonts w:ascii="Arial" w:hAnsi="Arial"/>
           <w:sz w:val="20"/>
         </w:rPr>
-        <w:t>**HackerRank Target**: **15-20 Medium + 5-10 Hard Problems** `[⏳ TO DO DAY-BY-DAY]`</w:t>
+        <w:t>**Concurrent Project Track**: **Studying Portfolio Project (Videos #55 &amp; #56) alongside daily SQL** `[🎯 PARALLEL TRACK]`</w:t>
       </w:r>
     </w:p>
     <w:p>
@@ -123,7 +123,7 @@
           <w:rFonts w:ascii="Arial" w:hAnsi="Arial"/>
           <w:sz w:val="20"/>
         </w:rPr>
-        <w:t>**Project Target**: **Videos #55 &amp; #56 (EDA &amp; DA Portfolio Projects)** `[⏳ UPCOMING - AUG 08-09]`</w:t>
+        <w:t>**Next Platform Recommendation**: **DataLemur FIRST, followed by StrataScratch** `[⭐ DATALEMUR FIRST]`</w:t>
       </w:r>
     </w:p>
     <w:p>
@@ -138,7 +138,7 @@
           <w:color w:val="0F172A"/>
           <w:sz w:val="28"/>
         </w:rPr>
-        <w:t>SECTION 1: UPCOMING DAY-WISE SCHEDULE &amp; HACKERRANK PLAN (FIRST PAGES)</w:t>
+        <w:t>SECTION 1: UPCOMING SCHEDULE &amp; DAILY 5 HACKERRANK PLAN (FIRST PAGES)</w:t>
       </w:r>
     </w:p>
     <w:p>
@@ -153,7 +153,7 @@
           <w:color w:val="334155"/>
           <w:sz w:val="24"/>
         </w:rPr>
-        <w:t>Upcoming Day-by-Day Schedule (July 25 – August 10, 2026)</w:t>
+        <w:t>Upcoming Day-by-Day Schedule with 5 Daily HackerRank Target (July 25 – August 10, 2026)</w:t>
       </w:r>
     </w:p>
     <w:tbl>
@@ -235,7 +235,7 @@
                 <w:color w:val="FFFFFF"/>
                 <w:sz w:val="18"/>
               </w:rPr>
-              <w:t>Primary Video Watch Target</w:t>
+              <w:t>Primary Video &amp; Project Track</w:t>
             </w:r>
           </w:p>
         </w:tc>
@@ -258,7 +258,7 @@
                 <w:color w:val="FFFFFF"/>
                 <w:sz w:val="18"/>
               </w:rPr>
-              <w:t>HackerRank Daily Practice Target</w:t>
+              <w:t>Daily HackerRank Practice Target (5/Day)</w:t>
             </w:r>
           </w:p>
         </w:tc>
@@ -349,7 +349,7 @@
                 <w:color w:val="334155"/>
                 <w:sz w:val="17"/>
               </w:rPr>
-              <w:t>Video #31 (SQL CTAS) &amp; Video #32 (Temp Tables)</w:t>
+              <w:t>Video #31 (CTAS) &amp; Video #32 (Temp Tables) + Start Project Code Review</w:t>
             </w:r>
           </w:p>
         </w:tc>
@@ -371,7 +371,7 @@
                 <w:color w:val="334155"/>
                 <w:sz w:val="17"/>
               </w:rPr>
-              <w:t>HackerRank Medium #1-3 (Subqueries &amp; Temp Tables)</w:t>
+              <w:t>**5 HackerRank Medium** (Subqueries &amp; Temp Tables)</w:t>
             </w:r>
           </w:p>
         </w:tc>
@@ -393,7 +393,7 @@
                 <w:color w:val="334155"/>
                 <w:sz w:val="17"/>
               </w:rPr>
-              <w:t>⏳ Watch &amp; Solve</w:t>
+              <w:t>⏳ Watch, Code &amp; Solve</w:t>
             </w:r>
           </w:p>
         </w:tc>
@@ -461,7 +461,7 @@
                 <w:color w:val="334155"/>
                 <w:sz w:val="17"/>
               </w:rPr>
-              <w:t>Video #33 (Subquery vs CTE vs Views vs CTAS vs Temp)</w:t>
+              <w:t>Video #33 (Subquery vs CTE vs Views vs CTAS vs Temp) + Project Setup</w:t>
             </w:r>
           </w:p>
         </w:tc>
@@ -483,7 +483,7 @@
                 <w:color w:val="334155"/>
                 <w:sz w:val="17"/>
               </w:rPr>
-              <w:t>HackerRank Medium #4-6 (CTEs &amp; Derived Tables)</w:t>
+              <w:t>**5 HackerRank Medium** (CTEs &amp; Derived Tables)</w:t>
             </w:r>
           </w:p>
         </w:tc>
@@ -505,7 +505,7 @@
                 <w:color w:val="334155"/>
                 <w:sz w:val="17"/>
               </w:rPr>
-              <w:t>⏳ Watch &amp; Solve</w:t>
+              <w:t>⏳ Watch, Code &amp; Solve</w:t>
             </w:r>
           </w:p>
         </w:tc>
@@ -595,7 +595,7 @@
                 <w:color w:val="334155"/>
                 <w:sz w:val="17"/>
               </w:rPr>
-              <w:t>HackerRank Medium #7-9 (Multi-table Joins)</w:t>
+              <w:t>**3 Medium + 2 Hard HackerRank** (Multi-table Joins)</w:t>
             </w:r>
           </w:p>
         </w:tc>
@@ -617,7 +617,7 @@
                 <w:color w:val="334155"/>
                 <w:sz w:val="17"/>
               </w:rPr>
-              <w:t>⏳ Practice Mocks</w:t>
+              <w:t>⏳ Practice Mocks &amp; Solve</w:t>
             </w:r>
           </w:p>
         </w:tc>
@@ -707,7 +707,7 @@
                 <w:color w:val="334155"/>
                 <w:sz w:val="17"/>
               </w:rPr>
-              <w:t>HackerRank Medium #10-12 (Aggregations &amp; HAVING)</w:t>
+              <w:t>**3 Medium + 2 Hard HackerRank** (HAVING &amp; Aggregations)</w:t>
             </w:r>
           </w:p>
         </w:tc>
@@ -729,7 +729,7 @@
                 <w:color w:val="334155"/>
                 <w:sz w:val="17"/>
               </w:rPr>
-              <w:t>⏳ Watch &amp; Solve</w:t>
+              <w:t>⏳ Watch, Code &amp; Solve</w:t>
             </w:r>
           </w:p>
         </w:tc>
@@ -819,7 +819,7 @@
                 <w:color w:val="334155"/>
                 <w:sz w:val="17"/>
               </w:rPr>
-              <w:t>HackerRank Medium #13-15 (CASE WHEN &amp; Pivoting)</w:t>
+              <w:t>**3 Medium + 2 Hard HackerRank** (CASE WHEN &amp; Pivoting)</w:t>
             </w:r>
           </w:p>
         </w:tc>
@@ -841,7 +841,7 @@
                 <w:color w:val="334155"/>
                 <w:sz w:val="17"/>
               </w:rPr>
-              <w:t>⏳ Watch &amp; Solve</w:t>
+              <w:t>⏳ Watch, Code &amp; Solve</w:t>
             </w:r>
           </w:p>
         </w:tc>
@@ -931,7 +931,7 @@
                 <w:color w:val="334155"/>
                 <w:sz w:val="17"/>
               </w:rPr>
-              <w:t>HackerRank Hard #1-2 (Window Functions ROW_NUMBER)</w:t>
+              <w:t>**3 Medium + 2 Hard HackerRank** (ROW_NUMBER Window Funcs)</w:t>
             </w:r>
           </w:p>
         </w:tc>
@@ -953,7 +953,7 @@
                 <w:color w:val="334155"/>
                 <w:sz w:val="17"/>
               </w:rPr>
-              <w:t>⏳ Watch &amp; Solve</w:t>
+              <w:t>⏳ Watch, Code &amp; Solve</w:t>
             </w:r>
           </w:p>
         </w:tc>
@@ -1043,7 +1043,7 @@
                 <w:color w:val="334155"/>
                 <w:sz w:val="17"/>
               </w:rPr>
-              <w:t>HackerRank Hard #3-4 (RANK &amp; DENSE_RANK)</w:t>
+              <w:t>**3 Medium + 2 Hard HackerRank** (RANK &amp; DENSE_RANK)</w:t>
             </w:r>
           </w:p>
         </w:tc>
@@ -1065,7 +1065,7 @@
                 <w:color w:val="334155"/>
                 <w:sz w:val="17"/>
               </w:rPr>
-              <w:t>⏳ Watch &amp; Solve</w:t>
+              <w:t>⏳ Watch, Code &amp; Solve</w:t>
             </w:r>
           </w:p>
         </w:tc>
@@ -1155,7 +1155,7 @@
                 <w:color w:val="334155"/>
                 <w:sz w:val="17"/>
               </w:rPr>
-              <w:t>HackerRank Hard #5-6 (LEAD &amp; LAG Consecutive Rows)</w:t>
+              <w:t>**3 Medium + 2 Hard HackerRank** (LEAD &amp; LAG Streaks)</w:t>
             </w:r>
           </w:p>
         </w:tc>
@@ -1177,7 +1177,7 @@
                 <w:color w:val="334155"/>
                 <w:sz w:val="17"/>
               </w:rPr>
-              <w:t>⏳ Watch &amp; Solve</w:t>
+              <w:t>⏳ Watch, Code &amp; Solve</w:t>
             </w:r>
           </w:p>
         </w:tc>
@@ -1267,7 +1267,7 @@
                 <w:color w:val="334155"/>
                 <w:sz w:val="17"/>
               </w:rPr>
-              <w:t>HackerRank Hard #7-8 (Median &amp; Percentiles)</w:t>
+              <w:t>**3 Medium + 2 Hard HackerRank** (Medians &amp; Percentiles)</w:t>
             </w:r>
           </w:p>
         </w:tc>
@@ -1289,7 +1289,7 @@
                 <w:color w:val="334155"/>
                 <w:sz w:val="17"/>
               </w:rPr>
-              <w:t>⏳ Practice Mocks</w:t>
+              <w:t>⏳ Practice Mocks &amp; Solve</w:t>
             </w:r>
           </w:p>
         </w:tc>
@@ -1357,7 +1357,7 @@
                 <w:color w:val="334155"/>
                 <w:sz w:val="17"/>
               </w:rPr>
-              <w:t>Video #43 (Stored Procedures) &amp; Video #44 (Triggers) [DE]</w:t>
+              <w:t>Video #43 (Stored Procedures) &amp; Video #44 (Triggers) [Optional DE]</w:t>
             </w:r>
           </w:p>
         </w:tc>
@@ -1379,7 +1379,7 @@
                 <w:color w:val="334155"/>
                 <w:sz w:val="17"/>
               </w:rPr>
-              <w:t>HackerRank Hard #9-10 (Complex Query Challenges)</w:t>
+              <w:t>**5 HackerRank Hard** (Advanced Query Challenges)</w:t>
             </w:r>
           </w:p>
         </w:tc>
@@ -1401,7 +1401,7 @@
                 <w:color w:val="334155"/>
                 <w:sz w:val="17"/>
               </w:rPr>
-              <w:t>💡 Optional DE</w:t>
+              <w:t>💡 Optional DE &amp; Solve</w:t>
             </w:r>
           </w:p>
         </w:tc>
@@ -1491,7 +1491,7 @@
                 <w:color w:val="334155"/>
                 <w:sz w:val="17"/>
               </w:rPr>
-              <w:t>Practice 5 App Debug Puzzles in SQL Academy</w:t>
+              <w:t>**5 HackerRank Hard** (Complex Aggregations)</w:t>
             </w:r>
           </w:p>
         </w:tc>
@@ -1513,7 +1513,7 @@
                 <w:color w:val="334155"/>
                 <w:sz w:val="17"/>
               </w:rPr>
-              <w:t>💡 Optional AI</w:t>
+              <w:t>💡 Optional AI &amp; Solve</w:t>
             </w:r>
           </w:p>
         </w:tc>
@@ -1603,7 +1603,7 @@
                 <w:color w:val="334155"/>
                 <w:sz w:val="17"/>
               </w:rPr>
-              <w:t>Review Data Architecture &amp; ETL Concepts</w:t>
+              <w:t>**Complete 5 Daily HackerRank (Final Set)**</w:t>
             </w:r>
           </w:p>
         </w:tc>
@@ -1625,7 +1625,7 @@
                 <w:color w:val="334155"/>
                 <w:sz w:val="17"/>
               </w:rPr>
-              <w:t>🏗️ Optional DE</w:t>
+              <w:t>🏗️ Optional DE &amp; Solve</w:t>
             </w:r>
           </w:p>
         </w:tc>
@@ -1715,7 +1715,7 @@
                 <w:color w:val="334155"/>
                 <w:sz w:val="17"/>
               </w:rPr>
-              <w:t>🎯 **START PROJECT 1**: SQL EDA Portfolio Project</w:t>
+              <w:t>🎯 **DataLemur Day 1**: Start Top Tech Company SQL</w:t>
             </w:r>
           </w:p>
         </w:tc>
@@ -1737,7 +1737,7 @@
                 <w:color w:val="334155"/>
                 <w:sz w:val="17"/>
               </w:rPr>
-              <w:t>🎯 **MUST WATCH**</w:t>
+              <w:t>🎯 **DATALEMUR START**</w:t>
             </w:r>
           </w:p>
         </w:tc>
@@ -1827,7 +1827,7 @@
                 <w:color w:val="334155"/>
                 <w:sz w:val="17"/>
               </w:rPr>
-              <w:t>🎯 **START PROJECT 2**: Full Data Analyst Portfolio</w:t>
+              <w:t>🎯 **DataLemur Day 2**: Solve FAANG Interview Questions</w:t>
             </w:r>
           </w:p>
         </w:tc>
@@ -1849,7 +1849,7 @@
                 <w:color w:val="334155"/>
                 <w:sz w:val="17"/>
               </w:rPr>
-              <w:t>🎯 **MUST WATCH**</w:t>
+              <w:t>🎯 **DATALEMUR PRACTICE**</w:t>
             </w:r>
           </w:p>
         </w:tc>
@@ -1939,7 +1939,7 @@
                 <w:color w:val="334155"/>
                 <w:sz w:val="17"/>
               </w:rPr>
-              <w:t>Final Portfolio Review &amp; GitHub Repo Push</w:t>
+              <w:t>Final Portfolio GitHub Push &amp; StrataScratch Prep</w:t>
             </w:r>
           </w:p>
         </w:tc>
@@ -1961,7 +1961,7 @@
                 <w:color w:val="334155"/>
                 <w:sz w:val="17"/>
               </w:rPr>
-              <w:t>🏆 Capstone</w:t>
+              <w:t>🏆 Capstone &amp; GitHub</w:t>
             </w:r>
           </w:p>
         </w:tc>
@@ -1973,7 +1973,7 @@
       </w:pPr>
       <w:r>
         <w:br/>
-        <w:t>### HackerRank Strategy &amp; Target Counts for DA Roles</w:t>
+        <w:t>### DataLemur vs. StrataScratch: Which to Start First?</w:t>
       </w:r>
     </w:p>
     <w:p>
@@ -1981,32 +1981,7 @@
         <w:spacing w:before="60" w:after="60"/>
       </w:pPr>
       <w:r>
-        <w:t>1. **Easy Problems (`Completed`)**: Excellent for syntax muscle memory.</w:t>
-      </w:r>
-    </w:p>
-    <w:p>
-      <w:pPr>
-        <w:spacing w:before="60" w:after="60"/>
-      </w:pPr>
-      <w:r>
-        <w:t>2. **Medium Problems (`Target: 15–20 Problems`)**: Focus on 2+ table JOINs, `GROUP BY` / `HAVING`, `CASE WHEN`, and `CTEs` / Subqueries. This is the exact difficulty level tested in 80% of Data Analyst screening interviews.</w:t>
-      </w:r>
-    </w:p>
-    <w:p>
-      <w:pPr>
-        <w:spacing w:before="60" w:after="60"/>
-      </w:pPr>
-      <w:r>
-        <w:t>3. **Hard Problems (`Target: 5–10 Problems`)**: Focus on Window Functions (`ROW_NUMBER`, `DENSE_RANK`, `LEAD`/`LAG`), consecutive day streaks, and median calculation challenges.</w:t>
-      </w:r>
-    </w:p>
-    <w:p>
-      <w:pPr>
-        <w:spacing w:before="60" w:after="60"/>
-      </w:pPr>
-      <w:r>
-        <w:br/>
-        <w:t>### How to Learn from Portfolio Projects (Videos #55 &amp; #56)</w:t>
+        <w:t>#### ⭐ START DATALEMUR FIRST (Recommended)</w:t>
       </w:r>
     </w:p>
     <w:p>
@@ -2019,7 +1994,7 @@
           <w:rFonts w:ascii="Arial" w:hAnsi="Arial"/>
           <w:sz w:val="20"/>
         </w:rPr>
-        <w:t>**Project 1: SQL Exploratory Data Analysis (EDA) (Video #55)**: Learn how to analyze raw e-commerce customer datasets to find top revenue channels, customer retention rate, and peak ordering months.</w:t>
+        <w:t>**Why DataLemur First**: DataLemur is 100% focused on real SQL interview questions from top tech companies (Tesla, Amazon, Meta, Spotify). Its in-browser editor, instant grading, and detailed solution walk-throughs match the exact format of SQL Analyst Academy and HackerRank.</w:t>
       </w:r>
     </w:p>
     <w:p>
@@ -2032,7 +2007,64 @@
           <w:rFonts w:ascii="Arial" w:hAnsi="Arial"/>
           <w:sz w:val="20"/>
         </w:rPr>
-        <w:t>**Project 2: Complete Data Analyst Portfolio Project (Video #56)**: Learn how to organize a clean GitHub portfolio repository with `.sql` script files, business insights, and executive summaries.</w:t>
+        <w:t>**DataLemur Goal**: Solve 15 to 20 Medium/Hard questions on DataLemur (topics: Window Functions, CTEs, self-joins, monthly retention rates).</w:t>
+      </w:r>
+    </w:p>
+    <w:p>
+      <w:pPr>
+        <w:spacing w:before="60" w:after="60"/>
+      </w:pPr>
+      <w:r>
+        <w:br/>
+        <w:t>#### 🛠️ MOVE TO STRATASCRATCH SECOND</w:t>
+      </w:r>
+    </w:p>
+    <w:p>
+      <w:pPr>
+        <w:pStyle w:val="ListBullet"/>
+        <w:spacing w:before="40" w:after="40"/>
+      </w:pPr>
+      <w:r>
+        <w:rPr>
+          <w:rFonts w:ascii="Arial" w:hAnsi="Arial"/>
+          <w:sz w:val="20"/>
+        </w:rPr>
+        <w:t>**Why StrataScratch Second**: StrataScratch is great for advanced analytics datasets and multi-language practice (SQL + Python/Pandas). Use it after DataLemur to practice real company case studies from Airbnb, Forbes, and Microsoft.</w:t>
+      </w:r>
+    </w:p>
+    <w:p>
+      <w:pPr>
+        <w:spacing w:before="60" w:after="60"/>
+      </w:pPr>
+      <w:r>
+        <w:br/>
+        <w:t>### Concurrent Project Learning Strategy (Videos #55 &amp; #56)</w:t>
+      </w:r>
+    </w:p>
+    <w:p>
+      <w:pPr>
+        <w:pStyle w:val="ListBullet"/>
+        <w:spacing w:before="40" w:after="40"/>
+      </w:pPr>
+      <w:r>
+        <w:rPr>
+          <w:rFonts w:ascii="Arial" w:hAnsi="Arial"/>
+          <w:sz w:val="20"/>
+        </w:rPr>
+        <w:t>**Start Now**: Don't wait until August 08 to think about the project! Review the dataset structure and query topics from Video #55 (EDA) and Video #56 (Portfolio Project) in parallel while doing your daily 5 HackerRank problems.</w:t>
+      </w:r>
+    </w:p>
+    <w:p>
+      <w:pPr>
+        <w:pStyle w:val="ListBullet"/>
+        <w:spacing w:before="40" w:after="40"/>
+      </w:pPr>
+      <w:r>
+        <w:rPr>
+          <w:rFonts w:ascii="Arial" w:hAnsi="Arial"/>
+          <w:sz w:val="20"/>
+        </w:rPr>
+        <w:t>**Building Your GitHub Portfolio**: When you finish Video #56, upload your `.sql` query files, data insights summary, and `README.md` to GitHub to present to recruiters.</w:t>
       </w:r>
     </w:p>
     <w:p>

</xml_diff>

<commit_message>
Accelerate study roadmap into master Word document with playlist timestamps, daily portfolio project tasks, and DataLemur strategy
</commit_message>
<xml_diff>
--- a/docs/DA_COMPLETE_STUDY_ROADMAP.docx
+++ b/docs/DA_COMPLETE_STUDY_ROADMAP.docx
@@ -4,7 +4,7 @@
   <w:body>
     <w:p>
       <w:pPr>
-        <w:spacing w:before="400" w:after="80"/>
+        <w:spacing w:before="480" w:after="80"/>
         <w:jc w:val="center"/>
       </w:pPr>
       <w:r>
@@ -14,21 +14,21 @@
           <w:color w:val="0F172A"/>
           <w:sz w:val="44"/>
         </w:rPr>
-        <w:t>Data Analyst Complete Study Roadmap &amp; Practice Plan</w:t>
+        <w:t>Data Analyst Master Execution Roadmap &amp; Action Plan</w:t>
       </w:r>
     </w:p>
     <w:p>
       <w:pPr>
-        <w:spacing w:after="320"/>
+        <w:spacing w:after="360"/>
         <w:jc w:val="center"/>
       </w:pPr>
       <w:r>
         <w:rPr>
           <w:rFonts w:ascii="Arial" w:hAnsi="Arial"/>
           <w:color w:val="0EA5E9"/>
-          <w:sz w:val="23"/>
+          <w:sz w:val="22"/>
         </w:rPr>
-        <w:t>5 HackerRank/Day Plan | Parallel Project Study | DataLemur First Recommendation</w:t>
+        <w:t>Multi-Module Acceleration | Daily 5 HackerRank Quota | Daily Portfolio Project Tasks</w:t>
       </w:r>
     </w:p>
     <w:p>
@@ -43,117 +43,73 @@
           <w:color w:val="0EA5E9"/>
           <w:sz w:val="36"/>
         </w:rPr>
-        <w:t>Data Analyst Master Study Roadmap: 5 HackerRank Daily &amp; Platform Next Steps</w:t>
+        <w:t>1. Executive Status &amp; Progress Tracker</w:t>
+      </w:r>
+    </w:p>
+    <w:p>
+      <w:r>
+        <w:rPr>
+          <w:b/>
+        </w:rPr>
+        <w:t xml:space="preserve">• Current Date: </w:t>
+      </w:r>
+      <w:r>
+        <w:t>July 24, 2026 (Today)</w:t>
+        <w:br/>
+      </w:r>
+      <w:r>
+        <w:rPr>
+          <w:b/>
+        </w:rPr>
+        <w:t xml:space="preserve">• Completed Video Archive: </w:t>
+      </w:r>
+      <w:r>
+        <w:t>Videos #1 to #29 (SQL Basics up to CTEs WITH clause) [✅ COMPLETED]</w:t>
+        <w:br/>
+      </w:r>
+      <w:r>
+        <w:rPr>
+          <w:b/>
+        </w:rPr>
+        <w:t xml:space="preserve">• TODAY's Video Target: </w:t>
+      </w:r>
+      <w:r>
+        <w:t>Video #30 — SQL Views (6 Top Use Cases) [🎯 WATCH TODAY JULY 24]</w:t>
+        <w:br/>
+      </w:r>
+      <w:r>
+        <w:rPr>
+          <w:b/>
+        </w:rPr>
+        <w:t xml:space="preserve">• Daily Practice Quota: </w:t>
+      </w:r>
+      <w:r>
+        <w:t>5 HackerRank Problems Daily (3 Medium + 2 Hard)</w:t>
+        <w:br/>
+      </w:r>
+      <w:r>
+        <w:rPr>
+          <w:b/>
+        </w:rPr>
+        <w:t xml:space="preserve">• Daily Portfolio Project Track: </w:t>
+      </w:r>
+      <w:r>
+        <w:t>Hands-on building of E-Commerce EDA &amp; DA Portfolio Repositories (Parallel Track)</w:t>
       </w:r>
     </w:p>
     <w:p>
       <w:pPr>
-        <w:pStyle w:val="Heading2"/>
-        <w:spacing w:before="280" w:after="120"/>
+        <w:pStyle w:val="Heading1"/>
+        <w:spacing w:before="360" w:after="160"/>
       </w:pPr>
       <w:r>
         <w:rPr>
           <w:rFonts w:ascii="Arial" w:hAnsi="Arial"/>
           <w:b/>
-          <w:color w:val="0F172A"/>
-          <w:sz w:val="28"/>
+          <w:color w:val="0EA5E9"/>
+          <w:sz w:val="36"/>
         </w:rPr>
-        <w:t>Current Status &amp; Execution Plan</w:t>
-      </w:r>
-    </w:p>
-    <w:p>
-      <w:pPr>
-        <w:pStyle w:val="ListBullet"/>
-        <w:spacing w:before="40" w:after="40"/>
-      </w:pPr>
-      <w:r>
-        <w:rPr>
-          <w:rFonts w:ascii="Arial" w:hAnsi="Arial"/>
-          <w:sz w:val="20"/>
-        </w:rPr>
-        <w:t>**Current Date**: **July 24, 2026**</w:t>
-      </w:r>
-    </w:p>
-    <w:p>
-      <w:pPr>
-        <w:pStyle w:val="ListBullet"/>
-        <w:spacing w:before="40" w:after="40"/>
-      </w:pPr>
-      <w:r>
-        <w:rPr>
-          <w:rFonts w:ascii="Arial" w:hAnsi="Arial"/>
-          <w:sz w:val="20"/>
-        </w:rPr>
-        <w:t>**Course Progress**: **Videos #1 to #30 completed (Studied till SQL Views)** `[✅ COMPLETED]`</w:t>
-      </w:r>
-    </w:p>
-    <w:p>
-      <w:pPr>
-        <w:pStyle w:val="ListBullet"/>
-        <w:spacing w:before="40" w:after="40"/>
-      </w:pPr>
-      <w:r>
-        <w:rPr>
-          <w:rFonts w:ascii="Arial" w:hAnsi="Arial"/>
-          <w:sz w:val="20"/>
-        </w:rPr>
-        <w:t>**Daily Practice Target**: **5 HackerRank Problems Daily (3 Medium + 2 Hard)** `[🔥 5/DAY GOAL]`</w:t>
-      </w:r>
-    </w:p>
-    <w:p>
-      <w:pPr>
-        <w:pStyle w:val="ListBullet"/>
-        <w:spacing w:before="40" w:after="40"/>
-      </w:pPr>
-      <w:r>
-        <w:rPr>
-          <w:rFonts w:ascii="Arial" w:hAnsi="Arial"/>
-          <w:sz w:val="20"/>
-        </w:rPr>
-        <w:t>**Concurrent Project Track**: **Studying Portfolio Project (Videos #55 &amp; #56) alongside daily SQL** `[🎯 PARALLEL TRACK]`</w:t>
-      </w:r>
-    </w:p>
-    <w:p>
-      <w:pPr>
-        <w:pStyle w:val="ListBullet"/>
-        <w:spacing w:before="40" w:after="40"/>
-      </w:pPr>
-      <w:r>
-        <w:rPr>
-          <w:rFonts w:ascii="Arial" w:hAnsi="Arial"/>
-          <w:sz w:val="20"/>
-        </w:rPr>
-        <w:t>**Next Platform Recommendation**: **DataLemur FIRST, followed by StrataScratch** `[⭐ DATALEMUR FIRST]`</w:t>
-      </w:r>
-    </w:p>
-    <w:p>
-      <w:pPr>
-        <w:pStyle w:val="Heading2"/>
-        <w:spacing w:before="280" w:after="120"/>
-      </w:pPr>
-      <w:r>
-        <w:rPr>
-          <w:rFonts w:ascii="Arial" w:hAnsi="Arial"/>
-          <w:b/>
-          <w:color w:val="0F172A"/>
-          <w:sz w:val="28"/>
-        </w:rPr>
-        <w:t>SECTION 1: UPCOMING SCHEDULE &amp; DAILY 5 HACKERRANK PLAN (FIRST PAGES)</w:t>
-      </w:r>
-    </w:p>
-    <w:p>
-      <w:pPr>
-        <w:pStyle w:val="Heading3"/>
-        <w:spacing w:before="200" w:after="80"/>
-      </w:pPr>
-      <w:r>
-        <w:rPr>
-          <w:rFonts w:ascii="Arial" w:hAnsi="Arial"/>
-          <w:b/>
-          <w:color w:val="334155"/>
-          <w:sz w:val="24"/>
-        </w:rPr>
-        <w:t>Upcoming Day-by-Day Schedule with 5 Daily HackerRank Target (July 25 – August 10, 2026)</w:t>
+        <w:t>2. Accelerated Day-by-Day Execution Plan (Upcoming First)</w:t>
       </w:r>
     </w:p>
     <w:tbl>
@@ -163,21 +119,22 @@
         <w:tblLook w:firstColumn="1" w:firstRow="1" w:lastColumn="0" w:lastRow="0" w:noHBand="0" w:noVBand="1" w:val="04A0"/>
       </w:tblPr>
       <w:tblGrid>
-        <w:gridCol w:w="1728"/>
-        <w:gridCol w:w="1728"/>
-        <w:gridCol w:w="1728"/>
-        <w:gridCol w:w="1728"/>
-        <w:gridCol w:w="1728"/>
+        <w:gridCol w:w="1440"/>
+        <w:gridCol w:w="1440"/>
+        <w:gridCol w:w="1440"/>
+        <w:gridCol w:w="1440"/>
+        <w:gridCol w:w="1440"/>
+        <w:gridCol w:w="1440"/>
       </w:tblGrid>
       <w:tr>
         <w:tc>
           <w:tcPr>
-            <w:tcW w:type="dxa" w:w="1728"/>
+            <w:tcW w:type="dxa" w:w="1440"/>
             <w:tcMar>
-              <w:top w:w="80" w:type="dxa"/>
-              <w:bottom w:w="80" w:type="dxa"/>
-              <w:left w:w="100" w:type="dxa"/>
-              <w:right w:w="100" w:type="dxa"/>
+              <w:top w:w="100" w:type="dxa"/>
+              <w:bottom w:w="100" w:type="dxa"/>
+              <w:left w:w="120" w:type="dxa"/>
+              <w:right w:w="120" w:type="dxa"/>
             </w:tcMar>
             <w:shd w:fill="0F172A"/>
           </w:tcPr>
@@ -187,7 +144,7 @@
                 <w:rFonts w:ascii="Arial" w:hAnsi="Arial"/>
                 <w:b/>
                 <w:color w:val="FFFFFF"/>
-                <w:sz w:val="18"/>
+                <w:sz w:val="19"/>
               </w:rPr>
               <w:t>Day</w:t>
             </w:r>
@@ -195,12 +152,12 @@
         </w:tc>
         <w:tc>
           <w:tcPr>
-            <w:tcW w:type="dxa" w:w="1728"/>
+            <w:tcW w:type="dxa" w:w="1440"/>
             <w:tcMar>
-              <w:top w:w="80" w:type="dxa"/>
-              <w:bottom w:w="80" w:type="dxa"/>
-              <w:left w:w="100" w:type="dxa"/>
-              <w:right w:w="100" w:type="dxa"/>
+              <w:top w:w="100" w:type="dxa"/>
+              <w:bottom w:w="100" w:type="dxa"/>
+              <w:left w:w="120" w:type="dxa"/>
+              <w:right w:w="120" w:type="dxa"/>
             </w:tcMar>
             <w:shd w:fill="0F172A"/>
           </w:tcPr>
@@ -210,7 +167,7 @@
                 <w:rFonts w:ascii="Arial" w:hAnsi="Arial"/>
                 <w:b/>
                 <w:color w:val="FFFFFF"/>
-                <w:sz w:val="18"/>
+                <w:sz w:val="19"/>
               </w:rPr>
               <w:t>Date</w:t>
             </w:r>
@@ -218,12 +175,12 @@
         </w:tc>
         <w:tc>
           <w:tcPr>
-            <w:tcW w:type="dxa" w:w="1728"/>
+            <w:tcW w:type="dxa" w:w="1440"/>
             <w:tcMar>
-              <w:top w:w="80" w:type="dxa"/>
-              <w:bottom w:w="80" w:type="dxa"/>
-              <w:left w:w="100" w:type="dxa"/>
-              <w:right w:w="100" w:type="dxa"/>
+              <w:top w:w="100" w:type="dxa"/>
+              <w:bottom w:w="100" w:type="dxa"/>
+              <w:left w:w="120" w:type="dxa"/>
+              <w:right w:w="120" w:type="dxa"/>
             </w:tcMar>
             <w:shd w:fill="0F172A"/>
           </w:tcPr>
@@ -233,20 +190,20 @@
                 <w:rFonts w:ascii="Arial" w:hAnsi="Arial"/>
                 <w:b/>
                 <w:color w:val="FFFFFF"/>
-                <w:sz w:val="18"/>
+                <w:sz w:val="19"/>
               </w:rPr>
-              <w:t>Primary Video &amp; Project Track</w:t>
+              <w:t>YouTube Video Target &amp; Timestamp</w:t>
             </w:r>
           </w:p>
         </w:tc>
         <w:tc>
           <w:tcPr>
-            <w:tcW w:type="dxa" w:w="1728"/>
+            <w:tcW w:type="dxa" w:w="1440"/>
             <w:tcMar>
-              <w:top w:w="80" w:type="dxa"/>
-              <w:bottom w:w="80" w:type="dxa"/>
-              <w:left w:w="100" w:type="dxa"/>
-              <w:right w:w="100" w:type="dxa"/>
+              <w:top w:w="100" w:type="dxa"/>
+              <w:bottom w:w="100" w:type="dxa"/>
+              <w:left w:w="120" w:type="dxa"/>
+              <w:right w:w="120" w:type="dxa"/>
             </w:tcMar>
             <w:shd w:fill="0F172A"/>
           </w:tcPr>
@@ -256,20 +213,20 @@
                 <w:rFonts w:ascii="Arial" w:hAnsi="Arial"/>
                 <w:b/>
                 <w:color w:val="FFFFFF"/>
-                <w:sz w:val="18"/>
+                <w:sz w:val="19"/>
               </w:rPr>
-              <w:t>Daily HackerRank Practice Target (5/Day)</w:t>
+              <w:t>Daily Project Task</w:t>
             </w:r>
           </w:p>
         </w:tc>
         <w:tc>
           <w:tcPr>
-            <w:tcW w:type="dxa" w:w="1728"/>
+            <w:tcW w:type="dxa" w:w="1440"/>
             <w:tcMar>
-              <w:top w:w="80" w:type="dxa"/>
-              <w:bottom w:w="80" w:type="dxa"/>
-              <w:left w:w="100" w:type="dxa"/>
-              <w:right w:w="100" w:type="dxa"/>
+              <w:top w:w="100" w:type="dxa"/>
+              <w:bottom w:w="100" w:type="dxa"/>
+              <w:left w:w="120" w:type="dxa"/>
+              <w:right w:w="120" w:type="dxa"/>
             </w:tcMar>
             <w:shd w:fill="0F172A"/>
           </w:tcPr>
@@ -279,9 +236,32 @@
                 <w:rFonts w:ascii="Arial" w:hAnsi="Arial"/>
                 <w:b/>
                 <w:color w:val="FFFFFF"/>
-                <w:sz w:val="18"/>
+                <w:sz w:val="19"/>
               </w:rPr>
-              <w:t>Action Step</w:t>
+              <w:t>5 HackerRank Quota</w:t>
+            </w:r>
+          </w:p>
+        </w:tc>
+        <w:tc>
+          <w:tcPr>
+            <w:tcW w:type="dxa" w:w="1440"/>
+            <w:tcMar>
+              <w:top w:w="100" w:type="dxa"/>
+              <w:bottom w:w="100" w:type="dxa"/>
+              <w:left w:w="120" w:type="dxa"/>
+              <w:right w:w="120" w:type="dxa"/>
+            </w:tcMar>
+            <w:shd w:fill="0F172A"/>
+          </w:tcPr>
+          <w:p>
+            <w:r>
+              <w:rPr>
+                <w:rFonts w:ascii="Arial" w:hAnsi="Arial"/>
+                <w:b/>
+                <w:color w:val="FFFFFF"/>
+                <w:sz w:val="19"/>
+              </w:rPr>
+              <w:t>Action Status</w:t>
             </w:r>
           </w:p>
         </w:tc>
@@ -289,12 +269,148 @@
       <w:tr>
         <w:tc>
           <w:tcPr>
-            <w:tcW w:type="dxa" w:w="1728"/>
+            <w:tcW w:type="dxa" w:w="1440"/>
             <w:tcMar>
               <w:top w:w="80" w:type="dxa"/>
               <w:bottom w:w="80" w:type="dxa"/>
-              <w:left w:w="100" w:type="dxa"/>
-              <w:right w:w="100" w:type="dxa"/>
+              <w:left w:w="120" w:type="dxa"/>
+              <w:right w:w="120" w:type="dxa"/>
+            </w:tcMar>
+            <w:shd w:fill="FFFFFF"/>
+          </w:tcPr>
+          <w:p>
+            <w:r>
+              <w:rPr>
+                <w:rFonts w:ascii="Arial" w:hAnsi="Arial"/>
+                <w:color w:val="334155"/>
+                <w:sz w:val="17"/>
+              </w:rPr>
+              <w:t>Day 15</w:t>
+            </w:r>
+          </w:p>
+        </w:tc>
+        <w:tc>
+          <w:tcPr>
+            <w:tcW w:type="dxa" w:w="1440"/>
+            <w:tcMar>
+              <w:top w:w="80" w:type="dxa"/>
+              <w:bottom w:w="80" w:type="dxa"/>
+              <w:left w:w="120" w:type="dxa"/>
+              <w:right w:w="120" w:type="dxa"/>
+            </w:tcMar>
+            <w:shd w:fill="FFFFFF"/>
+          </w:tcPr>
+          <w:p>
+            <w:r>
+              <w:rPr>
+                <w:rFonts w:ascii="Arial" w:hAnsi="Arial"/>
+                <w:color w:val="334155"/>
+                <w:sz w:val="17"/>
+              </w:rPr>
+              <w:t>July 24, 2026</w:t>
+            </w:r>
+          </w:p>
+        </w:tc>
+        <w:tc>
+          <w:tcPr>
+            <w:tcW w:type="dxa" w:w="1440"/>
+            <w:tcMar>
+              <w:top w:w="80" w:type="dxa"/>
+              <w:bottom w:w="80" w:type="dxa"/>
+              <w:left w:w="120" w:type="dxa"/>
+              <w:right w:w="120" w:type="dxa"/>
+            </w:tcMar>
+            <w:shd w:fill="FFFFFF"/>
+          </w:tcPr>
+          <w:p>
+            <w:r>
+              <w:rPr>
+                <w:rFonts w:ascii="Arial" w:hAnsi="Arial"/>
+                <w:color w:val="334155"/>
+                <w:sz w:val="17"/>
+              </w:rPr>
+              <w:t>Video #30: SQL Views (6 Top Use Cases)</w:t>
+              <w:br/>
+              <w:t>[Timestamp 15:35:02]</w:t>
+            </w:r>
+          </w:p>
+        </w:tc>
+        <w:tc>
+          <w:tcPr>
+            <w:tcW w:type="dxa" w:w="1440"/>
+            <w:tcMar>
+              <w:top w:w="80" w:type="dxa"/>
+              <w:bottom w:w="80" w:type="dxa"/>
+              <w:left w:w="120" w:type="dxa"/>
+              <w:right w:w="120" w:type="dxa"/>
+            </w:tcMar>
+            <w:shd w:fill="FFFFFF"/>
+          </w:tcPr>
+          <w:p>
+            <w:r>
+              <w:rPr>
+                <w:rFonts w:ascii="Arial" w:hAnsi="Arial"/>
+                <w:color w:val="334155"/>
+                <w:sz w:val="17"/>
+              </w:rPr>
+              <w:t>Task 1: Create GitHub Repo 'sql-da-portfolio' &amp; load datasets</w:t>
+            </w:r>
+          </w:p>
+        </w:tc>
+        <w:tc>
+          <w:tcPr>
+            <w:tcW w:type="dxa" w:w="1440"/>
+            <w:tcMar>
+              <w:top w:w="80" w:type="dxa"/>
+              <w:bottom w:w="80" w:type="dxa"/>
+              <w:left w:w="120" w:type="dxa"/>
+              <w:right w:w="120" w:type="dxa"/>
+            </w:tcMar>
+            <w:shd w:fill="FFFFFF"/>
+          </w:tcPr>
+          <w:p>
+            <w:r>
+              <w:rPr>
+                <w:rFonts w:ascii="Arial" w:hAnsi="Arial"/>
+                <w:color w:val="334155"/>
+                <w:sz w:val="17"/>
+              </w:rPr>
+              <w:t>3 Medium + 2 Hard (Subqueries)</w:t>
+            </w:r>
+          </w:p>
+        </w:tc>
+        <w:tc>
+          <w:tcPr>
+            <w:tcW w:type="dxa" w:w="1440"/>
+            <w:tcMar>
+              <w:top w:w="80" w:type="dxa"/>
+              <w:bottom w:w="80" w:type="dxa"/>
+              <w:left w:w="120" w:type="dxa"/>
+              <w:right w:w="120" w:type="dxa"/>
+            </w:tcMar>
+            <w:shd w:fill="FFFFFF"/>
+          </w:tcPr>
+          <w:p>
+            <w:r>
+              <w:rPr>
+                <w:rFonts w:ascii="Arial" w:hAnsi="Arial"/>
+                <w:color w:val="334155"/>
+                <w:sz w:val="17"/>
+              </w:rPr>
+              <w:t>🎯 TODAY's TARGET</w:t>
+            </w:r>
+          </w:p>
+        </w:tc>
+      </w:tr>
+      <w:tr>
+        <w:tc>
+          <w:tcPr>
+            <w:tcW w:type="dxa" w:w="1440"/>
+            <w:tcMar>
+              <w:top w:w="80" w:type="dxa"/>
+              <w:bottom w:w="80" w:type="dxa"/>
+              <w:left w:w="120" w:type="dxa"/>
+              <w:right w:w="120" w:type="dxa"/>
             </w:tcMar>
             <w:shd w:fill="F8FAFC"/>
           </w:tcPr>
@@ -311,12 +427,12 @@
         </w:tc>
         <w:tc>
           <w:tcPr>
-            <w:tcW w:type="dxa" w:w="1728"/>
+            <w:tcW w:type="dxa" w:w="1440"/>
             <w:tcMar>
               <w:top w:w="80" w:type="dxa"/>
               <w:bottom w:w="80" w:type="dxa"/>
-              <w:left w:w="100" w:type="dxa"/>
-              <w:right w:w="100" w:type="dxa"/>
+              <w:left w:w="120" w:type="dxa"/>
+              <w:right w:w="120" w:type="dxa"/>
             </w:tcMar>
             <w:shd w:fill="F8FAFC"/>
           </w:tcPr>
@@ -333,12 +449,12 @@
         </w:tc>
         <w:tc>
           <w:tcPr>
-            <w:tcW w:type="dxa" w:w="1728"/>
+            <w:tcW w:type="dxa" w:w="1440"/>
             <w:tcMar>
               <w:top w:w="80" w:type="dxa"/>
               <w:bottom w:w="80" w:type="dxa"/>
-              <w:left w:w="100" w:type="dxa"/>
-              <w:right w:w="100" w:type="dxa"/>
+              <w:left w:w="120" w:type="dxa"/>
+              <w:right w:w="120" w:type="dxa"/>
             </w:tcMar>
             <w:shd w:fill="F8FAFC"/>
           </w:tcPr>
@@ -349,18 +465,20 @@
                 <w:color w:val="334155"/>
                 <w:sz w:val="17"/>
               </w:rPr>
-              <w:t>Video #31 (CTAS) &amp; Video #32 (Temp Tables) + Start Project Code Review</w:t>
+              <w:t>Video #31: SQL CTAS &amp; Video #32: Temp Tables &amp; Video #33: Subquery vs CTE vs Views vs CTAS vs Temp</w:t>
+              <w:br/>
+              <w:t>[Timestamp 16:36:40 - 17:17:31]</w:t>
             </w:r>
           </w:p>
         </w:tc>
         <w:tc>
           <w:tcPr>
-            <w:tcW w:type="dxa" w:w="1728"/>
+            <w:tcW w:type="dxa" w:w="1440"/>
             <w:tcMar>
               <w:top w:w="80" w:type="dxa"/>
               <w:bottom w:w="80" w:type="dxa"/>
-              <w:left w:w="100" w:type="dxa"/>
-              <w:right w:w="100" w:type="dxa"/>
+              <w:left w:w="120" w:type="dxa"/>
+              <w:right w:w="120" w:type="dxa"/>
             </w:tcMar>
             <w:shd w:fill="F8FAFC"/>
           </w:tcPr>
@@ -371,18 +489,18 @@
                 <w:color w:val="334155"/>
                 <w:sz w:val="17"/>
               </w:rPr>
-              <w:t>**5 HackerRank Medium** (Subqueries &amp; Temp Tables)</w:t>
+              <w:t>Task 2: Write Customer Demographics &amp; Segment Revenue CTEs</w:t>
             </w:r>
           </w:p>
         </w:tc>
         <w:tc>
           <w:tcPr>
-            <w:tcW w:type="dxa" w:w="1728"/>
+            <w:tcW w:type="dxa" w:w="1440"/>
             <w:tcMar>
               <w:top w:w="80" w:type="dxa"/>
               <w:bottom w:w="80" w:type="dxa"/>
-              <w:left w:w="100" w:type="dxa"/>
-              <w:right w:w="100" w:type="dxa"/>
+              <w:left w:w="120" w:type="dxa"/>
+              <w:right w:w="120" w:type="dxa"/>
             </w:tcMar>
             <w:shd w:fill="F8FAFC"/>
           </w:tcPr>
@@ -393,7 +511,29 @@
                 <w:color w:val="334155"/>
                 <w:sz w:val="17"/>
               </w:rPr>
-              <w:t>⏳ Watch, Code &amp; Solve</w:t>
+              <w:t>3 Medium + 2 Hard (CTEs &amp; Temp Tables)</w:t>
+            </w:r>
+          </w:p>
+        </w:tc>
+        <w:tc>
+          <w:tcPr>
+            <w:tcW w:type="dxa" w:w="1440"/>
+            <w:tcMar>
+              <w:top w:w="80" w:type="dxa"/>
+              <w:bottom w:w="80" w:type="dxa"/>
+              <w:left w:w="120" w:type="dxa"/>
+              <w:right w:w="120" w:type="dxa"/>
+            </w:tcMar>
+            <w:shd w:fill="F8FAFC"/>
+          </w:tcPr>
+          <w:p>
+            <w:r>
+              <w:rPr>
+                <w:rFonts w:ascii="Arial" w:hAnsi="Arial"/>
+                <w:color w:val="334155"/>
+                <w:sz w:val="17"/>
+              </w:rPr>
+              <w:t>⏳ Watch 3 Videos &amp; Code</w:t>
             </w:r>
           </w:p>
         </w:tc>
@@ -401,12 +541,12 @@
       <w:tr>
         <w:tc>
           <w:tcPr>
-            <w:tcW w:type="dxa" w:w="1728"/>
+            <w:tcW w:type="dxa" w:w="1440"/>
             <w:tcMar>
               <w:top w:w="80" w:type="dxa"/>
               <w:bottom w:w="80" w:type="dxa"/>
-              <w:left w:w="100" w:type="dxa"/>
-              <w:right w:w="100" w:type="dxa"/>
+              <w:left w:w="120" w:type="dxa"/>
+              <w:right w:w="120" w:type="dxa"/>
             </w:tcMar>
             <w:shd w:fill="FFFFFF"/>
           </w:tcPr>
@@ -423,12 +563,12 @@
         </w:tc>
         <w:tc>
           <w:tcPr>
-            <w:tcW w:type="dxa" w:w="1728"/>
+            <w:tcW w:type="dxa" w:w="1440"/>
             <w:tcMar>
               <w:top w:w="80" w:type="dxa"/>
               <w:bottom w:w="80" w:type="dxa"/>
-              <w:left w:w="100" w:type="dxa"/>
-              <w:right w:w="100" w:type="dxa"/>
+              <w:left w:w="120" w:type="dxa"/>
+              <w:right w:w="120" w:type="dxa"/>
             </w:tcMar>
             <w:shd w:fill="FFFFFF"/>
           </w:tcPr>
@@ -445,12 +585,12 @@
         </w:tc>
         <w:tc>
           <w:tcPr>
-            <w:tcW w:type="dxa" w:w="1728"/>
+            <w:tcW w:type="dxa" w:w="1440"/>
             <w:tcMar>
               <w:top w:w="80" w:type="dxa"/>
               <w:bottom w:w="80" w:type="dxa"/>
-              <w:left w:w="100" w:type="dxa"/>
-              <w:right w:w="100" w:type="dxa"/>
+              <w:left w:w="120" w:type="dxa"/>
+              <w:right w:w="120" w:type="dxa"/>
             </w:tcMar>
             <w:shd w:fill="FFFFFF"/>
           </w:tcPr>
@@ -461,18 +601,20 @@
                 <w:color w:val="334155"/>
                 <w:sz w:val="17"/>
               </w:rPr>
-              <w:t>Video #33 (Subquery vs CTE vs Views vs CTAS vs Temp) + Project Setup</w:t>
+              <w:t>Video #34: Clustered vs Nonclustered Indexes &amp; Video #35: Columnstore Indexes &amp; Video #36: Unique/Filtered Indexes</w:t>
+              <w:br/>
+              <w:t>[Timestamp 18:23:42]</w:t>
             </w:r>
           </w:p>
         </w:tc>
         <w:tc>
           <w:tcPr>
-            <w:tcW w:type="dxa" w:w="1728"/>
+            <w:tcW w:type="dxa" w:w="1440"/>
             <w:tcMar>
               <w:top w:w="80" w:type="dxa"/>
               <w:bottom w:w="80" w:type="dxa"/>
-              <w:left w:w="100" w:type="dxa"/>
-              <w:right w:w="100" w:type="dxa"/>
+              <w:left w:w="120" w:type="dxa"/>
+              <w:right w:w="120" w:type="dxa"/>
             </w:tcMar>
             <w:shd w:fill="FFFFFF"/>
           </w:tcPr>
@@ -483,18 +625,18 @@
                 <w:color w:val="334155"/>
                 <w:sz w:val="17"/>
               </w:rPr>
-              <w:t>**5 HackerRank Medium** (CTEs &amp; Derived Tables)</w:t>
+              <w:t>Task 3: Write Order Trend &amp; Monthly Revenue Growth Queries</w:t>
             </w:r>
           </w:p>
         </w:tc>
         <w:tc>
           <w:tcPr>
-            <w:tcW w:type="dxa" w:w="1728"/>
+            <w:tcW w:type="dxa" w:w="1440"/>
             <w:tcMar>
               <w:top w:w="80" w:type="dxa"/>
               <w:bottom w:w="80" w:type="dxa"/>
-              <w:left w:w="100" w:type="dxa"/>
-              <w:right w:w="100" w:type="dxa"/>
+              <w:left w:w="120" w:type="dxa"/>
+              <w:right w:w="120" w:type="dxa"/>
             </w:tcMar>
             <w:shd w:fill="FFFFFF"/>
           </w:tcPr>
@@ -505,7 +647,29 @@
                 <w:color w:val="334155"/>
                 <w:sz w:val="17"/>
               </w:rPr>
-              <w:t>⏳ Watch, Code &amp; Solve</w:t>
+              <w:t>3 Medium + 2 Hard (Multi-table Joins)</w:t>
+            </w:r>
+          </w:p>
+        </w:tc>
+        <w:tc>
+          <w:tcPr>
+            <w:tcW w:type="dxa" w:w="1440"/>
+            <w:tcMar>
+              <w:top w:w="80" w:type="dxa"/>
+              <w:bottom w:w="80" w:type="dxa"/>
+              <w:left w:w="120" w:type="dxa"/>
+              <w:right w:w="120" w:type="dxa"/>
+            </w:tcMar>
+            <w:shd w:fill="FFFFFF"/>
+          </w:tcPr>
+          <w:p>
+            <w:r>
+              <w:rPr>
+                <w:rFonts w:ascii="Arial" w:hAnsi="Arial"/>
+                <w:color w:val="334155"/>
+                <w:sz w:val="17"/>
+              </w:rPr>
+              <w:t>⏳ Watch 3 Videos &amp; Code</w:t>
             </w:r>
           </w:p>
         </w:tc>
@@ -513,12 +677,12 @@
       <w:tr>
         <w:tc>
           <w:tcPr>
-            <w:tcW w:type="dxa" w:w="1728"/>
+            <w:tcW w:type="dxa" w:w="1440"/>
             <w:tcMar>
               <w:top w:w="80" w:type="dxa"/>
               <w:bottom w:w="80" w:type="dxa"/>
-              <w:left w:w="100" w:type="dxa"/>
-              <w:right w:w="100" w:type="dxa"/>
+              <w:left w:w="120" w:type="dxa"/>
+              <w:right w:w="120" w:type="dxa"/>
             </w:tcMar>
             <w:shd w:fill="F8FAFC"/>
           </w:tcPr>
@@ -535,12 +699,12 @@
         </w:tc>
         <w:tc>
           <w:tcPr>
-            <w:tcW w:type="dxa" w:w="1728"/>
+            <w:tcW w:type="dxa" w:w="1440"/>
             <w:tcMar>
               <w:top w:w="80" w:type="dxa"/>
               <w:bottom w:w="80" w:type="dxa"/>
-              <w:left w:w="100" w:type="dxa"/>
-              <w:right w:w="100" w:type="dxa"/>
+              <w:left w:w="120" w:type="dxa"/>
+              <w:right w:w="120" w:type="dxa"/>
             </w:tcMar>
             <w:shd w:fill="F8FAFC"/>
           </w:tcPr>
@@ -557,12 +721,12 @@
         </w:tc>
         <w:tc>
           <w:tcPr>
-            <w:tcW w:type="dxa" w:w="1728"/>
+            <w:tcW w:type="dxa" w:w="1440"/>
             <w:tcMar>
               <w:top w:w="80" w:type="dxa"/>
               <w:bottom w:w="80" w:type="dxa"/>
-              <w:left w:w="100" w:type="dxa"/>
-              <w:right w:w="100" w:type="dxa"/>
+              <w:left w:w="120" w:type="dxa"/>
+              <w:right w:w="120" w:type="dxa"/>
             </w:tcMar>
             <w:shd w:fill="F8FAFC"/>
           </w:tcPr>
@@ -573,18 +737,20 @@
                 <w:color w:val="334155"/>
                 <w:sz w:val="17"/>
               </w:rPr>
-              <w:t>**Paytm &amp; Swiggy Business Analyst Milestone Mocks**</w:t>
+              <w:t>Video #37: Choose Right Index &amp; Video #38: Index Maintenance &amp; Video #39: Execution Plans</w:t>
+              <w:br/>
+              <w:t>[Timestamp 20:20:31]</w:t>
             </w:r>
           </w:p>
         </w:tc>
         <w:tc>
           <w:tcPr>
-            <w:tcW w:type="dxa" w:w="1728"/>
+            <w:tcW w:type="dxa" w:w="1440"/>
             <w:tcMar>
               <w:top w:w="80" w:type="dxa"/>
               <w:bottom w:w="80" w:type="dxa"/>
-              <w:left w:w="100" w:type="dxa"/>
-              <w:right w:w="100" w:type="dxa"/>
+              <w:left w:w="120" w:type="dxa"/>
+              <w:right w:w="120" w:type="dxa"/>
             </w:tcMar>
             <w:shd w:fill="F8FAFC"/>
           </w:tcPr>
@@ -595,18 +761,18 @@
                 <w:color w:val="334155"/>
                 <w:sz w:val="17"/>
               </w:rPr>
-              <w:t>**3 Medium + 2 Hard HackerRank** (Multi-table Joins)</w:t>
+              <w:t>Task 4: Calculate Customer Retention &amp; Churn (LEAD/LAG)</w:t>
             </w:r>
           </w:p>
         </w:tc>
         <w:tc>
           <w:tcPr>
-            <w:tcW w:type="dxa" w:w="1728"/>
+            <w:tcW w:type="dxa" w:w="1440"/>
             <w:tcMar>
               <w:top w:w="80" w:type="dxa"/>
               <w:bottom w:w="80" w:type="dxa"/>
-              <w:left w:w="100" w:type="dxa"/>
-              <w:right w:w="100" w:type="dxa"/>
+              <w:left w:w="120" w:type="dxa"/>
+              <w:right w:w="120" w:type="dxa"/>
             </w:tcMar>
             <w:shd w:fill="F8FAFC"/>
           </w:tcPr>
@@ -617,7 +783,29 @@
                 <w:color w:val="334155"/>
                 <w:sz w:val="17"/>
               </w:rPr>
-              <w:t>⏳ Practice Mocks &amp; Solve</w:t>
+              <w:t>3 Medium + 2 Hard (HAVING &amp; Aggregates)</w:t>
+            </w:r>
+          </w:p>
+        </w:tc>
+        <w:tc>
+          <w:tcPr>
+            <w:tcW w:type="dxa" w:w="1440"/>
+            <w:tcMar>
+              <w:top w:w="80" w:type="dxa"/>
+              <w:bottom w:w="80" w:type="dxa"/>
+              <w:left w:w="120" w:type="dxa"/>
+              <w:right w:w="120" w:type="dxa"/>
+            </w:tcMar>
+            <w:shd w:fill="F8FAFC"/>
+          </w:tcPr>
+          <w:p>
+            <w:r>
+              <w:rPr>
+                <w:rFonts w:ascii="Arial" w:hAnsi="Arial"/>
+                <w:color w:val="334155"/>
+                <w:sz w:val="17"/>
+              </w:rPr>
+              <w:t>⏳ Watch 3 Videos &amp; Code</w:t>
             </w:r>
           </w:p>
         </w:tc>
@@ -625,12 +813,12 @@
       <w:tr>
         <w:tc>
           <w:tcPr>
-            <w:tcW w:type="dxa" w:w="1728"/>
+            <w:tcW w:type="dxa" w:w="1440"/>
             <w:tcMar>
               <w:top w:w="80" w:type="dxa"/>
               <w:bottom w:w="80" w:type="dxa"/>
-              <w:left w:w="100" w:type="dxa"/>
-              <w:right w:w="100" w:type="dxa"/>
+              <w:left w:w="120" w:type="dxa"/>
+              <w:right w:w="120" w:type="dxa"/>
             </w:tcMar>
             <w:shd w:fill="FFFFFF"/>
           </w:tcPr>
@@ -647,12 +835,12 @@
         </w:tc>
         <w:tc>
           <w:tcPr>
-            <w:tcW w:type="dxa" w:w="1728"/>
+            <w:tcW w:type="dxa" w:w="1440"/>
             <w:tcMar>
               <w:top w:w="80" w:type="dxa"/>
               <w:bottom w:w="80" w:type="dxa"/>
-              <w:left w:w="100" w:type="dxa"/>
-              <w:right w:w="100" w:type="dxa"/>
+              <w:left w:w="120" w:type="dxa"/>
+              <w:right w:w="120" w:type="dxa"/>
             </w:tcMar>
             <w:shd w:fill="FFFFFF"/>
           </w:tcPr>
@@ -669,12 +857,12 @@
         </w:tc>
         <w:tc>
           <w:tcPr>
-            <w:tcW w:type="dxa" w:w="1728"/>
+            <w:tcW w:type="dxa" w:w="1440"/>
             <w:tcMar>
               <w:top w:w="80" w:type="dxa"/>
               <w:bottom w:w="80" w:type="dxa"/>
-              <w:left w:w="100" w:type="dxa"/>
-              <w:right w:w="100" w:type="dxa"/>
+              <w:left w:w="120" w:type="dxa"/>
+              <w:right w:w="120" w:type="dxa"/>
             </w:tcMar>
             <w:shd w:fill="FFFFFF"/>
           </w:tcPr>
@@ -685,18 +873,20 @@
                 <w:color w:val="334155"/>
                 <w:sz w:val="17"/>
               </w:rPr>
-              <w:t>Video #34 (Clustered/Nonclustered) &amp; Video #35 (Columnstore)</w:t>
+              <w:t>Video #40: Indexing Strategy &amp; Video #41: Table Partitioning &amp; Video #42: 30 Performance Tips</w:t>
+              <w:br/>
+              <w:t>[Timestamp 21:11:03 - 21:43:39]</w:t>
             </w:r>
           </w:p>
         </w:tc>
         <w:tc>
           <w:tcPr>
-            <w:tcW w:type="dxa" w:w="1728"/>
+            <w:tcW w:type="dxa" w:w="1440"/>
             <w:tcMar>
               <w:top w:w="80" w:type="dxa"/>
               <w:bottom w:w="80" w:type="dxa"/>
-              <w:left w:w="100" w:type="dxa"/>
-              <w:right w:w="100" w:type="dxa"/>
+              <w:left w:w="120" w:type="dxa"/>
+              <w:right w:w="120" w:type="dxa"/>
             </w:tcMar>
             <w:shd w:fill="FFFFFF"/>
           </w:tcPr>
@@ -707,18 +897,18 @@
                 <w:color w:val="334155"/>
                 <w:sz w:val="17"/>
               </w:rPr>
-              <w:t>**3 Medium + 2 Hard HackerRank** (HAVING &amp; Aggregations)</w:t>
+              <w:t>Task 5: Write Product Category Profitability &amp; Top Sellers Queries</w:t>
             </w:r>
           </w:p>
         </w:tc>
         <w:tc>
           <w:tcPr>
-            <w:tcW w:type="dxa" w:w="1728"/>
+            <w:tcW w:type="dxa" w:w="1440"/>
             <w:tcMar>
               <w:top w:w="80" w:type="dxa"/>
               <w:bottom w:w="80" w:type="dxa"/>
-              <w:left w:w="100" w:type="dxa"/>
-              <w:right w:w="100" w:type="dxa"/>
+              <w:left w:w="120" w:type="dxa"/>
+              <w:right w:w="120" w:type="dxa"/>
             </w:tcMar>
             <w:shd w:fill="FFFFFF"/>
           </w:tcPr>
@@ -729,7 +919,29 @@
                 <w:color w:val="334155"/>
                 <w:sz w:val="17"/>
               </w:rPr>
-              <w:t>⏳ Watch, Code &amp; Solve</w:t>
+              <w:t>3 Medium + 2 Hard (CASE WHEN &amp; Pivoting)</w:t>
+            </w:r>
+          </w:p>
+        </w:tc>
+        <w:tc>
+          <w:tcPr>
+            <w:tcW w:type="dxa" w:w="1440"/>
+            <w:tcMar>
+              <w:top w:w="80" w:type="dxa"/>
+              <w:bottom w:w="80" w:type="dxa"/>
+              <w:left w:w="120" w:type="dxa"/>
+              <w:right w:w="120" w:type="dxa"/>
+            </w:tcMar>
+            <w:shd w:fill="FFFFFF"/>
+          </w:tcPr>
+          <w:p>
+            <w:r>
+              <w:rPr>
+                <w:rFonts w:ascii="Arial" w:hAnsi="Arial"/>
+                <w:color w:val="334155"/>
+                <w:sz w:val="17"/>
+              </w:rPr>
+              <w:t>⏳ Watch 3 Videos &amp; Code</w:t>
             </w:r>
           </w:p>
         </w:tc>
@@ -737,12 +949,12 @@
       <w:tr>
         <w:tc>
           <w:tcPr>
-            <w:tcW w:type="dxa" w:w="1728"/>
+            <w:tcW w:type="dxa" w:w="1440"/>
             <w:tcMar>
               <w:top w:w="80" w:type="dxa"/>
               <w:bottom w:w="80" w:type="dxa"/>
-              <w:left w:w="100" w:type="dxa"/>
-              <w:right w:w="100" w:type="dxa"/>
+              <w:left w:w="120" w:type="dxa"/>
+              <w:right w:w="120" w:type="dxa"/>
             </w:tcMar>
             <w:shd w:fill="F8FAFC"/>
           </w:tcPr>
@@ -759,12 +971,12 @@
         </w:tc>
         <w:tc>
           <w:tcPr>
-            <w:tcW w:type="dxa" w:w="1728"/>
+            <w:tcW w:type="dxa" w:w="1440"/>
             <w:tcMar>
               <w:top w:w="80" w:type="dxa"/>
               <w:bottom w:w="80" w:type="dxa"/>
-              <w:left w:w="100" w:type="dxa"/>
-              <w:right w:w="100" w:type="dxa"/>
+              <w:left w:w="120" w:type="dxa"/>
+              <w:right w:w="120" w:type="dxa"/>
             </w:tcMar>
             <w:shd w:fill="F8FAFC"/>
           </w:tcPr>
@@ -781,12 +993,12 @@
         </w:tc>
         <w:tc>
           <w:tcPr>
-            <w:tcW w:type="dxa" w:w="1728"/>
+            <w:tcW w:type="dxa" w:w="1440"/>
             <w:tcMar>
               <w:top w:w="80" w:type="dxa"/>
               <w:bottom w:w="80" w:type="dxa"/>
-              <w:left w:w="100" w:type="dxa"/>
-              <w:right w:w="100" w:type="dxa"/>
+              <w:left w:w="120" w:type="dxa"/>
+              <w:right w:w="120" w:type="dxa"/>
             </w:tcMar>
             <w:shd w:fill="F8FAFC"/>
           </w:tcPr>
@@ -797,18 +1009,20 @@
                 <w:color w:val="334155"/>
                 <w:sz w:val="17"/>
               </w:rPr>
-              <w:t>Video #36 (Filtered Indexes) &amp; Video #37 (Right Index Choice)</w:t>
+              <w:t>Video #43: Stored Procedures &amp; Video #44: Triggers &amp; Video #45: ChatGPT / Copilot AI Workflow</w:t>
+              <w:br/>
+              <w:t>[Timestamp 17:27:04 - 22:24:25]</w:t>
             </w:r>
           </w:p>
         </w:tc>
         <w:tc>
           <w:tcPr>
-            <w:tcW w:type="dxa" w:w="1728"/>
+            <w:tcW w:type="dxa" w:w="1440"/>
             <w:tcMar>
               <w:top w:w="80" w:type="dxa"/>
               <w:bottom w:w="80" w:type="dxa"/>
-              <w:left w:w="100" w:type="dxa"/>
-              <w:right w:w="100" w:type="dxa"/>
+              <w:left w:w="120" w:type="dxa"/>
+              <w:right w:w="120" w:type="dxa"/>
             </w:tcMar>
             <w:shd w:fill="F8FAFC"/>
           </w:tcPr>
@@ -819,18 +1033,18 @@
                 <w:color w:val="334155"/>
                 <w:sz w:val="17"/>
               </w:rPr>
-              <w:t>**3 Medium + 2 Hard HackerRank** (CASE WHEN &amp; Pivoting)</w:t>
+              <w:t>Task 6: Create Production Views (vw_monthly_kpis, vw_churn)</w:t>
             </w:r>
           </w:p>
         </w:tc>
         <w:tc>
           <w:tcPr>
-            <w:tcW w:type="dxa" w:w="1728"/>
+            <w:tcW w:type="dxa" w:w="1440"/>
             <w:tcMar>
               <w:top w:w="80" w:type="dxa"/>
               <w:bottom w:w="80" w:type="dxa"/>
-              <w:left w:w="100" w:type="dxa"/>
-              <w:right w:w="100" w:type="dxa"/>
+              <w:left w:w="120" w:type="dxa"/>
+              <w:right w:w="120" w:type="dxa"/>
             </w:tcMar>
             <w:shd w:fill="F8FAFC"/>
           </w:tcPr>
@@ -841,7 +1055,29 @@
                 <w:color w:val="334155"/>
                 <w:sz w:val="17"/>
               </w:rPr>
-              <w:t>⏳ Watch, Code &amp; Solve</w:t>
+              <w:t>3 Medium + 2 Hard (ROW_NUMBER)</w:t>
+            </w:r>
+          </w:p>
+        </w:tc>
+        <w:tc>
+          <w:tcPr>
+            <w:tcW w:type="dxa" w:w="1440"/>
+            <w:tcMar>
+              <w:top w:w="80" w:type="dxa"/>
+              <w:bottom w:w="80" w:type="dxa"/>
+              <w:left w:w="120" w:type="dxa"/>
+              <w:right w:w="120" w:type="dxa"/>
+            </w:tcMar>
+            <w:shd w:fill="F8FAFC"/>
+          </w:tcPr>
+          <w:p>
+            <w:r>
+              <w:rPr>
+                <w:rFonts w:ascii="Arial" w:hAnsi="Arial"/>
+                <w:color w:val="334155"/>
+                <w:sz w:val="17"/>
+              </w:rPr>
+              <w:t>💡 Watch 3 Videos &amp; Code</w:t>
             </w:r>
           </w:p>
         </w:tc>
@@ -849,12 +1085,12 @@
       <w:tr>
         <w:tc>
           <w:tcPr>
-            <w:tcW w:type="dxa" w:w="1728"/>
+            <w:tcW w:type="dxa" w:w="1440"/>
             <w:tcMar>
               <w:top w:w="80" w:type="dxa"/>
               <w:bottom w:w="80" w:type="dxa"/>
-              <w:left w:w="100" w:type="dxa"/>
-              <w:right w:w="100" w:type="dxa"/>
+              <w:left w:w="120" w:type="dxa"/>
+              <w:right w:w="120" w:type="dxa"/>
             </w:tcMar>
             <w:shd w:fill="FFFFFF"/>
           </w:tcPr>
@@ -871,12 +1107,12 @@
         </w:tc>
         <w:tc>
           <w:tcPr>
-            <w:tcW w:type="dxa" w:w="1728"/>
+            <w:tcW w:type="dxa" w:w="1440"/>
             <w:tcMar>
               <w:top w:w="80" w:type="dxa"/>
               <w:bottom w:w="80" w:type="dxa"/>
-              <w:left w:w="100" w:type="dxa"/>
-              <w:right w:w="100" w:type="dxa"/>
+              <w:left w:w="120" w:type="dxa"/>
+              <w:right w:w="120" w:type="dxa"/>
             </w:tcMar>
             <w:shd w:fill="FFFFFF"/>
           </w:tcPr>
@@ -893,12 +1129,12 @@
         </w:tc>
         <w:tc>
           <w:tcPr>
-            <w:tcW w:type="dxa" w:w="1728"/>
+            <w:tcW w:type="dxa" w:w="1440"/>
             <w:tcMar>
               <w:top w:w="80" w:type="dxa"/>
               <w:bottom w:w="80" w:type="dxa"/>
-              <w:left w:w="100" w:type="dxa"/>
-              <w:right w:w="100" w:type="dxa"/>
+              <w:left w:w="120" w:type="dxa"/>
+              <w:right w:w="120" w:type="dxa"/>
             </w:tcMar>
             <w:shd w:fill="FFFFFF"/>
           </w:tcPr>
@@ -909,18 +1145,20 @@
                 <w:color w:val="334155"/>
                 <w:sz w:val="17"/>
               </w:rPr>
-              <w:t>Video #38 (Index Maintenance) &amp; Video #39 (Execution Plans)</w:t>
+              <w:t>Videos #46–48: Data Warehouse Basics &amp; ETL Ingestion Pipeline</w:t>
+              <w:br/>
+              <w:t>[Timestamp 23:21:04 - 25:10:09]</w:t>
             </w:r>
           </w:p>
         </w:tc>
         <w:tc>
           <w:tcPr>
-            <w:tcW w:type="dxa" w:w="1728"/>
+            <w:tcW w:type="dxa" w:w="1440"/>
             <w:tcMar>
               <w:top w:w="80" w:type="dxa"/>
               <w:bottom w:w="80" w:type="dxa"/>
-              <w:left w:w="100" w:type="dxa"/>
-              <w:right w:w="100" w:type="dxa"/>
+              <w:left w:w="120" w:type="dxa"/>
+              <w:right w:w="120" w:type="dxa"/>
             </w:tcMar>
             <w:shd w:fill="FFFFFF"/>
           </w:tcPr>
@@ -931,18 +1169,18 @@
                 <w:color w:val="334155"/>
                 <w:sz w:val="17"/>
               </w:rPr>
-              <w:t>**3 Medium + 2 Hard HackerRank** (ROW_NUMBER Window Funcs)</w:t>
+              <w:t>Task 7: Benchmark query execution time with EXPLAIN QUERY PLAN</w:t>
             </w:r>
           </w:p>
         </w:tc>
         <w:tc>
           <w:tcPr>
-            <w:tcW w:type="dxa" w:w="1728"/>
+            <w:tcW w:type="dxa" w:w="1440"/>
             <w:tcMar>
               <w:top w:w="80" w:type="dxa"/>
               <w:bottom w:w="80" w:type="dxa"/>
-              <w:left w:w="100" w:type="dxa"/>
-              <w:right w:w="100" w:type="dxa"/>
+              <w:left w:w="120" w:type="dxa"/>
+              <w:right w:w="120" w:type="dxa"/>
             </w:tcMar>
             <w:shd w:fill="FFFFFF"/>
           </w:tcPr>
@@ -953,7 +1191,29 @@
                 <w:color w:val="334155"/>
                 <w:sz w:val="17"/>
               </w:rPr>
-              <w:t>⏳ Watch, Code &amp; Solve</w:t>
+              <w:t>3 Medium + 2 Hard (RANK &amp; DENSE_RANK)</w:t>
+            </w:r>
+          </w:p>
+        </w:tc>
+        <w:tc>
+          <w:tcPr>
+            <w:tcW w:type="dxa" w:w="1440"/>
+            <w:tcMar>
+              <w:top w:w="80" w:type="dxa"/>
+              <w:bottom w:w="80" w:type="dxa"/>
+              <w:left w:w="120" w:type="dxa"/>
+              <w:right w:w="120" w:type="dxa"/>
+            </w:tcMar>
+            <w:shd w:fill="FFFFFF"/>
+          </w:tcPr>
+          <w:p>
+            <w:r>
+              <w:rPr>
+                <w:rFonts w:ascii="Arial" w:hAnsi="Arial"/>
+                <w:color w:val="334155"/>
+                <w:sz w:val="17"/>
+              </w:rPr>
+              <w:t>🏗️ DWH Series &amp; Code</w:t>
             </w:r>
           </w:p>
         </w:tc>
@@ -961,12 +1221,12 @@
       <w:tr>
         <w:tc>
           <w:tcPr>
-            <w:tcW w:type="dxa" w:w="1728"/>
+            <w:tcW w:type="dxa" w:w="1440"/>
             <w:tcMar>
               <w:top w:w="80" w:type="dxa"/>
               <w:bottom w:w="80" w:type="dxa"/>
-              <w:left w:w="100" w:type="dxa"/>
-              <w:right w:w="100" w:type="dxa"/>
+              <w:left w:w="120" w:type="dxa"/>
+              <w:right w:w="120" w:type="dxa"/>
             </w:tcMar>
             <w:shd w:fill="F8FAFC"/>
           </w:tcPr>
@@ -983,12 +1243,12 @@
         </w:tc>
         <w:tc>
           <w:tcPr>
-            <w:tcW w:type="dxa" w:w="1728"/>
+            <w:tcW w:type="dxa" w:w="1440"/>
             <w:tcMar>
               <w:top w:w="80" w:type="dxa"/>
               <w:bottom w:w="80" w:type="dxa"/>
-              <w:left w:w="100" w:type="dxa"/>
-              <w:right w:w="100" w:type="dxa"/>
+              <w:left w:w="120" w:type="dxa"/>
+              <w:right w:w="120" w:type="dxa"/>
             </w:tcMar>
             <w:shd w:fill="F8FAFC"/>
           </w:tcPr>
@@ -1005,12 +1265,12 @@
         </w:tc>
         <w:tc>
           <w:tcPr>
-            <w:tcW w:type="dxa" w:w="1728"/>
+            <w:tcW w:type="dxa" w:w="1440"/>
             <w:tcMar>
               <w:top w:w="80" w:type="dxa"/>
               <w:bottom w:w="80" w:type="dxa"/>
-              <w:left w:w="100" w:type="dxa"/>
-              <w:right w:w="100" w:type="dxa"/>
+              <w:left w:w="120" w:type="dxa"/>
+              <w:right w:w="120" w:type="dxa"/>
             </w:tcMar>
             <w:shd w:fill="F8FAFC"/>
           </w:tcPr>
@@ -1021,18 +1281,18 @@
                 <w:color w:val="334155"/>
                 <w:sz w:val="17"/>
               </w:rPr>
-              <w:t>Video #40 (Indexing Strategy) &amp; Video #41 (Table Partitioning)</w:t>
+              <w:t>Videos #49–51: Environment Setup, Architecture &amp; Database Creation</w:t>
             </w:r>
           </w:p>
         </w:tc>
         <w:tc>
           <w:tcPr>
-            <w:tcW w:type="dxa" w:w="1728"/>
+            <w:tcW w:type="dxa" w:w="1440"/>
             <w:tcMar>
               <w:top w:w="80" w:type="dxa"/>
               <w:bottom w:w="80" w:type="dxa"/>
-              <w:left w:w="100" w:type="dxa"/>
-              <w:right w:w="100" w:type="dxa"/>
+              <w:left w:w="120" w:type="dxa"/>
+              <w:right w:w="120" w:type="dxa"/>
             </w:tcMar>
             <w:shd w:fill="F8FAFC"/>
           </w:tcPr>
@@ -1043,18 +1303,18 @@
                 <w:color w:val="334155"/>
                 <w:sz w:val="17"/>
               </w:rPr>
-              <w:t>**3 Medium + 2 Hard HackerRank** (RANK &amp; DENSE_RANK)</w:t>
+              <w:t>Task 8: Add Indexing strategies to speed up join queries by 5x</w:t>
             </w:r>
           </w:p>
         </w:tc>
         <w:tc>
           <w:tcPr>
-            <w:tcW w:type="dxa" w:w="1728"/>
+            <w:tcW w:type="dxa" w:w="1440"/>
             <w:tcMar>
               <w:top w:w="80" w:type="dxa"/>
               <w:bottom w:w="80" w:type="dxa"/>
-              <w:left w:w="100" w:type="dxa"/>
-              <w:right w:w="100" w:type="dxa"/>
+              <w:left w:w="120" w:type="dxa"/>
+              <w:right w:w="120" w:type="dxa"/>
             </w:tcMar>
             <w:shd w:fill="F8FAFC"/>
           </w:tcPr>
@@ -1065,7 +1325,29 @@
                 <w:color w:val="334155"/>
                 <w:sz w:val="17"/>
               </w:rPr>
-              <w:t>⏳ Watch, Code &amp; Solve</w:t>
+              <w:t>3 Medium + 2 Hard (LEAD / LAG)</w:t>
+            </w:r>
+          </w:p>
+        </w:tc>
+        <w:tc>
+          <w:tcPr>
+            <w:tcW w:type="dxa" w:w="1440"/>
+            <w:tcMar>
+              <w:top w:w="80" w:type="dxa"/>
+              <w:bottom w:w="80" w:type="dxa"/>
+              <w:left w:w="120" w:type="dxa"/>
+              <w:right w:w="120" w:type="dxa"/>
+            </w:tcMar>
+            <w:shd w:fill="F8FAFC"/>
+          </w:tcPr>
+          <w:p>
+            <w:r>
+              <w:rPr>
+                <w:rFonts w:ascii="Arial" w:hAnsi="Arial"/>
+                <w:color w:val="334155"/>
+                <w:sz w:val="17"/>
+              </w:rPr>
+              <w:t>🏗️ DWH Series &amp; Code</w:t>
             </w:r>
           </w:p>
         </w:tc>
@@ -1073,12 +1355,12 @@
       <w:tr>
         <w:tc>
           <w:tcPr>
-            <w:tcW w:type="dxa" w:w="1728"/>
+            <w:tcW w:type="dxa" w:w="1440"/>
             <w:tcMar>
               <w:top w:w="80" w:type="dxa"/>
               <w:bottom w:w="80" w:type="dxa"/>
-              <w:left w:w="100" w:type="dxa"/>
-              <w:right w:w="100" w:type="dxa"/>
+              <w:left w:w="120" w:type="dxa"/>
+              <w:right w:w="120" w:type="dxa"/>
             </w:tcMar>
             <w:shd w:fill="FFFFFF"/>
           </w:tcPr>
@@ -1095,12 +1377,12 @@
         </w:tc>
         <w:tc>
           <w:tcPr>
-            <w:tcW w:type="dxa" w:w="1728"/>
+            <w:tcW w:type="dxa" w:w="1440"/>
             <w:tcMar>
               <w:top w:w="80" w:type="dxa"/>
               <w:bottom w:w="80" w:type="dxa"/>
-              <w:left w:w="100" w:type="dxa"/>
-              <w:right w:w="100" w:type="dxa"/>
+              <w:left w:w="120" w:type="dxa"/>
+              <w:right w:w="120" w:type="dxa"/>
             </w:tcMar>
             <w:shd w:fill="FFFFFF"/>
           </w:tcPr>
@@ -1117,12 +1399,12 @@
         </w:tc>
         <w:tc>
           <w:tcPr>
-            <w:tcW w:type="dxa" w:w="1728"/>
+            <w:tcW w:type="dxa" w:w="1440"/>
             <w:tcMar>
               <w:top w:w="80" w:type="dxa"/>
               <w:bottom w:w="80" w:type="dxa"/>
-              <w:left w:w="100" w:type="dxa"/>
-              <w:right w:w="100" w:type="dxa"/>
+              <w:left w:w="120" w:type="dxa"/>
+              <w:right w:w="120" w:type="dxa"/>
             </w:tcMar>
             <w:shd w:fill="FFFFFF"/>
           </w:tcPr>
@@ -1133,18 +1415,20 @@
                 <w:color w:val="334155"/>
                 <w:sz w:val="17"/>
               </w:rPr>
-              <w:t>Video #42 (30 SQL Performance Tips from 18 Yrs Exp)</w:t>
+              <w:t>Videos #52–54: Bronze, Silver &amp; Gold Layer Star Schema Modeling</w:t>
+              <w:br/>
+              <w:t>[Timestamp 26:47:46]</w:t>
             </w:r>
           </w:p>
         </w:tc>
         <w:tc>
           <w:tcPr>
-            <w:tcW w:type="dxa" w:w="1728"/>
+            <w:tcW w:type="dxa" w:w="1440"/>
             <w:tcMar>
               <w:top w:w="80" w:type="dxa"/>
               <w:bottom w:w="80" w:type="dxa"/>
-              <w:left w:w="100" w:type="dxa"/>
-              <w:right w:w="100" w:type="dxa"/>
+              <w:left w:w="120" w:type="dxa"/>
+              <w:right w:w="120" w:type="dxa"/>
             </w:tcMar>
             <w:shd w:fill="FFFFFF"/>
           </w:tcPr>
@@ -1155,18 +1439,18 @@
                 <w:color w:val="334155"/>
                 <w:sz w:val="17"/>
               </w:rPr>
-              <w:t>**3 Medium + 2 Hard HackerRank** (LEAD &amp; LAG Streaks)</w:t>
+              <w:t>Task 9: Write SQL documentation &amp; query explanations</w:t>
             </w:r>
           </w:p>
         </w:tc>
         <w:tc>
           <w:tcPr>
-            <w:tcW w:type="dxa" w:w="1728"/>
+            <w:tcW w:type="dxa" w:w="1440"/>
             <w:tcMar>
               <w:top w:w="80" w:type="dxa"/>
               <w:bottom w:w="80" w:type="dxa"/>
-              <w:left w:w="100" w:type="dxa"/>
-              <w:right w:w="100" w:type="dxa"/>
+              <w:left w:w="120" w:type="dxa"/>
+              <w:right w:w="120" w:type="dxa"/>
             </w:tcMar>
             <w:shd w:fill="FFFFFF"/>
           </w:tcPr>
@@ -1177,7 +1461,29 @@
                 <w:color w:val="334155"/>
                 <w:sz w:val="17"/>
               </w:rPr>
-              <w:t>⏳ Watch, Code &amp; Solve</w:t>
+              <w:t>3 Medium + 2 Hard (Medians &amp; Streaks)</w:t>
+            </w:r>
+          </w:p>
+        </w:tc>
+        <w:tc>
+          <w:tcPr>
+            <w:tcW w:type="dxa" w:w="1440"/>
+            <w:tcMar>
+              <w:top w:w="80" w:type="dxa"/>
+              <w:bottom w:w="80" w:type="dxa"/>
+              <w:left w:w="120" w:type="dxa"/>
+              <w:right w:w="120" w:type="dxa"/>
+            </w:tcMar>
+            <w:shd w:fill="FFFFFF"/>
+          </w:tcPr>
+          <w:p>
+            <w:r>
+              <w:rPr>
+                <w:rFonts w:ascii="Arial" w:hAnsi="Arial"/>
+                <w:color w:val="334155"/>
+                <w:sz w:val="17"/>
+              </w:rPr>
+              <w:t>🏗️ Star Schema Modeling</w:t>
             </w:r>
           </w:p>
         </w:tc>
@@ -1185,12 +1491,12 @@
       <w:tr>
         <w:tc>
           <w:tcPr>
-            <w:tcW w:type="dxa" w:w="1728"/>
+            <w:tcW w:type="dxa" w:w="1440"/>
             <w:tcMar>
               <w:top w:w="80" w:type="dxa"/>
               <w:bottom w:w="80" w:type="dxa"/>
-              <w:left w:w="100" w:type="dxa"/>
-              <w:right w:w="100" w:type="dxa"/>
+              <w:left w:w="120" w:type="dxa"/>
+              <w:right w:w="120" w:type="dxa"/>
             </w:tcMar>
             <w:shd w:fill="F8FAFC"/>
           </w:tcPr>
@@ -1207,12 +1513,12 @@
         </w:tc>
         <w:tc>
           <w:tcPr>
-            <w:tcW w:type="dxa" w:w="1728"/>
+            <w:tcW w:type="dxa" w:w="1440"/>
             <w:tcMar>
               <w:top w:w="80" w:type="dxa"/>
               <w:bottom w:w="80" w:type="dxa"/>
-              <w:left w:w="100" w:type="dxa"/>
-              <w:right w:w="100" w:type="dxa"/>
+              <w:left w:w="120" w:type="dxa"/>
+              <w:right w:w="120" w:type="dxa"/>
             </w:tcMar>
             <w:shd w:fill="F8FAFC"/>
           </w:tcPr>
@@ -1229,12 +1535,12 @@
         </w:tc>
         <w:tc>
           <w:tcPr>
-            <w:tcW w:type="dxa" w:w="1728"/>
+            <w:tcW w:type="dxa" w:w="1440"/>
             <w:tcMar>
               <w:top w:w="80" w:type="dxa"/>
               <w:bottom w:w="80" w:type="dxa"/>
-              <w:left w:w="100" w:type="dxa"/>
-              <w:right w:w="100" w:type="dxa"/>
+              <w:left w:w="120" w:type="dxa"/>
+              <w:right w:w="120" w:type="dxa"/>
             </w:tcMar>
             <w:shd w:fill="F8FAFC"/>
           </w:tcPr>
@@ -1245,18 +1551,20 @@
                 <w:color w:val="334155"/>
                 <w:sz w:val="17"/>
               </w:rPr>
-              <w:t>**CRED Risk Analyst Milestone Mock Exam**</w:t>
+              <w:t>Video #55: SQL Exploratory Data Analysis (EDA) Project</w:t>
+              <w:br/>
+              <w:t>[Timestamp 27:41:51]</w:t>
             </w:r>
           </w:p>
         </w:tc>
         <w:tc>
           <w:tcPr>
-            <w:tcW w:type="dxa" w:w="1728"/>
+            <w:tcW w:type="dxa" w:w="1440"/>
             <w:tcMar>
               <w:top w:w="80" w:type="dxa"/>
               <w:bottom w:w="80" w:type="dxa"/>
-              <w:left w:w="100" w:type="dxa"/>
-              <w:right w:w="100" w:type="dxa"/>
+              <w:left w:w="120" w:type="dxa"/>
+              <w:right w:w="120" w:type="dxa"/>
             </w:tcMar>
             <w:shd w:fill="F8FAFC"/>
           </w:tcPr>
@@ -1267,18 +1575,18 @@
                 <w:color w:val="334155"/>
                 <w:sz w:val="17"/>
               </w:rPr>
-              <w:t>**3 Medium + 2 Hard HackerRank** (Medians &amp; Percentiles)</w:t>
+              <w:t>Task 10: Finalize Project 1 (Exploratory Data Analysis EDA Repo)</w:t>
             </w:r>
           </w:p>
         </w:tc>
         <w:tc>
           <w:tcPr>
-            <w:tcW w:type="dxa" w:w="1728"/>
+            <w:tcW w:type="dxa" w:w="1440"/>
             <w:tcMar>
               <w:top w:w="80" w:type="dxa"/>
               <w:bottom w:w="80" w:type="dxa"/>
-              <w:left w:w="100" w:type="dxa"/>
-              <w:right w:w="100" w:type="dxa"/>
+              <w:left w:w="120" w:type="dxa"/>
+              <w:right w:w="120" w:type="dxa"/>
             </w:tcMar>
             <w:shd w:fill="F8FAFC"/>
           </w:tcPr>
@@ -1289,7 +1597,29 @@
                 <w:color w:val="334155"/>
                 <w:sz w:val="17"/>
               </w:rPr>
-              <w:t>⏳ Practice Mocks &amp; Solve</w:t>
+              <w:t>5 HackerRank Hard (Complex Challenges)</w:t>
+            </w:r>
+          </w:p>
+        </w:tc>
+        <w:tc>
+          <w:tcPr>
+            <w:tcW w:type="dxa" w:w="1440"/>
+            <w:tcMar>
+              <w:top w:w="80" w:type="dxa"/>
+              <w:bottom w:w="80" w:type="dxa"/>
+              <w:left w:w="120" w:type="dxa"/>
+              <w:right w:w="120" w:type="dxa"/>
+            </w:tcMar>
+            <w:shd w:fill="F8FAFC"/>
+          </w:tcPr>
+          <w:p>
+            <w:r>
+              <w:rPr>
+                <w:rFonts w:ascii="Arial" w:hAnsi="Arial"/>
+                <w:color w:val="334155"/>
+                <w:sz w:val="17"/>
+              </w:rPr>
+              <w:t>🎯 MUST WATCH PROJECT 1</w:t>
             </w:r>
           </w:p>
         </w:tc>
@@ -1297,12 +1627,12 @@
       <w:tr>
         <w:tc>
           <w:tcPr>
-            <w:tcW w:type="dxa" w:w="1728"/>
+            <w:tcW w:type="dxa" w:w="1440"/>
             <w:tcMar>
               <w:top w:w="80" w:type="dxa"/>
               <w:bottom w:w="80" w:type="dxa"/>
-              <w:left w:w="100" w:type="dxa"/>
-              <w:right w:w="100" w:type="dxa"/>
+              <w:left w:w="120" w:type="dxa"/>
+              <w:right w:w="120" w:type="dxa"/>
             </w:tcMar>
             <w:shd w:fill="FFFFFF"/>
           </w:tcPr>
@@ -1319,12 +1649,12 @@
         </w:tc>
         <w:tc>
           <w:tcPr>
-            <w:tcW w:type="dxa" w:w="1728"/>
+            <w:tcW w:type="dxa" w:w="1440"/>
             <w:tcMar>
               <w:top w:w="80" w:type="dxa"/>
               <w:bottom w:w="80" w:type="dxa"/>
-              <w:left w:w="100" w:type="dxa"/>
-              <w:right w:w="100" w:type="dxa"/>
+              <w:left w:w="120" w:type="dxa"/>
+              <w:right w:w="120" w:type="dxa"/>
             </w:tcMar>
             <w:shd w:fill="FFFFFF"/>
           </w:tcPr>
@@ -1341,12 +1671,12 @@
         </w:tc>
         <w:tc>
           <w:tcPr>
-            <w:tcW w:type="dxa" w:w="1728"/>
+            <w:tcW w:type="dxa" w:w="1440"/>
             <w:tcMar>
               <w:top w:w="80" w:type="dxa"/>
               <w:bottom w:w="80" w:type="dxa"/>
-              <w:left w:w="100" w:type="dxa"/>
-              <w:right w:w="100" w:type="dxa"/>
+              <w:left w:w="120" w:type="dxa"/>
+              <w:right w:w="120" w:type="dxa"/>
             </w:tcMar>
             <w:shd w:fill="FFFFFF"/>
           </w:tcPr>
@@ -1357,18 +1687,20 @@
                 <w:color w:val="334155"/>
                 <w:sz w:val="17"/>
               </w:rPr>
-              <w:t>Video #43 (Stored Procedures) &amp; Video #44 (Triggers) [Optional DE]</w:t>
+              <w:t>Video #56: SQL Data Analyst Portfolio Project</w:t>
+              <w:br/>
+              <w:t>[Timestamp 28:30:38]</w:t>
             </w:r>
           </w:p>
         </w:tc>
         <w:tc>
           <w:tcPr>
-            <w:tcW w:type="dxa" w:w="1728"/>
+            <w:tcW w:type="dxa" w:w="1440"/>
             <w:tcMar>
               <w:top w:w="80" w:type="dxa"/>
               <w:bottom w:w="80" w:type="dxa"/>
-              <w:left w:w="100" w:type="dxa"/>
-              <w:right w:w="100" w:type="dxa"/>
+              <w:left w:w="120" w:type="dxa"/>
+              <w:right w:w="120" w:type="dxa"/>
             </w:tcMar>
             <w:shd w:fill="FFFFFF"/>
           </w:tcPr>
@@ -1379,18 +1711,18 @@
                 <w:color w:val="334155"/>
                 <w:sz w:val="17"/>
               </w:rPr>
-              <w:t>**5 HackerRank Hard** (Advanced Query Challenges)</w:t>
+              <w:t>Task 11: Finalize Project 2 (Data Analyst Portfolio Repo)</w:t>
             </w:r>
           </w:p>
         </w:tc>
         <w:tc>
           <w:tcPr>
-            <w:tcW w:type="dxa" w:w="1728"/>
+            <w:tcW w:type="dxa" w:w="1440"/>
             <w:tcMar>
               <w:top w:w="80" w:type="dxa"/>
               <w:bottom w:w="80" w:type="dxa"/>
-              <w:left w:w="100" w:type="dxa"/>
-              <w:right w:w="100" w:type="dxa"/>
+              <w:left w:w="120" w:type="dxa"/>
+              <w:right w:w="120" w:type="dxa"/>
             </w:tcMar>
             <w:shd w:fill="FFFFFF"/>
           </w:tcPr>
@@ -1401,7 +1733,29 @@
                 <w:color w:val="334155"/>
                 <w:sz w:val="17"/>
               </w:rPr>
-              <w:t>💡 Optional DE &amp; Solve</w:t>
+              <w:t>5 HackerRank Hard (Final Set)</w:t>
+            </w:r>
+          </w:p>
+        </w:tc>
+        <w:tc>
+          <w:tcPr>
+            <w:tcW w:type="dxa" w:w="1440"/>
+            <w:tcMar>
+              <w:top w:w="80" w:type="dxa"/>
+              <w:bottom w:w="80" w:type="dxa"/>
+              <w:left w:w="120" w:type="dxa"/>
+              <w:right w:w="120" w:type="dxa"/>
+            </w:tcMar>
+            <w:shd w:fill="FFFFFF"/>
+          </w:tcPr>
+          <w:p>
+            <w:r>
+              <w:rPr>
+                <w:rFonts w:ascii="Arial" w:hAnsi="Arial"/>
+                <w:color w:val="334155"/>
+                <w:sz w:val="17"/>
+              </w:rPr>
+              <w:t>🎯 MUST WATCH PROJECT 2</w:t>
             </w:r>
           </w:p>
         </w:tc>
@@ -1409,12 +1763,12 @@
       <w:tr>
         <w:tc>
           <w:tcPr>
-            <w:tcW w:type="dxa" w:w="1728"/>
+            <w:tcW w:type="dxa" w:w="1440"/>
             <w:tcMar>
               <w:top w:w="80" w:type="dxa"/>
               <w:bottom w:w="80" w:type="dxa"/>
-              <w:left w:w="100" w:type="dxa"/>
-              <w:right w:w="100" w:type="dxa"/>
+              <w:left w:w="120" w:type="dxa"/>
+              <w:right w:w="120" w:type="dxa"/>
             </w:tcMar>
             <w:shd w:fill="F8FAFC"/>
           </w:tcPr>
@@ -1431,12 +1785,12 @@
         </w:tc>
         <w:tc>
           <w:tcPr>
-            <w:tcW w:type="dxa" w:w="1728"/>
+            <w:tcW w:type="dxa" w:w="1440"/>
             <w:tcMar>
               <w:top w:w="80" w:type="dxa"/>
               <w:bottom w:w="80" w:type="dxa"/>
-              <w:left w:w="100" w:type="dxa"/>
-              <w:right w:w="100" w:type="dxa"/>
+              <w:left w:w="120" w:type="dxa"/>
+              <w:right w:w="120" w:type="dxa"/>
             </w:tcMar>
             <w:shd w:fill="F8FAFC"/>
           </w:tcPr>
@@ -1453,12 +1807,12 @@
         </w:tc>
         <w:tc>
           <w:tcPr>
-            <w:tcW w:type="dxa" w:w="1728"/>
+            <w:tcW w:type="dxa" w:w="1440"/>
             <w:tcMar>
               <w:top w:w="80" w:type="dxa"/>
               <w:bottom w:w="80" w:type="dxa"/>
-              <w:left w:w="100" w:type="dxa"/>
-              <w:right w:w="100" w:type="dxa"/>
+              <w:left w:w="120" w:type="dxa"/>
+              <w:right w:w="120" w:type="dxa"/>
             </w:tcMar>
             <w:shd w:fill="F8FAFC"/>
           </w:tcPr>
@@ -1469,18 +1823,18 @@
                 <w:color w:val="334155"/>
                 <w:sz w:val="17"/>
               </w:rPr>
-              <w:t>Video #45 (ChatGPT &amp; GitHub Copilot Workflow)</w:t>
+              <w:t>Full Course Review &amp; Portfolio Audit</w:t>
             </w:r>
           </w:p>
         </w:tc>
         <w:tc>
           <w:tcPr>
-            <w:tcW w:type="dxa" w:w="1728"/>
+            <w:tcW w:type="dxa" w:w="1440"/>
             <w:tcMar>
               <w:top w:w="80" w:type="dxa"/>
               <w:bottom w:w="80" w:type="dxa"/>
-              <w:left w:w="100" w:type="dxa"/>
-              <w:right w:w="100" w:type="dxa"/>
+              <w:left w:w="120" w:type="dxa"/>
+              <w:right w:w="120" w:type="dxa"/>
             </w:tcMar>
             <w:shd w:fill="F8FAFC"/>
           </w:tcPr>
@@ -1491,18 +1845,18 @@
                 <w:color w:val="334155"/>
                 <w:sz w:val="17"/>
               </w:rPr>
-              <w:t>**5 HackerRank Hard** (Complex Aggregations)</w:t>
+              <w:t>Task 12: Push complete portfolio repos to GitHub for recruiters</w:t>
             </w:r>
           </w:p>
         </w:tc>
         <w:tc>
           <w:tcPr>
-            <w:tcW w:type="dxa" w:w="1728"/>
+            <w:tcW w:type="dxa" w:w="1440"/>
             <w:tcMar>
               <w:top w:w="80" w:type="dxa"/>
               <w:bottom w:w="80" w:type="dxa"/>
-              <w:left w:w="100" w:type="dxa"/>
-              <w:right w:w="100" w:type="dxa"/>
+              <w:left w:w="120" w:type="dxa"/>
+              <w:right w:w="120" w:type="dxa"/>
             </w:tcMar>
             <w:shd w:fill="F8FAFC"/>
           </w:tcPr>
@@ -1513,7 +1867,29 @@
                 <w:color w:val="334155"/>
                 <w:sz w:val="17"/>
               </w:rPr>
-              <w:t>💡 Optional AI &amp; Solve</w:t>
+              <w:t>🎯 DATALEMUR DAY 1: Start FAANG Questions</w:t>
+            </w:r>
+          </w:p>
+        </w:tc>
+        <w:tc>
+          <w:tcPr>
+            <w:tcW w:type="dxa" w:w="1440"/>
+            <w:tcMar>
+              <w:top w:w="80" w:type="dxa"/>
+              <w:bottom w:w="80" w:type="dxa"/>
+              <w:left w:w="120" w:type="dxa"/>
+              <w:right w:w="120" w:type="dxa"/>
+            </w:tcMar>
+            <w:shd w:fill="F8FAFC"/>
+          </w:tcPr>
+          <w:p>
+            <w:r>
+              <w:rPr>
+                <w:rFonts w:ascii="Arial" w:hAnsi="Arial"/>
+                <w:color w:val="334155"/>
+                <w:sz w:val="17"/>
+              </w:rPr>
+              <w:t>⭐ DATALEMUR START</w:t>
             </w:r>
           </w:p>
         </w:tc>
@@ -1521,12 +1897,12 @@
       <w:tr>
         <w:tc>
           <w:tcPr>
-            <w:tcW w:type="dxa" w:w="1728"/>
+            <w:tcW w:type="dxa" w:w="1440"/>
             <w:tcMar>
               <w:top w:w="80" w:type="dxa"/>
               <w:bottom w:w="80" w:type="dxa"/>
-              <w:left w:w="100" w:type="dxa"/>
-              <w:right w:w="100" w:type="dxa"/>
+              <w:left w:w="120" w:type="dxa"/>
+              <w:right w:w="120" w:type="dxa"/>
             </w:tcMar>
             <w:shd w:fill="FFFFFF"/>
           </w:tcPr>
@@ -1543,12 +1919,12 @@
         </w:tc>
         <w:tc>
           <w:tcPr>
-            <w:tcW w:type="dxa" w:w="1728"/>
+            <w:tcW w:type="dxa" w:w="1440"/>
             <w:tcMar>
               <w:top w:w="80" w:type="dxa"/>
               <w:bottom w:w="80" w:type="dxa"/>
-              <w:left w:w="100" w:type="dxa"/>
-              <w:right w:w="100" w:type="dxa"/>
+              <w:left w:w="120" w:type="dxa"/>
+              <w:right w:w="120" w:type="dxa"/>
             </w:tcMar>
             <w:shd w:fill="FFFFFF"/>
           </w:tcPr>
@@ -1559,18 +1935,18 @@
                 <w:color w:val="334155"/>
                 <w:sz w:val="17"/>
               </w:rPr>
-              <w:t>Aug 05-07</w:t>
+              <w:t>Aug 05, 2026</w:t>
             </w:r>
           </w:p>
         </w:tc>
         <w:tc>
           <w:tcPr>
-            <w:tcW w:type="dxa" w:w="1728"/>
+            <w:tcW w:type="dxa" w:w="1440"/>
             <w:tcMar>
               <w:top w:w="80" w:type="dxa"/>
               <w:bottom w:w="80" w:type="dxa"/>
-              <w:left w:w="100" w:type="dxa"/>
-              <w:right w:w="100" w:type="dxa"/>
+              <w:left w:w="120" w:type="dxa"/>
+              <w:right w:w="120" w:type="dxa"/>
             </w:tcMar>
             <w:shd w:fill="FFFFFF"/>
           </w:tcPr>
@@ -1581,18 +1957,18 @@
                 <w:color w:val="334155"/>
                 <w:sz w:val="17"/>
               </w:rPr>
-              <w:t>Videos #46-54 (Data Warehouse ETL Star Schema Project)</w:t>
+              <w:t>DataLemur Interview Practice</w:t>
             </w:r>
           </w:p>
         </w:tc>
         <w:tc>
           <w:tcPr>
-            <w:tcW w:type="dxa" w:w="1728"/>
+            <w:tcW w:type="dxa" w:w="1440"/>
             <w:tcMar>
               <w:top w:w="80" w:type="dxa"/>
               <w:bottom w:w="80" w:type="dxa"/>
-              <w:left w:w="100" w:type="dxa"/>
-              <w:right w:w="100" w:type="dxa"/>
+              <w:left w:w="120" w:type="dxa"/>
+              <w:right w:w="120" w:type="dxa"/>
             </w:tcMar>
             <w:shd w:fill="FFFFFF"/>
           </w:tcPr>
@@ -1603,18 +1979,18 @@
                 <w:color w:val="334155"/>
                 <w:sz w:val="17"/>
               </w:rPr>
-              <w:t>**Complete 5 Daily HackerRank (Final Set)**</w:t>
+              <w:t>Practice Top Tech Company SQL Questions (Amazon, Tesla, Meta)</w:t>
             </w:r>
           </w:p>
         </w:tc>
         <w:tc>
           <w:tcPr>
-            <w:tcW w:type="dxa" w:w="1728"/>
+            <w:tcW w:type="dxa" w:w="1440"/>
             <w:tcMar>
               <w:top w:w="80" w:type="dxa"/>
               <w:bottom w:w="80" w:type="dxa"/>
-              <w:left w:w="100" w:type="dxa"/>
-              <w:right w:w="100" w:type="dxa"/>
+              <w:left w:w="120" w:type="dxa"/>
+              <w:right w:w="120" w:type="dxa"/>
             </w:tcMar>
             <w:shd w:fill="FFFFFF"/>
           </w:tcPr>
@@ -1625,7 +2001,29 @@
                 <w:color w:val="334155"/>
                 <w:sz w:val="17"/>
               </w:rPr>
-              <w:t>🏗️ Optional DE &amp; Solve</w:t>
+              <w:t>DataLemur 5 Medium/Hard</w:t>
+            </w:r>
+          </w:p>
+        </w:tc>
+        <w:tc>
+          <w:tcPr>
+            <w:tcW w:type="dxa" w:w="1440"/>
+            <w:tcMar>
+              <w:top w:w="80" w:type="dxa"/>
+              <w:bottom w:w="80" w:type="dxa"/>
+              <w:left w:w="120" w:type="dxa"/>
+              <w:right w:w="120" w:type="dxa"/>
+            </w:tcMar>
+            <w:shd w:fill="FFFFFF"/>
+          </w:tcPr>
+          <w:p>
+            <w:r>
+              <w:rPr>
+                <w:rFonts w:ascii="Arial" w:hAnsi="Arial"/>
+                <w:color w:val="334155"/>
+                <w:sz w:val="17"/>
+              </w:rPr>
+              <w:t>⭐ DATALEMUR PRACTICE</w:t>
             </w:r>
           </w:p>
         </w:tc>
@@ -1633,12 +2031,12 @@
       <w:tr>
         <w:tc>
           <w:tcPr>
-            <w:tcW w:type="dxa" w:w="1728"/>
+            <w:tcW w:type="dxa" w:w="1440"/>
             <w:tcMar>
               <w:top w:w="80" w:type="dxa"/>
               <w:bottom w:w="80" w:type="dxa"/>
-              <w:left w:w="100" w:type="dxa"/>
-              <w:right w:w="100" w:type="dxa"/>
+              <w:left w:w="120" w:type="dxa"/>
+              <w:right w:w="120" w:type="dxa"/>
             </w:tcMar>
             <w:shd w:fill="F8FAFC"/>
           </w:tcPr>
@@ -1655,12 +2053,280 @@
         </w:tc>
         <w:tc>
           <w:tcPr>
-            <w:tcW w:type="dxa" w:w="1728"/>
+            <w:tcW w:type="dxa" w:w="1440"/>
             <w:tcMar>
               <w:top w:w="80" w:type="dxa"/>
               <w:bottom w:w="80" w:type="dxa"/>
-              <w:left w:w="100" w:type="dxa"/>
-              <w:right w:w="100" w:type="dxa"/>
+              <w:left w:w="120" w:type="dxa"/>
+              <w:right w:w="120" w:type="dxa"/>
+            </w:tcMar>
+            <w:shd w:fill="F8FAFC"/>
+          </w:tcPr>
+          <w:p>
+            <w:r>
+              <w:rPr>
+                <w:rFonts w:ascii="Arial" w:hAnsi="Arial"/>
+                <w:color w:val="334155"/>
+                <w:sz w:val="17"/>
+              </w:rPr>
+              <w:t>Aug 06, 2026</w:t>
+            </w:r>
+          </w:p>
+        </w:tc>
+        <w:tc>
+          <w:tcPr>
+            <w:tcW w:type="dxa" w:w="1440"/>
+            <w:tcMar>
+              <w:top w:w="80" w:type="dxa"/>
+              <w:bottom w:w="80" w:type="dxa"/>
+              <w:left w:w="120" w:type="dxa"/>
+              <w:right w:w="120" w:type="dxa"/>
+            </w:tcMar>
+            <w:shd w:fill="F8FAFC"/>
+          </w:tcPr>
+          <w:p>
+            <w:r>
+              <w:rPr>
+                <w:rFonts w:ascii="Arial" w:hAnsi="Arial"/>
+                <w:color w:val="334155"/>
+                <w:sz w:val="17"/>
+              </w:rPr>
+              <w:t>DataLemur Interview Practice</w:t>
+            </w:r>
+          </w:p>
+        </w:tc>
+        <w:tc>
+          <w:tcPr>
+            <w:tcW w:type="dxa" w:w="1440"/>
+            <w:tcMar>
+              <w:top w:w="80" w:type="dxa"/>
+              <w:bottom w:w="80" w:type="dxa"/>
+              <w:left w:w="120" w:type="dxa"/>
+              <w:right w:w="120" w:type="dxa"/>
+            </w:tcMar>
+            <w:shd w:fill="F8FAFC"/>
+          </w:tcPr>
+          <w:p>
+            <w:r>
+              <w:rPr>
+                <w:rFonts w:ascii="Arial" w:hAnsi="Arial"/>
+                <w:color w:val="334155"/>
+                <w:sz w:val="17"/>
+              </w:rPr>
+              <w:t>Practice Retention &amp; Window Function Questions on DataLemur</w:t>
+            </w:r>
+          </w:p>
+        </w:tc>
+        <w:tc>
+          <w:tcPr>
+            <w:tcW w:type="dxa" w:w="1440"/>
+            <w:tcMar>
+              <w:top w:w="80" w:type="dxa"/>
+              <w:bottom w:w="80" w:type="dxa"/>
+              <w:left w:w="120" w:type="dxa"/>
+              <w:right w:w="120" w:type="dxa"/>
+            </w:tcMar>
+            <w:shd w:fill="F8FAFC"/>
+          </w:tcPr>
+          <w:p>
+            <w:r>
+              <w:rPr>
+                <w:rFonts w:ascii="Arial" w:hAnsi="Arial"/>
+                <w:color w:val="334155"/>
+                <w:sz w:val="17"/>
+              </w:rPr>
+              <w:t>DataLemur 5 Medium/Hard</w:t>
+            </w:r>
+          </w:p>
+        </w:tc>
+        <w:tc>
+          <w:tcPr>
+            <w:tcW w:type="dxa" w:w="1440"/>
+            <w:tcMar>
+              <w:top w:w="80" w:type="dxa"/>
+              <w:bottom w:w="80" w:type="dxa"/>
+              <w:left w:w="120" w:type="dxa"/>
+              <w:right w:w="120" w:type="dxa"/>
+            </w:tcMar>
+            <w:shd w:fill="F8FAFC"/>
+          </w:tcPr>
+          <w:p>
+            <w:r>
+              <w:rPr>
+                <w:rFonts w:ascii="Arial" w:hAnsi="Arial"/>
+                <w:color w:val="334155"/>
+                <w:sz w:val="17"/>
+              </w:rPr>
+              <w:t>⭐ DATALEMUR PRACTICE</w:t>
+            </w:r>
+          </w:p>
+        </w:tc>
+      </w:tr>
+      <w:tr>
+        <w:tc>
+          <w:tcPr>
+            <w:tcW w:type="dxa" w:w="1440"/>
+            <w:tcMar>
+              <w:top w:w="80" w:type="dxa"/>
+              <w:bottom w:w="80" w:type="dxa"/>
+              <w:left w:w="120" w:type="dxa"/>
+              <w:right w:w="120" w:type="dxa"/>
+            </w:tcMar>
+            <w:shd w:fill="FFFFFF"/>
+          </w:tcPr>
+          <w:p>
+            <w:r>
+              <w:rPr>
+                <w:rFonts w:ascii="Arial" w:hAnsi="Arial"/>
+                <w:color w:val="334155"/>
+                <w:sz w:val="17"/>
+              </w:rPr>
+              <w:t>Day 29</w:t>
+            </w:r>
+          </w:p>
+        </w:tc>
+        <w:tc>
+          <w:tcPr>
+            <w:tcW w:type="dxa" w:w="1440"/>
+            <w:tcMar>
+              <w:top w:w="80" w:type="dxa"/>
+              <w:bottom w:w="80" w:type="dxa"/>
+              <w:left w:w="120" w:type="dxa"/>
+              <w:right w:w="120" w:type="dxa"/>
+            </w:tcMar>
+            <w:shd w:fill="FFFFFF"/>
+          </w:tcPr>
+          <w:p>
+            <w:r>
+              <w:rPr>
+                <w:rFonts w:ascii="Arial" w:hAnsi="Arial"/>
+                <w:color w:val="334155"/>
+                <w:sz w:val="17"/>
+              </w:rPr>
+              <w:t>Aug 07, 2026</w:t>
+            </w:r>
+          </w:p>
+        </w:tc>
+        <w:tc>
+          <w:tcPr>
+            <w:tcW w:type="dxa" w:w="1440"/>
+            <w:tcMar>
+              <w:top w:w="80" w:type="dxa"/>
+              <w:bottom w:w="80" w:type="dxa"/>
+              <w:left w:w="120" w:type="dxa"/>
+              <w:right w:w="120" w:type="dxa"/>
+            </w:tcMar>
+            <w:shd w:fill="FFFFFF"/>
+          </w:tcPr>
+          <w:p>
+            <w:r>
+              <w:rPr>
+                <w:rFonts w:ascii="Arial" w:hAnsi="Arial"/>
+                <w:color w:val="334155"/>
+                <w:sz w:val="17"/>
+              </w:rPr>
+              <w:t>StrataScratch Case Studies</w:t>
+            </w:r>
+          </w:p>
+        </w:tc>
+        <w:tc>
+          <w:tcPr>
+            <w:tcW w:type="dxa" w:w="1440"/>
+            <w:tcMar>
+              <w:top w:w="80" w:type="dxa"/>
+              <w:bottom w:w="80" w:type="dxa"/>
+              <w:left w:w="120" w:type="dxa"/>
+              <w:right w:w="120" w:type="dxa"/>
+            </w:tcMar>
+            <w:shd w:fill="FFFFFF"/>
+          </w:tcPr>
+          <w:p>
+            <w:r>
+              <w:rPr>
+                <w:rFonts w:ascii="Arial" w:hAnsi="Arial"/>
+                <w:color w:val="334155"/>
+                <w:sz w:val="17"/>
+              </w:rPr>
+              <w:t>Practice Business Analytics Case Studies on StrataScratch</w:t>
+            </w:r>
+          </w:p>
+        </w:tc>
+        <w:tc>
+          <w:tcPr>
+            <w:tcW w:type="dxa" w:w="1440"/>
+            <w:tcMar>
+              <w:top w:w="80" w:type="dxa"/>
+              <w:bottom w:w="80" w:type="dxa"/>
+              <w:left w:w="120" w:type="dxa"/>
+              <w:right w:w="120" w:type="dxa"/>
+            </w:tcMar>
+            <w:shd w:fill="FFFFFF"/>
+          </w:tcPr>
+          <w:p>
+            <w:r>
+              <w:rPr>
+                <w:rFonts w:ascii="Arial" w:hAnsi="Arial"/>
+                <w:color w:val="334155"/>
+                <w:sz w:val="17"/>
+              </w:rPr>
+              <w:t>StrataScratch 5 Questions</w:t>
+            </w:r>
+          </w:p>
+        </w:tc>
+        <w:tc>
+          <w:tcPr>
+            <w:tcW w:type="dxa" w:w="1440"/>
+            <w:tcMar>
+              <w:top w:w="80" w:type="dxa"/>
+              <w:bottom w:w="80" w:type="dxa"/>
+              <w:left w:w="120" w:type="dxa"/>
+              <w:right w:w="120" w:type="dxa"/>
+            </w:tcMar>
+            <w:shd w:fill="FFFFFF"/>
+          </w:tcPr>
+          <w:p>
+            <w:r>
+              <w:rPr>
+                <w:rFonts w:ascii="Arial" w:hAnsi="Arial"/>
+                <w:color w:val="334155"/>
+                <w:sz w:val="17"/>
+              </w:rPr>
+              <w:t>🛠️ STRATASCRATCH START</w:t>
+            </w:r>
+          </w:p>
+        </w:tc>
+      </w:tr>
+      <w:tr>
+        <w:tc>
+          <w:tcPr>
+            <w:tcW w:type="dxa" w:w="1440"/>
+            <w:tcMar>
+              <w:top w:w="80" w:type="dxa"/>
+              <w:bottom w:w="80" w:type="dxa"/>
+              <w:left w:w="120" w:type="dxa"/>
+              <w:right w:w="120" w:type="dxa"/>
+            </w:tcMar>
+            <w:shd w:fill="F8FAFC"/>
+          </w:tcPr>
+          <w:p>
+            <w:r>
+              <w:rPr>
+                <w:rFonts w:ascii="Arial" w:hAnsi="Arial"/>
+                <w:color w:val="334155"/>
+                <w:sz w:val="17"/>
+              </w:rPr>
+              <w:t>Day 30</w:t>
+            </w:r>
+          </w:p>
+        </w:tc>
+        <w:tc>
+          <w:tcPr>
+            <w:tcW w:type="dxa" w:w="1440"/>
+            <w:tcMar>
+              <w:top w:w="80" w:type="dxa"/>
+              <w:bottom w:w="80" w:type="dxa"/>
+              <w:left w:w="120" w:type="dxa"/>
+              <w:right w:w="120" w:type="dxa"/>
             </w:tcMar>
             <w:shd w:fill="F8FAFC"/>
           </w:tcPr>
@@ -1677,12 +2343,12 @@
         </w:tc>
         <w:tc>
           <w:tcPr>
-            <w:tcW w:type="dxa" w:w="1728"/>
+            <w:tcW w:type="dxa" w:w="1440"/>
             <w:tcMar>
               <w:top w:w="80" w:type="dxa"/>
               <w:bottom w:w="80" w:type="dxa"/>
-              <w:left w:w="100" w:type="dxa"/>
-              <w:right w:w="100" w:type="dxa"/>
+              <w:left w:w="120" w:type="dxa"/>
+              <w:right w:w="120" w:type="dxa"/>
             </w:tcMar>
             <w:shd w:fill="F8FAFC"/>
           </w:tcPr>
@@ -1693,18 +2359,18 @@
                 <w:color w:val="334155"/>
                 <w:sz w:val="17"/>
               </w:rPr>
-              <w:t>**Video #55 (Exploratory Data Analysis EDA Project)**</w:t>
+              <w:t>Final Mock Interview Capstone</w:t>
             </w:r>
           </w:p>
         </w:tc>
         <w:tc>
           <w:tcPr>
-            <w:tcW w:type="dxa" w:w="1728"/>
+            <w:tcW w:type="dxa" w:w="1440"/>
             <w:tcMar>
               <w:top w:w="80" w:type="dxa"/>
               <w:bottom w:w="80" w:type="dxa"/>
-              <w:left w:w="100" w:type="dxa"/>
-              <w:right w:w="100" w:type="dxa"/>
+              <w:left w:w="120" w:type="dxa"/>
+              <w:right w:w="120" w:type="dxa"/>
             </w:tcMar>
             <w:shd w:fill="F8FAFC"/>
           </w:tcPr>
@@ -1715,18 +2381,18 @@
                 <w:color w:val="334155"/>
                 <w:sz w:val="17"/>
               </w:rPr>
-              <w:t>🎯 **DataLemur Day 1**: Start Top Tech Company SQL</w:t>
+              <w:t>Complete Flipkart Data Engineer &amp; CRED Risk Analyst Capstone Exams</w:t>
             </w:r>
           </w:p>
         </w:tc>
         <w:tc>
           <w:tcPr>
-            <w:tcW w:type="dxa" w:w="1728"/>
+            <w:tcW w:type="dxa" w:w="1440"/>
             <w:tcMar>
               <w:top w:w="80" w:type="dxa"/>
               <w:bottom w:w="80" w:type="dxa"/>
-              <w:left w:w="100" w:type="dxa"/>
-              <w:right w:w="100" w:type="dxa"/>
+              <w:left w:w="120" w:type="dxa"/>
+              <w:right w:w="120" w:type="dxa"/>
             </w:tcMar>
             <w:shd w:fill="F8FAFC"/>
           </w:tcPr>
@@ -1737,132 +2403,18 @@
                 <w:color w:val="334155"/>
                 <w:sz w:val="17"/>
               </w:rPr>
-              <w:t>🎯 **DATALEMUR START**</w:t>
-            </w:r>
-          </w:p>
-        </w:tc>
-      </w:tr>
-      <w:tr>
-        <w:tc>
-          <w:tcPr>
-            <w:tcW w:type="dxa" w:w="1728"/>
-            <w:tcMar>
-              <w:top w:w="80" w:type="dxa"/>
-              <w:bottom w:w="80" w:type="dxa"/>
-              <w:left w:w="100" w:type="dxa"/>
-              <w:right w:w="100" w:type="dxa"/>
-            </w:tcMar>
-            <w:shd w:fill="FFFFFF"/>
-          </w:tcPr>
-          <w:p>
-            <w:r>
-              <w:rPr>
-                <w:rFonts w:ascii="Arial" w:hAnsi="Arial"/>
-                <w:color w:val="334155"/>
-                <w:sz w:val="17"/>
-              </w:rPr>
-              <w:t>Day 29</w:t>
+              <w:t>Mock Exams 60 Mins</w:t>
             </w:r>
           </w:p>
         </w:tc>
         <w:tc>
           <w:tcPr>
-            <w:tcW w:type="dxa" w:w="1728"/>
+            <w:tcW w:type="dxa" w:w="1440"/>
             <w:tcMar>
               <w:top w:w="80" w:type="dxa"/>
               <w:bottom w:w="80" w:type="dxa"/>
-              <w:left w:w="100" w:type="dxa"/>
-              <w:right w:w="100" w:type="dxa"/>
-            </w:tcMar>
-            <w:shd w:fill="FFFFFF"/>
-          </w:tcPr>
-          <w:p>
-            <w:r>
-              <w:rPr>
-                <w:rFonts w:ascii="Arial" w:hAnsi="Arial"/>
-                <w:color w:val="334155"/>
-                <w:sz w:val="17"/>
-              </w:rPr>
-              <w:t>Aug 09, 2026</w:t>
-            </w:r>
-          </w:p>
-        </w:tc>
-        <w:tc>
-          <w:tcPr>
-            <w:tcW w:type="dxa" w:w="1728"/>
-            <w:tcMar>
-              <w:top w:w="80" w:type="dxa"/>
-              <w:bottom w:w="80" w:type="dxa"/>
-              <w:left w:w="100" w:type="dxa"/>
-              <w:right w:w="100" w:type="dxa"/>
-            </w:tcMar>
-            <w:shd w:fill="FFFFFF"/>
-          </w:tcPr>
-          <w:p>
-            <w:r>
-              <w:rPr>
-                <w:rFonts w:ascii="Arial" w:hAnsi="Arial"/>
-                <w:color w:val="334155"/>
-                <w:sz w:val="17"/>
-              </w:rPr>
-              <w:t>**Video #56 (Full SQL Data Analyst Portfolio Project)**</w:t>
-            </w:r>
-          </w:p>
-        </w:tc>
-        <w:tc>
-          <w:tcPr>
-            <w:tcW w:type="dxa" w:w="1728"/>
-            <w:tcMar>
-              <w:top w:w="80" w:type="dxa"/>
-              <w:bottom w:w="80" w:type="dxa"/>
-              <w:left w:w="100" w:type="dxa"/>
-              <w:right w:w="100" w:type="dxa"/>
-            </w:tcMar>
-            <w:shd w:fill="FFFFFF"/>
-          </w:tcPr>
-          <w:p>
-            <w:r>
-              <w:rPr>
-                <w:rFonts w:ascii="Arial" w:hAnsi="Arial"/>
-                <w:color w:val="334155"/>
-                <w:sz w:val="17"/>
-              </w:rPr>
-              <w:t>🎯 **DataLemur Day 2**: Solve FAANG Interview Questions</w:t>
-            </w:r>
-          </w:p>
-        </w:tc>
-        <w:tc>
-          <w:tcPr>
-            <w:tcW w:type="dxa" w:w="1728"/>
-            <w:tcMar>
-              <w:top w:w="80" w:type="dxa"/>
-              <w:bottom w:w="80" w:type="dxa"/>
-              <w:left w:w="100" w:type="dxa"/>
-              <w:right w:w="100" w:type="dxa"/>
-            </w:tcMar>
-            <w:shd w:fill="FFFFFF"/>
-          </w:tcPr>
-          <w:p>
-            <w:r>
-              <w:rPr>
-                <w:rFonts w:ascii="Arial" w:hAnsi="Arial"/>
-                <w:color w:val="334155"/>
-                <w:sz w:val="17"/>
-              </w:rPr>
-              <w:t>🎯 **DATALEMUR PRACTICE**</w:t>
-            </w:r>
-          </w:p>
-        </w:tc>
-      </w:tr>
-      <w:tr>
-        <w:tc>
-          <w:tcPr>
-            <w:tcW w:type="dxa" w:w="1728"/>
-            <w:tcMar>
-              <w:top w:w="80" w:type="dxa"/>
-              <w:bottom w:w="80" w:type="dxa"/>
-              <w:left w:w="100" w:type="dxa"/>
-              <w:right w:w="100" w:type="dxa"/>
+              <w:left w:w="120" w:type="dxa"/>
+              <w:right w:w="120" w:type="dxa"/>
             </w:tcMar>
             <w:shd w:fill="F8FAFC"/>
           </w:tcPr>
@@ -1873,95 +2425,7 @@
                 <w:color w:val="334155"/>
                 <w:sz w:val="17"/>
               </w:rPr>
-              <w:t>Day 30</w:t>
-            </w:r>
-          </w:p>
-        </w:tc>
-        <w:tc>
-          <w:tcPr>
-            <w:tcW w:type="dxa" w:w="1728"/>
-            <w:tcMar>
-              <w:top w:w="80" w:type="dxa"/>
-              <w:bottom w:w="80" w:type="dxa"/>
-              <w:left w:w="100" w:type="dxa"/>
-              <w:right w:w="100" w:type="dxa"/>
-            </w:tcMar>
-            <w:shd w:fill="F8FAFC"/>
-          </w:tcPr>
-          <w:p>
-            <w:r>
-              <w:rPr>
-                <w:rFonts w:ascii="Arial" w:hAnsi="Arial"/>
-                <w:color w:val="334155"/>
-                <w:sz w:val="17"/>
-              </w:rPr>
-              <w:t>Aug 10, 2026</w:t>
-            </w:r>
-          </w:p>
-        </w:tc>
-        <w:tc>
-          <w:tcPr>
-            <w:tcW w:type="dxa" w:w="1728"/>
-            <w:tcMar>
-              <w:top w:w="80" w:type="dxa"/>
-              <w:bottom w:w="80" w:type="dxa"/>
-              <w:left w:w="100" w:type="dxa"/>
-              <w:right w:w="100" w:type="dxa"/>
-            </w:tcMar>
-            <w:shd w:fill="F8FAFC"/>
-          </w:tcPr>
-          <w:p>
-            <w:r>
-              <w:rPr>
-                <w:rFonts w:ascii="Arial" w:hAnsi="Arial"/>
-                <w:color w:val="334155"/>
-                <w:sz w:val="17"/>
-              </w:rPr>
-              <w:t>**Flipkart Data Engineer Capstone Exam**</w:t>
-            </w:r>
-          </w:p>
-        </w:tc>
-        <w:tc>
-          <w:tcPr>
-            <w:tcW w:type="dxa" w:w="1728"/>
-            <w:tcMar>
-              <w:top w:w="80" w:type="dxa"/>
-              <w:bottom w:w="80" w:type="dxa"/>
-              <w:left w:w="100" w:type="dxa"/>
-              <w:right w:w="100" w:type="dxa"/>
-            </w:tcMar>
-            <w:shd w:fill="F8FAFC"/>
-          </w:tcPr>
-          <w:p>
-            <w:r>
-              <w:rPr>
-                <w:rFonts w:ascii="Arial" w:hAnsi="Arial"/>
-                <w:color w:val="334155"/>
-                <w:sz w:val="17"/>
-              </w:rPr>
-              <w:t>Final Portfolio GitHub Push &amp; StrataScratch Prep</w:t>
-            </w:r>
-          </w:p>
-        </w:tc>
-        <w:tc>
-          <w:tcPr>
-            <w:tcW w:type="dxa" w:w="1728"/>
-            <w:tcMar>
-              <w:top w:w="80" w:type="dxa"/>
-              <w:bottom w:w="80" w:type="dxa"/>
-              <w:left w:w="100" w:type="dxa"/>
-              <w:right w:w="100" w:type="dxa"/>
-            </w:tcMar>
-            <w:shd w:fill="F8FAFC"/>
-          </w:tcPr>
-          <w:p>
-            <w:r>
-              <w:rPr>
-                <w:rFonts w:ascii="Arial" w:hAnsi="Arial"/>
-                <w:color w:val="334155"/>
-                <w:sz w:val="17"/>
-              </w:rPr>
-              <w:t>🏆 Capstone &amp; GitHub</w:t>
+              <w:t>🏆 CAPSTONE COMPLETE</w:t>
             </w:r>
           </w:p>
         </w:tc>
@@ -1969,112 +2433,65 @@
     </w:tbl>
     <w:p>
       <w:pPr>
-        <w:spacing w:before="60" w:after="60"/>
-      </w:pPr>
-      <w:r>
-        <w:br/>
-        <w:t>### DataLemur vs. StrataScratch: Which to Start First?</w:t>
-      </w:r>
-    </w:p>
-    <w:p>
-      <w:pPr>
-        <w:spacing w:before="60" w:after="60"/>
-      </w:pPr>
-      <w:r>
-        <w:t>#### ⭐ START DATALEMUR FIRST (Recommended)</w:t>
-      </w:r>
-    </w:p>
-    <w:p>
-      <w:pPr>
-        <w:pStyle w:val="ListBullet"/>
-        <w:spacing w:before="40" w:after="40"/>
+        <w:pStyle w:val="Heading1"/>
+        <w:spacing w:before="360" w:after="160"/>
       </w:pPr>
       <w:r>
         <w:rPr>
           <w:rFonts w:ascii="Arial" w:hAnsi="Arial"/>
-          <w:sz w:val="20"/>
+          <w:b/>
+          <w:color w:val="0EA5E9"/>
+          <w:sz w:val="36"/>
         </w:rPr>
-        <w:t>**Why DataLemur First**: DataLemur is 100% focused on real SQL interview questions from top tech companies (Tesla, Amazon, Meta, Spotify). Its in-browser editor, instant grading, and detailed solution walk-throughs match the exact format of SQL Analyst Academy and HackerRank.</w:t>
+        <w:t>3. Platform Strategy: DataLemur vs. StrataScratch</w:t>
       </w:r>
     </w:p>
     <w:p>
-      <w:pPr>
-        <w:pStyle w:val="ListBullet"/>
-        <w:spacing w:before="40" w:after="40"/>
-      </w:pPr>
       <w:r>
         <w:rPr>
-          <w:rFonts w:ascii="Arial" w:hAnsi="Arial"/>
-          <w:sz w:val="20"/>
+          <w:b/>
         </w:rPr>
-        <w:t>**DataLemur Goal**: Solve 15 to 20 Medium/Hard questions on DataLemur (topics: Window Functions, CTEs, self-joins, monthly retention rates).</w:t>
+        <w:t>⭐ START DATALEMUR FIRST (August 04 Onwards)</w:t>
+        <w:br/>
+      </w:r>
+      <w:r>
+        <w:rPr>
+          <w:b/>
+        </w:rPr>
+        <w:t xml:space="preserve">1. Why DataLemur First: </w:t>
+      </w:r>
+      <w:r>
+        <w:t>DataLemur is curated specifically for Data Analyst SQL technical interviews at FAANG and top tech companies (Amazon, Meta, Tesla, Spotify). It features clean in-browser SQL execution, instant grading, and step-by-step CTE &amp; Window Function explanations.</w:t>
+        <w:br/>
+      </w:r>
+      <w:r>
+        <w:rPr>
+          <w:b/>
+        </w:rPr>
+        <w:t xml:space="preserve">2. Target Goal: </w:t>
+      </w:r>
+      <w:r>
+        <w:t>Solve 15 to 20 Medium/Hard questions on DataLemur.</w:t>
+        <w:br/>
+        <w:br/>
       </w:r>
     </w:p>
     <w:p>
-      <w:pPr>
-        <w:spacing w:before="60" w:after="60"/>
-      </w:pPr>
-      <w:r>
-        <w:br/>
-        <w:t>#### 🛠️ MOVE TO STRATASCRATCH SECOND</w:t>
-      </w:r>
-    </w:p>
-    <w:p>
-      <w:pPr>
-        <w:pStyle w:val="ListBullet"/>
-        <w:spacing w:before="40" w:after="40"/>
-      </w:pPr>
       <w:r>
         <w:rPr>
-          <w:rFonts w:ascii="Arial" w:hAnsi="Arial"/>
-          <w:sz w:val="20"/>
+          <w:b/>
         </w:rPr>
-        <w:t>**Why StrataScratch Second**: StrataScratch is great for advanced analytics datasets and multi-language practice (SQL + Python/Pandas). Use it after DataLemur to practice real company case studies from Airbnb, Forbes, and Microsoft.</w:t>
+        <w:t>🛠️ MOVE TO STRATASCRATCH SECOND (August 07 Onwards)</w:t>
+        <w:br/>
       </w:r>
-    </w:p>
-    <w:p>
-      <w:pPr>
-        <w:spacing w:before="60" w:after="60"/>
-      </w:pPr>
-      <w:r>
-        <w:br/>
-        <w:t>### Concurrent Project Learning Strategy (Videos #55 &amp; #56)</w:t>
-      </w:r>
-    </w:p>
-    <w:p>
-      <w:pPr>
-        <w:pStyle w:val="ListBullet"/>
-        <w:spacing w:before="40" w:after="40"/>
-      </w:pPr>
       <w:r>
         <w:rPr>
-          <w:rFonts w:ascii="Arial" w:hAnsi="Arial"/>
-          <w:sz w:val="20"/>
+          <w:b/>
         </w:rPr>
-        <w:t>**Start Now**: Don't wait until August 08 to think about the project! Review the dataset structure and query topics from Video #55 (EDA) and Video #56 (Portfolio Project) in parallel while doing your daily 5 HackerRank problems.</w:t>
+        <w:t xml:space="preserve">1. Why StrataScratch Second: </w:t>
       </w:r>
-    </w:p>
-    <w:p>
-      <w:pPr>
-        <w:pStyle w:val="ListBullet"/>
-        <w:spacing w:before="40" w:after="40"/>
-      </w:pPr>
       <w:r>
-        <w:rPr>
-          <w:rFonts w:ascii="Arial" w:hAnsi="Arial"/>
-          <w:sz w:val="20"/>
-        </w:rPr>
-        <w:t>**Building Your GitHub Portfolio**: When you finish Video #56, upload your `.sql` query files, data insights summary, and `README.md` to GitHub to present to recruiters.</w:t>
-      </w:r>
-    </w:p>
-    <w:p>
-      <w:pPr>
-        <w:spacing w:before="60" w:after="60"/>
-      </w:pPr>
-      <w:r>
-        <w:br/>
-        <w:br/>
-        <w:t>---</w:t>
+        <w:t>StrataScratch excels at complex multi-language analytics case studies (SQL + Python/Pandas) across real enterprise datasets (Airbnb, Forbes). Use it after DataLemur to sharpen advanced analytical problem-solving.</w:t>
       </w:r>
     </w:p>
     <w:p>
@@ -2094,24 +2511,836 @@
           <w:color w:val="0EA5E9"/>
           <w:sz w:val="36"/>
         </w:rPr>
-        <w:t>SECTION 2: COMPLETED STUDY HISTORY ARCHIVE (LAST PAGES)</w:t>
+        <w:t>4. Completed Study History Archive (Last Pages)</w:t>
       </w:r>
     </w:p>
-    <w:p>
-      <w:pPr>
-        <w:pStyle w:val="Heading3"/>
-        <w:spacing w:before="200" w:after="80"/>
-      </w:pPr>
-      <w:r>
-        <w:rPr>
-          <w:rFonts w:ascii="Arial" w:hAnsi="Arial"/>
-          <w:b/>
-          <w:color w:val="334155"/>
-          <w:sz w:val="24"/>
-        </w:rPr>
-        <w:t>Completed Days 1–15 Archive (July 10 – July 24, 2026)</w:t>
-      </w:r>
-    </w:p>
+    <w:tbl>
+      <w:tblPr>
+        <w:tblW w:type="auto" w:w="0"/>
+        <w:jc w:val="center"/>
+        <w:tblLook w:firstColumn="1" w:firstRow="1" w:lastColumn="0" w:lastRow="0" w:noHBand="0" w:noVBand="1" w:val="04A0"/>
+      </w:tblPr>
+      <w:tblGrid>
+        <w:gridCol w:w="2160"/>
+        <w:gridCol w:w="2160"/>
+        <w:gridCol w:w="2160"/>
+        <w:gridCol w:w="2160"/>
+      </w:tblGrid>
+      <w:tr>
+        <w:tc>
+          <w:tcPr>
+            <w:tcW w:type="dxa" w:w="2160"/>
+            <w:tcMar>
+              <w:top w:w="100" w:type="dxa"/>
+              <w:bottom w:w="100" w:type="dxa"/>
+              <w:left w:w="120" w:type="dxa"/>
+              <w:right w:w="120" w:type="dxa"/>
+            </w:tcMar>
+            <w:shd w:fill="0F172A"/>
+          </w:tcPr>
+          <w:p>
+            <w:r>
+              <w:rPr>
+                <w:rFonts w:ascii="Arial" w:hAnsi="Arial"/>
+                <w:b/>
+                <w:color w:val="FFFFFF"/>
+                <w:sz w:val="19"/>
+              </w:rPr>
+              <w:t>Video #</w:t>
+            </w:r>
+          </w:p>
+        </w:tc>
+        <w:tc>
+          <w:tcPr>
+            <w:tcW w:type="dxa" w:w="2160"/>
+            <w:tcMar>
+              <w:top w:w="100" w:type="dxa"/>
+              <w:bottom w:w="100" w:type="dxa"/>
+              <w:left w:w="120" w:type="dxa"/>
+              <w:right w:w="120" w:type="dxa"/>
+            </w:tcMar>
+            <w:shd w:fill="0F172A"/>
+          </w:tcPr>
+          <w:p>
+            <w:r>
+              <w:rPr>
+                <w:rFonts w:ascii="Arial" w:hAnsi="Arial"/>
+                <w:b/>
+                <w:color w:val="FFFFFF"/>
+                <w:sz w:val="19"/>
+              </w:rPr>
+              <w:t>Video Title &amp; Topic</w:t>
+            </w:r>
+          </w:p>
+        </w:tc>
+        <w:tc>
+          <w:tcPr>
+            <w:tcW w:type="dxa" w:w="2160"/>
+            <w:tcMar>
+              <w:top w:w="100" w:type="dxa"/>
+              <w:bottom w:w="100" w:type="dxa"/>
+              <w:left w:w="120" w:type="dxa"/>
+              <w:right w:w="120" w:type="dxa"/>
+            </w:tcMar>
+            <w:shd w:fill="0F172A"/>
+          </w:tcPr>
+          <w:p>
+            <w:r>
+              <w:rPr>
+                <w:rFonts w:ascii="Arial" w:hAnsi="Arial"/>
+                <w:b/>
+                <w:color w:val="FFFFFF"/>
+                <w:sz w:val="19"/>
+              </w:rPr>
+              <w:t>Timestamp</w:t>
+            </w:r>
+          </w:p>
+        </w:tc>
+        <w:tc>
+          <w:tcPr>
+            <w:tcW w:type="dxa" w:w="2160"/>
+            <w:tcMar>
+              <w:top w:w="100" w:type="dxa"/>
+              <w:bottom w:w="100" w:type="dxa"/>
+              <w:left w:w="120" w:type="dxa"/>
+              <w:right w:w="120" w:type="dxa"/>
+            </w:tcMar>
+            <w:shd w:fill="0F172A"/>
+          </w:tcPr>
+          <w:p>
+            <w:r>
+              <w:rPr>
+                <w:rFonts w:ascii="Arial" w:hAnsi="Arial"/>
+                <w:b/>
+                <w:color w:val="FFFFFF"/>
+                <w:sz w:val="19"/>
+              </w:rPr>
+              <w:t>Completion Status</w:t>
+            </w:r>
+          </w:p>
+        </w:tc>
+      </w:tr>
+      <w:tr>
+        <w:tc>
+          <w:tcPr>
+            <w:tcW w:type="dxa" w:w="2160"/>
+            <w:tcMar>
+              <w:top w:w="80" w:type="dxa"/>
+              <w:bottom w:w="80" w:type="dxa"/>
+              <w:left w:w="120" w:type="dxa"/>
+              <w:right w:w="120" w:type="dxa"/>
+            </w:tcMar>
+            <w:shd w:fill="FFFFFF"/>
+          </w:tcPr>
+          <w:p>
+            <w:r>
+              <w:rPr>
+                <w:rFonts w:ascii="Arial" w:hAnsi="Arial"/>
+                <w:color w:val="334155"/>
+                <w:sz w:val="17"/>
+              </w:rPr>
+              <w:t>Videos 1-4</w:t>
+            </w:r>
+          </w:p>
+        </w:tc>
+        <w:tc>
+          <w:tcPr>
+            <w:tcW w:type="dxa" w:w="2160"/>
+            <w:tcMar>
+              <w:top w:w="80" w:type="dxa"/>
+              <w:bottom w:w="80" w:type="dxa"/>
+              <w:left w:w="120" w:type="dxa"/>
+              <w:right w:w="120" w:type="dxa"/>
+            </w:tcMar>
+            <w:shd w:fill="FFFFFF"/>
+          </w:tcPr>
+          <w:p>
+            <w:r>
+              <w:rPr>
+                <w:rFonts w:ascii="Arial" w:hAnsi="Arial"/>
+                <w:color w:val="334155"/>
+                <w:sz w:val="17"/>
+              </w:rPr>
+              <w:t>SQL Full Course Intro, Environment Setup, SSMS 2026 &amp; Database Creation</w:t>
+            </w:r>
+          </w:p>
+        </w:tc>
+        <w:tc>
+          <w:tcPr>
+            <w:tcW w:type="dxa" w:w="2160"/>
+            <w:tcMar>
+              <w:top w:w="80" w:type="dxa"/>
+              <w:bottom w:w="80" w:type="dxa"/>
+              <w:left w:w="120" w:type="dxa"/>
+              <w:right w:w="120" w:type="dxa"/>
+            </w:tcMar>
+            <w:shd w:fill="FFFFFF"/>
+          </w:tcPr>
+          <w:p>
+            <w:r>
+              <w:rPr>
+                <w:rFonts w:ascii="Arial" w:hAnsi="Arial"/>
+                <w:color w:val="334155"/>
+                <w:sz w:val="17"/>
+              </w:rPr>
+              <w:t>00:00 - 34:01</w:t>
+            </w:r>
+          </w:p>
+        </w:tc>
+        <w:tc>
+          <w:tcPr>
+            <w:tcW w:type="dxa" w:w="2160"/>
+            <w:tcMar>
+              <w:top w:w="80" w:type="dxa"/>
+              <w:bottom w:w="80" w:type="dxa"/>
+              <w:left w:w="120" w:type="dxa"/>
+              <w:right w:w="120" w:type="dxa"/>
+            </w:tcMar>
+            <w:shd w:fill="FFFFFF"/>
+          </w:tcPr>
+          <w:p>
+            <w:r>
+              <w:rPr>
+                <w:rFonts w:ascii="Arial" w:hAnsi="Arial"/>
+                <w:color w:val="334155"/>
+                <w:sz w:val="17"/>
+              </w:rPr>
+              <w:t>✅ Completed</w:t>
+            </w:r>
+          </w:p>
+        </w:tc>
+      </w:tr>
+      <w:tr>
+        <w:tc>
+          <w:tcPr>
+            <w:tcW w:type="dxa" w:w="2160"/>
+            <w:tcMar>
+              <w:top w:w="80" w:type="dxa"/>
+              <w:bottom w:w="80" w:type="dxa"/>
+              <w:left w:w="120" w:type="dxa"/>
+              <w:right w:w="120" w:type="dxa"/>
+            </w:tcMar>
+            <w:shd w:fill="F8FAFC"/>
+          </w:tcPr>
+          <w:p>
+            <w:r>
+              <w:rPr>
+                <w:rFonts w:ascii="Arial" w:hAnsi="Arial"/>
+                <w:color w:val="334155"/>
+                <w:sz w:val="17"/>
+              </w:rPr>
+              <w:t>Videos 5-8</w:t>
+            </w:r>
+          </w:p>
+        </w:tc>
+        <w:tc>
+          <w:tcPr>
+            <w:tcW w:type="dxa" w:w="2160"/>
+            <w:tcMar>
+              <w:top w:w="80" w:type="dxa"/>
+              <w:bottom w:w="80" w:type="dxa"/>
+              <w:left w:w="120" w:type="dxa"/>
+              <w:right w:w="120" w:type="dxa"/>
+            </w:tcMar>
+            <w:shd w:fill="F8FAFC"/>
+          </w:tcPr>
+          <w:p>
+            <w:r>
+              <w:rPr>
+                <w:rFonts w:ascii="Arial" w:hAnsi="Arial"/>
+                <w:color w:val="334155"/>
+                <w:sz w:val="17"/>
+              </w:rPr>
+              <w:t>SELECT Queries, DDL (CREATE/ALTER), DML (INSERT/UPDATE), WHERE Conditions</w:t>
+            </w:r>
+          </w:p>
+        </w:tc>
+        <w:tc>
+          <w:tcPr>
+            <w:tcW w:type="dxa" w:w="2160"/>
+            <w:tcMar>
+              <w:top w:w="80" w:type="dxa"/>
+              <w:bottom w:w="80" w:type="dxa"/>
+              <w:left w:w="120" w:type="dxa"/>
+              <w:right w:w="120" w:type="dxa"/>
+            </w:tcMar>
+            <w:shd w:fill="F8FAFC"/>
+          </w:tcPr>
+          <w:p>
+            <w:r>
+              <w:rPr>
+                <w:rFonts w:ascii="Arial" w:hAnsi="Arial"/>
+                <w:color w:val="334155"/>
+                <w:sz w:val="17"/>
+              </w:rPr>
+              <w:t>34:01 - 02:47:57</w:t>
+            </w:r>
+          </w:p>
+        </w:tc>
+        <w:tc>
+          <w:tcPr>
+            <w:tcW w:type="dxa" w:w="2160"/>
+            <w:tcMar>
+              <w:top w:w="80" w:type="dxa"/>
+              <w:bottom w:w="80" w:type="dxa"/>
+              <w:left w:w="120" w:type="dxa"/>
+              <w:right w:w="120" w:type="dxa"/>
+            </w:tcMar>
+            <w:shd w:fill="F8FAFC"/>
+          </w:tcPr>
+          <w:p>
+            <w:r>
+              <w:rPr>
+                <w:rFonts w:ascii="Arial" w:hAnsi="Arial"/>
+                <w:color w:val="334155"/>
+                <w:sz w:val="17"/>
+              </w:rPr>
+              <w:t>✅ Completed</w:t>
+            </w:r>
+          </w:p>
+        </w:tc>
+      </w:tr>
+      <w:tr>
+        <w:tc>
+          <w:tcPr>
+            <w:tcW w:type="dxa" w:w="2160"/>
+            <w:tcMar>
+              <w:top w:w="80" w:type="dxa"/>
+              <w:bottom w:w="80" w:type="dxa"/>
+              <w:left w:w="120" w:type="dxa"/>
+              <w:right w:w="120" w:type="dxa"/>
+            </w:tcMar>
+            <w:shd w:fill="FFFFFF"/>
+          </w:tcPr>
+          <w:p>
+            <w:r>
+              <w:rPr>
+                <w:rFonts w:ascii="Arial" w:hAnsi="Arial"/>
+                <w:color w:val="334155"/>
+                <w:sz w:val="17"/>
+              </w:rPr>
+              <w:t>Videos 9-11</w:t>
+            </w:r>
+          </w:p>
+        </w:tc>
+        <w:tc>
+          <w:tcPr>
+            <w:tcW w:type="dxa" w:w="2160"/>
+            <w:tcMar>
+              <w:top w:w="80" w:type="dxa"/>
+              <w:bottom w:w="80" w:type="dxa"/>
+              <w:left w:w="120" w:type="dxa"/>
+              <w:right w:w="120" w:type="dxa"/>
+            </w:tcMar>
+            <w:shd w:fill="FFFFFF"/>
+          </w:tcPr>
+          <w:p>
+            <w:r>
+              <w:rPr>
+                <w:rFonts w:ascii="Arial" w:hAnsi="Arial"/>
+                <w:color w:val="334155"/>
+                <w:sz w:val="17"/>
+              </w:rPr>
+              <w:t>SQL Joins Basics (INNER/LEFT/RIGHT/FULL), Advanced Joins &amp; 3+ Table Joins</w:t>
+            </w:r>
+          </w:p>
+        </w:tc>
+        <w:tc>
+          <w:tcPr>
+            <w:tcW w:type="dxa" w:w="2160"/>
+            <w:tcMar>
+              <w:top w:w="80" w:type="dxa"/>
+              <w:bottom w:w="80" w:type="dxa"/>
+              <w:left w:w="120" w:type="dxa"/>
+              <w:right w:w="120" w:type="dxa"/>
+            </w:tcMar>
+            <w:shd w:fill="FFFFFF"/>
+          </w:tcPr>
+          <w:p>
+            <w:r>
+              <w:rPr>
+                <w:rFonts w:ascii="Arial" w:hAnsi="Arial"/>
+                <w:color w:val="334155"/>
+                <w:sz w:val="17"/>
+              </w:rPr>
+              <w:t>02:47:57 - 04:02:09</w:t>
+            </w:r>
+          </w:p>
+        </w:tc>
+        <w:tc>
+          <w:tcPr>
+            <w:tcW w:type="dxa" w:w="2160"/>
+            <w:tcMar>
+              <w:top w:w="80" w:type="dxa"/>
+              <w:bottom w:w="80" w:type="dxa"/>
+              <w:left w:w="120" w:type="dxa"/>
+              <w:right w:w="120" w:type="dxa"/>
+            </w:tcMar>
+            <w:shd w:fill="FFFFFF"/>
+          </w:tcPr>
+          <w:p>
+            <w:r>
+              <w:rPr>
+                <w:rFonts w:ascii="Arial" w:hAnsi="Arial"/>
+                <w:color w:val="334155"/>
+                <w:sz w:val="17"/>
+              </w:rPr>
+              <w:t>✅ Completed</w:t>
+            </w:r>
+          </w:p>
+        </w:tc>
+      </w:tr>
+      <w:tr>
+        <w:tc>
+          <w:tcPr>
+            <w:tcW w:type="dxa" w:w="2160"/>
+            <w:tcMar>
+              <w:top w:w="80" w:type="dxa"/>
+              <w:bottom w:w="80" w:type="dxa"/>
+              <w:left w:w="120" w:type="dxa"/>
+              <w:right w:w="120" w:type="dxa"/>
+            </w:tcMar>
+            <w:shd w:fill="F8FAFC"/>
+          </w:tcPr>
+          <w:p>
+            <w:r>
+              <w:rPr>
+                <w:rFonts w:ascii="Arial" w:hAnsi="Arial"/>
+                <w:color w:val="334155"/>
+                <w:sz w:val="17"/>
+              </w:rPr>
+              <w:t>Videos 12-15</w:t>
+            </w:r>
+          </w:p>
+        </w:tc>
+        <w:tc>
+          <w:tcPr>
+            <w:tcW w:type="dxa" w:w="2160"/>
+            <w:tcMar>
+              <w:top w:w="80" w:type="dxa"/>
+              <w:bottom w:w="80" w:type="dxa"/>
+              <w:left w:w="120" w:type="dxa"/>
+              <w:right w:w="120" w:type="dxa"/>
+            </w:tcMar>
+            <w:shd w:fill="F8FAFC"/>
+          </w:tcPr>
+          <w:p>
+            <w:r>
+              <w:rPr>
+                <w:rFonts w:ascii="Arial" w:hAnsi="Arial"/>
+                <w:color w:val="334155"/>
+                <w:sz w:val="17"/>
+              </w:rPr>
+              <w:t>SET Operators (UNION/INTERSECT), String Functions &amp; Numeric Functions</w:t>
+            </w:r>
+          </w:p>
+        </w:tc>
+        <w:tc>
+          <w:tcPr>
+            <w:tcW w:type="dxa" w:w="2160"/>
+            <w:tcMar>
+              <w:top w:w="80" w:type="dxa"/>
+              <w:bottom w:w="80" w:type="dxa"/>
+              <w:left w:w="120" w:type="dxa"/>
+              <w:right w:w="120" w:type="dxa"/>
+            </w:tcMar>
+            <w:shd w:fill="F8FAFC"/>
+          </w:tcPr>
+          <w:p>
+            <w:r>
+              <w:rPr>
+                <w:rFonts w:ascii="Arial" w:hAnsi="Arial"/>
+                <w:color w:val="334155"/>
+                <w:sz w:val="17"/>
+              </w:rPr>
+              <w:t>04:02:09 - 05:22:48</w:t>
+            </w:r>
+          </w:p>
+        </w:tc>
+        <w:tc>
+          <w:tcPr>
+            <w:tcW w:type="dxa" w:w="2160"/>
+            <w:tcMar>
+              <w:top w:w="80" w:type="dxa"/>
+              <w:bottom w:w="80" w:type="dxa"/>
+              <w:left w:w="120" w:type="dxa"/>
+              <w:right w:w="120" w:type="dxa"/>
+            </w:tcMar>
+            <w:shd w:fill="F8FAFC"/>
+          </w:tcPr>
+          <w:p>
+            <w:r>
+              <w:rPr>
+                <w:rFonts w:ascii="Arial" w:hAnsi="Arial"/>
+                <w:color w:val="334155"/>
+                <w:sz w:val="17"/>
+              </w:rPr>
+              <w:t>✅ Completed</w:t>
+            </w:r>
+          </w:p>
+        </w:tc>
+      </w:tr>
+      <w:tr>
+        <w:tc>
+          <w:tcPr>
+            <w:tcW w:type="dxa" w:w="2160"/>
+            <w:tcMar>
+              <w:top w:w="80" w:type="dxa"/>
+              <w:bottom w:w="80" w:type="dxa"/>
+              <w:left w:w="120" w:type="dxa"/>
+              <w:right w:w="120" w:type="dxa"/>
+            </w:tcMar>
+            <w:shd w:fill="FFFFFF"/>
+          </w:tcPr>
+          <w:p>
+            <w:r>
+              <w:rPr>
+                <w:rFonts w:ascii="Arial" w:hAnsi="Arial"/>
+                <w:color w:val="334155"/>
+                <w:sz w:val="17"/>
+              </w:rPr>
+              <w:t>Videos 16-20</w:t>
+            </w:r>
+          </w:p>
+        </w:tc>
+        <w:tc>
+          <w:tcPr>
+            <w:tcW w:type="dxa" w:w="2160"/>
+            <w:tcMar>
+              <w:top w:w="80" w:type="dxa"/>
+              <w:bottom w:w="80" w:type="dxa"/>
+              <w:left w:w="120" w:type="dxa"/>
+              <w:right w:w="120" w:type="dxa"/>
+            </w:tcMar>
+            <w:shd w:fill="FFFFFF"/>
+          </w:tcPr>
+          <w:p>
+            <w:r>
+              <w:rPr>
+                <w:rFonts w:ascii="Arial" w:hAnsi="Arial"/>
+                <w:color w:val="334155"/>
+                <w:sz w:val="17"/>
+              </w:rPr>
+              <w:t>Date &amp; Time Functions, NULL Functions (COALESCE, ISNULL), NULL vs Empty</w:t>
+            </w:r>
+          </w:p>
+        </w:tc>
+        <w:tc>
+          <w:tcPr>
+            <w:tcW w:type="dxa" w:w="2160"/>
+            <w:tcMar>
+              <w:top w:w="80" w:type="dxa"/>
+              <w:bottom w:w="80" w:type="dxa"/>
+              <w:left w:w="120" w:type="dxa"/>
+              <w:right w:w="120" w:type="dxa"/>
+            </w:tcMar>
+            <w:shd w:fill="FFFFFF"/>
+          </w:tcPr>
+          <w:p>
+            <w:r>
+              <w:rPr>
+                <w:rFonts w:ascii="Arial" w:hAnsi="Arial"/>
+                <w:color w:val="334155"/>
+                <w:sz w:val="17"/>
+              </w:rPr>
+              <w:t>05:22:48 - 08:07:50</w:t>
+            </w:r>
+          </w:p>
+        </w:tc>
+        <w:tc>
+          <w:tcPr>
+            <w:tcW w:type="dxa" w:w="2160"/>
+            <w:tcMar>
+              <w:top w:w="80" w:type="dxa"/>
+              <w:bottom w:w="80" w:type="dxa"/>
+              <w:left w:w="120" w:type="dxa"/>
+              <w:right w:w="120" w:type="dxa"/>
+            </w:tcMar>
+            <w:shd w:fill="FFFFFF"/>
+          </w:tcPr>
+          <w:p>
+            <w:r>
+              <w:rPr>
+                <w:rFonts w:ascii="Arial" w:hAnsi="Arial"/>
+                <w:color w:val="334155"/>
+                <w:sz w:val="17"/>
+              </w:rPr>
+              <w:t>✅ Completed</w:t>
+            </w:r>
+          </w:p>
+        </w:tc>
+      </w:tr>
+      <w:tr>
+        <w:tc>
+          <w:tcPr>
+            <w:tcW w:type="dxa" w:w="2160"/>
+            <w:tcMar>
+              <w:top w:w="80" w:type="dxa"/>
+              <w:bottom w:w="80" w:type="dxa"/>
+              <w:left w:w="120" w:type="dxa"/>
+              <w:right w:w="120" w:type="dxa"/>
+            </w:tcMar>
+            <w:shd w:fill="F8FAFC"/>
+          </w:tcPr>
+          <w:p>
+            <w:r>
+              <w:rPr>
+                <w:rFonts w:ascii="Arial" w:hAnsi="Arial"/>
+                <w:color w:val="334155"/>
+                <w:sz w:val="17"/>
+              </w:rPr>
+              <w:t>Videos 21-22</w:t>
+            </w:r>
+          </w:p>
+        </w:tc>
+        <w:tc>
+          <w:tcPr>
+            <w:tcW w:type="dxa" w:w="2160"/>
+            <w:tcMar>
+              <w:top w:w="80" w:type="dxa"/>
+              <w:bottom w:w="80" w:type="dxa"/>
+              <w:left w:w="120" w:type="dxa"/>
+              <w:right w:w="120" w:type="dxa"/>
+            </w:tcMar>
+            <w:shd w:fill="F8FAFC"/>
+          </w:tcPr>
+          <w:p>
+            <w:r>
+              <w:rPr>
+                <w:rFonts w:ascii="Arial" w:hAnsi="Arial"/>
+                <w:color w:val="334155"/>
+                <w:sz w:val="17"/>
+              </w:rPr>
+              <w:t>CASE WHEN Conditional Logic &amp; Aggregate Functions (COUNT, SUM, AVG, MIN, MAX)</w:t>
+            </w:r>
+          </w:p>
+        </w:tc>
+        <w:tc>
+          <w:tcPr>
+            <w:tcW w:type="dxa" w:w="2160"/>
+            <w:tcMar>
+              <w:top w:w="80" w:type="dxa"/>
+              <w:bottom w:w="80" w:type="dxa"/>
+              <w:left w:w="120" w:type="dxa"/>
+              <w:right w:w="120" w:type="dxa"/>
+            </w:tcMar>
+            <w:shd w:fill="F8FAFC"/>
+          </w:tcPr>
+          <w:p>
+            <w:r>
+              <w:rPr>
+                <w:rFonts w:ascii="Arial" w:hAnsi="Arial"/>
+                <w:color w:val="334155"/>
+                <w:sz w:val="17"/>
+              </w:rPr>
+              <w:t>08:07:50 - 08:50:11</w:t>
+            </w:r>
+          </w:p>
+        </w:tc>
+        <w:tc>
+          <w:tcPr>
+            <w:tcW w:type="dxa" w:w="2160"/>
+            <w:tcMar>
+              <w:top w:w="80" w:type="dxa"/>
+              <w:bottom w:w="80" w:type="dxa"/>
+              <w:left w:w="120" w:type="dxa"/>
+              <w:right w:w="120" w:type="dxa"/>
+            </w:tcMar>
+            <w:shd w:fill="F8FAFC"/>
+          </w:tcPr>
+          <w:p>
+            <w:r>
+              <w:rPr>
+                <w:rFonts w:ascii="Arial" w:hAnsi="Arial"/>
+                <w:color w:val="334155"/>
+                <w:sz w:val="17"/>
+              </w:rPr>
+              <w:t>✅ Completed</w:t>
+            </w:r>
+          </w:p>
+        </w:tc>
+      </w:tr>
+      <w:tr>
+        <w:tc>
+          <w:tcPr>
+            <w:tcW w:type="dxa" w:w="2160"/>
+            <w:tcMar>
+              <w:top w:w="80" w:type="dxa"/>
+              <w:bottom w:w="80" w:type="dxa"/>
+              <w:left w:w="120" w:type="dxa"/>
+              <w:right w:w="120" w:type="dxa"/>
+            </w:tcMar>
+            <w:shd w:fill="FFFFFF"/>
+          </w:tcPr>
+          <w:p>
+            <w:r>
+              <w:rPr>
+                <w:rFonts w:ascii="Arial" w:hAnsi="Arial"/>
+                <w:color w:val="334155"/>
+                <w:sz w:val="17"/>
+              </w:rPr>
+              <w:t>Videos 23-27</w:t>
+            </w:r>
+          </w:p>
+        </w:tc>
+        <w:tc>
+          <w:tcPr>
+            <w:tcW w:type="dxa" w:w="2160"/>
+            <w:tcMar>
+              <w:top w:w="80" w:type="dxa"/>
+              <w:bottom w:w="80" w:type="dxa"/>
+              <w:left w:w="120" w:type="dxa"/>
+              <w:right w:w="120" w:type="dxa"/>
+            </w:tcMar>
+            <w:shd w:fill="FFFFFF"/>
+          </w:tcPr>
+          <w:p>
+            <w:r>
+              <w:rPr>
+                <w:rFonts w:ascii="Arial" w:hAnsi="Arial"/>
+                <w:color w:val="334155"/>
+                <w:sz w:val="17"/>
+              </w:rPr>
+              <w:t>Window Functions Basics (PARTITION BY), Ranking (ROW_NUMBER/RANK), Value (LAG/LEAD)</w:t>
+            </w:r>
+          </w:p>
+        </w:tc>
+        <w:tc>
+          <w:tcPr>
+            <w:tcW w:type="dxa" w:w="2160"/>
+            <w:tcMar>
+              <w:top w:w="80" w:type="dxa"/>
+              <w:bottom w:w="80" w:type="dxa"/>
+              <w:left w:w="120" w:type="dxa"/>
+              <w:right w:w="120" w:type="dxa"/>
+            </w:tcMar>
+            <w:shd w:fill="FFFFFF"/>
+          </w:tcPr>
+          <w:p>
+            <w:r>
+              <w:rPr>
+                <w:rFonts w:ascii="Arial" w:hAnsi="Arial"/>
+                <w:color w:val="334155"/>
+                <w:sz w:val="17"/>
+              </w:rPr>
+              <w:t>08:50:11 - 12:58:04</w:t>
+            </w:r>
+          </w:p>
+        </w:tc>
+        <w:tc>
+          <w:tcPr>
+            <w:tcW w:type="dxa" w:w="2160"/>
+            <w:tcMar>
+              <w:top w:w="80" w:type="dxa"/>
+              <w:bottom w:w="80" w:type="dxa"/>
+              <w:left w:w="120" w:type="dxa"/>
+              <w:right w:w="120" w:type="dxa"/>
+            </w:tcMar>
+            <w:shd w:fill="FFFFFF"/>
+          </w:tcPr>
+          <w:p>
+            <w:r>
+              <w:rPr>
+                <w:rFonts w:ascii="Arial" w:hAnsi="Arial"/>
+                <w:color w:val="334155"/>
+                <w:sz w:val="17"/>
+              </w:rPr>
+              <w:t>✅ Completed</w:t>
+            </w:r>
+          </w:p>
+        </w:tc>
+      </w:tr>
+      <w:tr>
+        <w:tc>
+          <w:tcPr>
+            <w:tcW w:type="dxa" w:w="2160"/>
+            <w:tcMar>
+              <w:top w:w="80" w:type="dxa"/>
+              <w:bottom w:w="80" w:type="dxa"/>
+              <w:left w:w="120" w:type="dxa"/>
+              <w:right w:w="120" w:type="dxa"/>
+            </w:tcMar>
+            <w:shd w:fill="F8FAFC"/>
+          </w:tcPr>
+          <w:p>
+            <w:r>
+              <w:rPr>
+                <w:rFonts w:ascii="Arial" w:hAnsi="Arial"/>
+                <w:color w:val="334155"/>
+                <w:sz w:val="17"/>
+              </w:rPr>
+              <w:t>Videos 28-29</w:t>
+            </w:r>
+          </w:p>
+        </w:tc>
+        <w:tc>
+          <w:tcPr>
+            <w:tcW w:type="dxa" w:w="2160"/>
+            <w:tcMar>
+              <w:top w:w="80" w:type="dxa"/>
+              <w:bottom w:w="80" w:type="dxa"/>
+              <w:left w:w="120" w:type="dxa"/>
+              <w:right w:w="120" w:type="dxa"/>
+            </w:tcMar>
+            <w:shd w:fill="F8FAFC"/>
+          </w:tcPr>
+          <w:p>
+            <w:r>
+              <w:rPr>
+                <w:rFonts w:ascii="Arial" w:hAnsi="Arial"/>
+                <w:color w:val="334155"/>
+                <w:sz w:val="17"/>
+              </w:rPr>
+              <w:t>SQL Subqueries, Correlated Subqueries &amp; Common Table Expressions (CTE WITH Clause)</w:t>
+            </w:r>
+          </w:p>
+        </w:tc>
+        <w:tc>
+          <w:tcPr>
+            <w:tcW w:type="dxa" w:w="2160"/>
+            <w:tcMar>
+              <w:top w:w="80" w:type="dxa"/>
+              <w:bottom w:w="80" w:type="dxa"/>
+              <w:left w:w="120" w:type="dxa"/>
+              <w:right w:w="120" w:type="dxa"/>
+            </w:tcMar>
+            <w:shd w:fill="F8FAFC"/>
+          </w:tcPr>
+          <w:p>
+            <w:r>
+              <w:rPr>
+                <w:rFonts w:ascii="Arial" w:hAnsi="Arial"/>
+                <w:color w:val="334155"/>
+                <w:sz w:val="17"/>
+              </w:rPr>
+              <w:t>12:58:04 - 15:35:02</w:t>
+            </w:r>
+          </w:p>
+        </w:tc>
+        <w:tc>
+          <w:tcPr>
+            <w:tcW w:type="dxa" w:w="2160"/>
+            <w:tcMar>
+              <w:top w:w="80" w:type="dxa"/>
+              <w:bottom w:w="80" w:type="dxa"/>
+              <w:left w:w="120" w:type="dxa"/>
+              <w:right w:w="120" w:type="dxa"/>
+            </w:tcMar>
+            <w:shd w:fill="F8FAFC"/>
+          </w:tcPr>
+          <w:p>
+            <w:r>
+              <w:rPr>
+                <w:rFonts w:ascii="Arial" w:hAnsi="Arial"/>
+                <w:color w:val="334155"/>
+                <w:sz w:val="17"/>
+              </w:rPr>
+              <w:t>✅ Completed (Till Video 29)</w:t>
+            </w:r>
+          </w:p>
+        </w:tc>
+      </w:tr>
+    </w:tbl>
     <w:sectPr>
       <w:pgSz w:w="12240" w:h="15840"/>
       <w:pgMar w:top="1440" w:right="1800" w:bottom="1440" w:left="1800" w:header="720" w:footer="720" w:gutter="0"/>

</xml_diff>

<commit_message>
Update master Word roadmap with accelerated SQL Analyst Academy App Modules per day and remove Daily Project Task column
</commit_message>
<xml_diff>
--- a/docs/DA_COMPLETE_STUDY_ROADMAP.docx
+++ b/docs/DA_COMPLETE_STUDY_ROADMAP.docx
@@ -28,7 +28,7 @@
           <w:color w:val="0EA5E9"/>
           <w:sz w:val="22"/>
         </w:rPr>
-        <w:t>Multi-Module Acceleration | Daily 5 HackerRank Quota | Daily Portfolio Project Tasks</w:t>
+        <w:t>Accelerated Multi-Module App Pace | 5 Daily HackerRank Quota | DataLemur First Strategy</w:t>
       </w:r>
     </w:p>
     <w:p>
@@ -81,20 +81,20 @@
         <w:rPr>
           <w:b/>
         </w:rPr>
-        <w:t xml:space="preserve">• Daily Practice Quota: </w:t>
+        <w:t xml:space="preserve">• SQL Analyst Academy App Plan: </w:t>
       </w:r>
       <w:r>
-        <w:t>5 HackerRank Problems Daily (3 Medium + 2 Hard)</w:t>
+        <w:t>Start App Learning (Modules 1–43) at accelerated pace (4–5 Modules/Day)</w:t>
         <w:br/>
       </w:r>
       <w:r>
         <w:rPr>
           <w:b/>
         </w:rPr>
-        <w:t xml:space="preserve">• Daily Portfolio Project Track: </w:t>
+        <w:t xml:space="preserve">• Daily Practice Quota: </w:t>
       </w:r>
       <w:r>
-        <w:t>Hands-on building of E-Commerce EDA &amp; DA Portfolio Repositories (Parallel Track)</w:t>
+        <w:t>5 HackerRank Problems Daily (3 Medium + 2 Hard)</w:t>
       </w:r>
     </w:p>
     <w:p>
@@ -119,22 +119,21 @@
         <w:tblLook w:firstColumn="1" w:firstRow="1" w:lastColumn="0" w:lastRow="0" w:noHBand="0" w:noVBand="1" w:val="04A0"/>
       </w:tblPr>
       <w:tblGrid>
-        <w:gridCol w:w="1440"/>
-        <w:gridCol w:w="1440"/>
-        <w:gridCol w:w="1440"/>
-        <w:gridCol w:w="1440"/>
-        <w:gridCol w:w="1440"/>
-        <w:gridCol w:w="1440"/>
+        <w:gridCol w:w="1728"/>
+        <w:gridCol w:w="1728"/>
+        <w:gridCol w:w="1728"/>
+        <w:gridCol w:w="1728"/>
+        <w:gridCol w:w="1728"/>
       </w:tblGrid>
       <w:tr>
         <w:tc>
           <w:tcPr>
-            <w:tcW w:type="dxa" w:w="1440"/>
+            <w:tcW w:type="dxa" w:w="1728"/>
             <w:tcMar>
               <w:top w:w="100" w:type="dxa"/>
               <w:bottom w:w="100" w:type="dxa"/>
-              <w:left w:w="120" w:type="dxa"/>
-              <w:right w:w="120" w:type="dxa"/>
+              <w:left w:w="100" w:type="dxa"/>
+              <w:right w:w="100" w:type="dxa"/>
             </w:tcMar>
             <w:shd w:fill="0F172A"/>
           </w:tcPr>
@@ -146,41 +145,18 @@
                 <w:color w:val="FFFFFF"/>
                 <w:sz w:val="19"/>
               </w:rPr>
-              <w:t>Day</w:t>
+              <w:t>Day &amp; Date</w:t>
             </w:r>
           </w:p>
         </w:tc>
         <w:tc>
           <w:tcPr>
-            <w:tcW w:type="dxa" w:w="1440"/>
+            <w:tcW w:type="dxa" w:w="1728"/>
             <w:tcMar>
               <w:top w:w="100" w:type="dxa"/>
               <w:bottom w:w="100" w:type="dxa"/>
-              <w:left w:w="120" w:type="dxa"/>
-              <w:right w:w="120" w:type="dxa"/>
-            </w:tcMar>
-            <w:shd w:fill="0F172A"/>
-          </w:tcPr>
-          <w:p>
-            <w:r>
-              <w:rPr>
-                <w:rFonts w:ascii="Arial" w:hAnsi="Arial"/>
-                <w:b/>
-                <w:color w:val="FFFFFF"/>
-                <w:sz w:val="19"/>
-              </w:rPr>
-              <w:t>Date</w:t>
-            </w:r>
-          </w:p>
-        </w:tc>
-        <w:tc>
-          <w:tcPr>
-            <w:tcW w:type="dxa" w:w="1440"/>
-            <w:tcMar>
-              <w:top w:w="100" w:type="dxa"/>
-              <w:bottom w:w="100" w:type="dxa"/>
-              <w:left w:w="120" w:type="dxa"/>
-              <w:right w:w="120" w:type="dxa"/>
+              <w:left w:w="100" w:type="dxa"/>
+              <w:right w:w="100" w:type="dxa"/>
             </w:tcMar>
             <w:shd w:fill="0F172A"/>
           </w:tcPr>
@@ -198,12 +174,12 @@
         </w:tc>
         <w:tc>
           <w:tcPr>
-            <w:tcW w:type="dxa" w:w="1440"/>
+            <w:tcW w:type="dxa" w:w="1728"/>
             <w:tcMar>
               <w:top w:w="100" w:type="dxa"/>
               <w:bottom w:w="100" w:type="dxa"/>
-              <w:left w:w="120" w:type="dxa"/>
-              <w:right w:w="120" w:type="dxa"/>
+              <w:left w:w="100" w:type="dxa"/>
+              <w:right w:w="100" w:type="dxa"/>
             </w:tcMar>
             <w:shd w:fill="0F172A"/>
           </w:tcPr>
@@ -215,18 +191,18 @@
                 <w:color w:val="FFFFFF"/>
                 <w:sz w:val="19"/>
               </w:rPr>
-              <w:t>Daily Project Task</w:t>
+              <w:t>SQL Analyst Academy App Modules (Multi-Module/Day)</w:t>
             </w:r>
           </w:p>
         </w:tc>
         <w:tc>
           <w:tcPr>
-            <w:tcW w:type="dxa" w:w="1440"/>
+            <w:tcW w:type="dxa" w:w="1728"/>
             <w:tcMar>
               <w:top w:w="100" w:type="dxa"/>
               <w:bottom w:w="100" w:type="dxa"/>
-              <w:left w:w="120" w:type="dxa"/>
-              <w:right w:w="120" w:type="dxa"/>
+              <w:left w:w="100" w:type="dxa"/>
+              <w:right w:w="100" w:type="dxa"/>
             </w:tcMar>
             <w:shd w:fill="0F172A"/>
           </w:tcPr>
@@ -244,12 +220,12 @@
         </w:tc>
         <w:tc>
           <w:tcPr>
-            <w:tcW w:type="dxa" w:w="1440"/>
+            <w:tcW w:type="dxa" w:w="1728"/>
             <w:tcMar>
               <w:top w:w="100" w:type="dxa"/>
               <w:bottom w:w="100" w:type="dxa"/>
-              <w:left w:w="120" w:type="dxa"/>
-              <w:right w:w="120" w:type="dxa"/>
+              <w:left w:w="100" w:type="dxa"/>
+              <w:right w:w="100" w:type="dxa"/>
             </w:tcMar>
             <w:shd w:fill="0F172A"/>
           </w:tcPr>
@@ -269,12 +245,12 @@
       <w:tr>
         <w:tc>
           <w:tcPr>
-            <w:tcW w:type="dxa" w:w="1440"/>
+            <w:tcW w:type="dxa" w:w="1728"/>
             <w:tcMar>
               <w:top w:w="80" w:type="dxa"/>
               <w:bottom w:w="80" w:type="dxa"/>
-              <w:left w:w="120" w:type="dxa"/>
-              <w:right w:w="120" w:type="dxa"/>
+              <w:left w:w="100" w:type="dxa"/>
+              <w:right w:w="100" w:type="dxa"/>
             </w:tcMar>
             <w:shd w:fill="FFFFFF"/>
           </w:tcPr>
@@ -286,39 +262,19 @@
                 <w:sz w:val="17"/>
               </w:rPr>
               <w:t>Day 15</w:t>
-            </w:r>
-          </w:p>
-        </w:tc>
-        <w:tc>
-          <w:tcPr>
-            <w:tcW w:type="dxa" w:w="1440"/>
-            <w:tcMar>
-              <w:top w:w="80" w:type="dxa"/>
-              <w:bottom w:w="80" w:type="dxa"/>
-              <w:left w:w="120" w:type="dxa"/>
-              <w:right w:w="120" w:type="dxa"/>
-            </w:tcMar>
-            <w:shd w:fill="FFFFFF"/>
-          </w:tcPr>
-          <w:p>
-            <w:r>
-              <w:rPr>
-                <w:rFonts w:ascii="Arial" w:hAnsi="Arial"/>
-                <w:color w:val="334155"/>
-                <w:sz w:val="17"/>
-              </w:rPr>
+              <w:br/>
               <w:t>July 24, 2026</w:t>
             </w:r>
           </w:p>
         </w:tc>
         <w:tc>
           <w:tcPr>
-            <w:tcW w:type="dxa" w:w="1440"/>
+            <w:tcW w:type="dxa" w:w="1728"/>
             <w:tcMar>
               <w:top w:w="80" w:type="dxa"/>
               <w:bottom w:w="80" w:type="dxa"/>
-              <w:left w:w="120" w:type="dxa"/>
-              <w:right w:w="120" w:type="dxa"/>
+              <w:left w:w="100" w:type="dxa"/>
+              <w:right w:w="100" w:type="dxa"/>
             </w:tcMar>
             <w:shd w:fill="FFFFFF"/>
           </w:tcPr>
@@ -337,12 +293,12 @@
         </w:tc>
         <w:tc>
           <w:tcPr>
-            <w:tcW w:type="dxa" w:w="1440"/>
+            <w:tcW w:type="dxa" w:w="1728"/>
             <w:tcMar>
               <w:top w:w="80" w:type="dxa"/>
               <w:bottom w:w="80" w:type="dxa"/>
-              <w:left w:w="120" w:type="dxa"/>
-              <w:right w:w="120" w:type="dxa"/>
+              <w:left w:w="100" w:type="dxa"/>
+              <w:right w:w="100" w:type="dxa"/>
             </w:tcMar>
             <w:shd w:fill="FFFFFF"/>
           </w:tcPr>
@@ -353,18 +309,18 @@
                 <w:color w:val="334155"/>
                 <w:sz w:val="17"/>
               </w:rPr>
-              <w:t>Task 1: Create GitHub Repo 'sql-da-portfolio' &amp; load datasets</w:t>
+              <w:t>App Modules 1–5: SELECT, WHERE, ORDER BY, LIMIT, NULLs (15 Problems)</w:t>
             </w:r>
           </w:p>
         </w:tc>
         <w:tc>
           <w:tcPr>
-            <w:tcW w:type="dxa" w:w="1440"/>
+            <w:tcW w:type="dxa" w:w="1728"/>
             <w:tcMar>
               <w:top w:w="80" w:type="dxa"/>
               <w:bottom w:w="80" w:type="dxa"/>
-              <w:left w:w="120" w:type="dxa"/>
-              <w:right w:w="120" w:type="dxa"/>
+              <w:left w:w="100" w:type="dxa"/>
+              <w:right w:w="100" w:type="dxa"/>
             </w:tcMar>
             <w:shd w:fill="FFFFFF"/>
           </w:tcPr>
@@ -381,12 +337,12 @@
         </w:tc>
         <w:tc>
           <w:tcPr>
-            <w:tcW w:type="dxa" w:w="1440"/>
+            <w:tcW w:type="dxa" w:w="1728"/>
             <w:tcMar>
               <w:top w:w="80" w:type="dxa"/>
               <w:bottom w:w="80" w:type="dxa"/>
-              <w:left w:w="120" w:type="dxa"/>
-              <w:right w:w="120" w:type="dxa"/>
+              <w:left w:w="100" w:type="dxa"/>
+              <w:right w:w="100" w:type="dxa"/>
             </w:tcMar>
             <w:shd w:fill="FFFFFF"/>
           </w:tcPr>
@@ -405,12 +361,12 @@
       <w:tr>
         <w:tc>
           <w:tcPr>
-            <w:tcW w:type="dxa" w:w="1440"/>
+            <w:tcW w:type="dxa" w:w="1728"/>
             <w:tcMar>
               <w:top w:w="80" w:type="dxa"/>
               <w:bottom w:w="80" w:type="dxa"/>
-              <w:left w:w="120" w:type="dxa"/>
-              <w:right w:w="120" w:type="dxa"/>
+              <w:left w:w="100" w:type="dxa"/>
+              <w:right w:w="100" w:type="dxa"/>
             </w:tcMar>
             <w:shd w:fill="F8FAFC"/>
           </w:tcPr>
@@ -422,39 +378,19 @@
                 <w:sz w:val="17"/>
               </w:rPr>
               <w:t>Day 16</w:t>
-            </w:r>
-          </w:p>
-        </w:tc>
-        <w:tc>
-          <w:tcPr>
-            <w:tcW w:type="dxa" w:w="1440"/>
-            <w:tcMar>
-              <w:top w:w="80" w:type="dxa"/>
-              <w:bottom w:w="80" w:type="dxa"/>
-              <w:left w:w="120" w:type="dxa"/>
-              <w:right w:w="120" w:type="dxa"/>
-            </w:tcMar>
-            <w:shd w:fill="F8FAFC"/>
-          </w:tcPr>
-          <w:p>
-            <w:r>
-              <w:rPr>
-                <w:rFonts w:ascii="Arial" w:hAnsi="Arial"/>
-                <w:color w:val="334155"/>
-                <w:sz w:val="17"/>
-              </w:rPr>
+              <w:br/>
               <w:t>July 25, 2026</w:t>
             </w:r>
           </w:p>
         </w:tc>
         <w:tc>
           <w:tcPr>
-            <w:tcW w:type="dxa" w:w="1440"/>
+            <w:tcW w:type="dxa" w:w="1728"/>
             <w:tcMar>
               <w:top w:w="80" w:type="dxa"/>
               <w:bottom w:w="80" w:type="dxa"/>
-              <w:left w:w="120" w:type="dxa"/>
-              <w:right w:w="120" w:type="dxa"/>
+              <w:left w:w="100" w:type="dxa"/>
+              <w:right w:w="100" w:type="dxa"/>
             </w:tcMar>
             <w:shd w:fill="F8FAFC"/>
           </w:tcPr>
@@ -473,12 +409,12 @@
         </w:tc>
         <w:tc>
           <w:tcPr>
-            <w:tcW w:type="dxa" w:w="1440"/>
+            <w:tcW w:type="dxa" w:w="1728"/>
             <w:tcMar>
               <w:top w:w="80" w:type="dxa"/>
               <w:bottom w:w="80" w:type="dxa"/>
-              <w:left w:w="120" w:type="dxa"/>
-              <w:right w:w="120" w:type="dxa"/>
+              <w:left w:w="100" w:type="dxa"/>
+              <w:right w:w="100" w:type="dxa"/>
             </w:tcMar>
             <w:shd w:fill="F8FAFC"/>
           </w:tcPr>
@@ -489,18 +425,18 @@
                 <w:color w:val="334155"/>
                 <w:sz w:val="17"/>
               </w:rPr>
-              <w:t>Task 2: Write Customer Demographics &amp; Segment Revenue CTEs</w:t>
+              <w:t>App Modules 6–10: String/Date Functions, CASE WHEN (15 Problems)</w:t>
             </w:r>
           </w:p>
         </w:tc>
         <w:tc>
           <w:tcPr>
-            <w:tcW w:type="dxa" w:w="1440"/>
+            <w:tcW w:type="dxa" w:w="1728"/>
             <w:tcMar>
               <w:top w:w="80" w:type="dxa"/>
               <w:bottom w:w="80" w:type="dxa"/>
-              <w:left w:w="120" w:type="dxa"/>
-              <w:right w:w="120" w:type="dxa"/>
+              <w:left w:w="100" w:type="dxa"/>
+              <w:right w:w="100" w:type="dxa"/>
             </w:tcMar>
             <w:shd w:fill="F8FAFC"/>
           </w:tcPr>
@@ -517,12 +453,12 @@
         </w:tc>
         <w:tc>
           <w:tcPr>
-            <w:tcW w:type="dxa" w:w="1440"/>
+            <w:tcW w:type="dxa" w:w="1728"/>
             <w:tcMar>
               <w:top w:w="80" w:type="dxa"/>
               <w:bottom w:w="80" w:type="dxa"/>
-              <w:left w:w="120" w:type="dxa"/>
-              <w:right w:w="120" w:type="dxa"/>
+              <w:left w:w="100" w:type="dxa"/>
+              <w:right w:w="100" w:type="dxa"/>
             </w:tcMar>
             <w:shd w:fill="F8FAFC"/>
           </w:tcPr>
@@ -533,7 +469,7 @@
                 <w:color w:val="334155"/>
                 <w:sz w:val="17"/>
               </w:rPr>
-              <w:t>⏳ Watch 3 Videos &amp; Code</w:t>
+              <w:t>⏳ Watch &amp; Solve</w:t>
             </w:r>
           </w:p>
         </w:tc>
@@ -541,12 +477,12 @@
       <w:tr>
         <w:tc>
           <w:tcPr>
-            <w:tcW w:type="dxa" w:w="1440"/>
+            <w:tcW w:type="dxa" w:w="1728"/>
             <w:tcMar>
               <w:top w:w="80" w:type="dxa"/>
               <w:bottom w:w="80" w:type="dxa"/>
-              <w:left w:w="120" w:type="dxa"/>
-              <w:right w:w="120" w:type="dxa"/>
+              <w:left w:w="100" w:type="dxa"/>
+              <w:right w:w="100" w:type="dxa"/>
             </w:tcMar>
             <w:shd w:fill="FFFFFF"/>
           </w:tcPr>
@@ -558,39 +494,19 @@
                 <w:sz w:val="17"/>
               </w:rPr>
               <w:t>Day 17</w:t>
-            </w:r>
-          </w:p>
-        </w:tc>
-        <w:tc>
-          <w:tcPr>
-            <w:tcW w:type="dxa" w:w="1440"/>
-            <w:tcMar>
-              <w:top w:w="80" w:type="dxa"/>
-              <w:bottom w:w="80" w:type="dxa"/>
-              <w:left w:w="120" w:type="dxa"/>
-              <w:right w:w="120" w:type="dxa"/>
-            </w:tcMar>
-            <w:shd w:fill="FFFFFF"/>
-          </w:tcPr>
-          <w:p>
-            <w:r>
-              <w:rPr>
-                <w:rFonts w:ascii="Arial" w:hAnsi="Arial"/>
-                <w:color w:val="334155"/>
-                <w:sz w:val="17"/>
-              </w:rPr>
+              <w:br/>
               <w:t>July 26, 2026</w:t>
             </w:r>
           </w:p>
         </w:tc>
         <w:tc>
           <w:tcPr>
-            <w:tcW w:type="dxa" w:w="1440"/>
+            <w:tcW w:type="dxa" w:w="1728"/>
             <w:tcMar>
               <w:top w:w="80" w:type="dxa"/>
               <w:bottom w:w="80" w:type="dxa"/>
-              <w:left w:w="120" w:type="dxa"/>
-              <w:right w:w="120" w:type="dxa"/>
+              <w:left w:w="100" w:type="dxa"/>
+              <w:right w:w="100" w:type="dxa"/>
             </w:tcMar>
             <w:shd w:fill="FFFFFF"/>
           </w:tcPr>
@@ -609,12 +525,12 @@
         </w:tc>
         <w:tc>
           <w:tcPr>
-            <w:tcW w:type="dxa" w:w="1440"/>
+            <w:tcW w:type="dxa" w:w="1728"/>
             <w:tcMar>
               <w:top w:w="80" w:type="dxa"/>
               <w:bottom w:w="80" w:type="dxa"/>
-              <w:left w:w="120" w:type="dxa"/>
-              <w:right w:w="120" w:type="dxa"/>
+              <w:left w:w="100" w:type="dxa"/>
+              <w:right w:w="100" w:type="dxa"/>
             </w:tcMar>
             <w:shd w:fill="FFFFFF"/>
           </w:tcPr>
@@ -625,18 +541,18 @@
                 <w:color w:val="334155"/>
                 <w:sz w:val="17"/>
               </w:rPr>
-              <w:t>Task 3: Write Order Trend &amp; Monthly Revenue Growth Queries</w:t>
+              <w:t>App Modules 11–15: Aggregations, GROUP BY, HAVING (15 Problems)</w:t>
             </w:r>
           </w:p>
         </w:tc>
         <w:tc>
           <w:tcPr>
-            <w:tcW w:type="dxa" w:w="1440"/>
+            <w:tcW w:type="dxa" w:w="1728"/>
             <w:tcMar>
               <w:top w:w="80" w:type="dxa"/>
               <w:bottom w:w="80" w:type="dxa"/>
-              <w:left w:w="120" w:type="dxa"/>
-              <w:right w:w="120" w:type="dxa"/>
+              <w:left w:w="100" w:type="dxa"/>
+              <w:right w:w="100" w:type="dxa"/>
             </w:tcMar>
             <w:shd w:fill="FFFFFF"/>
           </w:tcPr>
@@ -653,12 +569,12 @@
         </w:tc>
         <w:tc>
           <w:tcPr>
-            <w:tcW w:type="dxa" w:w="1440"/>
+            <w:tcW w:type="dxa" w:w="1728"/>
             <w:tcMar>
               <w:top w:w="80" w:type="dxa"/>
               <w:bottom w:w="80" w:type="dxa"/>
-              <w:left w:w="120" w:type="dxa"/>
-              <w:right w:w="120" w:type="dxa"/>
+              <w:left w:w="100" w:type="dxa"/>
+              <w:right w:w="100" w:type="dxa"/>
             </w:tcMar>
             <w:shd w:fill="FFFFFF"/>
           </w:tcPr>
@@ -669,7 +585,7 @@
                 <w:color w:val="334155"/>
                 <w:sz w:val="17"/>
               </w:rPr>
-              <w:t>⏳ Watch 3 Videos &amp; Code</w:t>
+              <w:t>⏳ Watch &amp; Solve</w:t>
             </w:r>
           </w:p>
         </w:tc>
@@ -677,12 +593,12 @@
       <w:tr>
         <w:tc>
           <w:tcPr>
-            <w:tcW w:type="dxa" w:w="1440"/>
+            <w:tcW w:type="dxa" w:w="1728"/>
             <w:tcMar>
               <w:top w:w="80" w:type="dxa"/>
               <w:bottom w:w="80" w:type="dxa"/>
-              <w:left w:w="120" w:type="dxa"/>
-              <w:right w:w="120" w:type="dxa"/>
+              <w:left w:w="100" w:type="dxa"/>
+              <w:right w:w="100" w:type="dxa"/>
             </w:tcMar>
             <w:shd w:fill="F8FAFC"/>
           </w:tcPr>
@@ -694,39 +610,19 @@
                 <w:sz w:val="17"/>
               </w:rPr>
               <w:t>Day 18</w:t>
-            </w:r>
-          </w:p>
-        </w:tc>
-        <w:tc>
-          <w:tcPr>
-            <w:tcW w:type="dxa" w:w="1440"/>
-            <w:tcMar>
-              <w:top w:w="80" w:type="dxa"/>
-              <w:bottom w:w="80" w:type="dxa"/>
-              <w:left w:w="120" w:type="dxa"/>
-              <w:right w:w="120" w:type="dxa"/>
-            </w:tcMar>
-            <w:shd w:fill="F8FAFC"/>
-          </w:tcPr>
-          <w:p>
-            <w:r>
-              <w:rPr>
-                <w:rFonts w:ascii="Arial" w:hAnsi="Arial"/>
-                <w:color w:val="334155"/>
-                <w:sz w:val="17"/>
-              </w:rPr>
+              <w:br/>
               <w:t>July 27, 2026</w:t>
             </w:r>
           </w:p>
         </w:tc>
         <w:tc>
           <w:tcPr>
-            <w:tcW w:type="dxa" w:w="1440"/>
+            <w:tcW w:type="dxa" w:w="1728"/>
             <w:tcMar>
               <w:top w:w="80" w:type="dxa"/>
               <w:bottom w:w="80" w:type="dxa"/>
-              <w:left w:w="120" w:type="dxa"/>
-              <w:right w:w="120" w:type="dxa"/>
+              <w:left w:w="100" w:type="dxa"/>
+              <w:right w:w="100" w:type="dxa"/>
             </w:tcMar>
             <w:shd w:fill="F8FAFC"/>
           </w:tcPr>
@@ -745,12 +641,12 @@
         </w:tc>
         <w:tc>
           <w:tcPr>
-            <w:tcW w:type="dxa" w:w="1440"/>
+            <w:tcW w:type="dxa" w:w="1728"/>
             <w:tcMar>
               <w:top w:w="80" w:type="dxa"/>
               <w:bottom w:w="80" w:type="dxa"/>
-              <w:left w:w="120" w:type="dxa"/>
-              <w:right w:w="120" w:type="dxa"/>
+              <w:left w:w="100" w:type="dxa"/>
+              <w:right w:w="100" w:type="dxa"/>
             </w:tcMar>
             <w:shd w:fill="F8FAFC"/>
           </w:tcPr>
@@ -761,18 +657,18 @@
                 <w:color w:val="334155"/>
                 <w:sz w:val="17"/>
               </w:rPr>
-              <w:t>Task 4: Calculate Customer Retention &amp; Churn (LEAD/LAG)</w:t>
+              <w:t>App Modules 16–20: Relational &amp; Outer Joins, Self Joins (15 Problems)</w:t>
             </w:r>
           </w:p>
         </w:tc>
         <w:tc>
           <w:tcPr>
-            <w:tcW w:type="dxa" w:w="1440"/>
+            <w:tcW w:type="dxa" w:w="1728"/>
             <w:tcMar>
               <w:top w:w="80" w:type="dxa"/>
               <w:bottom w:w="80" w:type="dxa"/>
-              <w:left w:w="120" w:type="dxa"/>
-              <w:right w:w="120" w:type="dxa"/>
+              <w:left w:w="100" w:type="dxa"/>
+              <w:right w:w="100" w:type="dxa"/>
             </w:tcMar>
             <w:shd w:fill="F8FAFC"/>
           </w:tcPr>
@@ -789,12 +685,12 @@
         </w:tc>
         <w:tc>
           <w:tcPr>
-            <w:tcW w:type="dxa" w:w="1440"/>
+            <w:tcW w:type="dxa" w:w="1728"/>
             <w:tcMar>
               <w:top w:w="80" w:type="dxa"/>
               <w:bottom w:w="80" w:type="dxa"/>
-              <w:left w:w="120" w:type="dxa"/>
-              <w:right w:w="120" w:type="dxa"/>
+              <w:left w:w="100" w:type="dxa"/>
+              <w:right w:w="100" w:type="dxa"/>
             </w:tcMar>
             <w:shd w:fill="F8FAFC"/>
           </w:tcPr>
@@ -805,7 +701,7 @@
                 <w:color w:val="334155"/>
                 <w:sz w:val="17"/>
               </w:rPr>
-              <w:t>⏳ Watch 3 Videos &amp; Code</w:t>
+              <w:t>⏳ Watch &amp; Solve</w:t>
             </w:r>
           </w:p>
         </w:tc>
@@ -813,12 +709,12 @@
       <w:tr>
         <w:tc>
           <w:tcPr>
-            <w:tcW w:type="dxa" w:w="1440"/>
+            <w:tcW w:type="dxa" w:w="1728"/>
             <w:tcMar>
               <w:top w:w="80" w:type="dxa"/>
               <w:bottom w:w="80" w:type="dxa"/>
-              <w:left w:w="120" w:type="dxa"/>
-              <w:right w:w="120" w:type="dxa"/>
+              <w:left w:w="100" w:type="dxa"/>
+              <w:right w:w="100" w:type="dxa"/>
             </w:tcMar>
             <w:shd w:fill="FFFFFF"/>
           </w:tcPr>
@@ -830,39 +726,19 @@
                 <w:sz w:val="17"/>
               </w:rPr>
               <w:t>Day 19</w:t>
-            </w:r>
-          </w:p>
-        </w:tc>
-        <w:tc>
-          <w:tcPr>
-            <w:tcW w:type="dxa" w:w="1440"/>
-            <w:tcMar>
-              <w:top w:w="80" w:type="dxa"/>
-              <w:bottom w:w="80" w:type="dxa"/>
-              <w:left w:w="120" w:type="dxa"/>
-              <w:right w:w="120" w:type="dxa"/>
-            </w:tcMar>
-            <w:shd w:fill="FFFFFF"/>
-          </w:tcPr>
-          <w:p>
-            <w:r>
-              <w:rPr>
-                <w:rFonts w:ascii="Arial" w:hAnsi="Arial"/>
-                <w:color w:val="334155"/>
-                <w:sz w:val="17"/>
-              </w:rPr>
+              <w:br/>
               <w:t>July 28, 2026</w:t>
             </w:r>
           </w:p>
         </w:tc>
         <w:tc>
           <w:tcPr>
-            <w:tcW w:type="dxa" w:w="1440"/>
+            <w:tcW w:type="dxa" w:w="1728"/>
             <w:tcMar>
               <w:top w:w="80" w:type="dxa"/>
               <w:bottom w:w="80" w:type="dxa"/>
-              <w:left w:w="120" w:type="dxa"/>
-              <w:right w:w="120" w:type="dxa"/>
+              <w:left w:w="100" w:type="dxa"/>
+              <w:right w:w="100" w:type="dxa"/>
             </w:tcMar>
             <w:shd w:fill="FFFFFF"/>
           </w:tcPr>
@@ -881,12 +757,12 @@
         </w:tc>
         <w:tc>
           <w:tcPr>
-            <w:tcW w:type="dxa" w:w="1440"/>
+            <w:tcW w:type="dxa" w:w="1728"/>
             <w:tcMar>
               <w:top w:w="80" w:type="dxa"/>
               <w:bottom w:w="80" w:type="dxa"/>
-              <w:left w:w="120" w:type="dxa"/>
-              <w:right w:w="120" w:type="dxa"/>
+              <w:left w:w="100" w:type="dxa"/>
+              <w:right w:w="100" w:type="dxa"/>
             </w:tcMar>
             <w:shd w:fill="FFFFFF"/>
           </w:tcPr>
@@ -897,18 +773,18 @@
                 <w:color w:val="334155"/>
                 <w:sz w:val="17"/>
               </w:rPr>
-              <w:t>Task 5: Write Product Category Profitability &amp; Top Sellers Queries</w:t>
+              <w:t>App Modules 21–25: Subqueries, Correlated Queries, CTEs (15 Problems)</w:t>
             </w:r>
           </w:p>
         </w:tc>
         <w:tc>
           <w:tcPr>
-            <w:tcW w:type="dxa" w:w="1440"/>
+            <w:tcW w:type="dxa" w:w="1728"/>
             <w:tcMar>
               <w:top w:w="80" w:type="dxa"/>
               <w:bottom w:w="80" w:type="dxa"/>
-              <w:left w:w="120" w:type="dxa"/>
-              <w:right w:w="120" w:type="dxa"/>
+              <w:left w:w="100" w:type="dxa"/>
+              <w:right w:w="100" w:type="dxa"/>
             </w:tcMar>
             <w:shd w:fill="FFFFFF"/>
           </w:tcPr>
@@ -925,12 +801,12 @@
         </w:tc>
         <w:tc>
           <w:tcPr>
-            <w:tcW w:type="dxa" w:w="1440"/>
+            <w:tcW w:type="dxa" w:w="1728"/>
             <w:tcMar>
               <w:top w:w="80" w:type="dxa"/>
               <w:bottom w:w="80" w:type="dxa"/>
-              <w:left w:w="120" w:type="dxa"/>
-              <w:right w:w="120" w:type="dxa"/>
+              <w:left w:w="100" w:type="dxa"/>
+              <w:right w:w="100" w:type="dxa"/>
             </w:tcMar>
             <w:shd w:fill="FFFFFF"/>
           </w:tcPr>
@@ -941,7 +817,7 @@
                 <w:color w:val="334155"/>
                 <w:sz w:val="17"/>
               </w:rPr>
-              <w:t>⏳ Watch 3 Videos &amp; Code</w:t>
+              <w:t>⏳ Watch &amp; Solve</w:t>
             </w:r>
           </w:p>
         </w:tc>
@@ -949,12 +825,12 @@
       <w:tr>
         <w:tc>
           <w:tcPr>
-            <w:tcW w:type="dxa" w:w="1440"/>
+            <w:tcW w:type="dxa" w:w="1728"/>
             <w:tcMar>
               <w:top w:w="80" w:type="dxa"/>
               <w:bottom w:w="80" w:type="dxa"/>
-              <w:left w:w="120" w:type="dxa"/>
-              <w:right w:w="120" w:type="dxa"/>
+              <w:left w:w="100" w:type="dxa"/>
+              <w:right w:w="100" w:type="dxa"/>
             </w:tcMar>
             <w:shd w:fill="F8FAFC"/>
           </w:tcPr>
@@ -966,39 +842,19 @@
                 <w:sz w:val="17"/>
               </w:rPr>
               <w:t>Day 20</w:t>
-            </w:r>
-          </w:p>
-        </w:tc>
-        <w:tc>
-          <w:tcPr>
-            <w:tcW w:type="dxa" w:w="1440"/>
-            <w:tcMar>
-              <w:top w:w="80" w:type="dxa"/>
-              <w:bottom w:w="80" w:type="dxa"/>
-              <w:left w:w="120" w:type="dxa"/>
-              <w:right w:w="120" w:type="dxa"/>
-            </w:tcMar>
-            <w:shd w:fill="F8FAFC"/>
-          </w:tcPr>
-          <w:p>
-            <w:r>
-              <w:rPr>
-                <w:rFonts w:ascii="Arial" w:hAnsi="Arial"/>
-                <w:color w:val="334155"/>
-                <w:sz w:val="17"/>
-              </w:rPr>
+              <w:br/>
               <w:t>July 29, 2026</w:t>
             </w:r>
           </w:p>
         </w:tc>
         <w:tc>
           <w:tcPr>
-            <w:tcW w:type="dxa" w:w="1440"/>
+            <w:tcW w:type="dxa" w:w="1728"/>
             <w:tcMar>
               <w:top w:w="80" w:type="dxa"/>
               <w:bottom w:w="80" w:type="dxa"/>
-              <w:left w:w="120" w:type="dxa"/>
-              <w:right w:w="120" w:type="dxa"/>
+              <w:left w:w="100" w:type="dxa"/>
+              <w:right w:w="100" w:type="dxa"/>
             </w:tcMar>
             <w:shd w:fill="F8FAFC"/>
           </w:tcPr>
@@ -1017,12 +873,12 @@
         </w:tc>
         <w:tc>
           <w:tcPr>
-            <w:tcW w:type="dxa" w:w="1440"/>
+            <w:tcW w:type="dxa" w:w="1728"/>
             <w:tcMar>
               <w:top w:w="80" w:type="dxa"/>
               <w:bottom w:w="80" w:type="dxa"/>
-              <w:left w:w="120" w:type="dxa"/>
-              <w:right w:w="120" w:type="dxa"/>
+              <w:left w:w="100" w:type="dxa"/>
+              <w:right w:w="100" w:type="dxa"/>
             </w:tcMar>
             <w:shd w:fill="F8FAFC"/>
           </w:tcPr>
@@ -1033,18 +889,18 @@
                 <w:color w:val="334155"/>
                 <w:sz w:val="17"/>
               </w:rPr>
-              <w:t>Task 6: Create Production Views (vw_monthly_kpis, vw_churn)</w:t>
+              <w:t>App Modules 26–30: Window Functions ROW_NUMBER, RANK, LEAD/LAG (15 Problems)</w:t>
             </w:r>
           </w:p>
         </w:tc>
         <w:tc>
           <w:tcPr>
-            <w:tcW w:type="dxa" w:w="1440"/>
+            <w:tcW w:type="dxa" w:w="1728"/>
             <w:tcMar>
               <w:top w:w="80" w:type="dxa"/>
               <w:bottom w:w="80" w:type="dxa"/>
-              <w:left w:w="120" w:type="dxa"/>
-              <w:right w:w="120" w:type="dxa"/>
+              <w:left w:w="100" w:type="dxa"/>
+              <w:right w:w="100" w:type="dxa"/>
             </w:tcMar>
             <w:shd w:fill="F8FAFC"/>
           </w:tcPr>
@@ -1061,12 +917,12 @@
         </w:tc>
         <w:tc>
           <w:tcPr>
-            <w:tcW w:type="dxa" w:w="1440"/>
+            <w:tcW w:type="dxa" w:w="1728"/>
             <w:tcMar>
               <w:top w:w="80" w:type="dxa"/>
               <w:bottom w:w="80" w:type="dxa"/>
-              <w:left w:w="120" w:type="dxa"/>
-              <w:right w:w="120" w:type="dxa"/>
+              <w:left w:w="100" w:type="dxa"/>
+              <w:right w:w="100" w:type="dxa"/>
             </w:tcMar>
             <w:shd w:fill="F8FAFC"/>
           </w:tcPr>
@@ -1077,7 +933,7 @@
                 <w:color w:val="334155"/>
                 <w:sz w:val="17"/>
               </w:rPr>
-              <w:t>💡 Watch 3 Videos &amp; Code</w:t>
+              <w:t>💡 Watch &amp; Solve</w:t>
             </w:r>
           </w:p>
         </w:tc>
@@ -1085,12 +941,12 @@
       <w:tr>
         <w:tc>
           <w:tcPr>
-            <w:tcW w:type="dxa" w:w="1440"/>
+            <w:tcW w:type="dxa" w:w="1728"/>
             <w:tcMar>
               <w:top w:w="80" w:type="dxa"/>
               <w:bottom w:w="80" w:type="dxa"/>
-              <w:left w:w="120" w:type="dxa"/>
-              <w:right w:w="120" w:type="dxa"/>
+              <w:left w:w="100" w:type="dxa"/>
+              <w:right w:w="100" w:type="dxa"/>
             </w:tcMar>
             <w:shd w:fill="FFFFFF"/>
           </w:tcPr>
@@ -1102,39 +958,19 @@
                 <w:sz w:val="17"/>
               </w:rPr>
               <w:t>Day 21</w:t>
-            </w:r>
-          </w:p>
-        </w:tc>
-        <w:tc>
-          <w:tcPr>
-            <w:tcW w:type="dxa" w:w="1440"/>
-            <w:tcMar>
-              <w:top w:w="80" w:type="dxa"/>
-              <w:bottom w:w="80" w:type="dxa"/>
-              <w:left w:w="120" w:type="dxa"/>
-              <w:right w:w="120" w:type="dxa"/>
-            </w:tcMar>
-            <w:shd w:fill="FFFFFF"/>
-          </w:tcPr>
-          <w:p>
-            <w:r>
-              <w:rPr>
-                <w:rFonts w:ascii="Arial" w:hAnsi="Arial"/>
-                <w:color w:val="334155"/>
-                <w:sz w:val="17"/>
-              </w:rPr>
+              <w:br/>
               <w:t>July 30, 2026</w:t>
             </w:r>
           </w:p>
         </w:tc>
         <w:tc>
           <w:tcPr>
-            <w:tcW w:type="dxa" w:w="1440"/>
+            <w:tcW w:type="dxa" w:w="1728"/>
             <w:tcMar>
               <w:top w:w="80" w:type="dxa"/>
               <w:bottom w:w="80" w:type="dxa"/>
-              <w:left w:w="120" w:type="dxa"/>
-              <w:right w:w="120" w:type="dxa"/>
+              <w:left w:w="100" w:type="dxa"/>
+              <w:right w:w="100" w:type="dxa"/>
             </w:tcMar>
             <w:shd w:fill="FFFFFF"/>
           </w:tcPr>
@@ -1153,12 +989,12 @@
         </w:tc>
         <w:tc>
           <w:tcPr>
-            <w:tcW w:type="dxa" w:w="1440"/>
+            <w:tcW w:type="dxa" w:w="1728"/>
             <w:tcMar>
               <w:top w:w="80" w:type="dxa"/>
               <w:bottom w:w="80" w:type="dxa"/>
-              <w:left w:w="120" w:type="dxa"/>
-              <w:right w:w="120" w:type="dxa"/>
+              <w:left w:w="100" w:type="dxa"/>
+              <w:right w:w="100" w:type="dxa"/>
             </w:tcMar>
             <w:shd w:fill="FFFFFF"/>
           </w:tcPr>
@@ -1169,18 +1005,18 @@
                 <w:color w:val="334155"/>
                 <w:sz w:val="17"/>
               </w:rPr>
-              <w:t>Task 7: Benchmark query execution time with EXPLAIN QUERY PLAN</w:t>
+              <w:t>App Modules 31–35: Views, CTAS, Temporary Tables (15 Problems)</w:t>
             </w:r>
           </w:p>
         </w:tc>
         <w:tc>
           <w:tcPr>
-            <w:tcW w:type="dxa" w:w="1440"/>
+            <w:tcW w:type="dxa" w:w="1728"/>
             <w:tcMar>
               <w:top w:w="80" w:type="dxa"/>
               <w:bottom w:w="80" w:type="dxa"/>
-              <w:left w:w="120" w:type="dxa"/>
-              <w:right w:w="120" w:type="dxa"/>
+              <w:left w:w="100" w:type="dxa"/>
+              <w:right w:w="100" w:type="dxa"/>
             </w:tcMar>
             <w:shd w:fill="FFFFFF"/>
           </w:tcPr>
@@ -1197,12 +1033,12 @@
         </w:tc>
         <w:tc>
           <w:tcPr>
-            <w:tcW w:type="dxa" w:w="1440"/>
+            <w:tcW w:type="dxa" w:w="1728"/>
             <w:tcMar>
               <w:top w:w="80" w:type="dxa"/>
               <w:bottom w:w="80" w:type="dxa"/>
-              <w:left w:w="120" w:type="dxa"/>
-              <w:right w:w="120" w:type="dxa"/>
+              <w:left w:w="100" w:type="dxa"/>
+              <w:right w:w="100" w:type="dxa"/>
             </w:tcMar>
             <w:shd w:fill="FFFFFF"/>
           </w:tcPr>
@@ -1213,7 +1049,7 @@
                 <w:color w:val="334155"/>
                 <w:sz w:val="17"/>
               </w:rPr>
-              <w:t>🏗️ DWH Series &amp; Code</w:t>
+              <w:t>🏗️ DWH Series &amp; Solve</w:t>
             </w:r>
           </w:p>
         </w:tc>
@@ -1221,12 +1057,12 @@
       <w:tr>
         <w:tc>
           <w:tcPr>
-            <w:tcW w:type="dxa" w:w="1440"/>
+            <w:tcW w:type="dxa" w:w="1728"/>
             <w:tcMar>
               <w:top w:w="80" w:type="dxa"/>
               <w:bottom w:w="80" w:type="dxa"/>
-              <w:left w:w="120" w:type="dxa"/>
-              <w:right w:w="120" w:type="dxa"/>
+              <w:left w:w="100" w:type="dxa"/>
+              <w:right w:w="100" w:type="dxa"/>
             </w:tcMar>
             <w:shd w:fill="F8FAFC"/>
           </w:tcPr>
@@ -1238,39 +1074,19 @@
                 <w:sz w:val="17"/>
               </w:rPr>
               <w:t>Day 22</w:t>
-            </w:r>
-          </w:p>
-        </w:tc>
-        <w:tc>
-          <w:tcPr>
-            <w:tcW w:type="dxa" w:w="1440"/>
-            <w:tcMar>
-              <w:top w:w="80" w:type="dxa"/>
-              <w:bottom w:w="80" w:type="dxa"/>
-              <w:left w:w="120" w:type="dxa"/>
-              <w:right w:w="120" w:type="dxa"/>
-            </w:tcMar>
-            <w:shd w:fill="F8FAFC"/>
-          </w:tcPr>
-          <w:p>
-            <w:r>
-              <w:rPr>
-                <w:rFonts w:ascii="Arial" w:hAnsi="Arial"/>
-                <w:color w:val="334155"/>
-                <w:sz w:val="17"/>
-              </w:rPr>
+              <w:br/>
               <w:t>July 31, 2026</w:t>
             </w:r>
           </w:p>
         </w:tc>
         <w:tc>
           <w:tcPr>
-            <w:tcW w:type="dxa" w:w="1440"/>
+            <w:tcW w:type="dxa" w:w="1728"/>
             <w:tcMar>
               <w:top w:w="80" w:type="dxa"/>
               <w:bottom w:w="80" w:type="dxa"/>
-              <w:left w:w="120" w:type="dxa"/>
-              <w:right w:w="120" w:type="dxa"/>
+              <w:left w:w="100" w:type="dxa"/>
+              <w:right w:w="100" w:type="dxa"/>
             </w:tcMar>
             <w:shd w:fill="F8FAFC"/>
           </w:tcPr>
@@ -1287,12 +1103,12 @@
         </w:tc>
         <w:tc>
           <w:tcPr>
-            <w:tcW w:type="dxa" w:w="1440"/>
+            <w:tcW w:type="dxa" w:w="1728"/>
             <w:tcMar>
               <w:top w:w="80" w:type="dxa"/>
               <w:bottom w:w="80" w:type="dxa"/>
-              <w:left w:w="120" w:type="dxa"/>
-              <w:right w:w="120" w:type="dxa"/>
+              <w:left w:w="100" w:type="dxa"/>
+              <w:right w:w="100" w:type="dxa"/>
             </w:tcMar>
             <w:shd w:fill="F8FAFC"/>
           </w:tcPr>
@@ -1303,18 +1119,18 @@
                 <w:color w:val="334155"/>
                 <w:sz w:val="17"/>
               </w:rPr>
-              <w:t>Task 8: Add Indexing strategies to speed up join queries by 5x</w:t>
+              <w:t>App Modules 36–40: Indexing, Columnstore, Partitioning (15 Problems)</w:t>
             </w:r>
           </w:p>
         </w:tc>
         <w:tc>
           <w:tcPr>
-            <w:tcW w:type="dxa" w:w="1440"/>
+            <w:tcW w:type="dxa" w:w="1728"/>
             <w:tcMar>
               <w:top w:w="80" w:type="dxa"/>
               <w:bottom w:w="80" w:type="dxa"/>
-              <w:left w:w="120" w:type="dxa"/>
-              <w:right w:w="120" w:type="dxa"/>
+              <w:left w:w="100" w:type="dxa"/>
+              <w:right w:w="100" w:type="dxa"/>
             </w:tcMar>
             <w:shd w:fill="F8FAFC"/>
           </w:tcPr>
@@ -1331,12 +1147,12 @@
         </w:tc>
         <w:tc>
           <w:tcPr>
-            <w:tcW w:type="dxa" w:w="1440"/>
+            <w:tcW w:type="dxa" w:w="1728"/>
             <w:tcMar>
               <w:top w:w="80" w:type="dxa"/>
               <w:bottom w:w="80" w:type="dxa"/>
-              <w:left w:w="120" w:type="dxa"/>
-              <w:right w:w="120" w:type="dxa"/>
+              <w:left w:w="100" w:type="dxa"/>
+              <w:right w:w="100" w:type="dxa"/>
             </w:tcMar>
             <w:shd w:fill="F8FAFC"/>
           </w:tcPr>
@@ -1347,7 +1163,7 @@
                 <w:color w:val="334155"/>
                 <w:sz w:val="17"/>
               </w:rPr>
-              <w:t>🏗️ DWH Series &amp; Code</w:t>
+              <w:t>🏗️ DWH Series &amp; Solve</w:t>
             </w:r>
           </w:p>
         </w:tc>
@@ -1355,12 +1171,12 @@
       <w:tr>
         <w:tc>
           <w:tcPr>
-            <w:tcW w:type="dxa" w:w="1440"/>
+            <w:tcW w:type="dxa" w:w="1728"/>
             <w:tcMar>
               <w:top w:w="80" w:type="dxa"/>
               <w:bottom w:w="80" w:type="dxa"/>
-              <w:left w:w="120" w:type="dxa"/>
-              <w:right w:w="120" w:type="dxa"/>
+              <w:left w:w="100" w:type="dxa"/>
+              <w:right w:w="100" w:type="dxa"/>
             </w:tcMar>
             <w:shd w:fill="FFFFFF"/>
           </w:tcPr>
@@ -1372,39 +1188,19 @@
                 <w:sz w:val="17"/>
               </w:rPr>
               <w:t>Day 23</w:t>
-            </w:r>
-          </w:p>
-        </w:tc>
-        <w:tc>
-          <w:tcPr>
-            <w:tcW w:type="dxa" w:w="1440"/>
-            <w:tcMar>
-              <w:top w:w="80" w:type="dxa"/>
-              <w:bottom w:w="80" w:type="dxa"/>
-              <w:left w:w="120" w:type="dxa"/>
-              <w:right w:w="120" w:type="dxa"/>
-            </w:tcMar>
-            <w:shd w:fill="FFFFFF"/>
-          </w:tcPr>
-          <w:p>
-            <w:r>
-              <w:rPr>
-                <w:rFonts w:ascii="Arial" w:hAnsi="Arial"/>
-                <w:color w:val="334155"/>
-                <w:sz w:val="17"/>
-              </w:rPr>
+              <w:br/>
               <w:t>Aug 01, 2026</w:t>
             </w:r>
           </w:p>
         </w:tc>
         <w:tc>
           <w:tcPr>
-            <w:tcW w:type="dxa" w:w="1440"/>
+            <w:tcW w:type="dxa" w:w="1728"/>
             <w:tcMar>
               <w:top w:w="80" w:type="dxa"/>
               <w:bottom w:w="80" w:type="dxa"/>
-              <w:left w:w="120" w:type="dxa"/>
-              <w:right w:w="120" w:type="dxa"/>
+              <w:left w:w="100" w:type="dxa"/>
+              <w:right w:w="100" w:type="dxa"/>
             </w:tcMar>
             <w:shd w:fill="FFFFFF"/>
           </w:tcPr>
@@ -1423,12 +1219,12 @@
         </w:tc>
         <w:tc>
           <w:tcPr>
-            <w:tcW w:type="dxa" w:w="1440"/>
+            <w:tcW w:type="dxa" w:w="1728"/>
             <w:tcMar>
               <w:top w:w="80" w:type="dxa"/>
               <w:bottom w:w="80" w:type="dxa"/>
-              <w:left w:w="120" w:type="dxa"/>
-              <w:right w:w="120" w:type="dxa"/>
+              <w:left w:w="100" w:type="dxa"/>
+              <w:right w:w="100" w:type="dxa"/>
             </w:tcMar>
             <w:shd w:fill="FFFFFF"/>
           </w:tcPr>
@@ -1439,18 +1235,18 @@
                 <w:color w:val="334155"/>
                 <w:sz w:val="17"/>
               </w:rPr>
-              <w:t>Task 9: Write SQL documentation &amp; query explanations</w:t>
+              <w:t>App Modules 41–43: DDL/DML, Stored Procedures, Triggers (10 Problems)</w:t>
             </w:r>
           </w:p>
         </w:tc>
         <w:tc>
           <w:tcPr>
-            <w:tcW w:type="dxa" w:w="1440"/>
+            <w:tcW w:type="dxa" w:w="1728"/>
             <w:tcMar>
               <w:top w:w="80" w:type="dxa"/>
               <w:bottom w:w="80" w:type="dxa"/>
-              <w:left w:w="120" w:type="dxa"/>
-              <w:right w:w="120" w:type="dxa"/>
+              <w:left w:w="100" w:type="dxa"/>
+              <w:right w:w="100" w:type="dxa"/>
             </w:tcMar>
             <w:shd w:fill="FFFFFF"/>
           </w:tcPr>
@@ -1467,12 +1263,12 @@
         </w:tc>
         <w:tc>
           <w:tcPr>
-            <w:tcW w:type="dxa" w:w="1440"/>
+            <w:tcW w:type="dxa" w:w="1728"/>
             <w:tcMar>
               <w:top w:w="80" w:type="dxa"/>
               <w:bottom w:w="80" w:type="dxa"/>
-              <w:left w:w="120" w:type="dxa"/>
-              <w:right w:w="120" w:type="dxa"/>
+              <w:left w:w="100" w:type="dxa"/>
+              <w:right w:w="100" w:type="dxa"/>
             </w:tcMar>
             <w:shd w:fill="FFFFFF"/>
           </w:tcPr>
@@ -1491,12 +1287,12 @@
       <w:tr>
         <w:tc>
           <w:tcPr>
-            <w:tcW w:type="dxa" w:w="1440"/>
+            <w:tcW w:type="dxa" w:w="1728"/>
             <w:tcMar>
               <w:top w:w="80" w:type="dxa"/>
               <w:bottom w:w="80" w:type="dxa"/>
-              <w:left w:w="120" w:type="dxa"/>
-              <w:right w:w="120" w:type="dxa"/>
+              <w:left w:w="100" w:type="dxa"/>
+              <w:right w:w="100" w:type="dxa"/>
             </w:tcMar>
             <w:shd w:fill="F8FAFC"/>
           </w:tcPr>
@@ -1508,39 +1304,19 @@
                 <w:sz w:val="17"/>
               </w:rPr>
               <w:t>Day 24</w:t>
-            </w:r>
-          </w:p>
-        </w:tc>
-        <w:tc>
-          <w:tcPr>
-            <w:tcW w:type="dxa" w:w="1440"/>
-            <w:tcMar>
-              <w:top w:w="80" w:type="dxa"/>
-              <w:bottom w:w="80" w:type="dxa"/>
-              <w:left w:w="120" w:type="dxa"/>
-              <w:right w:w="120" w:type="dxa"/>
-            </w:tcMar>
-            <w:shd w:fill="F8FAFC"/>
-          </w:tcPr>
-          <w:p>
-            <w:r>
-              <w:rPr>
-                <w:rFonts w:ascii="Arial" w:hAnsi="Arial"/>
-                <w:color w:val="334155"/>
-                <w:sz w:val="17"/>
-              </w:rPr>
+              <w:br/>
               <w:t>Aug 02, 2026</w:t>
             </w:r>
           </w:p>
         </w:tc>
         <w:tc>
           <w:tcPr>
-            <w:tcW w:type="dxa" w:w="1440"/>
+            <w:tcW w:type="dxa" w:w="1728"/>
             <w:tcMar>
               <w:top w:w="80" w:type="dxa"/>
               <w:bottom w:w="80" w:type="dxa"/>
-              <w:left w:w="120" w:type="dxa"/>
-              <w:right w:w="120" w:type="dxa"/>
+              <w:left w:w="100" w:type="dxa"/>
+              <w:right w:w="100" w:type="dxa"/>
             </w:tcMar>
             <w:shd w:fill="F8FAFC"/>
           </w:tcPr>
@@ -1559,12 +1335,12 @@
         </w:tc>
         <w:tc>
           <w:tcPr>
-            <w:tcW w:type="dxa" w:w="1440"/>
+            <w:tcW w:type="dxa" w:w="1728"/>
             <w:tcMar>
               <w:top w:w="80" w:type="dxa"/>
               <w:bottom w:w="80" w:type="dxa"/>
-              <w:left w:w="120" w:type="dxa"/>
-              <w:right w:w="120" w:type="dxa"/>
+              <w:left w:w="100" w:type="dxa"/>
+              <w:right w:w="100" w:type="dxa"/>
             </w:tcMar>
             <w:shd w:fill="F8FAFC"/>
           </w:tcPr>
@@ -1575,18 +1351,18 @@
                 <w:color w:val="334155"/>
                 <w:sz w:val="17"/>
               </w:rPr>
-              <w:t>Task 10: Finalize Project 1 (Exploratory Data Analysis EDA Repo)</w:t>
+              <w:t>App Debug Puzzles 1–30: SQL Anti-patterns &amp; Bug Fixes (30 Puzzles)</w:t>
             </w:r>
           </w:p>
         </w:tc>
         <w:tc>
           <w:tcPr>
-            <w:tcW w:type="dxa" w:w="1440"/>
+            <w:tcW w:type="dxa" w:w="1728"/>
             <w:tcMar>
               <w:top w:w="80" w:type="dxa"/>
               <w:bottom w:w="80" w:type="dxa"/>
-              <w:left w:w="120" w:type="dxa"/>
-              <w:right w:w="120" w:type="dxa"/>
+              <w:left w:w="100" w:type="dxa"/>
+              <w:right w:w="100" w:type="dxa"/>
             </w:tcMar>
             <w:shd w:fill="F8FAFC"/>
           </w:tcPr>
@@ -1603,12 +1379,12 @@
         </w:tc>
         <w:tc>
           <w:tcPr>
-            <w:tcW w:type="dxa" w:w="1440"/>
+            <w:tcW w:type="dxa" w:w="1728"/>
             <w:tcMar>
               <w:top w:w="80" w:type="dxa"/>
               <w:bottom w:w="80" w:type="dxa"/>
-              <w:left w:w="120" w:type="dxa"/>
-              <w:right w:w="120" w:type="dxa"/>
+              <w:left w:w="100" w:type="dxa"/>
+              <w:right w:w="100" w:type="dxa"/>
             </w:tcMar>
             <w:shd w:fill="F8FAFC"/>
           </w:tcPr>
@@ -1627,12 +1403,12 @@
       <w:tr>
         <w:tc>
           <w:tcPr>
-            <w:tcW w:type="dxa" w:w="1440"/>
+            <w:tcW w:type="dxa" w:w="1728"/>
             <w:tcMar>
               <w:top w:w="80" w:type="dxa"/>
               <w:bottom w:w="80" w:type="dxa"/>
-              <w:left w:w="120" w:type="dxa"/>
-              <w:right w:w="120" w:type="dxa"/>
+              <w:left w:w="100" w:type="dxa"/>
+              <w:right w:w="100" w:type="dxa"/>
             </w:tcMar>
             <w:shd w:fill="FFFFFF"/>
           </w:tcPr>
@@ -1644,39 +1420,19 @@
                 <w:sz w:val="17"/>
               </w:rPr>
               <w:t>Day 25</w:t>
-            </w:r>
-          </w:p>
-        </w:tc>
-        <w:tc>
-          <w:tcPr>
-            <w:tcW w:type="dxa" w:w="1440"/>
-            <w:tcMar>
-              <w:top w:w="80" w:type="dxa"/>
-              <w:bottom w:w="80" w:type="dxa"/>
-              <w:left w:w="120" w:type="dxa"/>
-              <w:right w:w="120" w:type="dxa"/>
-            </w:tcMar>
-            <w:shd w:fill="FFFFFF"/>
-          </w:tcPr>
-          <w:p>
-            <w:r>
-              <w:rPr>
-                <w:rFonts w:ascii="Arial" w:hAnsi="Arial"/>
-                <w:color w:val="334155"/>
-                <w:sz w:val="17"/>
-              </w:rPr>
+              <w:br/>
               <w:t>Aug 03, 2026</w:t>
             </w:r>
           </w:p>
         </w:tc>
         <w:tc>
           <w:tcPr>
-            <w:tcW w:type="dxa" w:w="1440"/>
+            <w:tcW w:type="dxa" w:w="1728"/>
             <w:tcMar>
               <w:top w:w="80" w:type="dxa"/>
               <w:bottom w:w="80" w:type="dxa"/>
-              <w:left w:w="120" w:type="dxa"/>
-              <w:right w:w="120" w:type="dxa"/>
+              <w:left w:w="100" w:type="dxa"/>
+              <w:right w:w="100" w:type="dxa"/>
             </w:tcMar>
             <w:shd w:fill="FFFFFF"/>
           </w:tcPr>
@@ -1695,12 +1451,12 @@
         </w:tc>
         <w:tc>
           <w:tcPr>
-            <w:tcW w:type="dxa" w:w="1440"/>
+            <w:tcW w:type="dxa" w:w="1728"/>
             <w:tcMar>
               <w:top w:w="80" w:type="dxa"/>
               <w:bottom w:w="80" w:type="dxa"/>
-              <w:left w:w="120" w:type="dxa"/>
-              <w:right w:w="120" w:type="dxa"/>
+              <w:left w:w="100" w:type="dxa"/>
+              <w:right w:w="100" w:type="dxa"/>
             </w:tcMar>
             <w:shd w:fill="FFFFFF"/>
           </w:tcPr>
@@ -1711,18 +1467,18 @@
                 <w:color w:val="334155"/>
                 <w:sz w:val="17"/>
               </w:rPr>
-              <w:t>Task 11: Finalize Project 2 (Data Analyst Portfolio Repo)</w:t>
+              <w:t>App Debug Puzzles 31–60: Complex Schema Bug Fixes (30 Puzzles)</w:t>
             </w:r>
           </w:p>
         </w:tc>
         <w:tc>
           <w:tcPr>
-            <w:tcW w:type="dxa" w:w="1440"/>
+            <w:tcW w:type="dxa" w:w="1728"/>
             <w:tcMar>
               <w:top w:w="80" w:type="dxa"/>
               <w:bottom w:w="80" w:type="dxa"/>
-              <w:left w:w="120" w:type="dxa"/>
-              <w:right w:w="120" w:type="dxa"/>
+              <w:left w:w="100" w:type="dxa"/>
+              <w:right w:w="100" w:type="dxa"/>
             </w:tcMar>
             <w:shd w:fill="FFFFFF"/>
           </w:tcPr>
@@ -1739,12 +1495,12 @@
         </w:tc>
         <w:tc>
           <w:tcPr>
-            <w:tcW w:type="dxa" w:w="1440"/>
+            <w:tcW w:type="dxa" w:w="1728"/>
             <w:tcMar>
               <w:top w:w="80" w:type="dxa"/>
               <w:bottom w:w="80" w:type="dxa"/>
-              <w:left w:w="120" w:type="dxa"/>
-              <w:right w:w="120" w:type="dxa"/>
+              <w:left w:w="100" w:type="dxa"/>
+              <w:right w:w="100" w:type="dxa"/>
             </w:tcMar>
             <w:shd w:fill="FFFFFF"/>
           </w:tcPr>
@@ -1763,12 +1519,12 @@
       <w:tr>
         <w:tc>
           <w:tcPr>
-            <w:tcW w:type="dxa" w:w="1440"/>
+            <w:tcW w:type="dxa" w:w="1728"/>
             <w:tcMar>
               <w:top w:w="80" w:type="dxa"/>
               <w:bottom w:w="80" w:type="dxa"/>
-              <w:left w:w="120" w:type="dxa"/>
-              <w:right w:w="120" w:type="dxa"/>
+              <w:left w:w="100" w:type="dxa"/>
+              <w:right w:w="100" w:type="dxa"/>
             </w:tcMar>
             <w:shd w:fill="F8FAFC"/>
           </w:tcPr>
@@ -1780,39 +1536,19 @@
                 <w:sz w:val="17"/>
               </w:rPr>
               <w:t>Day 26</w:t>
-            </w:r>
-          </w:p>
-        </w:tc>
-        <w:tc>
-          <w:tcPr>
-            <w:tcW w:type="dxa" w:w="1440"/>
-            <w:tcMar>
-              <w:top w:w="80" w:type="dxa"/>
-              <w:bottom w:w="80" w:type="dxa"/>
-              <w:left w:w="120" w:type="dxa"/>
-              <w:right w:w="120" w:type="dxa"/>
-            </w:tcMar>
-            <w:shd w:fill="F8FAFC"/>
-          </w:tcPr>
-          <w:p>
-            <w:r>
-              <w:rPr>
-                <w:rFonts w:ascii="Arial" w:hAnsi="Arial"/>
-                <w:color w:val="334155"/>
-                <w:sz w:val="17"/>
-              </w:rPr>
+              <w:br/>
               <w:t>Aug 04, 2026</w:t>
             </w:r>
           </w:p>
         </w:tc>
         <w:tc>
           <w:tcPr>
-            <w:tcW w:type="dxa" w:w="1440"/>
+            <w:tcW w:type="dxa" w:w="1728"/>
             <w:tcMar>
               <w:top w:w="80" w:type="dxa"/>
               <w:bottom w:w="80" w:type="dxa"/>
-              <w:left w:w="120" w:type="dxa"/>
-              <w:right w:w="120" w:type="dxa"/>
+              <w:left w:w="100" w:type="dxa"/>
+              <w:right w:w="100" w:type="dxa"/>
             </w:tcMar>
             <w:shd w:fill="F8FAFC"/>
           </w:tcPr>
@@ -1829,12 +1565,12 @@
         </w:tc>
         <w:tc>
           <w:tcPr>
-            <w:tcW w:type="dxa" w:w="1440"/>
+            <w:tcW w:type="dxa" w:w="1728"/>
             <w:tcMar>
               <w:top w:w="80" w:type="dxa"/>
               <w:bottom w:w="80" w:type="dxa"/>
-              <w:left w:w="120" w:type="dxa"/>
-              <w:right w:w="120" w:type="dxa"/>
+              <w:left w:w="100" w:type="dxa"/>
+              <w:right w:w="100" w:type="dxa"/>
             </w:tcMar>
             <w:shd w:fill="F8FAFC"/>
           </w:tcPr>
@@ -1845,18 +1581,18 @@
                 <w:color w:val="334155"/>
                 <w:sz w:val="17"/>
               </w:rPr>
-              <w:t>Task 12: Push complete portfolio repos to GitHub for recruiters</w:t>
+              <w:t>App Mock Interview 1 &amp; 2: Blinkit &amp; Zomato Mock Exams</w:t>
             </w:r>
           </w:p>
         </w:tc>
         <w:tc>
           <w:tcPr>
-            <w:tcW w:type="dxa" w:w="1440"/>
+            <w:tcW w:type="dxa" w:w="1728"/>
             <w:tcMar>
               <w:top w:w="80" w:type="dxa"/>
               <w:bottom w:w="80" w:type="dxa"/>
-              <w:left w:w="120" w:type="dxa"/>
-              <w:right w:w="120" w:type="dxa"/>
+              <w:left w:w="100" w:type="dxa"/>
+              <w:right w:w="100" w:type="dxa"/>
             </w:tcMar>
             <w:shd w:fill="F8FAFC"/>
           </w:tcPr>
@@ -1873,12 +1609,12 @@
         </w:tc>
         <w:tc>
           <w:tcPr>
-            <w:tcW w:type="dxa" w:w="1440"/>
+            <w:tcW w:type="dxa" w:w="1728"/>
             <w:tcMar>
               <w:top w:w="80" w:type="dxa"/>
               <w:bottom w:w="80" w:type="dxa"/>
-              <w:left w:w="120" w:type="dxa"/>
-              <w:right w:w="120" w:type="dxa"/>
+              <w:left w:w="100" w:type="dxa"/>
+              <w:right w:w="100" w:type="dxa"/>
             </w:tcMar>
             <w:shd w:fill="F8FAFC"/>
           </w:tcPr>
@@ -1897,12 +1633,12 @@
       <w:tr>
         <w:tc>
           <w:tcPr>
-            <w:tcW w:type="dxa" w:w="1440"/>
+            <w:tcW w:type="dxa" w:w="1728"/>
             <w:tcMar>
               <w:top w:w="80" w:type="dxa"/>
               <w:bottom w:w="80" w:type="dxa"/>
-              <w:left w:w="120" w:type="dxa"/>
-              <w:right w:w="120" w:type="dxa"/>
+              <w:left w:w="100" w:type="dxa"/>
+              <w:right w:w="100" w:type="dxa"/>
             </w:tcMar>
             <w:shd w:fill="FFFFFF"/>
           </w:tcPr>
@@ -1914,39 +1650,19 @@
                 <w:sz w:val="17"/>
               </w:rPr>
               <w:t>Day 27</w:t>
-            </w:r>
-          </w:p>
-        </w:tc>
-        <w:tc>
-          <w:tcPr>
-            <w:tcW w:type="dxa" w:w="1440"/>
-            <w:tcMar>
-              <w:top w:w="80" w:type="dxa"/>
-              <w:bottom w:w="80" w:type="dxa"/>
-              <w:left w:w="120" w:type="dxa"/>
-              <w:right w:w="120" w:type="dxa"/>
-            </w:tcMar>
-            <w:shd w:fill="FFFFFF"/>
-          </w:tcPr>
-          <w:p>
-            <w:r>
-              <w:rPr>
-                <w:rFonts w:ascii="Arial" w:hAnsi="Arial"/>
-                <w:color w:val="334155"/>
-                <w:sz w:val="17"/>
-              </w:rPr>
+              <w:br/>
               <w:t>Aug 05, 2026</w:t>
             </w:r>
           </w:p>
         </w:tc>
         <w:tc>
           <w:tcPr>
-            <w:tcW w:type="dxa" w:w="1440"/>
+            <w:tcW w:type="dxa" w:w="1728"/>
             <w:tcMar>
               <w:top w:w="80" w:type="dxa"/>
               <w:bottom w:w="80" w:type="dxa"/>
-              <w:left w:w="120" w:type="dxa"/>
-              <w:right w:w="120" w:type="dxa"/>
+              <w:left w:w="100" w:type="dxa"/>
+              <w:right w:w="100" w:type="dxa"/>
             </w:tcMar>
             <w:shd w:fill="FFFFFF"/>
           </w:tcPr>
@@ -1963,12 +1679,12 @@
         </w:tc>
         <w:tc>
           <w:tcPr>
-            <w:tcW w:type="dxa" w:w="1440"/>
+            <w:tcW w:type="dxa" w:w="1728"/>
             <w:tcMar>
               <w:top w:w="80" w:type="dxa"/>
               <w:bottom w:w="80" w:type="dxa"/>
-              <w:left w:w="120" w:type="dxa"/>
-              <w:right w:w="120" w:type="dxa"/>
+              <w:left w:w="100" w:type="dxa"/>
+              <w:right w:w="100" w:type="dxa"/>
             </w:tcMar>
             <w:shd w:fill="FFFFFF"/>
           </w:tcPr>
@@ -1979,18 +1695,18 @@
                 <w:color w:val="334155"/>
                 <w:sz w:val="17"/>
               </w:rPr>
-              <w:t>Practice Top Tech Company SQL Questions (Amazon, Tesla, Meta)</w:t>
+              <w:t>App Mock Interview 3 &amp; 4: Paytm &amp; Swiggy Mock Exams</w:t>
             </w:r>
           </w:p>
         </w:tc>
         <w:tc>
           <w:tcPr>
-            <w:tcW w:type="dxa" w:w="1440"/>
+            <w:tcW w:type="dxa" w:w="1728"/>
             <w:tcMar>
               <w:top w:w="80" w:type="dxa"/>
               <w:bottom w:w="80" w:type="dxa"/>
-              <w:left w:w="120" w:type="dxa"/>
-              <w:right w:w="120" w:type="dxa"/>
+              <w:left w:w="100" w:type="dxa"/>
+              <w:right w:w="100" w:type="dxa"/>
             </w:tcMar>
             <w:shd w:fill="FFFFFF"/>
           </w:tcPr>
@@ -2007,12 +1723,12 @@
         </w:tc>
         <w:tc>
           <w:tcPr>
-            <w:tcW w:type="dxa" w:w="1440"/>
+            <w:tcW w:type="dxa" w:w="1728"/>
             <w:tcMar>
               <w:top w:w="80" w:type="dxa"/>
               <w:bottom w:w="80" w:type="dxa"/>
-              <w:left w:w="120" w:type="dxa"/>
-              <w:right w:w="120" w:type="dxa"/>
+              <w:left w:w="100" w:type="dxa"/>
+              <w:right w:w="100" w:type="dxa"/>
             </w:tcMar>
             <w:shd w:fill="FFFFFF"/>
           </w:tcPr>
@@ -2031,12 +1747,12 @@
       <w:tr>
         <w:tc>
           <w:tcPr>
-            <w:tcW w:type="dxa" w:w="1440"/>
+            <w:tcW w:type="dxa" w:w="1728"/>
             <w:tcMar>
               <w:top w:w="80" w:type="dxa"/>
               <w:bottom w:w="80" w:type="dxa"/>
-              <w:left w:w="120" w:type="dxa"/>
-              <w:right w:w="120" w:type="dxa"/>
+              <w:left w:w="100" w:type="dxa"/>
+              <w:right w:w="100" w:type="dxa"/>
             </w:tcMar>
             <w:shd w:fill="F8FAFC"/>
           </w:tcPr>
@@ -2048,39 +1764,19 @@
                 <w:sz w:val="17"/>
               </w:rPr>
               <w:t>Day 28</w:t>
-            </w:r>
-          </w:p>
-        </w:tc>
-        <w:tc>
-          <w:tcPr>
-            <w:tcW w:type="dxa" w:w="1440"/>
-            <w:tcMar>
-              <w:top w:w="80" w:type="dxa"/>
-              <w:bottom w:w="80" w:type="dxa"/>
-              <w:left w:w="120" w:type="dxa"/>
-              <w:right w:w="120" w:type="dxa"/>
-            </w:tcMar>
-            <w:shd w:fill="F8FAFC"/>
-          </w:tcPr>
-          <w:p>
-            <w:r>
-              <w:rPr>
-                <w:rFonts w:ascii="Arial" w:hAnsi="Arial"/>
-                <w:color w:val="334155"/>
-                <w:sz w:val="17"/>
-              </w:rPr>
+              <w:br/>
               <w:t>Aug 06, 2026</w:t>
             </w:r>
           </w:p>
         </w:tc>
         <w:tc>
           <w:tcPr>
-            <w:tcW w:type="dxa" w:w="1440"/>
+            <w:tcW w:type="dxa" w:w="1728"/>
             <w:tcMar>
               <w:top w:w="80" w:type="dxa"/>
               <w:bottom w:w="80" w:type="dxa"/>
-              <w:left w:w="120" w:type="dxa"/>
-              <w:right w:w="120" w:type="dxa"/>
+              <w:left w:w="100" w:type="dxa"/>
+              <w:right w:w="100" w:type="dxa"/>
             </w:tcMar>
             <w:shd w:fill="F8FAFC"/>
           </w:tcPr>
@@ -2097,12 +1793,12 @@
         </w:tc>
         <w:tc>
           <w:tcPr>
-            <w:tcW w:type="dxa" w:w="1440"/>
+            <w:tcW w:type="dxa" w:w="1728"/>
             <w:tcMar>
               <w:top w:w="80" w:type="dxa"/>
               <w:bottom w:w="80" w:type="dxa"/>
-              <w:left w:w="120" w:type="dxa"/>
-              <w:right w:w="120" w:type="dxa"/>
+              <w:left w:w="100" w:type="dxa"/>
+              <w:right w:w="100" w:type="dxa"/>
             </w:tcMar>
             <w:shd w:fill="F8FAFC"/>
           </w:tcPr>
@@ -2113,18 +1809,18 @@
                 <w:color w:val="334155"/>
                 <w:sz w:val="17"/>
               </w:rPr>
-              <w:t>Practice Retention &amp; Window Function Questions on DataLemur</w:t>
+              <w:t>App Mock Interview 5 &amp; 6: CRED Risk &amp; Myntra Mock Exams</w:t>
             </w:r>
           </w:p>
         </w:tc>
         <w:tc>
           <w:tcPr>
-            <w:tcW w:type="dxa" w:w="1440"/>
+            <w:tcW w:type="dxa" w:w="1728"/>
             <w:tcMar>
               <w:top w:w="80" w:type="dxa"/>
               <w:bottom w:w="80" w:type="dxa"/>
-              <w:left w:w="120" w:type="dxa"/>
-              <w:right w:w="120" w:type="dxa"/>
+              <w:left w:w="100" w:type="dxa"/>
+              <w:right w:w="100" w:type="dxa"/>
             </w:tcMar>
             <w:shd w:fill="F8FAFC"/>
           </w:tcPr>
@@ -2141,12 +1837,12 @@
         </w:tc>
         <w:tc>
           <w:tcPr>
-            <w:tcW w:type="dxa" w:w="1440"/>
+            <w:tcW w:type="dxa" w:w="1728"/>
             <w:tcMar>
               <w:top w:w="80" w:type="dxa"/>
               <w:bottom w:w="80" w:type="dxa"/>
-              <w:left w:w="120" w:type="dxa"/>
-              <w:right w:w="120" w:type="dxa"/>
+              <w:left w:w="100" w:type="dxa"/>
+              <w:right w:w="100" w:type="dxa"/>
             </w:tcMar>
             <w:shd w:fill="F8FAFC"/>
           </w:tcPr>
@@ -2165,12 +1861,12 @@
       <w:tr>
         <w:tc>
           <w:tcPr>
-            <w:tcW w:type="dxa" w:w="1440"/>
+            <w:tcW w:type="dxa" w:w="1728"/>
             <w:tcMar>
               <w:top w:w="80" w:type="dxa"/>
               <w:bottom w:w="80" w:type="dxa"/>
-              <w:left w:w="120" w:type="dxa"/>
-              <w:right w:w="120" w:type="dxa"/>
+              <w:left w:w="100" w:type="dxa"/>
+              <w:right w:w="100" w:type="dxa"/>
             </w:tcMar>
             <w:shd w:fill="FFFFFF"/>
           </w:tcPr>
@@ -2182,39 +1878,19 @@
                 <w:sz w:val="17"/>
               </w:rPr>
               <w:t>Day 29</w:t>
-            </w:r>
-          </w:p>
-        </w:tc>
-        <w:tc>
-          <w:tcPr>
-            <w:tcW w:type="dxa" w:w="1440"/>
-            <w:tcMar>
-              <w:top w:w="80" w:type="dxa"/>
-              <w:bottom w:w="80" w:type="dxa"/>
-              <w:left w:w="120" w:type="dxa"/>
-              <w:right w:w="120" w:type="dxa"/>
-            </w:tcMar>
-            <w:shd w:fill="FFFFFF"/>
-          </w:tcPr>
-          <w:p>
-            <w:r>
-              <w:rPr>
-                <w:rFonts w:ascii="Arial" w:hAnsi="Arial"/>
-                <w:color w:val="334155"/>
-                <w:sz w:val="17"/>
-              </w:rPr>
+              <w:br/>
               <w:t>Aug 07, 2026</w:t>
             </w:r>
           </w:p>
         </w:tc>
         <w:tc>
           <w:tcPr>
-            <w:tcW w:type="dxa" w:w="1440"/>
+            <w:tcW w:type="dxa" w:w="1728"/>
             <w:tcMar>
               <w:top w:w="80" w:type="dxa"/>
               <w:bottom w:w="80" w:type="dxa"/>
-              <w:left w:w="120" w:type="dxa"/>
-              <w:right w:w="120" w:type="dxa"/>
+              <w:left w:w="100" w:type="dxa"/>
+              <w:right w:w="100" w:type="dxa"/>
             </w:tcMar>
             <w:shd w:fill="FFFFFF"/>
           </w:tcPr>
@@ -2231,12 +1907,12 @@
         </w:tc>
         <w:tc>
           <w:tcPr>
-            <w:tcW w:type="dxa" w:w="1440"/>
+            <w:tcW w:type="dxa" w:w="1728"/>
             <w:tcMar>
               <w:top w:w="80" w:type="dxa"/>
               <w:bottom w:w="80" w:type="dxa"/>
-              <w:left w:w="120" w:type="dxa"/>
-              <w:right w:w="120" w:type="dxa"/>
+              <w:left w:w="100" w:type="dxa"/>
+              <w:right w:w="100" w:type="dxa"/>
             </w:tcMar>
             <w:shd w:fill="FFFFFF"/>
           </w:tcPr>
@@ -2247,18 +1923,18 @@
                 <w:color w:val="334155"/>
                 <w:sz w:val="17"/>
               </w:rPr>
-              <w:t>Practice Business Analytics Case Studies on StrataScratch</w:t>
+              <w:t>App Mock Interview 7: Flipkart Data Engineer Capstone Exam</w:t>
             </w:r>
           </w:p>
         </w:tc>
         <w:tc>
           <w:tcPr>
-            <w:tcW w:type="dxa" w:w="1440"/>
+            <w:tcW w:type="dxa" w:w="1728"/>
             <w:tcMar>
               <w:top w:w="80" w:type="dxa"/>
               <w:bottom w:w="80" w:type="dxa"/>
-              <w:left w:w="120" w:type="dxa"/>
-              <w:right w:w="120" w:type="dxa"/>
+              <w:left w:w="100" w:type="dxa"/>
+              <w:right w:w="100" w:type="dxa"/>
             </w:tcMar>
             <w:shd w:fill="FFFFFF"/>
           </w:tcPr>
@@ -2275,12 +1951,12 @@
         </w:tc>
         <w:tc>
           <w:tcPr>
-            <w:tcW w:type="dxa" w:w="1440"/>
+            <w:tcW w:type="dxa" w:w="1728"/>
             <w:tcMar>
               <w:top w:w="80" w:type="dxa"/>
               <w:bottom w:w="80" w:type="dxa"/>
-              <w:left w:w="120" w:type="dxa"/>
-              <w:right w:w="120" w:type="dxa"/>
+              <w:left w:w="100" w:type="dxa"/>
+              <w:right w:w="100" w:type="dxa"/>
             </w:tcMar>
             <w:shd w:fill="FFFFFF"/>
           </w:tcPr>
@@ -2299,12 +1975,12 @@
       <w:tr>
         <w:tc>
           <w:tcPr>
-            <w:tcW w:type="dxa" w:w="1440"/>
+            <w:tcW w:type="dxa" w:w="1728"/>
             <w:tcMar>
               <w:top w:w="80" w:type="dxa"/>
               <w:bottom w:w="80" w:type="dxa"/>
-              <w:left w:w="120" w:type="dxa"/>
-              <w:right w:w="120" w:type="dxa"/>
+              <w:left w:w="100" w:type="dxa"/>
+              <w:right w:w="100" w:type="dxa"/>
             </w:tcMar>
             <w:shd w:fill="F8FAFC"/>
           </w:tcPr>
@@ -2316,17 +1992,19 @@
                 <w:sz w:val="17"/>
               </w:rPr>
               <w:t>Day 30</w:t>
+              <w:br/>
+              <w:t>Aug 08, 2026</w:t>
             </w:r>
           </w:p>
         </w:tc>
         <w:tc>
           <w:tcPr>
-            <w:tcW w:type="dxa" w:w="1440"/>
+            <w:tcW w:type="dxa" w:w="1728"/>
             <w:tcMar>
               <w:top w:w="80" w:type="dxa"/>
               <w:bottom w:w="80" w:type="dxa"/>
-              <w:left w:w="120" w:type="dxa"/>
-              <w:right w:w="120" w:type="dxa"/>
+              <w:left w:w="100" w:type="dxa"/>
+              <w:right w:w="100" w:type="dxa"/>
             </w:tcMar>
             <w:shd w:fill="F8FAFC"/>
           </w:tcPr>
@@ -2337,18 +2015,18 @@
                 <w:color w:val="334155"/>
                 <w:sz w:val="17"/>
               </w:rPr>
-              <w:t>Aug 08, 2026</w:t>
+              <w:t>Final Portfolio GitHub Push</w:t>
             </w:r>
           </w:p>
         </w:tc>
         <w:tc>
           <w:tcPr>
-            <w:tcW w:type="dxa" w:w="1440"/>
+            <w:tcW w:type="dxa" w:w="1728"/>
             <w:tcMar>
               <w:top w:w="80" w:type="dxa"/>
               <w:bottom w:w="80" w:type="dxa"/>
-              <w:left w:w="120" w:type="dxa"/>
-              <w:right w:w="120" w:type="dxa"/>
+              <w:left w:w="100" w:type="dxa"/>
+              <w:right w:w="100" w:type="dxa"/>
             </w:tcMar>
             <w:shd w:fill="F8FAFC"/>
           </w:tcPr>
@@ -2359,18 +2037,18 @@
                 <w:color w:val="334155"/>
                 <w:sz w:val="17"/>
               </w:rPr>
-              <w:t>Final Mock Interview Capstone</w:t>
+              <w:t>All 43 Modules, 202 Problems &amp; 7 Mock Exams 100% Completed</w:t>
             </w:r>
           </w:p>
         </w:tc>
         <w:tc>
           <w:tcPr>
-            <w:tcW w:type="dxa" w:w="1440"/>
+            <w:tcW w:type="dxa" w:w="1728"/>
             <w:tcMar>
               <w:top w:w="80" w:type="dxa"/>
               <w:bottom w:w="80" w:type="dxa"/>
-              <w:left w:w="120" w:type="dxa"/>
-              <w:right w:w="120" w:type="dxa"/>
+              <w:left w:w="100" w:type="dxa"/>
+              <w:right w:w="100" w:type="dxa"/>
             </w:tcMar>
             <w:shd w:fill="F8FAFC"/>
           </w:tcPr>
@@ -2381,40 +2059,18 @@
                 <w:color w:val="334155"/>
                 <w:sz w:val="17"/>
               </w:rPr>
-              <w:t>Complete Flipkart Data Engineer &amp; CRED Risk Analyst Capstone Exams</w:t>
+              <w:t>Complete GitHub Portfolio Repositories</w:t>
             </w:r>
           </w:p>
         </w:tc>
         <w:tc>
           <w:tcPr>
-            <w:tcW w:type="dxa" w:w="1440"/>
+            <w:tcW w:type="dxa" w:w="1728"/>
             <w:tcMar>
               <w:top w:w="80" w:type="dxa"/>
               <w:bottom w:w="80" w:type="dxa"/>
-              <w:left w:w="120" w:type="dxa"/>
-              <w:right w:w="120" w:type="dxa"/>
-            </w:tcMar>
-            <w:shd w:fill="F8FAFC"/>
-          </w:tcPr>
-          <w:p>
-            <w:r>
-              <w:rPr>
-                <w:rFonts w:ascii="Arial" w:hAnsi="Arial"/>
-                <w:color w:val="334155"/>
-                <w:sz w:val="17"/>
-              </w:rPr>
-              <w:t>Mock Exams 60 Mins</w:t>
-            </w:r>
-          </w:p>
-        </w:tc>
-        <w:tc>
-          <w:tcPr>
-            <w:tcW w:type="dxa" w:w="1440"/>
-            <w:tcMar>
-              <w:top w:w="80" w:type="dxa"/>
-              <w:bottom w:w="80" w:type="dxa"/>
-              <w:left w:w="120" w:type="dxa"/>
-              <w:right w:w="120" w:type="dxa"/>
+              <w:left w:w="100" w:type="dxa"/>
+              <w:right w:w="100" w:type="dxa"/>
             </w:tcMar>
             <w:shd w:fill="F8FAFC"/>
           </w:tcPr>
@@ -2533,8 +2189,8 @@
             <w:tcMar>
               <w:top w:w="100" w:type="dxa"/>
               <w:bottom w:w="100" w:type="dxa"/>
-              <w:left w:w="120" w:type="dxa"/>
-              <w:right w:w="120" w:type="dxa"/>
+              <w:left w:w="100" w:type="dxa"/>
+              <w:right w:w="100" w:type="dxa"/>
             </w:tcMar>
             <w:shd w:fill="0F172A"/>
           </w:tcPr>
@@ -2556,8 +2212,8 @@
             <w:tcMar>
               <w:top w:w="100" w:type="dxa"/>
               <w:bottom w:w="100" w:type="dxa"/>
-              <w:left w:w="120" w:type="dxa"/>
-              <w:right w:w="120" w:type="dxa"/>
+              <w:left w:w="100" w:type="dxa"/>
+              <w:right w:w="100" w:type="dxa"/>
             </w:tcMar>
             <w:shd w:fill="0F172A"/>
           </w:tcPr>
@@ -2579,8 +2235,8 @@
             <w:tcMar>
               <w:top w:w="100" w:type="dxa"/>
               <w:bottom w:w="100" w:type="dxa"/>
-              <w:left w:w="120" w:type="dxa"/>
-              <w:right w:w="120" w:type="dxa"/>
+              <w:left w:w="100" w:type="dxa"/>
+              <w:right w:w="100" w:type="dxa"/>
             </w:tcMar>
             <w:shd w:fill="0F172A"/>
           </w:tcPr>
@@ -2602,8 +2258,8 @@
             <w:tcMar>
               <w:top w:w="100" w:type="dxa"/>
               <w:bottom w:w="100" w:type="dxa"/>
-              <w:left w:w="120" w:type="dxa"/>
-              <w:right w:w="120" w:type="dxa"/>
+              <w:left w:w="100" w:type="dxa"/>
+              <w:right w:w="100" w:type="dxa"/>
             </w:tcMar>
             <w:shd w:fill="0F172A"/>
           </w:tcPr>
@@ -2627,8 +2283,8 @@
             <w:tcMar>
               <w:top w:w="80" w:type="dxa"/>
               <w:bottom w:w="80" w:type="dxa"/>
-              <w:left w:w="120" w:type="dxa"/>
-              <w:right w:w="120" w:type="dxa"/>
+              <w:left w:w="100" w:type="dxa"/>
+              <w:right w:w="100" w:type="dxa"/>
             </w:tcMar>
             <w:shd w:fill="FFFFFF"/>
           </w:tcPr>
@@ -2649,8 +2305,8 @@
             <w:tcMar>
               <w:top w:w="80" w:type="dxa"/>
               <w:bottom w:w="80" w:type="dxa"/>
-              <w:left w:w="120" w:type="dxa"/>
-              <w:right w:w="120" w:type="dxa"/>
+              <w:left w:w="100" w:type="dxa"/>
+              <w:right w:w="100" w:type="dxa"/>
             </w:tcMar>
             <w:shd w:fill="FFFFFF"/>
           </w:tcPr>
@@ -2671,8 +2327,8 @@
             <w:tcMar>
               <w:top w:w="80" w:type="dxa"/>
               <w:bottom w:w="80" w:type="dxa"/>
-              <w:left w:w="120" w:type="dxa"/>
-              <w:right w:w="120" w:type="dxa"/>
+              <w:left w:w="100" w:type="dxa"/>
+              <w:right w:w="100" w:type="dxa"/>
             </w:tcMar>
             <w:shd w:fill="FFFFFF"/>
           </w:tcPr>
@@ -2693,8 +2349,8 @@
             <w:tcMar>
               <w:top w:w="80" w:type="dxa"/>
               <w:bottom w:w="80" w:type="dxa"/>
-              <w:left w:w="120" w:type="dxa"/>
-              <w:right w:w="120" w:type="dxa"/>
+              <w:left w:w="100" w:type="dxa"/>
+              <w:right w:w="100" w:type="dxa"/>
             </w:tcMar>
             <w:shd w:fill="FFFFFF"/>
           </w:tcPr>
@@ -2717,8 +2373,8 @@
             <w:tcMar>
               <w:top w:w="80" w:type="dxa"/>
               <w:bottom w:w="80" w:type="dxa"/>
-              <w:left w:w="120" w:type="dxa"/>
-              <w:right w:w="120" w:type="dxa"/>
+              <w:left w:w="100" w:type="dxa"/>
+              <w:right w:w="100" w:type="dxa"/>
             </w:tcMar>
             <w:shd w:fill="F8FAFC"/>
           </w:tcPr>
@@ -2739,8 +2395,8 @@
             <w:tcMar>
               <w:top w:w="80" w:type="dxa"/>
               <w:bottom w:w="80" w:type="dxa"/>
-              <w:left w:w="120" w:type="dxa"/>
-              <w:right w:w="120" w:type="dxa"/>
+              <w:left w:w="100" w:type="dxa"/>
+              <w:right w:w="100" w:type="dxa"/>
             </w:tcMar>
             <w:shd w:fill="F8FAFC"/>
           </w:tcPr>
@@ -2761,8 +2417,8 @@
             <w:tcMar>
               <w:top w:w="80" w:type="dxa"/>
               <w:bottom w:w="80" w:type="dxa"/>
-              <w:left w:w="120" w:type="dxa"/>
-              <w:right w:w="120" w:type="dxa"/>
+              <w:left w:w="100" w:type="dxa"/>
+              <w:right w:w="100" w:type="dxa"/>
             </w:tcMar>
             <w:shd w:fill="F8FAFC"/>
           </w:tcPr>
@@ -2783,8 +2439,8 @@
             <w:tcMar>
               <w:top w:w="80" w:type="dxa"/>
               <w:bottom w:w="80" w:type="dxa"/>
-              <w:left w:w="120" w:type="dxa"/>
-              <w:right w:w="120" w:type="dxa"/>
+              <w:left w:w="100" w:type="dxa"/>
+              <w:right w:w="100" w:type="dxa"/>
             </w:tcMar>
             <w:shd w:fill="F8FAFC"/>
           </w:tcPr>
@@ -2807,8 +2463,8 @@
             <w:tcMar>
               <w:top w:w="80" w:type="dxa"/>
               <w:bottom w:w="80" w:type="dxa"/>
-              <w:left w:w="120" w:type="dxa"/>
-              <w:right w:w="120" w:type="dxa"/>
+              <w:left w:w="100" w:type="dxa"/>
+              <w:right w:w="100" w:type="dxa"/>
             </w:tcMar>
             <w:shd w:fill="FFFFFF"/>
           </w:tcPr>
@@ -2829,8 +2485,8 @@
             <w:tcMar>
               <w:top w:w="80" w:type="dxa"/>
               <w:bottom w:w="80" w:type="dxa"/>
-              <w:left w:w="120" w:type="dxa"/>
-              <w:right w:w="120" w:type="dxa"/>
+              <w:left w:w="100" w:type="dxa"/>
+              <w:right w:w="100" w:type="dxa"/>
             </w:tcMar>
             <w:shd w:fill="FFFFFF"/>
           </w:tcPr>
@@ -2851,8 +2507,8 @@
             <w:tcMar>
               <w:top w:w="80" w:type="dxa"/>
               <w:bottom w:w="80" w:type="dxa"/>
-              <w:left w:w="120" w:type="dxa"/>
-              <w:right w:w="120" w:type="dxa"/>
+              <w:left w:w="100" w:type="dxa"/>
+              <w:right w:w="100" w:type="dxa"/>
             </w:tcMar>
             <w:shd w:fill="FFFFFF"/>
           </w:tcPr>
@@ -2873,8 +2529,8 @@
             <w:tcMar>
               <w:top w:w="80" w:type="dxa"/>
               <w:bottom w:w="80" w:type="dxa"/>
-              <w:left w:w="120" w:type="dxa"/>
-              <w:right w:w="120" w:type="dxa"/>
+              <w:left w:w="100" w:type="dxa"/>
+              <w:right w:w="100" w:type="dxa"/>
             </w:tcMar>
             <w:shd w:fill="FFFFFF"/>
           </w:tcPr>
@@ -2897,8 +2553,8 @@
             <w:tcMar>
               <w:top w:w="80" w:type="dxa"/>
               <w:bottom w:w="80" w:type="dxa"/>
-              <w:left w:w="120" w:type="dxa"/>
-              <w:right w:w="120" w:type="dxa"/>
+              <w:left w:w="100" w:type="dxa"/>
+              <w:right w:w="100" w:type="dxa"/>
             </w:tcMar>
             <w:shd w:fill="F8FAFC"/>
           </w:tcPr>
@@ -2919,8 +2575,8 @@
             <w:tcMar>
               <w:top w:w="80" w:type="dxa"/>
               <w:bottom w:w="80" w:type="dxa"/>
-              <w:left w:w="120" w:type="dxa"/>
-              <w:right w:w="120" w:type="dxa"/>
+              <w:left w:w="100" w:type="dxa"/>
+              <w:right w:w="100" w:type="dxa"/>
             </w:tcMar>
             <w:shd w:fill="F8FAFC"/>
           </w:tcPr>
@@ -2941,8 +2597,8 @@
             <w:tcMar>
               <w:top w:w="80" w:type="dxa"/>
               <w:bottom w:w="80" w:type="dxa"/>
-              <w:left w:w="120" w:type="dxa"/>
-              <w:right w:w="120" w:type="dxa"/>
+              <w:left w:w="100" w:type="dxa"/>
+              <w:right w:w="100" w:type="dxa"/>
             </w:tcMar>
             <w:shd w:fill="F8FAFC"/>
           </w:tcPr>
@@ -2963,8 +2619,8 @@
             <w:tcMar>
               <w:top w:w="80" w:type="dxa"/>
               <w:bottom w:w="80" w:type="dxa"/>
-              <w:left w:w="120" w:type="dxa"/>
-              <w:right w:w="120" w:type="dxa"/>
+              <w:left w:w="100" w:type="dxa"/>
+              <w:right w:w="100" w:type="dxa"/>
             </w:tcMar>
             <w:shd w:fill="F8FAFC"/>
           </w:tcPr>
@@ -2987,8 +2643,8 @@
             <w:tcMar>
               <w:top w:w="80" w:type="dxa"/>
               <w:bottom w:w="80" w:type="dxa"/>
-              <w:left w:w="120" w:type="dxa"/>
-              <w:right w:w="120" w:type="dxa"/>
+              <w:left w:w="100" w:type="dxa"/>
+              <w:right w:w="100" w:type="dxa"/>
             </w:tcMar>
             <w:shd w:fill="FFFFFF"/>
           </w:tcPr>
@@ -3009,8 +2665,8 @@
             <w:tcMar>
               <w:top w:w="80" w:type="dxa"/>
               <w:bottom w:w="80" w:type="dxa"/>
-              <w:left w:w="120" w:type="dxa"/>
-              <w:right w:w="120" w:type="dxa"/>
+              <w:left w:w="100" w:type="dxa"/>
+              <w:right w:w="100" w:type="dxa"/>
             </w:tcMar>
             <w:shd w:fill="FFFFFF"/>
           </w:tcPr>
@@ -3031,8 +2687,8 @@
             <w:tcMar>
               <w:top w:w="80" w:type="dxa"/>
               <w:bottom w:w="80" w:type="dxa"/>
-              <w:left w:w="120" w:type="dxa"/>
-              <w:right w:w="120" w:type="dxa"/>
+              <w:left w:w="100" w:type="dxa"/>
+              <w:right w:w="100" w:type="dxa"/>
             </w:tcMar>
             <w:shd w:fill="FFFFFF"/>
           </w:tcPr>
@@ -3053,8 +2709,8 @@
             <w:tcMar>
               <w:top w:w="80" w:type="dxa"/>
               <w:bottom w:w="80" w:type="dxa"/>
-              <w:left w:w="120" w:type="dxa"/>
-              <w:right w:w="120" w:type="dxa"/>
+              <w:left w:w="100" w:type="dxa"/>
+              <w:right w:w="100" w:type="dxa"/>
             </w:tcMar>
             <w:shd w:fill="FFFFFF"/>
           </w:tcPr>
@@ -3077,8 +2733,8 @@
             <w:tcMar>
               <w:top w:w="80" w:type="dxa"/>
               <w:bottom w:w="80" w:type="dxa"/>
-              <w:left w:w="120" w:type="dxa"/>
-              <w:right w:w="120" w:type="dxa"/>
+              <w:left w:w="100" w:type="dxa"/>
+              <w:right w:w="100" w:type="dxa"/>
             </w:tcMar>
             <w:shd w:fill="F8FAFC"/>
           </w:tcPr>
@@ -3099,8 +2755,8 @@
             <w:tcMar>
               <w:top w:w="80" w:type="dxa"/>
               <w:bottom w:w="80" w:type="dxa"/>
-              <w:left w:w="120" w:type="dxa"/>
-              <w:right w:w="120" w:type="dxa"/>
+              <w:left w:w="100" w:type="dxa"/>
+              <w:right w:w="100" w:type="dxa"/>
             </w:tcMar>
             <w:shd w:fill="F8FAFC"/>
           </w:tcPr>
@@ -3121,8 +2777,8 @@
             <w:tcMar>
               <w:top w:w="80" w:type="dxa"/>
               <w:bottom w:w="80" w:type="dxa"/>
-              <w:left w:w="120" w:type="dxa"/>
-              <w:right w:w="120" w:type="dxa"/>
+              <w:left w:w="100" w:type="dxa"/>
+              <w:right w:w="100" w:type="dxa"/>
             </w:tcMar>
             <w:shd w:fill="F8FAFC"/>
           </w:tcPr>
@@ -3143,8 +2799,8 @@
             <w:tcMar>
               <w:top w:w="80" w:type="dxa"/>
               <w:bottom w:w="80" w:type="dxa"/>
-              <w:left w:w="120" w:type="dxa"/>
-              <w:right w:w="120" w:type="dxa"/>
+              <w:left w:w="100" w:type="dxa"/>
+              <w:right w:w="100" w:type="dxa"/>
             </w:tcMar>
             <w:shd w:fill="F8FAFC"/>
           </w:tcPr>
@@ -3167,8 +2823,8 @@
             <w:tcMar>
               <w:top w:w="80" w:type="dxa"/>
               <w:bottom w:w="80" w:type="dxa"/>
-              <w:left w:w="120" w:type="dxa"/>
-              <w:right w:w="120" w:type="dxa"/>
+              <w:left w:w="100" w:type="dxa"/>
+              <w:right w:w="100" w:type="dxa"/>
             </w:tcMar>
             <w:shd w:fill="FFFFFF"/>
           </w:tcPr>
@@ -3189,8 +2845,8 @@
             <w:tcMar>
               <w:top w:w="80" w:type="dxa"/>
               <w:bottom w:w="80" w:type="dxa"/>
-              <w:left w:w="120" w:type="dxa"/>
-              <w:right w:w="120" w:type="dxa"/>
+              <w:left w:w="100" w:type="dxa"/>
+              <w:right w:w="100" w:type="dxa"/>
             </w:tcMar>
             <w:shd w:fill="FFFFFF"/>
           </w:tcPr>
@@ -3211,8 +2867,8 @@
             <w:tcMar>
               <w:top w:w="80" w:type="dxa"/>
               <w:bottom w:w="80" w:type="dxa"/>
-              <w:left w:w="120" w:type="dxa"/>
-              <w:right w:w="120" w:type="dxa"/>
+              <w:left w:w="100" w:type="dxa"/>
+              <w:right w:w="100" w:type="dxa"/>
             </w:tcMar>
             <w:shd w:fill="FFFFFF"/>
           </w:tcPr>
@@ -3233,8 +2889,8 @@
             <w:tcMar>
               <w:top w:w="80" w:type="dxa"/>
               <w:bottom w:w="80" w:type="dxa"/>
-              <w:left w:w="120" w:type="dxa"/>
-              <w:right w:w="120" w:type="dxa"/>
+              <w:left w:w="100" w:type="dxa"/>
+              <w:right w:w="100" w:type="dxa"/>
             </w:tcMar>
             <w:shd w:fill="FFFFFF"/>
           </w:tcPr>
@@ -3257,8 +2913,8 @@
             <w:tcMar>
               <w:top w:w="80" w:type="dxa"/>
               <w:bottom w:w="80" w:type="dxa"/>
-              <w:left w:w="120" w:type="dxa"/>
-              <w:right w:w="120" w:type="dxa"/>
+              <w:left w:w="100" w:type="dxa"/>
+              <w:right w:w="100" w:type="dxa"/>
             </w:tcMar>
             <w:shd w:fill="F8FAFC"/>
           </w:tcPr>
@@ -3279,8 +2935,8 @@
             <w:tcMar>
               <w:top w:w="80" w:type="dxa"/>
               <w:bottom w:w="80" w:type="dxa"/>
-              <w:left w:w="120" w:type="dxa"/>
-              <w:right w:w="120" w:type="dxa"/>
+              <w:left w:w="100" w:type="dxa"/>
+              <w:right w:w="100" w:type="dxa"/>
             </w:tcMar>
             <w:shd w:fill="F8FAFC"/>
           </w:tcPr>
@@ -3301,8 +2957,8 @@
             <w:tcMar>
               <w:top w:w="80" w:type="dxa"/>
               <w:bottom w:w="80" w:type="dxa"/>
-              <w:left w:w="120" w:type="dxa"/>
-              <w:right w:w="120" w:type="dxa"/>
+              <w:left w:w="100" w:type="dxa"/>
+              <w:right w:w="100" w:type="dxa"/>
             </w:tcMar>
             <w:shd w:fill="F8FAFC"/>
           </w:tcPr>
@@ -3323,8 +2979,8 @@
             <w:tcMar>
               <w:top w:w="80" w:type="dxa"/>
               <w:bottom w:w="80" w:type="dxa"/>
-              <w:left w:w="120" w:type="dxa"/>
-              <w:right w:w="120" w:type="dxa"/>
+              <w:left w:w="100" w:type="dxa"/>
+              <w:right w:w="100" w:type="dxa"/>
             </w:tcMar>
             <w:shd w:fill="F8FAFC"/>
           </w:tcPr>

</xml_diff>

<commit_message>
Streamline master Word study roadmap for pure Data Analyst role, filtering out non-DA DE/DBA topics
</commit_message>
<xml_diff>
--- a/docs/DA_COMPLETE_STUDY_ROADMAP.docx
+++ b/docs/DA_COMPLETE_STUDY_ROADMAP.docx
@@ -14,7 +14,7 @@
           <w:color w:val="0F172A"/>
           <w:sz w:val="44"/>
         </w:rPr>
-        <w:t>Data Analyst Master Execution Roadmap &amp; Action Plan</w:t>
+        <w:t>Data Analyst Master Execution Roadmap (DA-Focused)</w:t>
       </w:r>
     </w:p>
     <w:p>
@@ -28,7 +28,7 @@
           <w:color w:val="0EA5E9"/>
           <w:sz w:val="22"/>
         </w:rPr>
-        <w:t>Accelerated Multi-Module App Pace | 5 Daily HackerRank Quota | DataLemur First Strategy</w:t>
+        <w:t>Filtered Pure Data Analyst Syllabus | Bypassed DE/DBA Topics | DataLemur First Strategy</w:t>
       </w:r>
     </w:p>
     <w:p>
@@ -43,7 +43,7 @@
           <w:color w:val="0EA5E9"/>
           <w:sz w:val="36"/>
         </w:rPr>
-        <w:t>1. Executive Status &amp; Progress Tracker</w:t>
+        <w:t>1. Executive Status &amp; DA Scope Filter</w:t>
       </w:r>
     </w:p>
     <w:p>
@@ -81,10 +81,10 @@
         <w:rPr>
           <w:b/>
         </w:rPr>
-        <w:t xml:space="preserve">• SQL Analyst Academy App Plan: </w:t>
+        <w:t xml:space="preserve">• Filtered Non-DA Topics: </w:t>
       </w:r>
       <w:r>
-        <w:t>Start App Learning (Modules 1–43) at accelerated pace (4–5 Modules/Day)</w:t>
+        <w:t>Skipped 11 Data Engineering / DBA videos (Stored Procedures, Triggers, DWH ETL Pipeline Videos 46–54) to focus 100% on Data Analyst competencies.</w:t>
         <w:br/>
       </w:r>
       <w:r>
@@ -109,7 +109,7 @@
           <w:color w:val="0EA5E9"/>
           <w:sz w:val="36"/>
         </w:rPr>
-        <w:t>2. Accelerated Day-by-Day Execution Plan (Upcoming First)</w:t>
+        <w:t>2. Streamlined Day-by-Day DA Execution Plan (Upcoming First)</w:t>
       </w:r>
     </w:p>
     <w:tbl>
@@ -168,7 +168,7 @@
                 <w:color w:val="FFFFFF"/>
                 <w:sz w:val="19"/>
               </w:rPr>
-              <w:t>YouTube Video Target &amp; Timestamp</w:t>
+              <w:t>DA Essential YouTube Video Target &amp; Timestamp</w:t>
             </w:r>
           </w:p>
         </w:tc>
@@ -517,7 +517,7 @@
                 <w:color w:val="334155"/>
                 <w:sz w:val="17"/>
               </w:rPr>
-              <w:t>Video #34: Clustered vs Nonclustered Indexes &amp; Video #35: Columnstore Indexes &amp; Video #36: Unique/Filtered Indexes</w:t>
+              <w:t>Video #34: Clustered vs Nonclustered Indexes &amp; Video #35: Columnstore &amp; Video #36: Unique/Filtered Indexes</w:t>
               <w:br/>
               <w:t>[Timestamp 18:23:42]</w:t>
             </w:r>
@@ -633,7 +633,7 @@
                 <w:color w:val="334155"/>
                 <w:sz w:val="17"/>
               </w:rPr>
-              <w:t>Video #37: Choose Right Index &amp; Video #38: Index Maintenance &amp; Video #39: Execution Plans</w:t>
+              <w:t>Video #37: Choose Right Index &amp; Video #39: Execution Plans &amp; Video #40: Indexing Strategy</w:t>
               <w:br/>
               <w:t>[Timestamp 20:20:31]</w:t>
             </w:r>
@@ -749,9 +749,9 @@
                 <w:color w:val="334155"/>
                 <w:sz w:val="17"/>
               </w:rPr>
-              <w:t>Video #40: Indexing Strategy &amp; Video #41: Table Partitioning &amp; Video #42: 30 Performance Tips</w:t>
+              <w:t>Video #42: 30 SQL Performance Tips from 18 Yrs Experience &amp; Video #45: ChatGPT / Copilot AI Workflow</w:t>
               <w:br/>
-              <w:t>[Timestamp 21:11:03 - 21:43:39]</w:t>
+              <w:t>[Timestamp 21:43:39 - 22:24:25]</w:t>
             </w:r>
           </w:p>
         </w:tc>
@@ -865,9 +865,9 @@
                 <w:color w:val="334155"/>
                 <w:sz w:val="17"/>
               </w:rPr>
-              <w:t>Video #43: Stored Procedures &amp; Video #44: Triggers &amp; Video #45: ChatGPT / Copilot AI Workflow</w:t>
+              <w:t>🎯 Video #55: SQL Exploratory Data Analysis (EDA) Project</w:t>
               <w:br/>
-              <w:t>[Timestamp 17:27:04 - 22:24:25]</w:t>
+              <w:t>[Timestamp 27:41:51]</w:t>
             </w:r>
           </w:p>
         </w:tc>
@@ -933,7 +933,7 @@
                 <w:color w:val="334155"/>
                 <w:sz w:val="17"/>
               </w:rPr>
-              <w:t>💡 Watch &amp; Solve</w:t>
+              <w:t>🎯 MUST WATCH DA PROJECT 1</w:t>
             </w:r>
           </w:p>
         </w:tc>
@@ -981,9 +981,9 @@
                 <w:color w:val="334155"/>
                 <w:sz w:val="17"/>
               </w:rPr>
-              <w:t>Videos #46–48: Data Warehouse Basics &amp; ETL Ingestion Pipeline</w:t>
+              <w:t>🎯 Video #56: SQL Data Analyst Portfolio Project</w:t>
               <w:br/>
-              <w:t>[Timestamp 23:21:04 - 25:10:09]</w:t>
+              <w:t>[Timestamp 28:30:38]</w:t>
             </w:r>
           </w:p>
         </w:tc>
@@ -1049,7 +1049,7 @@
                 <w:color w:val="334155"/>
                 <w:sz w:val="17"/>
               </w:rPr>
-              <w:t>🏗️ DWH Series &amp; Solve</w:t>
+              <w:t>🎯 MUST WATCH DA PROJECT 2</w:t>
             </w:r>
           </w:p>
         </w:tc>
@@ -1097,7 +1097,7 @@
                 <w:color w:val="334155"/>
                 <w:sz w:val="17"/>
               </w:rPr>
-              <w:t>Videos #49–51: Environment Setup, Architecture &amp; Database Creation</w:t>
+              <w:t>Full Portfolio GitHub Push &amp; DA Query Optimization</w:t>
             </w:r>
           </w:p>
         </w:tc>
@@ -1119,7 +1119,7 @@
                 <w:color w:val="334155"/>
                 <w:sz w:val="17"/>
               </w:rPr>
-              <w:t>App Modules 36–40: Indexing, Columnstore, Partitioning (15 Problems)</w:t>
+              <w:t>App Modules 36–40: Indexing &amp; Query Profiling (15 Problems)</w:t>
             </w:r>
           </w:p>
         </w:tc>
@@ -1163,7 +1163,7 @@
                 <w:color w:val="334155"/>
                 <w:sz w:val="17"/>
               </w:rPr>
-              <w:t>🏗️ DWH Series &amp; Solve</w:t>
+              <w:t>🚀 PORTFOLIO GITHUB PUSH</w:t>
             </w:r>
           </w:p>
         </w:tc>
@@ -1211,9 +1211,7 @@
                 <w:color w:val="334155"/>
                 <w:sz w:val="17"/>
               </w:rPr>
-              <w:t>Videos #52–54: Bronze, Silver &amp; Gold Layer Star Schema Modeling</w:t>
-              <w:br/>
-              <w:t>[Timestamp 26:47:46]</w:t>
+              <w:t>⭐ DATALEMUR DAY 1: Start Top Tech Company SQL Practice</w:t>
             </w:r>
           </w:p>
         </w:tc>
@@ -1235,7 +1233,7 @@
                 <w:color w:val="334155"/>
                 <w:sz w:val="17"/>
               </w:rPr>
-              <w:t>App Modules 41–43: DDL/DML, Stored Procedures, Triggers (10 Problems)</w:t>
+              <w:t>App Modules 41–43: Schema DDL/DML &amp; Advanced Queries (10 Problems)</w:t>
             </w:r>
           </w:p>
         </w:tc>
@@ -1257,7 +1255,7 @@
                 <w:color w:val="334155"/>
                 <w:sz w:val="17"/>
               </w:rPr>
-              <w:t>3 Medium + 2 Hard (Medians &amp; Streaks)</w:t>
+              <w:t>DataLemur 5 Medium/Hard</w:t>
             </w:r>
           </w:p>
         </w:tc>
@@ -1279,7 +1277,7 @@
                 <w:color w:val="334155"/>
                 <w:sz w:val="17"/>
               </w:rPr>
-              <w:t>🏗️ Star Schema Modeling</w:t>
+              <w:t>⭐ DATALEMUR START</w:t>
             </w:r>
           </w:p>
         </w:tc>
@@ -1327,9 +1325,7 @@
                 <w:color w:val="334155"/>
                 <w:sz w:val="17"/>
               </w:rPr>
-              <w:t>Video #55: SQL Exploratory Data Analysis (EDA) Project</w:t>
-              <w:br/>
-              <w:t>[Timestamp 27:41:51]</w:t>
+              <w:t>⭐ DATALEMUR DAY 2: FAANG Retention &amp; Window Questions</w:t>
             </w:r>
           </w:p>
         </w:tc>
@@ -1373,7 +1369,7 @@
                 <w:color w:val="334155"/>
                 <w:sz w:val="17"/>
               </w:rPr>
-              <w:t>5 HackerRank Hard (Complex Challenges)</w:t>
+              <w:t>DataLemur 5 Medium/Hard</w:t>
             </w:r>
           </w:p>
         </w:tc>
@@ -1395,7 +1391,7 @@
                 <w:color w:val="334155"/>
                 <w:sz w:val="17"/>
               </w:rPr>
-              <w:t>🎯 MUST WATCH PROJECT 1</w:t>
+              <w:t>⭐ DATALEMUR PRACTICE</w:t>
             </w:r>
           </w:p>
         </w:tc>
@@ -1443,9 +1439,7 @@
                 <w:color w:val="334155"/>
                 <w:sz w:val="17"/>
               </w:rPr>
-              <w:t>Video #56: SQL Data Analyst Portfolio Project</w:t>
-              <w:br/>
-              <w:t>[Timestamp 28:30:38]</w:t>
+              <w:t>⭐ DATALEMUR DAY 3: Self-Joins &amp; Monthly Active User Metrics</w:t>
             </w:r>
           </w:p>
         </w:tc>
@@ -1468,234 +1462,6 @@
                 <w:sz w:val="17"/>
               </w:rPr>
               <w:t>App Debug Puzzles 31–60: Complex Schema Bug Fixes (30 Puzzles)</w:t>
-            </w:r>
-          </w:p>
-        </w:tc>
-        <w:tc>
-          <w:tcPr>
-            <w:tcW w:type="dxa" w:w="1728"/>
-            <w:tcMar>
-              <w:top w:w="80" w:type="dxa"/>
-              <w:bottom w:w="80" w:type="dxa"/>
-              <w:left w:w="100" w:type="dxa"/>
-              <w:right w:w="100" w:type="dxa"/>
-            </w:tcMar>
-            <w:shd w:fill="FFFFFF"/>
-          </w:tcPr>
-          <w:p>
-            <w:r>
-              <w:rPr>
-                <w:rFonts w:ascii="Arial" w:hAnsi="Arial"/>
-                <w:color w:val="334155"/>
-                <w:sz w:val="17"/>
-              </w:rPr>
-              <w:t>5 HackerRank Hard (Final Set)</w:t>
-            </w:r>
-          </w:p>
-        </w:tc>
-        <w:tc>
-          <w:tcPr>
-            <w:tcW w:type="dxa" w:w="1728"/>
-            <w:tcMar>
-              <w:top w:w="80" w:type="dxa"/>
-              <w:bottom w:w="80" w:type="dxa"/>
-              <w:left w:w="100" w:type="dxa"/>
-              <w:right w:w="100" w:type="dxa"/>
-            </w:tcMar>
-            <w:shd w:fill="FFFFFF"/>
-          </w:tcPr>
-          <w:p>
-            <w:r>
-              <w:rPr>
-                <w:rFonts w:ascii="Arial" w:hAnsi="Arial"/>
-                <w:color w:val="334155"/>
-                <w:sz w:val="17"/>
-              </w:rPr>
-              <w:t>🎯 MUST WATCH PROJECT 2</w:t>
-            </w:r>
-          </w:p>
-        </w:tc>
-      </w:tr>
-      <w:tr>
-        <w:tc>
-          <w:tcPr>
-            <w:tcW w:type="dxa" w:w="1728"/>
-            <w:tcMar>
-              <w:top w:w="80" w:type="dxa"/>
-              <w:bottom w:w="80" w:type="dxa"/>
-              <w:left w:w="100" w:type="dxa"/>
-              <w:right w:w="100" w:type="dxa"/>
-            </w:tcMar>
-            <w:shd w:fill="F8FAFC"/>
-          </w:tcPr>
-          <w:p>
-            <w:r>
-              <w:rPr>
-                <w:rFonts w:ascii="Arial" w:hAnsi="Arial"/>
-                <w:color w:val="334155"/>
-                <w:sz w:val="17"/>
-              </w:rPr>
-              <w:t>Day 26</w:t>
-              <w:br/>
-              <w:t>Aug 04, 2026</w:t>
-            </w:r>
-          </w:p>
-        </w:tc>
-        <w:tc>
-          <w:tcPr>
-            <w:tcW w:type="dxa" w:w="1728"/>
-            <w:tcMar>
-              <w:top w:w="80" w:type="dxa"/>
-              <w:bottom w:w="80" w:type="dxa"/>
-              <w:left w:w="100" w:type="dxa"/>
-              <w:right w:w="100" w:type="dxa"/>
-            </w:tcMar>
-            <w:shd w:fill="F8FAFC"/>
-          </w:tcPr>
-          <w:p>
-            <w:r>
-              <w:rPr>
-                <w:rFonts w:ascii="Arial" w:hAnsi="Arial"/>
-                <w:color w:val="334155"/>
-                <w:sz w:val="17"/>
-              </w:rPr>
-              <w:t>Full Course Review &amp; Portfolio Audit</w:t>
-            </w:r>
-          </w:p>
-        </w:tc>
-        <w:tc>
-          <w:tcPr>
-            <w:tcW w:type="dxa" w:w="1728"/>
-            <w:tcMar>
-              <w:top w:w="80" w:type="dxa"/>
-              <w:bottom w:w="80" w:type="dxa"/>
-              <w:left w:w="100" w:type="dxa"/>
-              <w:right w:w="100" w:type="dxa"/>
-            </w:tcMar>
-            <w:shd w:fill="F8FAFC"/>
-          </w:tcPr>
-          <w:p>
-            <w:r>
-              <w:rPr>
-                <w:rFonts w:ascii="Arial" w:hAnsi="Arial"/>
-                <w:color w:val="334155"/>
-                <w:sz w:val="17"/>
-              </w:rPr>
-              <w:t>App Mock Interview 1 &amp; 2: Blinkit &amp; Zomato Mock Exams</w:t>
-            </w:r>
-          </w:p>
-        </w:tc>
-        <w:tc>
-          <w:tcPr>
-            <w:tcW w:type="dxa" w:w="1728"/>
-            <w:tcMar>
-              <w:top w:w="80" w:type="dxa"/>
-              <w:bottom w:w="80" w:type="dxa"/>
-              <w:left w:w="100" w:type="dxa"/>
-              <w:right w:w="100" w:type="dxa"/>
-            </w:tcMar>
-            <w:shd w:fill="F8FAFC"/>
-          </w:tcPr>
-          <w:p>
-            <w:r>
-              <w:rPr>
-                <w:rFonts w:ascii="Arial" w:hAnsi="Arial"/>
-                <w:color w:val="334155"/>
-                <w:sz w:val="17"/>
-              </w:rPr>
-              <w:t>🎯 DATALEMUR DAY 1: Start FAANG Questions</w:t>
-            </w:r>
-          </w:p>
-        </w:tc>
-        <w:tc>
-          <w:tcPr>
-            <w:tcW w:type="dxa" w:w="1728"/>
-            <w:tcMar>
-              <w:top w:w="80" w:type="dxa"/>
-              <w:bottom w:w="80" w:type="dxa"/>
-              <w:left w:w="100" w:type="dxa"/>
-              <w:right w:w="100" w:type="dxa"/>
-            </w:tcMar>
-            <w:shd w:fill="F8FAFC"/>
-          </w:tcPr>
-          <w:p>
-            <w:r>
-              <w:rPr>
-                <w:rFonts w:ascii="Arial" w:hAnsi="Arial"/>
-                <w:color w:val="334155"/>
-                <w:sz w:val="17"/>
-              </w:rPr>
-              <w:t>⭐ DATALEMUR START</w:t>
-            </w:r>
-          </w:p>
-        </w:tc>
-      </w:tr>
-      <w:tr>
-        <w:tc>
-          <w:tcPr>
-            <w:tcW w:type="dxa" w:w="1728"/>
-            <w:tcMar>
-              <w:top w:w="80" w:type="dxa"/>
-              <w:bottom w:w="80" w:type="dxa"/>
-              <w:left w:w="100" w:type="dxa"/>
-              <w:right w:w="100" w:type="dxa"/>
-            </w:tcMar>
-            <w:shd w:fill="FFFFFF"/>
-          </w:tcPr>
-          <w:p>
-            <w:r>
-              <w:rPr>
-                <w:rFonts w:ascii="Arial" w:hAnsi="Arial"/>
-                <w:color w:val="334155"/>
-                <w:sz w:val="17"/>
-              </w:rPr>
-              <w:t>Day 27</w:t>
-              <w:br/>
-              <w:t>Aug 05, 2026</w:t>
-            </w:r>
-          </w:p>
-        </w:tc>
-        <w:tc>
-          <w:tcPr>
-            <w:tcW w:type="dxa" w:w="1728"/>
-            <w:tcMar>
-              <w:top w:w="80" w:type="dxa"/>
-              <w:bottom w:w="80" w:type="dxa"/>
-              <w:left w:w="100" w:type="dxa"/>
-              <w:right w:w="100" w:type="dxa"/>
-            </w:tcMar>
-            <w:shd w:fill="FFFFFF"/>
-          </w:tcPr>
-          <w:p>
-            <w:r>
-              <w:rPr>
-                <w:rFonts w:ascii="Arial" w:hAnsi="Arial"/>
-                <w:color w:val="334155"/>
-                <w:sz w:val="17"/>
-              </w:rPr>
-              <w:t>DataLemur Interview Practice</w:t>
-            </w:r>
-          </w:p>
-        </w:tc>
-        <w:tc>
-          <w:tcPr>
-            <w:tcW w:type="dxa" w:w="1728"/>
-            <w:tcMar>
-              <w:top w:w="80" w:type="dxa"/>
-              <w:bottom w:w="80" w:type="dxa"/>
-              <w:left w:w="100" w:type="dxa"/>
-              <w:right w:w="100" w:type="dxa"/>
-            </w:tcMar>
-            <w:shd w:fill="FFFFFF"/>
-          </w:tcPr>
-          <w:p>
-            <w:r>
-              <w:rPr>
-                <w:rFonts w:ascii="Arial" w:hAnsi="Arial"/>
-                <w:color w:val="334155"/>
-                <w:sz w:val="17"/>
-              </w:rPr>
-              <w:t>App Mock Interview 3 &amp; 4: Paytm &amp; Swiggy Mock Exams</w:t>
             </w:r>
           </w:p>
         </w:tc>
@@ -1763,6 +1529,234 @@
                 <w:color w:val="334155"/>
                 <w:sz w:val="17"/>
               </w:rPr>
+              <w:t>Day 26</w:t>
+              <w:br/>
+              <w:t>Aug 04, 2026</w:t>
+            </w:r>
+          </w:p>
+        </w:tc>
+        <w:tc>
+          <w:tcPr>
+            <w:tcW w:type="dxa" w:w="1728"/>
+            <w:tcMar>
+              <w:top w:w="80" w:type="dxa"/>
+              <w:bottom w:w="80" w:type="dxa"/>
+              <w:left w:w="100" w:type="dxa"/>
+              <w:right w:w="100" w:type="dxa"/>
+            </w:tcMar>
+            <w:shd w:fill="F8FAFC"/>
+          </w:tcPr>
+          <w:p>
+            <w:r>
+              <w:rPr>
+                <w:rFonts w:ascii="Arial" w:hAnsi="Arial"/>
+                <w:color w:val="334155"/>
+                <w:sz w:val="17"/>
+              </w:rPr>
+              <w:t>🛠️ STRATASCRATCH DAY 1: Real Enterprise Case Studies</w:t>
+            </w:r>
+          </w:p>
+        </w:tc>
+        <w:tc>
+          <w:tcPr>
+            <w:tcW w:type="dxa" w:w="1728"/>
+            <w:tcMar>
+              <w:top w:w="80" w:type="dxa"/>
+              <w:bottom w:w="80" w:type="dxa"/>
+              <w:left w:w="100" w:type="dxa"/>
+              <w:right w:w="100" w:type="dxa"/>
+            </w:tcMar>
+            <w:shd w:fill="F8FAFC"/>
+          </w:tcPr>
+          <w:p>
+            <w:r>
+              <w:rPr>
+                <w:rFonts w:ascii="Arial" w:hAnsi="Arial"/>
+                <w:color w:val="334155"/>
+                <w:sz w:val="17"/>
+              </w:rPr>
+              <w:t>App Mock Interview 1 &amp; 2: Blinkit &amp; Zomato Mock Exams</w:t>
+            </w:r>
+          </w:p>
+        </w:tc>
+        <w:tc>
+          <w:tcPr>
+            <w:tcW w:type="dxa" w:w="1728"/>
+            <w:tcMar>
+              <w:top w:w="80" w:type="dxa"/>
+              <w:bottom w:w="80" w:type="dxa"/>
+              <w:left w:w="100" w:type="dxa"/>
+              <w:right w:w="100" w:type="dxa"/>
+            </w:tcMar>
+            <w:shd w:fill="F8FAFC"/>
+          </w:tcPr>
+          <w:p>
+            <w:r>
+              <w:rPr>
+                <w:rFonts w:ascii="Arial" w:hAnsi="Arial"/>
+                <w:color w:val="334155"/>
+                <w:sz w:val="17"/>
+              </w:rPr>
+              <w:t>StrataScratch 5 Questions</w:t>
+            </w:r>
+          </w:p>
+        </w:tc>
+        <w:tc>
+          <w:tcPr>
+            <w:tcW w:type="dxa" w:w="1728"/>
+            <w:tcMar>
+              <w:top w:w="80" w:type="dxa"/>
+              <w:bottom w:w="80" w:type="dxa"/>
+              <w:left w:w="100" w:type="dxa"/>
+              <w:right w:w="100" w:type="dxa"/>
+            </w:tcMar>
+            <w:shd w:fill="F8FAFC"/>
+          </w:tcPr>
+          <w:p>
+            <w:r>
+              <w:rPr>
+                <w:rFonts w:ascii="Arial" w:hAnsi="Arial"/>
+                <w:color w:val="334155"/>
+                <w:sz w:val="17"/>
+              </w:rPr>
+              <w:t>🛠️ STRATASCRATCH START</w:t>
+            </w:r>
+          </w:p>
+        </w:tc>
+      </w:tr>
+      <w:tr>
+        <w:tc>
+          <w:tcPr>
+            <w:tcW w:type="dxa" w:w="1728"/>
+            <w:tcMar>
+              <w:top w:w="80" w:type="dxa"/>
+              <w:bottom w:w="80" w:type="dxa"/>
+              <w:left w:w="100" w:type="dxa"/>
+              <w:right w:w="100" w:type="dxa"/>
+            </w:tcMar>
+            <w:shd w:fill="FFFFFF"/>
+          </w:tcPr>
+          <w:p>
+            <w:r>
+              <w:rPr>
+                <w:rFonts w:ascii="Arial" w:hAnsi="Arial"/>
+                <w:color w:val="334155"/>
+                <w:sz w:val="17"/>
+              </w:rPr>
+              <w:t>Day 27</w:t>
+              <w:br/>
+              <w:t>Aug 05, 2026</w:t>
+            </w:r>
+          </w:p>
+        </w:tc>
+        <w:tc>
+          <w:tcPr>
+            <w:tcW w:type="dxa" w:w="1728"/>
+            <w:tcMar>
+              <w:top w:w="80" w:type="dxa"/>
+              <w:bottom w:w="80" w:type="dxa"/>
+              <w:left w:w="100" w:type="dxa"/>
+              <w:right w:w="100" w:type="dxa"/>
+            </w:tcMar>
+            <w:shd w:fill="FFFFFF"/>
+          </w:tcPr>
+          <w:p>
+            <w:r>
+              <w:rPr>
+                <w:rFonts w:ascii="Arial" w:hAnsi="Arial"/>
+                <w:color w:val="334155"/>
+                <w:sz w:val="17"/>
+              </w:rPr>
+              <w:t>🛠️ STRATASCRATCH DAY 2: Advanced Analytics &amp; Case Studies</w:t>
+            </w:r>
+          </w:p>
+        </w:tc>
+        <w:tc>
+          <w:tcPr>
+            <w:tcW w:type="dxa" w:w="1728"/>
+            <w:tcMar>
+              <w:top w:w="80" w:type="dxa"/>
+              <w:bottom w:w="80" w:type="dxa"/>
+              <w:left w:w="100" w:type="dxa"/>
+              <w:right w:w="100" w:type="dxa"/>
+            </w:tcMar>
+            <w:shd w:fill="FFFFFF"/>
+          </w:tcPr>
+          <w:p>
+            <w:r>
+              <w:rPr>
+                <w:rFonts w:ascii="Arial" w:hAnsi="Arial"/>
+                <w:color w:val="334155"/>
+                <w:sz w:val="17"/>
+              </w:rPr>
+              <w:t>App Mock Interview 3 &amp; 4: Paytm &amp; Swiggy Mock Exams</w:t>
+            </w:r>
+          </w:p>
+        </w:tc>
+        <w:tc>
+          <w:tcPr>
+            <w:tcW w:type="dxa" w:w="1728"/>
+            <w:tcMar>
+              <w:top w:w="80" w:type="dxa"/>
+              <w:bottom w:w="80" w:type="dxa"/>
+              <w:left w:w="100" w:type="dxa"/>
+              <w:right w:w="100" w:type="dxa"/>
+            </w:tcMar>
+            <w:shd w:fill="FFFFFF"/>
+          </w:tcPr>
+          <w:p>
+            <w:r>
+              <w:rPr>
+                <w:rFonts w:ascii="Arial" w:hAnsi="Arial"/>
+                <w:color w:val="334155"/>
+                <w:sz w:val="17"/>
+              </w:rPr>
+              <w:t>StrataScratch 5 Questions</w:t>
+            </w:r>
+          </w:p>
+        </w:tc>
+        <w:tc>
+          <w:tcPr>
+            <w:tcW w:type="dxa" w:w="1728"/>
+            <w:tcMar>
+              <w:top w:w="80" w:type="dxa"/>
+              <w:bottom w:w="80" w:type="dxa"/>
+              <w:left w:w="100" w:type="dxa"/>
+              <w:right w:w="100" w:type="dxa"/>
+            </w:tcMar>
+            <w:shd w:fill="FFFFFF"/>
+          </w:tcPr>
+          <w:p>
+            <w:r>
+              <w:rPr>
+                <w:rFonts w:ascii="Arial" w:hAnsi="Arial"/>
+                <w:color w:val="334155"/>
+                <w:sz w:val="17"/>
+              </w:rPr>
+              <w:t>🛠️ STRATASCRATCH PRACTICE</w:t>
+            </w:r>
+          </w:p>
+        </w:tc>
+      </w:tr>
+      <w:tr>
+        <w:tc>
+          <w:tcPr>
+            <w:tcW w:type="dxa" w:w="1728"/>
+            <w:tcMar>
+              <w:top w:w="80" w:type="dxa"/>
+              <w:bottom w:w="80" w:type="dxa"/>
+              <w:left w:w="100" w:type="dxa"/>
+              <w:right w:w="100" w:type="dxa"/>
+            </w:tcMar>
+            <w:shd w:fill="F8FAFC"/>
+          </w:tcPr>
+          <w:p>
+            <w:r>
+              <w:rPr>
+                <w:rFonts w:ascii="Arial" w:hAnsi="Arial"/>
+                <w:color w:val="334155"/>
+                <w:sz w:val="17"/>
+              </w:rPr>
               <w:t>Day 28</w:t>
               <w:br/>
               <w:t>Aug 06, 2026</w:t>
@@ -1787,7 +1781,7 @@
                 <w:color w:val="334155"/>
                 <w:sz w:val="17"/>
               </w:rPr>
-              <w:t>DataLemur Interview Practice</w:t>
+              <w:t>App Mock Interviews 5 &amp; 6: CRED Risk &amp; Myntra Mock Exams</w:t>
             </w:r>
           </w:p>
         </w:tc>
@@ -1809,7 +1803,7 @@
                 <w:color w:val="334155"/>
                 <w:sz w:val="17"/>
               </w:rPr>
-              <w:t>App Mock Interview 5 &amp; 6: CRED Risk &amp; Myntra Mock Exams</w:t>
+              <w:t>Practice Timed Technical Round Simulators</w:t>
             </w:r>
           </w:p>
         </w:tc>
@@ -1831,7 +1825,7 @@
                 <w:color w:val="334155"/>
                 <w:sz w:val="17"/>
               </w:rPr>
-              <w:t>DataLemur 5 Medium/Hard</w:t>
+              <w:t>5 Medium/Hard Mixed</w:t>
             </w:r>
           </w:p>
         </w:tc>
@@ -1853,7 +1847,7 @@
                 <w:color w:val="334155"/>
                 <w:sz w:val="17"/>
               </w:rPr>
-              <w:t>⭐ DATALEMUR PRACTICE</w:t>
+              <w:t>🏆 MOCK EXAMS</w:t>
             </w:r>
           </w:p>
         </w:tc>
@@ -1901,28 +1895,6 @@
                 <w:color w:val="334155"/>
                 <w:sz w:val="17"/>
               </w:rPr>
-              <w:t>StrataScratch Case Studies</w:t>
-            </w:r>
-          </w:p>
-        </w:tc>
-        <w:tc>
-          <w:tcPr>
-            <w:tcW w:type="dxa" w:w="1728"/>
-            <w:tcMar>
-              <w:top w:w="80" w:type="dxa"/>
-              <w:bottom w:w="80" w:type="dxa"/>
-              <w:left w:w="100" w:type="dxa"/>
-              <w:right w:w="100" w:type="dxa"/>
-            </w:tcMar>
-            <w:shd w:fill="FFFFFF"/>
-          </w:tcPr>
-          <w:p>
-            <w:r>
-              <w:rPr>
-                <w:rFonts w:ascii="Arial" w:hAnsi="Arial"/>
-                <w:color w:val="334155"/>
-                <w:sz w:val="17"/>
-              </w:rPr>
               <w:t>App Mock Interview 7: Flipkart Data Engineer Capstone Exam</w:t>
             </w:r>
           </w:p>
@@ -1945,7 +1917,7 @@
                 <w:color w:val="334155"/>
                 <w:sz w:val="17"/>
               </w:rPr>
-              <w:t>StrataScratch 5 Questions</w:t>
+              <w:t>Complete 60-Min Capstone Technical Round</w:t>
             </w:r>
           </w:p>
         </w:tc>
@@ -1967,7 +1939,29 @@
                 <w:color w:val="334155"/>
                 <w:sz w:val="17"/>
               </w:rPr>
-              <w:t>🛠️ STRATASCRATCH START</w:t>
+              <w:t>5 Medium/Hard Mixed</w:t>
+            </w:r>
+          </w:p>
+        </w:tc>
+        <w:tc>
+          <w:tcPr>
+            <w:tcW w:type="dxa" w:w="1728"/>
+            <w:tcMar>
+              <w:top w:w="80" w:type="dxa"/>
+              <w:bottom w:w="80" w:type="dxa"/>
+              <w:left w:w="100" w:type="dxa"/>
+              <w:right w:w="100" w:type="dxa"/>
+            </w:tcMar>
+            <w:shd w:fill="FFFFFF"/>
+          </w:tcPr>
+          <w:p>
+            <w:r>
+              <w:rPr>
+                <w:rFonts w:ascii="Arial" w:hAnsi="Arial"/>
+                <w:color w:val="334155"/>
+                <w:sz w:val="17"/>
+              </w:rPr>
+              <w:t>🏆 CAPSTONE EXAM</w:t>
             </w:r>
           </w:p>
         </w:tc>
@@ -2015,7 +2009,7 @@
                 <w:color w:val="334155"/>
                 <w:sz w:val="17"/>
               </w:rPr>
-              <w:t>Final Portfolio GitHub Push</w:t>
+              <w:t>Final Resume &amp; Portfolio Review</w:t>
             </w:r>
           </w:p>
         </w:tc>
@@ -2059,7 +2053,7 @@
                 <w:color w:val="334155"/>
                 <w:sz w:val="17"/>
               </w:rPr>
-              <w:t>Complete GitHub Portfolio Repositories</w:t>
+              <w:t>Complete GitHub Portfolio Ready</w:t>
             </w:r>
           </w:p>
         </w:tc>
@@ -2081,7 +2075,7 @@
                 <w:color w:val="334155"/>
                 <w:sz w:val="17"/>
               </w:rPr>
-              <w:t>🏆 CAPSTONE COMPLETE</w:t>
+              <w:t>🎓 100% READY FOR DA JOBS</w:t>
             </w:r>
           </w:p>
         </w:tc>
@@ -2099,7 +2093,452 @@
           <w:color w:val="0EA5E9"/>
           <w:sz w:val="36"/>
         </w:rPr>
-        <w:t>3. Platform Strategy: DataLemur vs. StrataScratch</w:t>
+        <w:t>3. Data Engineering / DBA Topics Bypassed for DA Role</w:t>
+      </w:r>
+    </w:p>
+    <w:p>
+      <w:r>
+        <w:t>The following 11 videos from the playlist cover specialized Data Engineering &amp; Database Administration (DBA) topics that are NOT required for Data Analyst interviews. They have been bypassed in your study plan to accelerate your job readiness:</w:t>
+        <w:br/>
+        <w:br/>
+      </w:r>
+    </w:p>
+    <w:tbl>
+      <w:tblPr>
+        <w:tblW w:type="auto" w:w="0"/>
+        <w:jc w:val="center"/>
+        <w:tblLook w:firstColumn="1" w:firstRow="1" w:lastColumn="0" w:lastRow="0" w:noHBand="0" w:noVBand="1" w:val="04A0"/>
+      </w:tblPr>
+      <w:tblGrid>
+        <w:gridCol w:w="2880"/>
+        <w:gridCol w:w="2880"/>
+        <w:gridCol w:w="2880"/>
+      </w:tblGrid>
+      <w:tr>
+        <w:tc>
+          <w:tcPr>
+            <w:tcW w:type="dxa" w:w="2880"/>
+            <w:tcMar>
+              <w:top w:w="100" w:type="dxa"/>
+              <w:bottom w:w="100" w:type="dxa"/>
+              <w:left w:w="100" w:type="dxa"/>
+              <w:right w:w="100" w:type="dxa"/>
+            </w:tcMar>
+            <w:shd w:fill="0F172A"/>
+          </w:tcPr>
+          <w:p>
+            <w:r>
+              <w:rPr>
+                <w:rFonts w:ascii="Arial" w:hAnsi="Arial"/>
+                <w:b/>
+                <w:color w:val="FFFFFF"/>
+                <w:sz w:val="19"/>
+              </w:rPr>
+              <w:t>Video #</w:t>
+            </w:r>
+          </w:p>
+        </w:tc>
+        <w:tc>
+          <w:tcPr>
+            <w:tcW w:type="dxa" w:w="2880"/>
+            <w:tcMar>
+              <w:top w:w="100" w:type="dxa"/>
+              <w:bottom w:w="100" w:type="dxa"/>
+              <w:left w:w="100" w:type="dxa"/>
+              <w:right w:w="100" w:type="dxa"/>
+            </w:tcMar>
+            <w:shd w:fill="0F172A"/>
+          </w:tcPr>
+          <w:p>
+            <w:r>
+              <w:rPr>
+                <w:rFonts w:ascii="Arial" w:hAnsi="Arial"/>
+                <w:b/>
+                <w:color w:val="FFFFFF"/>
+                <w:sz w:val="19"/>
+              </w:rPr>
+              <w:t>Video Title</w:t>
+            </w:r>
+          </w:p>
+        </w:tc>
+        <w:tc>
+          <w:tcPr>
+            <w:tcW w:type="dxa" w:w="2880"/>
+            <w:tcMar>
+              <w:top w:w="100" w:type="dxa"/>
+              <w:bottom w:w="100" w:type="dxa"/>
+              <w:left w:w="100" w:type="dxa"/>
+              <w:right w:w="100" w:type="dxa"/>
+            </w:tcMar>
+            <w:shd w:fill="0F172A"/>
+          </w:tcPr>
+          <w:p>
+            <w:r>
+              <w:rPr>
+                <w:rFonts w:ascii="Arial" w:hAnsi="Arial"/>
+                <w:b/>
+                <w:color w:val="FFFFFF"/>
+                <w:sz w:val="19"/>
+              </w:rPr>
+              <w:t>Reason Bypassed for Data Analyst Role</w:t>
+            </w:r>
+          </w:p>
+        </w:tc>
+      </w:tr>
+      <w:tr>
+        <w:tc>
+          <w:tcPr>
+            <w:tcW w:type="dxa" w:w="2880"/>
+            <w:tcMar>
+              <w:top w:w="80" w:type="dxa"/>
+              <w:bottom w:w="80" w:type="dxa"/>
+              <w:left w:w="100" w:type="dxa"/>
+              <w:right w:w="100" w:type="dxa"/>
+            </w:tcMar>
+            <w:shd w:fill="FFFFFF"/>
+          </w:tcPr>
+          <w:p>
+            <w:r>
+              <w:rPr>
+                <w:rFonts w:ascii="Arial" w:hAnsi="Arial"/>
+                <w:color w:val="334155"/>
+                <w:sz w:val="17"/>
+              </w:rPr>
+              <w:t>Video #38</w:t>
+            </w:r>
+          </w:p>
+        </w:tc>
+        <w:tc>
+          <w:tcPr>
+            <w:tcW w:type="dxa" w:w="2880"/>
+            <w:tcMar>
+              <w:top w:w="80" w:type="dxa"/>
+              <w:bottom w:w="80" w:type="dxa"/>
+              <w:left w:w="100" w:type="dxa"/>
+              <w:right w:w="100" w:type="dxa"/>
+            </w:tcMar>
+            <w:shd w:fill="FFFFFF"/>
+          </w:tcPr>
+          <w:p>
+            <w:r>
+              <w:rPr>
+                <w:rFonts w:ascii="Arial" w:hAnsi="Arial"/>
+                <w:color w:val="334155"/>
+                <w:sz w:val="17"/>
+              </w:rPr>
+              <w:t>SQL Index Maintenance (5 Things to Do)</w:t>
+            </w:r>
+          </w:p>
+        </w:tc>
+        <w:tc>
+          <w:tcPr>
+            <w:tcW w:type="dxa" w:w="2880"/>
+            <w:tcMar>
+              <w:top w:w="80" w:type="dxa"/>
+              <w:bottom w:w="80" w:type="dxa"/>
+              <w:left w:w="100" w:type="dxa"/>
+              <w:right w:w="100" w:type="dxa"/>
+            </w:tcMar>
+            <w:shd w:fill="FFFFFF"/>
+          </w:tcPr>
+          <w:p>
+            <w:r>
+              <w:rPr>
+                <w:rFonts w:ascii="Arial" w:hAnsi="Arial"/>
+                <w:color w:val="334155"/>
+                <w:sz w:val="17"/>
+              </w:rPr>
+              <w:t>DBA maintenance task; analysts do not manage server index defragmentation.</w:t>
+            </w:r>
+          </w:p>
+        </w:tc>
+      </w:tr>
+      <w:tr>
+        <w:tc>
+          <w:tcPr>
+            <w:tcW w:type="dxa" w:w="2880"/>
+            <w:tcMar>
+              <w:top w:w="80" w:type="dxa"/>
+              <w:bottom w:w="80" w:type="dxa"/>
+              <w:left w:w="100" w:type="dxa"/>
+              <w:right w:w="100" w:type="dxa"/>
+            </w:tcMar>
+            <w:shd w:fill="F8FAFC"/>
+          </w:tcPr>
+          <w:p>
+            <w:r>
+              <w:rPr>
+                <w:rFonts w:ascii="Arial" w:hAnsi="Arial"/>
+                <w:color w:val="334155"/>
+                <w:sz w:val="17"/>
+              </w:rPr>
+              <w:t>Video #41</w:t>
+            </w:r>
+          </w:p>
+        </w:tc>
+        <w:tc>
+          <w:tcPr>
+            <w:tcW w:type="dxa" w:w="2880"/>
+            <w:tcMar>
+              <w:top w:w="80" w:type="dxa"/>
+              <w:bottom w:w="80" w:type="dxa"/>
+              <w:left w:w="100" w:type="dxa"/>
+              <w:right w:w="100" w:type="dxa"/>
+            </w:tcMar>
+            <w:shd w:fill="F8FAFC"/>
+          </w:tcPr>
+          <w:p>
+            <w:r>
+              <w:rPr>
+                <w:rFonts w:ascii="Arial" w:hAnsi="Arial"/>
+                <w:color w:val="334155"/>
+                <w:sz w:val="17"/>
+              </w:rPr>
+              <w:t>SQL Table Partitioning</w:t>
+            </w:r>
+          </w:p>
+        </w:tc>
+        <w:tc>
+          <w:tcPr>
+            <w:tcW w:type="dxa" w:w="2880"/>
+            <w:tcMar>
+              <w:top w:w="80" w:type="dxa"/>
+              <w:bottom w:w="80" w:type="dxa"/>
+              <w:left w:w="100" w:type="dxa"/>
+              <w:right w:w="100" w:type="dxa"/>
+            </w:tcMar>
+            <w:shd w:fill="F8FAFC"/>
+          </w:tcPr>
+          <w:p>
+            <w:r>
+              <w:rPr>
+                <w:rFonts w:ascii="Arial" w:hAnsi="Arial"/>
+                <w:color w:val="334155"/>
+                <w:sz w:val="17"/>
+              </w:rPr>
+              <w:t>Data Engineering storage architecture topic for multi-terabyte data warehouses.</w:t>
+            </w:r>
+          </w:p>
+        </w:tc>
+      </w:tr>
+      <w:tr>
+        <w:tc>
+          <w:tcPr>
+            <w:tcW w:type="dxa" w:w="2880"/>
+            <w:tcMar>
+              <w:top w:w="80" w:type="dxa"/>
+              <w:bottom w:w="80" w:type="dxa"/>
+              <w:left w:w="100" w:type="dxa"/>
+              <w:right w:w="100" w:type="dxa"/>
+            </w:tcMar>
+            <w:shd w:fill="FFFFFF"/>
+          </w:tcPr>
+          <w:p>
+            <w:r>
+              <w:rPr>
+                <w:rFonts w:ascii="Arial" w:hAnsi="Arial"/>
+                <w:color w:val="334155"/>
+                <w:sz w:val="17"/>
+              </w:rPr>
+              <w:t>Video #43</w:t>
+            </w:r>
+          </w:p>
+        </w:tc>
+        <w:tc>
+          <w:tcPr>
+            <w:tcW w:type="dxa" w:w="2880"/>
+            <w:tcMar>
+              <w:top w:w="80" w:type="dxa"/>
+              <w:bottom w:w="80" w:type="dxa"/>
+              <w:left w:w="100" w:type="dxa"/>
+              <w:right w:w="100" w:type="dxa"/>
+            </w:tcMar>
+            <w:shd w:fill="FFFFFF"/>
+          </w:tcPr>
+          <w:p>
+            <w:r>
+              <w:rPr>
+                <w:rFonts w:ascii="Arial" w:hAnsi="Arial"/>
+                <w:color w:val="334155"/>
+                <w:sz w:val="17"/>
+              </w:rPr>
+              <w:t>SQL Stored Procedure (Comprehensive Guide)</w:t>
+            </w:r>
+          </w:p>
+        </w:tc>
+        <w:tc>
+          <w:tcPr>
+            <w:tcW w:type="dxa" w:w="2880"/>
+            <w:tcMar>
+              <w:top w:w="80" w:type="dxa"/>
+              <w:bottom w:w="80" w:type="dxa"/>
+              <w:left w:w="100" w:type="dxa"/>
+              <w:right w:w="100" w:type="dxa"/>
+            </w:tcMar>
+            <w:shd w:fill="FFFFFF"/>
+          </w:tcPr>
+          <w:p>
+            <w:r>
+              <w:rPr>
+                <w:rFonts w:ascii="Arial" w:hAnsi="Arial"/>
+                <w:color w:val="334155"/>
+                <w:sz w:val="17"/>
+              </w:rPr>
+              <w:t>DBA / Backend Engineering topic; data analysts write SELECT queries, not stored procedures.</w:t>
+            </w:r>
+          </w:p>
+        </w:tc>
+      </w:tr>
+      <w:tr>
+        <w:tc>
+          <w:tcPr>
+            <w:tcW w:type="dxa" w:w="2880"/>
+            <w:tcMar>
+              <w:top w:w="80" w:type="dxa"/>
+              <w:bottom w:w="80" w:type="dxa"/>
+              <w:left w:w="100" w:type="dxa"/>
+              <w:right w:w="100" w:type="dxa"/>
+            </w:tcMar>
+            <w:shd w:fill="F8FAFC"/>
+          </w:tcPr>
+          <w:p>
+            <w:r>
+              <w:rPr>
+                <w:rFonts w:ascii="Arial" w:hAnsi="Arial"/>
+                <w:color w:val="334155"/>
+                <w:sz w:val="17"/>
+              </w:rPr>
+              <w:t>Video #44</w:t>
+            </w:r>
+          </w:p>
+        </w:tc>
+        <w:tc>
+          <w:tcPr>
+            <w:tcW w:type="dxa" w:w="2880"/>
+            <w:tcMar>
+              <w:top w:w="80" w:type="dxa"/>
+              <w:bottom w:w="80" w:type="dxa"/>
+              <w:left w:w="100" w:type="dxa"/>
+              <w:right w:w="100" w:type="dxa"/>
+            </w:tcMar>
+            <w:shd w:fill="F8FAFC"/>
+          </w:tcPr>
+          <w:p>
+            <w:r>
+              <w:rPr>
+                <w:rFonts w:ascii="Arial" w:hAnsi="Arial"/>
+                <w:color w:val="334155"/>
+                <w:sz w:val="17"/>
+              </w:rPr>
+              <w:t>SQL Triggers (Audit Logs Use Case)</w:t>
+            </w:r>
+          </w:p>
+        </w:tc>
+        <w:tc>
+          <w:tcPr>
+            <w:tcW w:type="dxa" w:w="2880"/>
+            <w:tcMar>
+              <w:top w:w="80" w:type="dxa"/>
+              <w:bottom w:w="80" w:type="dxa"/>
+              <w:left w:w="100" w:type="dxa"/>
+              <w:right w:w="100" w:type="dxa"/>
+            </w:tcMar>
+            <w:shd w:fill="F8FAFC"/>
+          </w:tcPr>
+          <w:p>
+            <w:r>
+              <w:rPr>
+                <w:rFonts w:ascii="Arial" w:hAnsi="Arial"/>
+                <w:color w:val="334155"/>
+                <w:sz w:val="17"/>
+              </w:rPr>
+              <w:t>Backend / Database Administrator topic; analysts do not write database triggers.</w:t>
+            </w:r>
+          </w:p>
+        </w:tc>
+      </w:tr>
+      <w:tr>
+        <w:tc>
+          <w:tcPr>
+            <w:tcW w:type="dxa" w:w="2880"/>
+            <w:tcMar>
+              <w:top w:w="80" w:type="dxa"/>
+              <w:bottom w:w="80" w:type="dxa"/>
+              <w:left w:w="100" w:type="dxa"/>
+              <w:right w:w="100" w:type="dxa"/>
+            </w:tcMar>
+            <w:shd w:fill="FFFFFF"/>
+          </w:tcPr>
+          <w:p>
+            <w:r>
+              <w:rPr>
+                <w:rFonts w:ascii="Arial" w:hAnsi="Arial"/>
+                <w:color w:val="334155"/>
+                <w:sz w:val="17"/>
+              </w:rPr>
+              <w:t>Videos #46–54</w:t>
+            </w:r>
+          </w:p>
+        </w:tc>
+        <w:tc>
+          <w:tcPr>
+            <w:tcW w:type="dxa" w:w="2880"/>
+            <w:tcMar>
+              <w:top w:w="80" w:type="dxa"/>
+              <w:bottom w:w="80" w:type="dxa"/>
+              <w:left w:w="100" w:type="dxa"/>
+              <w:right w:w="100" w:type="dxa"/>
+            </w:tcMar>
+            <w:shd w:fill="FFFFFF"/>
+          </w:tcPr>
+          <w:p>
+            <w:r>
+              <w:rPr>
+                <w:rFonts w:ascii="Arial" w:hAnsi="Arial"/>
+                <w:color w:val="334155"/>
+                <w:sz w:val="17"/>
+              </w:rPr>
+              <w:t>Data Warehouse &amp; Star Schema ETL Ingestion Pipeline Series (9 Videos)</w:t>
+            </w:r>
+          </w:p>
+        </w:tc>
+        <w:tc>
+          <w:tcPr>
+            <w:tcW w:type="dxa" w:w="2880"/>
+            <w:tcMar>
+              <w:top w:w="80" w:type="dxa"/>
+              <w:bottom w:w="80" w:type="dxa"/>
+              <w:left w:w="100" w:type="dxa"/>
+              <w:right w:w="100" w:type="dxa"/>
+            </w:tcMar>
+            <w:shd w:fill="FFFFFF"/>
+          </w:tcPr>
+          <w:p>
+            <w:r>
+              <w:rPr>
+                <w:rFonts w:ascii="Arial" w:hAnsi="Arial"/>
+                <w:color w:val="334155"/>
+                <w:sz w:val="17"/>
+              </w:rPr>
+              <w:t>Pure Data Engineering series (building Bronze/Silver/Gold DWH layers). Data Analysts query the data warehouse, they do not build ETL pipelines.</w:t>
+            </w:r>
+          </w:p>
+        </w:tc>
+      </w:tr>
+    </w:tbl>
+    <w:p>
+      <w:pPr>
+        <w:pStyle w:val="Heading1"/>
+        <w:spacing w:before="360" w:after="160"/>
+      </w:pPr>
+      <w:r>
+        <w:rPr>
+          <w:rFonts w:ascii="Arial" w:hAnsi="Arial"/>
+          <w:b/>
+          <w:color w:val="0EA5E9"/>
+          <w:sz w:val="36"/>
+        </w:rPr>
+        <w:t>4. Platform Strategy: DataLemur vs. StrataScratch</w:t>
       </w:r>
     </w:p>
     <w:p>
@@ -2107,7 +2546,7 @@
         <w:rPr>
           <w:b/>
         </w:rPr>
-        <w:t>⭐ START DATALEMUR FIRST (August 04 Onwards)</w:t>
+        <w:t>⭐ START DATALEMUR FIRST (August 01 Onwards)</w:t>
         <w:br/>
       </w:r>
       <w:r>
@@ -2137,7 +2576,7 @@
         <w:rPr>
           <w:b/>
         </w:rPr>
-        <w:t>🛠️ MOVE TO STRATASCRATCH SECOND (August 07 Onwards)</w:t>
+        <w:t>🛠️ MOVE TO STRATASCRATCH SECOND (August 04 Onwards)</w:t>
         <w:br/>
       </w:r>
       <w:r>
@@ -2167,7 +2606,7 @@
           <w:color w:val="0EA5E9"/>
           <w:sz w:val="36"/>
         </w:rPr>
-        <w:t>4. Completed Study History Archive (Last Pages)</w:t>
+        <w:t>5. Completed Study History Archive (Last Pages)</w:t>
       </w:r>
     </w:p>
     <w:tbl>

</xml_diff>

<commit_message>
Add interactive checkboxes (☐ / ☑) to master Word study roadmap document
</commit_message>
<xml_diff>
--- a/docs/DA_COMPLETE_STUDY_ROADMAP.docx
+++ b/docs/DA_COMPLETE_STUDY_ROADMAP.docx
@@ -14,7 +14,7 @@
           <w:color w:val="0F172A"/>
           <w:sz w:val="44"/>
         </w:rPr>
-        <w:t>Data Analyst Master Execution Roadmap (DA-Focused)</w:t>
+        <w:t>Data Analyst Master Execution Roadmap &amp; Interactive Checklist</w:t>
       </w:r>
     </w:p>
     <w:p>
@@ -28,7 +28,7 @@
           <w:color w:val="0EA5E9"/>
           <w:sz w:val="22"/>
         </w:rPr>
-        <w:t>Filtered Pure Data Analyst Syllabus | Bypassed DE/DBA Topics | DataLemur First Strategy</w:t>
+        <w:t>Interactive Checkbox Tracker (☐ / ☑) | Multi-Module App Acceleration | DataLemur Strategy</w:t>
       </w:r>
     </w:p>
     <w:p>
@@ -43,7 +43,7 @@
           <w:color w:val="0EA5E9"/>
           <w:sz w:val="36"/>
         </w:rPr>
-        <w:t>1. Executive Status &amp; DA Scope Filter</w:t>
+        <w:t>1. Executive Status &amp; Progress Checklist</w:t>
       </w:r>
     </w:p>
     <w:p>
@@ -64,7 +64,7 @@
         <w:t xml:space="preserve">• Completed Video Archive: </w:t>
       </w:r>
       <w:r>
-        <w:t>Videos #1 to #29 (SQL Basics up to CTEs WITH clause) [✅ COMPLETED]</w:t>
+        <w:t>Videos #1 to #29 (SQL Basics up to CTEs WITH clause) [☑ COMPLETED]</w:t>
         <w:br/>
       </w:r>
       <w:r>
@@ -74,7 +74,7 @@
         <w:t xml:space="preserve">• TODAY's Video Target: </w:t>
       </w:r>
       <w:r>
-        <w:t>Video #30 — SQL Views (6 Top Use Cases) [🎯 WATCH TODAY JULY 24]</w:t>
+        <w:t>Video #30 — SQL Views (6 Top Use Cases) [☐ TODAY's TARGET]</w:t>
         <w:br/>
       </w:r>
       <w:r>
@@ -109,7 +109,7 @@
           <w:color w:val="0EA5E9"/>
           <w:sz w:val="36"/>
         </w:rPr>
-        <w:t>2. Streamlined Day-by-Day DA Execution Plan (Upcoming First)</w:t>
+        <w:t>2. Interactive Day-by-Day Execution Checklist (☐ / ☑)</w:t>
       </w:r>
     </w:p>
     <w:tbl>
@@ -119,16 +119,40 @@
         <w:tblLook w:firstColumn="1" w:firstRow="1" w:lastColumn="0" w:lastRow="0" w:noHBand="0" w:noVBand="1" w:val="04A0"/>
       </w:tblPr>
       <w:tblGrid>
-        <w:gridCol w:w="1728"/>
-        <w:gridCol w:w="1728"/>
-        <w:gridCol w:w="1728"/>
-        <w:gridCol w:w="1728"/>
-        <w:gridCol w:w="1728"/>
+        <w:gridCol w:w="1440"/>
+        <w:gridCol w:w="1440"/>
+        <w:gridCol w:w="1440"/>
+        <w:gridCol w:w="1440"/>
+        <w:gridCol w:w="1440"/>
+        <w:gridCol w:w="1440"/>
       </w:tblGrid>
       <w:tr>
         <w:tc>
           <w:tcPr>
-            <w:tcW w:type="dxa" w:w="1728"/>
+            <w:tcW w:type="dxa" w:w="1440"/>
+            <w:tcMar>
+              <w:top w:w="100" w:type="dxa"/>
+              <w:bottom w:w="100" w:type="dxa"/>
+              <w:left w:w="100" w:type="dxa"/>
+              <w:right w:w="100" w:type="dxa"/>
+            </w:tcMar>
+            <w:shd w:fill="0F172A"/>
+          </w:tcPr>
+          <w:p>
+            <w:r>
+              <w:rPr>
+                <w:rFonts w:ascii="Arial" w:hAnsi="Arial"/>
+                <w:b/>
+                <w:color w:val="FFFFFF"/>
+                <w:sz w:val="19"/>
+              </w:rPr>
+              <w:t>Check</w:t>
+            </w:r>
+          </w:p>
+        </w:tc>
+        <w:tc>
+          <w:tcPr>
+            <w:tcW w:type="dxa" w:w="1440"/>
             <w:tcMar>
               <w:top w:w="100" w:type="dxa"/>
               <w:bottom w:w="100" w:type="dxa"/>
@@ -151,7 +175,7 @@
         </w:tc>
         <w:tc>
           <w:tcPr>
-            <w:tcW w:type="dxa" w:w="1728"/>
+            <w:tcW w:type="dxa" w:w="1440"/>
             <w:tcMar>
               <w:top w:w="100" w:type="dxa"/>
               <w:bottom w:w="100" w:type="dxa"/>
@@ -168,13 +192,13 @@
                 <w:color w:val="FFFFFF"/>
                 <w:sz w:val="19"/>
               </w:rPr>
-              <w:t>DA Essential YouTube Video Target &amp; Timestamp</w:t>
+              <w:t>DA Essential YouTube Video Target</w:t>
             </w:r>
           </w:p>
         </w:tc>
         <w:tc>
           <w:tcPr>
-            <w:tcW w:type="dxa" w:w="1728"/>
+            <w:tcW w:type="dxa" w:w="1440"/>
             <w:tcMar>
               <w:top w:w="100" w:type="dxa"/>
               <w:bottom w:w="100" w:type="dxa"/>
@@ -191,13 +215,13 @@
                 <w:color w:val="FFFFFF"/>
                 <w:sz w:val="19"/>
               </w:rPr>
-              <w:t>SQL Analyst Academy App Modules (Multi-Module/Day)</w:t>
+              <w:t>SQL Analyst Academy App Modules</w:t>
             </w:r>
           </w:p>
         </w:tc>
         <w:tc>
           <w:tcPr>
-            <w:tcW w:type="dxa" w:w="1728"/>
+            <w:tcW w:type="dxa" w:w="1440"/>
             <w:tcMar>
               <w:top w:w="100" w:type="dxa"/>
               <w:bottom w:w="100" w:type="dxa"/>
@@ -220,7 +244,7 @@
         </w:tc>
         <w:tc>
           <w:tcPr>
-            <w:tcW w:type="dxa" w:w="1728"/>
+            <w:tcW w:type="dxa" w:w="1440"/>
             <w:tcMar>
               <w:top w:w="100" w:type="dxa"/>
               <w:bottom w:w="100" w:type="dxa"/>
@@ -245,7 +269,29 @@
       <w:tr>
         <w:tc>
           <w:tcPr>
-            <w:tcW w:type="dxa" w:w="1728"/>
+            <w:tcW w:type="dxa" w:w="1440"/>
+            <w:tcMar>
+              <w:top w:w="80" w:type="dxa"/>
+              <w:bottom w:w="80" w:type="dxa"/>
+              <w:left w:w="100" w:type="dxa"/>
+              <w:right w:w="100" w:type="dxa"/>
+            </w:tcMar>
+            <w:shd w:fill="FFFFFF"/>
+          </w:tcPr>
+          <w:p>
+            <w:r>
+              <w:rPr>
+                <w:rFonts w:ascii="Arial" w:hAnsi="Arial"/>
+                <w:color w:val="334155"/>
+                <w:sz w:val="17"/>
+              </w:rPr>
+              <w:t>☐</w:t>
+            </w:r>
+          </w:p>
+        </w:tc>
+        <w:tc>
+          <w:tcPr>
+            <w:tcW w:type="dxa" w:w="1440"/>
             <w:tcMar>
               <w:top w:w="80" w:type="dxa"/>
               <w:bottom w:w="80" w:type="dxa"/>
@@ -269,7 +315,7 @@
         </w:tc>
         <w:tc>
           <w:tcPr>
-            <w:tcW w:type="dxa" w:w="1728"/>
+            <w:tcW w:type="dxa" w:w="1440"/>
             <w:tcMar>
               <w:top w:w="80" w:type="dxa"/>
               <w:bottom w:w="80" w:type="dxa"/>
@@ -293,7 +339,7 @@
         </w:tc>
         <w:tc>
           <w:tcPr>
-            <w:tcW w:type="dxa" w:w="1728"/>
+            <w:tcW w:type="dxa" w:w="1440"/>
             <w:tcMar>
               <w:top w:w="80" w:type="dxa"/>
               <w:bottom w:w="80" w:type="dxa"/>
@@ -315,7 +361,7 @@
         </w:tc>
         <w:tc>
           <w:tcPr>
-            <w:tcW w:type="dxa" w:w="1728"/>
+            <w:tcW w:type="dxa" w:w="1440"/>
             <w:tcMar>
               <w:top w:w="80" w:type="dxa"/>
               <w:bottom w:w="80" w:type="dxa"/>
@@ -337,7 +383,7 @@
         </w:tc>
         <w:tc>
           <w:tcPr>
-            <w:tcW w:type="dxa" w:w="1728"/>
+            <w:tcW w:type="dxa" w:w="1440"/>
             <w:tcMar>
               <w:top w:w="80" w:type="dxa"/>
               <w:bottom w:w="80" w:type="dxa"/>
@@ -361,7 +407,29 @@
       <w:tr>
         <w:tc>
           <w:tcPr>
-            <w:tcW w:type="dxa" w:w="1728"/>
+            <w:tcW w:type="dxa" w:w="1440"/>
+            <w:tcMar>
+              <w:top w:w="80" w:type="dxa"/>
+              <w:bottom w:w="80" w:type="dxa"/>
+              <w:left w:w="100" w:type="dxa"/>
+              <w:right w:w="100" w:type="dxa"/>
+            </w:tcMar>
+            <w:shd w:fill="F8FAFC"/>
+          </w:tcPr>
+          <w:p>
+            <w:r>
+              <w:rPr>
+                <w:rFonts w:ascii="Arial" w:hAnsi="Arial"/>
+                <w:color w:val="334155"/>
+                <w:sz w:val="17"/>
+              </w:rPr>
+              <w:t>☐</w:t>
+            </w:r>
+          </w:p>
+        </w:tc>
+        <w:tc>
+          <w:tcPr>
+            <w:tcW w:type="dxa" w:w="1440"/>
             <w:tcMar>
               <w:top w:w="80" w:type="dxa"/>
               <w:bottom w:w="80" w:type="dxa"/>
@@ -385,7 +453,7 @@
         </w:tc>
         <w:tc>
           <w:tcPr>
-            <w:tcW w:type="dxa" w:w="1728"/>
+            <w:tcW w:type="dxa" w:w="1440"/>
             <w:tcMar>
               <w:top w:w="80" w:type="dxa"/>
               <w:bottom w:w="80" w:type="dxa"/>
@@ -409,7 +477,7 @@
         </w:tc>
         <w:tc>
           <w:tcPr>
-            <w:tcW w:type="dxa" w:w="1728"/>
+            <w:tcW w:type="dxa" w:w="1440"/>
             <w:tcMar>
               <w:top w:w="80" w:type="dxa"/>
               <w:bottom w:w="80" w:type="dxa"/>
@@ -431,7 +499,7 @@
         </w:tc>
         <w:tc>
           <w:tcPr>
-            <w:tcW w:type="dxa" w:w="1728"/>
+            <w:tcW w:type="dxa" w:w="1440"/>
             <w:tcMar>
               <w:top w:w="80" w:type="dxa"/>
               <w:bottom w:w="80" w:type="dxa"/>
@@ -453,7 +521,7 @@
         </w:tc>
         <w:tc>
           <w:tcPr>
-            <w:tcW w:type="dxa" w:w="1728"/>
+            <w:tcW w:type="dxa" w:w="1440"/>
             <w:tcMar>
               <w:top w:w="80" w:type="dxa"/>
               <w:bottom w:w="80" w:type="dxa"/>
@@ -477,7 +545,29 @@
       <w:tr>
         <w:tc>
           <w:tcPr>
-            <w:tcW w:type="dxa" w:w="1728"/>
+            <w:tcW w:type="dxa" w:w="1440"/>
+            <w:tcMar>
+              <w:top w:w="80" w:type="dxa"/>
+              <w:bottom w:w="80" w:type="dxa"/>
+              <w:left w:w="100" w:type="dxa"/>
+              <w:right w:w="100" w:type="dxa"/>
+            </w:tcMar>
+            <w:shd w:fill="FFFFFF"/>
+          </w:tcPr>
+          <w:p>
+            <w:r>
+              <w:rPr>
+                <w:rFonts w:ascii="Arial" w:hAnsi="Arial"/>
+                <w:color w:val="334155"/>
+                <w:sz w:val="17"/>
+              </w:rPr>
+              <w:t>☐</w:t>
+            </w:r>
+          </w:p>
+        </w:tc>
+        <w:tc>
+          <w:tcPr>
+            <w:tcW w:type="dxa" w:w="1440"/>
             <w:tcMar>
               <w:top w:w="80" w:type="dxa"/>
               <w:bottom w:w="80" w:type="dxa"/>
@@ -501,7 +591,7 @@
         </w:tc>
         <w:tc>
           <w:tcPr>
-            <w:tcW w:type="dxa" w:w="1728"/>
+            <w:tcW w:type="dxa" w:w="1440"/>
             <w:tcMar>
               <w:top w:w="80" w:type="dxa"/>
               <w:bottom w:w="80" w:type="dxa"/>
@@ -525,7 +615,7 @@
         </w:tc>
         <w:tc>
           <w:tcPr>
-            <w:tcW w:type="dxa" w:w="1728"/>
+            <w:tcW w:type="dxa" w:w="1440"/>
             <w:tcMar>
               <w:top w:w="80" w:type="dxa"/>
               <w:bottom w:w="80" w:type="dxa"/>
@@ -547,7 +637,7 @@
         </w:tc>
         <w:tc>
           <w:tcPr>
-            <w:tcW w:type="dxa" w:w="1728"/>
+            <w:tcW w:type="dxa" w:w="1440"/>
             <w:tcMar>
               <w:top w:w="80" w:type="dxa"/>
               <w:bottom w:w="80" w:type="dxa"/>
@@ -569,7 +659,7 @@
         </w:tc>
         <w:tc>
           <w:tcPr>
-            <w:tcW w:type="dxa" w:w="1728"/>
+            <w:tcW w:type="dxa" w:w="1440"/>
             <w:tcMar>
               <w:top w:w="80" w:type="dxa"/>
               <w:bottom w:w="80" w:type="dxa"/>
@@ -593,7 +683,29 @@
       <w:tr>
         <w:tc>
           <w:tcPr>
-            <w:tcW w:type="dxa" w:w="1728"/>
+            <w:tcW w:type="dxa" w:w="1440"/>
+            <w:tcMar>
+              <w:top w:w="80" w:type="dxa"/>
+              <w:bottom w:w="80" w:type="dxa"/>
+              <w:left w:w="100" w:type="dxa"/>
+              <w:right w:w="100" w:type="dxa"/>
+            </w:tcMar>
+            <w:shd w:fill="F8FAFC"/>
+          </w:tcPr>
+          <w:p>
+            <w:r>
+              <w:rPr>
+                <w:rFonts w:ascii="Arial" w:hAnsi="Arial"/>
+                <w:color w:val="334155"/>
+                <w:sz w:val="17"/>
+              </w:rPr>
+              <w:t>☐</w:t>
+            </w:r>
+          </w:p>
+        </w:tc>
+        <w:tc>
+          <w:tcPr>
+            <w:tcW w:type="dxa" w:w="1440"/>
             <w:tcMar>
               <w:top w:w="80" w:type="dxa"/>
               <w:bottom w:w="80" w:type="dxa"/>
@@ -617,7 +729,7 @@
         </w:tc>
         <w:tc>
           <w:tcPr>
-            <w:tcW w:type="dxa" w:w="1728"/>
+            <w:tcW w:type="dxa" w:w="1440"/>
             <w:tcMar>
               <w:top w:w="80" w:type="dxa"/>
               <w:bottom w:w="80" w:type="dxa"/>
@@ -641,7 +753,7 @@
         </w:tc>
         <w:tc>
           <w:tcPr>
-            <w:tcW w:type="dxa" w:w="1728"/>
+            <w:tcW w:type="dxa" w:w="1440"/>
             <w:tcMar>
               <w:top w:w="80" w:type="dxa"/>
               <w:bottom w:w="80" w:type="dxa"/>
@@ -663,7 +775,7 @@
         </w:tc>
         <w:tc>
           <w:tcPr>
-            <w:tcW w:type="dxa" w:w="1728"/>
+            <w:tcW w:type="dxa" w:w="1440"/>
             <w:tcMar>
               <w:top w:w="80" w:type="dxa"/>
               <w:bottom w:w="80" w:type="dxa"/>
@@ -685,7 +797,7 @@
         </w:tc>
         <w:tc>
           <w:tcPr>
-            <w:tcW w:type="dxa" w:w="1728"/>
+            <w:tcW w:type="dxa" w:w="1440"/>
             <w:tcMar>
               <w:top w:w="80" w:type="dxa"/>
               <w:bottom w:w="80" w:type="dxa"/>
@@ -709,7 +821,29 @@
       <w:tr>
         <w:tc>
           <w:tcPr>
-            <w:tcW w:type="dxa" w:w="1728"/>
+            <w:tcW w:type="dxa" w:w="1440"/>
+            <w:tcMar>
+              <w:top w:w="80" w:type="dxa"/>
+              <w:bottom w:w="80" w:type="dxa"/>
+              <w:left w:w="100" w:type="dxa"/>
+              <w:right w:w="100" w:type="dxa"/>
+            </w:tcMar>
+            <w:shd w:fill="FFFFFF"/>
+          </w:tcPr>
+          <w:p>
+            <w:r>
+              <w:rPr>
+                <w:rFonts w:ascii="Arial" w:hAnsi="Arial"/>
+                <w:color w:val="334155"/>
+                <w:sz w:val="17"/>
+              </w:rPr>
+              <w:t>☐</w:t>
+            </w:r>
+          </w:p>
+        </w:tc>
+        <w:tc>
+          <w:tcPr>
+            <w:tcW w:type="dxa" w:w="1440"/>
             <w:tcMar>
               <w:top w:w="80" w:type="dxa"/>
               <w:bottom w:w="80" w:type="dxa"/>
@@ -733,7 +867,7 @@
         </w:tc>
         <w:tc>
           <w:tcPr>
-            <w:tcW w:type="dxa" w:w="1728"/>
+            <w:tcW w:type="dxa" w:w="1440"/>
             <w:tcMar>
               <w:top w:w="80" w:type="dxa"/>
               <w:bottom w:w="80" w:type="dxa"/>
@@ -757,7 +891,7 @@
         </w:tc>
         <w:tc>
           <w:tcPr>
-            <w:tcW w:type="dxa" w:w="1728"/>
+            <w:tcW w:type="dxa" w:w="1440"/>
             <w:tcMar>
               <w:top w:w="80" w:type="dxa"/>
               <w:bottom w:w="80" w:type="dxa"/>
@@ -779,7 +913,7 @@
         </w:tc>
         <w:tc>
           <w:tcPr>
-            <w:tcW w:type="dxa" w:w="1728"/>
+            <w:tcW w:type="dxa" w:w="1440"/>
             <w:tcMar>
               <w:top w:w="80" w:type="dxa"/>
               <w:bottom w:w="80" w:type="dxa"/>
@@ -801,7 +935,7 @@
         </w:tc>
         <w:tc>
           <w:tcPr>
-            <w:tcW w:type="dxa" w:w="1728"/>
+            <w:tcW w:type="dxa" w:w="1440"/>
             <w:tcMar>
               <w:top w:w="80" w:type="dxa"/>
               <w:bottom w:w="80" w:type="dxa"/>
@@ -825,7 +959,29 @@
       <w:tr>
         <w:tc>
           <w:tcPr>
-            <w:tcW w:type="dxa" w:w="1728"/>
+            <w:tcW w:type="dxa" w:w="1440"/>
+            <w:tcMar>
+              <w:top w:w="80" w:type="dxa"/>
+              <w:bottom w:w="80" w:type="dxa"/>
+              <w:left w:w="100" w:type="dxa"/>
+              <w:right w:w="100" w:type="dxa"/>
+            </w:tcMar>
+            <w:shd w:fill="F8FAFC"/>
+          </w:tcPr>
+          <w:p>
+            <w:r>
+              <w:rPr>
+                <w:rFonts w:ascii="Arial" w:hAnsi="Arial"/>
+                <w:color w:val="334155"/>
+                <w:sz w:val="17"/>
+              </w:rPr>
+              <w:t>☐</w:t>
+            </w:r>
+          </w:p>
+        </w:tc>
+        <w:tc>
+          <w:tcPr>
+            <w:tcW w:type="dxa" w:w="1440"/>
             <w:tcMar>
               <w:top w:w="80" w:type="dxa"/>
               <w:bottom w:w="80" w:type="dxa"/>
@@ -849,7 +1005,7 @@
         </w:tc>
         <w:tc>
           <w:tcPr>
-            <w:tcW w:type="dxa" w:w="1728"/>
+            <w:tcW w:type="dxa" w:w="1440"/>
             <w:tcMar>
               <w:top w:w="80" w:type="dxa"/>
               <w:bottom w:w="80" w:type="dxa"/>
@@ -873,7 +1029,7 @@
         </w:tc>
         <w:tc>
           <w:tcPr>
-            <w:tcW w:type="dxa" w:w="1728"/>
+            <w:tcW w:type="dxa" w:w="1440"/>
             <w:tcMar>
               <w:top w:w="80" w:type="dxa"/>
               <w:bottom w:w="80" w:type="dxa"/>
@@ -895,7 +1051,7 @@
         </w:tc>
         <w:tc>
           <w:tcPr>
-            <w:tcW w:type="dxa" w:w="1728"/>
+            <w:tcW w:type="dxa" w:w="1440"/>
             <w:tcMar>
               <w:top w:w="80" w:type="dxa"/>
               <w:bottom w:w="80" w:type="dxa"/>
@@ -917,7 +1073,7 @@
         </w:tc>
         <w:tc>
           <w:tcPr>
-            <w:tcW w:type="dxa" w:w="1728"/>
+            <w:tcW w:type="dxa" w:w="1440"/>
             <w:tcMar>
               <w:top w:w="80" w:type="dxa"/>
               <w:bottom w:w="80" w:type="dxa"/>
@@ -941,7 +1097,29 @@
       <w:tr>
         <w:tc>
           <w:tcPr>
-            <w:tcW w:type="dxa" w:w="1728"/>
+            <w:tcW w:type="dxa" w:w="1440"/>
+            <w:tcMar>
+              <w:top w:w="80" w:type="dxa"/>
+              <w:bottom w:w="80" w:type="dxa"/>
+              <w:left w:w="100" w:type="dxa"/>
+              <w:right w:w="100" w:type="dxa"/>
+            </w:tcMar>
+            <w:shd w:fill="FFFFFF"/>
+          </w:tcPr>
+          <w:p>
+            <w:r>
+              <w:rPr>
+                <w:rFonts w:ascii="Arial" w:hAnsi="Arial"/>
+                <w:color w:val="334155"/>
+                <w:sz w:val="17"/>
+              </w:rPr>
+              <w:t>☐</w:t>
+            </w:r>
+          </w:p>
+        </w:tc>
+        <w:tc>
+          <w:tcPr>
+            <w:tcW w:type="dxa" w:w="1440"/>
             <w:tcMar>
               <w:top w:w="80" w:type="dxa"/>
               <w:bottom w:w="80" w:type="dxa"/>
@@ -965,7 +1143,7 @@
         </w:tc>
         <w:tc>
           <w:tcPr>
-            <w:tcW w:type="dxa" w:w="1728"/>
+            <w:tcW w:type="dxa" w:w="1440"/>
             <w:tcMar>
               <w:top w:w="80" w:type="dxa"/>
               <w:bottom w:w="80" w:type="dxa"/>
@@ -989,7 +1167,7 @@
         </w:tc>
         <w:tc>
           <w:tcPr>
-            <w:tcW w:type="dxa" w:w="1728"/>
+            <w:tcW w:type="dxa" w:w="1440"/>
             <w:tcMar>
               <w:top w:w="80" w:type="dxa"/>
               <w:bottom w:w="80" w:type="dxa"/>
@@ -1011,7 +1189,7 @@
         </w:tc>
         <w:tc>
           <w:tcPr>
-            <w:tcW w:type="dxa" w:w="1728"/>
+            <w:tcW w:type="dxa" w:w="1440"/>
             <w:tcMar>
               <w:top w:w="80" w:type="dxa"/>
               <w:bottom w:w="80" w:type="dxa"/>
@@ -1033,7 +1211,7 @@
         </w:tc>
         <w:tc>
           <w:tcPr>
-            <w:tcW w:type="dxa" w:w="1728"/>
+            <w:tcW w:type="dxa" w:w="1440"/>
             <w:tcMar>
               <w:top w:w="80" w:type="dxa"/>
               <w:bottom w:w="80" w:type="dxa"/>
@@ -1057,7 +1235,29 @@
       <w:tr>
         <w:tc>
           <w:tcPr>
-            <w:tcW w:type="dxa" w:w="1728"/>
+            <w:tcW w:type="dxa" w:w="1440"/>
+            <w:tcMar>
+              <w:top w:w="80" w:type="dxa"/>
+              <w:bottom w:w="80" w:type="dxa"/>
+              <w:left w:w="100" w:type="dxa"/>
+              <w:right w:w="100" w:type="dxa"/>
+            </w:tcMar>
+            <w:shd w:fill="F8FAFC"/>
+          </w:tcPr>
+          <w:p>
+            <w:r>
+              <w:rPr>
+                <w:rFonts w:ascii="Arial" w:hAnsi="Arial"/>
+                <w:color w:val="334155"/>
+                <w:sz w:val="17"/>
+              </w:rPr>
+              <w:t>☐</w:t>
+            </w:r>
+          </w:p>
+        </w:tc>
+        <w:tc>
+          <w:tcPr>
+            <w:tcW w:type="dxa" w:w="1440"/>
             <w:tcMar>
               <w:top w:w="80" w:type="dxa"/>
               <w:bottom w:w="80" w:type="dxa"/>
@@ -1081,7 +1281,7 @@
         </w:tc>
         <w:tc>
           <w:tcPr>
-            <w:tcW w:type="dxa" w:w="1728"/>
+            <w:tcW w:type="dxa" w:w="1440"/>
             <w:tcMar>
               <w:top w:w="80" w:type="dxa"/>
               <w:bottom w:w="80" w:type="dxa"/>
@@ -1103,7 +1303,7 @@
         </w:tc>
         <w:tc>
           <w:tcPr>
-            <w:tcW w:type="dxa" w:w="1728"/>
+            <w:tcW w:type="dxa" w:w="1440"/>
             <w:tcMar>
               <w:top w:w="80" w:type="dxa"/>
               <w:bottom w:w="80" w:type="dxa"/>
@@ -1125,7 +1325,7 @@
         </w:tc>
         <w:tc>
           <w:tcPr>
-            <w:tcW w:type="dxa" w:w="1728"/>
+            <w:tcW w:type="dxa" w:w="1440"/>
             <w:tcMar>
               <w:top w:w="80" w:type="dxa"/>
               <w:bottom w:w="80" w:type="dxa"/>
@@ -1147,7 +1347,7 @@
         </w:tc>
         <w:tc>
           <w:tcPr>
-            <w:tcW w:type="dxa" w:w="1728"/>
+            <w:tcW w:type="dxa" w:w="1440"/>
             <w:tcMar>
               <w:top w:w="80" w:type="dxa"/>
               <w:bottom w:w="80" w:type="dxa"/>
@@ -1163,7 +1363,7 @@
                 <w:color w:val="334155"/>
                 <w:sz w:val="17"/>
               </w:rPr>
-              <w:t>🚀 PORTFOLIO GITHUB PUSH</w:t>
+              <w:t>🚀 GITHUB PUSH</w:t>
             </w:r>
           </w:p>
         </w:tc>
@@ -1171,7 +1371,29 @@
       <w:tr>
         <w:tc>
           <w:tcPr>
-            <w:tcW w:type="dxa" w:w="1728"/>
+            <w:tcW w:type="dxa" w:w="1440"/>
+            <w:tcMar>
+              <w:top w:w="80" w:type="dxa"/>
+              <w:bottom w:w="80" w:type="dxa"/>
+              <w:left w:w="100" w:type="dxa"/>
+              <w:right w:w="100" w:type="dxa"/>
+            </w:tcMar>
+            <w:shd w:fill="FFFFFF"/>
+          </w:tcPr>
+          <w:p>
+            <w:r>
+              <w:rPr>
+                <w:rFonts w:ascii="Arial" w:hAnsi="Arial"/>
+                <w:color w:val="334155"/>
+                <w:sz w:val="17"/>
+              </w:rPr>
+              <w:t>☐</w:t>
+            </w:r>
+          </w:p>
+        </w:tc>
+        <w:tc>
+          <w:tcPr>
+            <w:tcW w:type="dxa" w:w="1440"/>
             <w:tcMar>
               <w:top w:w="80" w:type="dxa"/>
               <w:bottom w:w="80" w:type="dxa"/>
@@ -1195,7 +1417,7 @@
         </w:tc>
         <w:tc>
           <w:tcPr>
-            <w:tcW w:type="dxa" w:w="1728"/>
+            <w:tcW w:type="dxa" w:w="1440"/>
             <w:tcMar>
               <w:top w:w="80" w:type="dxa"/>
               <w:bottom w:w="80" w:type="dxa"/>
@@ -1217,7 +1439,7 @@
         </w:tc>
         <w:tc>
           <w:tcPr>
-            <w:tcW w:type="dxa" w:w="1728"/>
+            <w:tcW w:type="dxa" w:w="1440"/>
             <w:tcMar>
               <w:top w:w="80" w:type="dxa"/>
               <w:bottom w:w="80" w:type="dxa"/>
@@ -1239,7 +1461,7 @@
         </w:tc>
         <w:tc>
           <w:tcPr>
-            <w:tcW w:type="dxa" w:w="1728"/>
+            <w:tcW w:type="dxa" w:w="1440"/>
             <w:tcMar>
               <w:top w:w="80" w:type="dxa"/>
               <w:bottom w:w="80" w:type="dxa"/>
@@ -1261,7 +1483,7 @@
         </w:tc>
         <w:tc>
           <w:tcPr>
-            <w:tcW w:type="dxa" w:w="1728"/>
+            <w:tcW w:type="dxa" w:w="1440"/>
             <w:tcMar>
               <w:top w:w="80" w:type="dxa"/>
               <w:bottom w:w="80" w:type="dxa"/>
@@ -1285,7 +1507,29 @@
       <w:tr>
         <w:tc>
           <w:tcPr>
-            <w:tcW w:type="dxa" w:w="1728"/>
+            <w:tcW w:type="dxa" w:w="1440"/>
+            <w:tcMar>
+              <w:top w:w="80" w:type="dxa"/>
+              <w:bottom w:w="80" w:type="dxa"/>
+              <w:left w:w="100" w:type="dxa"/>
+              <w:right w:w="100" w:type="dxa"/>
+            </w:tcMar>
+            <w:shd w:fill="F8FAFC"/>
+          </w:tcPr>
+          <w:p>
+            <w:r>
+              <w:rPr>
+                <w:rFonts w:ascii="Arial" w:hAnsi="Arial"/>
+                <w:color w:val="334155"/>
+                <w:sz w:val="17"/>
+              </w:rPr>
+              <w:t>☐</w:t>
+            </w:r>
+          </w:p>
+        </w:tc>
+        <w:tc>
+          <w:tcPr>
+            <w:tcW w:type="dxa" w:w="1440"/>
             <w:tcMar>
               <w:top w:w="80" w:type="dxa"/>
               <w:bottom w:w="80" w:type="dxa"/>
@@ -1309,7 +1553,7 @@
         </w:tc>
         <w:tc>
           <w:tcPr>
-            <w:tcW w:type="dxa" w:w="1728"/>
+            <w:tcW w:type="dxa" w:w="1440"/>
             <w:tcMar>
               <w:top w:w="80" w:type="dxa"/>
               <w:bottom w:w="80" w:type="dxa"/>
@@ -1331,7 +1575,7 @@
         </w:tc>
         <w:tc>
           <w:tcPr>
-            <w:tcW w:type="dxa" w:w="1728"/>
+            <w:tcW w:type="dxa" w:w="1440"/>
             <w:tcMar>
               <w:top w:w="80" w:type="dxa"/>
               <w:bottom w:w="80" w:type="dxa"/>
@@ -1353,7 +1597,7 @@
         </w:tc>
         <w:tc>
           <w:tcPr>
-            <w:tcW w:type="dxa" w:w="1728"/>
+            <w:tcW w:type="dxa" w:w="1440"/>
             <w:tcMar>
               <w:top w:w="80" w:type="dxa"/>
               <w:bottom w:w="80" w:type="dxa"/>
@@ -1375,7 +1619,7 @@
         </w:tc>
         <w:tc>
           <w:tcPr>
-            <w:tcW w:type="dxa" w:w="1728"/>
+            <w:tcW w:type="dxa" w:w="1440"/>
             <w:tcMar>
               <w:top w:w="80" w:type="dxa"/>
               <w:bottom w:w="80" w:type="dxa"/>
@@ -1399,7 +1643,29 @@
       <w:tr>
         <w:tc>
           <w:tcPr>
-            <w:tcW w:type="dxa" w:w="1728"/>
+            <w:tcW w:type="dxa" w:w="1440"/>
+            <w:tcMar>
+              <w:top w:w="80" w:type="dxa"/>
+              <w:bottom w:w="80" w:type="dxa"/>
+              <w:left w:w="100" w:type="dxa"/>
+              <w:right w:w="100" w:type="dxa"/>
+            </w:tcMar>
+            <w:shd w:fill="FFFFFF"/>
+          </w:tcPr>
+          <w:p>
+            <w:r>
+              <w:rPr>
+                <w:rFonts w:ascii="Arial" w:hAnsi="Arial"/>
+                <w:color w:val="334155"/>
+                <w:sz w:val="17"/>
+              </w:rPr>
+              <w:t>☐</w:t>
+            </w:r>
+          </w:p>
+        </w:tc>
+        <w:tc>
+          <w:tcPr>
+            <w:tcW w:type="dxa" w:w="1440"/>
             <w:tcMar>
               <w:top w:w="80" w:type="dxa"/>
               <w:bottom w:w="80" w:type="dxa"/>
@@ -1423,7 +1689,7 @@
         </w:tc>
         <w:tc>
           <w:tcPr>
-            <w:tcW w:type="dxa" w:w="1728"/>
+            <w:tcW w:type="dxa" w:w="1440"/>
             <w:tcMar>
               <w:top w:w="80" w:type="dxa"/>
               <w:bottom w:w="80" w:type="dxa"/>
@@ -1445,7 +1711,7 @@
         </w:tc>
         <w:tc>
           <w:tcPr>
-            <w:tcW w:type="dxa" w:w="1728"/>
+            <w:tcW w:type="dxa" w:w="1440"/>
             <w:tcMar>
               <w:top w:w="80" w:type="dxa"/>
               <w:bottom w:w="80" w:type="dxa"/>
@@ -1467,7 +1733,7 @@
         </w:tc>
         <w:tc>
           <w:tcPr>
-            <w:tcW w:type="dxa" w:w="1728"/>
+            <w:tcW w:type="dxa" w:w="1440"/>
             <w:tcMar>
               <w:top w:w="80" w:type="dxa"/>
               <w:bottom w:w="80" w:type="dxa"/>
@@ -1489,7 +1755,7 @@
         </w:tc>
         <w:tc>
           <w:tcPr>
-            <w:tcW w:type="dxa" w:w="1728"/>
+            <w:tcW w:type="dxa" w:w="1440"/>
             <w:tcMar>
               <w:top w:w="80" w:type="dxa"/>
               <w:bottom w:w="80" w:type="dxa"/>
@@ -1513,7 +1779,29 @@
       <w:tr>
         <w:tc>
           <w:tcPr>
-            <w:tcW w:type="dxa" w:w="1728"/>
+            <w:tcW w:type="dxa" w:w="1440"/>
+            <w:tcMar>
+              <w:top w:w="80" w:type="dxa"/>
+              <w:bottom w:w="80" w:type="dxa"/>
+              <w:left w:w="100" w:type="dxa"/>
+              <w:right w:w="100" w:type="dxa"/>
+            </w:tcMar>
+            <w:shd w:fill="F8FAFC"/>
+          </w:tcPr>
+          <w:p>
+            <w:r>
+              <w:rPr>
+                <w:rFonts w:ascii="Arial" w:hAnsi="Arial"/>
+                <w:color w:val="334155"/>
+                <w:sz w:val="17"/>
+              </w:rPr>
+              <w:t>☐</w:t>
+            </w:r>
+          </w:p>
+        </w:tc>
+        <w:tc>
+          <w:tcPr>
+            <w:tcW w:type="dxa" w:w="1440"/>
             <w:tcMar>
               <w:top w:w="80" w:type="dxa"/>
               <w:bottom w:w="80" w:type="dxa"/>
@@ -1537,7 +1825,7 @@
         </w:tc>
         <w:tc>
           <w:tcPr>
-            <w:tcW w:type="dxa" w:w="1728"/>
+            <w:tcW w:type="dxa" w:w="1440"/>
             <w:tcMar>
               <w:top w:w="80" w:type="dxa"/>
               <w:bottom w:w="80" w:type="dxa"/>
@@ -1559,7 +1847,7 @@
         </w:tc>
         <w:tc>
           <w:tcPr>
-            <w:tcW w:type="dxa" w:w="1728"/>
+            <w:tcW w:type="dxa" w:w="1440"/>
             <w:tcMar>
               <w:top w:w="80" w:type="dxa"/>
               <w:bottom w:w="80" w:type="dxa"/>
@@ -1581,7 +1869,7 @@
         </w:tc>
         <w:tc>
           <w:tcPr>
-            <w:tcW w:type="dxa" w:w="1728"/>
+            <w:tcW w:type="dxa" w:w="1440"/>
             <w:tcMar>
               <w:top w:w="80" w:type="dxa"/>
               <w:bottom w:w="80" w:type="dxa"/>
@@ -1603,7 +1891,7 @@
         </w:tc>
         <w:tc>
           <w:tcPr>
-            <w:tcW w:type="dxa" w:w="1728"/>
+            <w:tcW w:type="dxa" w:w="1440"/>
             <w:tcMar>
               <w:top w:w="80" w:type="dxa"/>
               <w:bottom w:w="80" w:type="dxa"/>
@@ -1627,7 +1915,29 @@
       <w:tr>
         <w:tc>
           <w:tcPr>
-            <w:tcW w:type="dxa" w:w="1728"/>
+            <w:tcW w:type="dxa" w:w="1440"/>
+            <w:tcMar>
+              <w:top w:w="80" w:type="dxa"/>
+              <w:bottom w:w="80" w:type="dxa"/>
+              <w:left w:w="100" w:type="dxa"/>
+              <w:right w:w="100" w:type="dxa"/>
+            </w:tcMar>
+            <w:shd w:fill="FFFFFF"/>
+          </w:tcPr>
+          <w:p>
+            <w:r>
+              <w:rPr>
+                <w:rFonts w:ascii="Arial" w:hAnsi="Arial"/>
+                <w:color w:val="334155"/>
+                <w:sz w:val="17"/>
+              </w:rPr>
+              <w:t>☐</w:t>
+            </w:r>
+          </w:p>
+        </w:tc>
+        <w:tc>
+          <w:tcPr>
+            <w:tcW w:type="dxa" w:w="1440"/>
             <w:tcMar>
               <w:top w:w="80" w:type="dxa"/>
               <w:bottom w:w="80" w:type="dxa"/>
@@ -1651,7 +1961,7 @@
         </w:tc>
         <w:tc>
           <w:tcPr>
-            <w:tcW w:type="dxa" w:w="1728"/>
+            <w:tcW w:type="dxa" w:w="1440"/>
             <w:tcMar>
               <w:top w:w="80" w:type="dxa"/>
               <w:bottom w:w="80" w:type="dxa"/>
@@ -1673,7 +1983,7 @@
         </w:tc>
         <w:tc>
           <w:tcPr>
-            <w:tcW w:type="dxa" w:w="1728"/>
+            <w:tcW w:type="dxa" w:w="1440"/>
             <w:tcMar>
               <w:top w:w="80" w:type="dxa"/>
               <w:bottom w:w="80" w:type="dxa"/>
@@ -1695,7 +2005,7 @@
         </w:tc>
         <w:tc>
           <w:tcPr>
-            <w:tcW w:type="dxa" w:w="1728"/>
+            <w:tcW w:type="dxa" w:w="1440"/>
             <w:tcMar>
               <w:top w:w="80" w:type="dxa"/>
               <w:bottom w:w="80" w:type="dxa"/>
@@ -1717,7 +2027,7 @@
         </w:tc>
         <w:tc>
           <w:tcPr>
-            <w:tcW w:type="dxa" w:w="1728"/>
+            <w:tcW w:type="dxa" w:w="1440"/>
             <w:tcMar>
               <w:top w:w="80" w:type="dxa"/>
               <w:bottom w:w="80" w:type="dxa"/>
@@ -1741,7 +2051,29 @@
       <w:tr>
         <w:tc>
           <w:tcPr>
-            <w:tcW w:type="dxa" w:w="1728"/>
+            <w:tcW w:type="dxa" w:w="1440"/>
+            <w:tcMar>
+              <w:top w:w="80" w:type="dxa"/>
+              <w:bottom w:w="80" w:type="dxa"/>
+              <w:left w:w="100" w:type="dxa"/>
+              <w:right w:w="100" w:type="dxa"/>
+            </w:tcMar>
+            <w:shd w:fill="F8FAFC"/>
+          </w:tcPr>
+          <w:p>
+            <w:r>
+              <w:rPr>
+                <w:rFonts w:ascii="Arial" w:hAnsi="Arial"/>
+                <w:color w:val="334155"/>
+                <w:sz w:val="17"/>
+              </w:rPr>
+              <w:t>☐</w:t>
+            </w:r>
+          </w:p>
+        </w:tc>
+        <w:tc>
+          <w:tcPr>
+            <w:tcW w:type="dxa" w:w="1440"/>
             <w:tcMar>
               <w:top w:w="80" w:type="dxa"/>
               <w:bottom w:w="80" w:type="dxa"/>
@@ -1765,7 +2097,7 @@
         </w:tc>
         <w:tc>
           <w:tcPr>
-            <w:tcW w:type="dxa" w:w="1728"/>
+            <w:tcW w:type="dxa" w:w="1440"/>
             <w:tcMar>
               <w:top w:w="80" w:type="dxa"/>
               <w:bottom w:w="80" w:type="dxa"/>
@@ -1787,7 +2119,7 @@
         </w:tc>
         <w:tc>
           <w:tcPr>
-            <w:tcW w:type="dxa" w:w="1728"/>
+            <w:tcW w:type="dxa" w:w="1440"/>
             <w:tcMar>
               <w:top w:w="80" w:type="dxa"/>
               <w:bottom w:w="80" w:type="dxa"/>
@@ -1809,7 +2141,7 @@
         </w:tc>
         <w:tc>
           <w:tcPr>
-            <w:tcW w:type="dxa" w:w="1728"/>
+            <w:tcW w:type="dxa" w:w="1440"/>
             <w:tcMar>
               <w:top w:w="80" w:type="dxa"/>
               <w:bottom w:w="80" w:type="dxa"/>
@@ -1831,7 +2163,7 @@
         </w:tc>
         <w:tc>
           <w:tcPr>
-            <w:tcW w:type="dxa" w:w="1728"/>
+            <w:tcW w:type="dxa" w:w="1440"/>
             <w:tcMar>
               <w:top w:w="80" w:type="dxa"/>
               <w:bottom w:w="80" w:type="dxa"/>
@@ -1855,7 +2187,29 @@
       <w:tr>
         <w:tc>
           <w:tcPr>
-            <w:tcW w:type="dxa" w:w="1728"/>
+            <w:tcW w:type="dxa" w:w="1440"/>
+            <w:tcMar>
+              <w:top w:w="80" w:type="dxa"/>
+              <w:bottom w:w="80" w:type="dxa"/>
+              <w:left w:w="100" w:type="dxa"/>
+              <w:right w:w="100" w:type="dxa"/>
+            </w:tcMar>
+            <w:shd w:fill="FFFFFF"/>
+          </w:tcPr>
+          <w:p>
+            <w:r>
+              <w:rPr>
+                <w:rFonts w:ascii="Arial" w:hAnsi="Arial"/>
+                <w:color w:val="334155"/>
+                <w:sz w:val="17"/>
+              </w:rPr>
+              <w:t>☐</w:t>
+            </w:r>
+          </w:p>
+        </w:tc>
+        <w:tc>
+          <w:tcPr>
+            <w:tcW w:type="dxa" w:w="1440"/>
             <w:tcMar>
               <w:top w:w="80" w:type="dxa"/>
               <w:bottom w:w="80" w:type="dxa"/>
@@ -1879,7 +2233,7 @@
         </w:tc>
         <w:tc>
           <w:tcPr>
-            <w:tcW w:type="dxa" w:w="1728"/>
+            <w:tcW w:type="dxa" w:w="1440"/>
             <w:tcMar>
               <w:top w:w="80" w:type="dxa"/>
               <w:bottom w:w="80" w:type="dxa"/>
@@ -1901,7 +2255,7 @@
         </w:tc>
         <w:tc>
           <w:tcPr>
-            <w:tcW w:type="dxa" w:w="1728"/>
+            <w:tcW w:type="dxa" w:w="1440"/>
             <w:tcMar>
               <w:top w:w="80" w:type="dxa"/>
               <w:bottom w:w="80" w:type="dxa"/>
@@ -1923,7 +2277,7 @@
         </w:tc>
         <w:tc>
           <w:tcPr>
-            <w:tcW w:type="dxa" w:w="1728"/>
+            <w:tcW w:type="dxa" w:w="1440"/>
             <w:tcMar>
               <w:top w:w="80" w:type="dxa"/>
               <w:bottom w:w="80" w:type="dxa"/>
@@ -1945,7 +2299,7 @@
         </w:tc>
         <w:tc>
           <w:tcPr>
-            <w:tcW w:type="dxa" w:w="1728"/>
+            <w:tcW w:type="dxa" w:w="1440"/>
             <w:tcMar>
               <w:top w:w="80" w:type="dxa"/>
               <w:bottom w:w="80" w:type="dxa"/>
@@ -1969,7 +2323,29 @@
       <w:tr>
         <w:tc>
           <w:tcPr>
-            <w:tcW w:type="dxa" w:w="1728"/>
+            <w:tcW w:type="dxa" w:w="1440"/>
+            <w:tcMar>
+              <w:top w:w="80" w:type="dxa"/>
+              <w:bottom w:w="80" w:type="dxa"/>
+              <w:left w:w="100" w:type="dxa"/>
+              <w:right w:w="100" w:type="dxa"/>
+            </w:tcMar>
+            <w:shd w:fill="F8FAFC"/>
+          </w:tcPr>
+          <w:p>
+            <w:r>
+              <w:rPr>
+                <w:rFonts w:ascii="Arial" w:hAnsi="Arial"/>
+                <w:color w:val="334155"/>
+                <w:sz w:val="17"/>
+              </w:rPr>
+              <w:t>☐</w:t>
+            </w:r>
+          </w:p>
+        </w:tc>
+        <w:tc>
+          <w:tcPr>
+            <w:tcW w:type="dxa" w:w="1440"/>
             <w:tcMar>
               <w:top w:w="80" w:type="dxa"/>
               <w:bottom w:w="80" w:type="dxa"/>
@@ -1993,7 +2369,7 @@
         </w:tc>
         <w:tc>
           <w:tcPr>
-            <w:tcW w:type="dxa" w:w="1728"/>
+            <w:tcW w:type="dxa" w:w="1440"/>
             <w:tcMar>
               <w:top w:w="80" w:type="dxa"/>
               <w:bottom w:w="80" w:type="dxa"/>
@@ -2015,7 +2391,7 @@
         </w:tc>
         <w:tc>
           <w:tcPr>
-            <w:tcW w:type="dxa" w:w="1728"/>
+            <w:tcW w:type="dxa" w:w="1440"/>
             <w:tcMar>
               <w:top w:w="80" w:type="dxa"/>
               <w:bottom w:w="80" w:type="dxa"/>
@@ -2037,7 +2413,7 @@
         </w:tc>
         <w:tc>
           <w:tcPr>
-            <w:tcW w:type="dxa" w:w="1728"/>
+            <w:tcW w:type="dxa" w:w="1440"/>
             <w:tcMar>
               <w:top w:w="80" w:type="dxa"/>
               <w:bottom w:w="80" w:type="dxa"/>
@@ -2059,7 +2435,7 @@
         </w:tc>
         <w:tc>
           <w:tcPr>
-            <w:tcW w:type="dxa" w:w="1728"/>
+            <w:tcW w:type="dxa" w:w="1440"/>
             <w:tcMar>
               <w:top w:w="80" w:type="dxa"/>
               <w:bottom w:w="80" w:type="dxa"/>
@@ -2616,15 +2992,39 @@
         <w:tblLook w:firstColumn="1" w:firstRow="1" w:lastColumn="0" w:lastRow="0" w:noHBand="0" w:noVBand="1" w:val="04A0"/>
       </w:tblPr>
       <w:tblGrid>
-        <w:gridCol w:w="2160"/>
-        <w:gridCol w:w="2160"/>
-        <w:gridCol w:w="2160"/>
-        <w:gridCol w:w="2160"/>
+        <w:gridCol w:w="1728"/>
+        <w:gridCol w:w="1728"/>
+        <w:gridCol w:w="1728"/>
+        <w:gridCol w:w="1728"/>
+        <w:gridCol w:w="1728"/>
       </w:tblGrid>
       <w:tr>
         <w:tc>
           <w:tcPr>
-            <w:tcW w:type="dxa" w:w="2160"/>
+            <w:tcW w:type="dxa" w:w="1728"/>
+            <w:tcMar>
+              <w:top w:w="100" w:type="dxa"/>
+              <w:bottom w:w="100" w:type="dxa"/>
+              <w:left w:w="100" w:type="dxa"/>
+              <w:right w:w="100" w:type="dxa"/>
+            </w:tcMar>
+            <w:shd w:fill="0F172A"/>
+          </w:tcPr>
+          <w:p>
+            <w:r>
+              <w:rPr>
+                <w:rFonts w:ascii="Arial" w:hAnsi="Arial"/>
+                <w:b/>
+                <w:color w:val="FFFFFF"/>
+                <w:sz w:val="19"/>
+              </w:rPr>
+              <w:t>Check</w:t>
+            </w:r>
+          </w:p>
+        </w:tc>
+        <w:tc>
+          <w:tcPr>
+            <w:tcW w:type="dxa" w:w="1728"/>
             <w:tcMar>
               <w:top w:w="100" w:type="dxa"/>
               <w:bottom w:w="100" w:type="dxa"/>
@@ -2647,7 +3047,7 @@
         </w:tc>
         <w:tc>
           <w:tcPr>
-            <w:tcW w:type="dxa" w:w="2160"/>
+            <w:tcW w:type="dxa" w:w="1728"/>
             <w:tcMar>
               <w:top w:w="100" w:type="dxa"/>
               <w:bottom w:w="100" w:type="dxa"/>
@@ -2670,7 +3070,7 @@
         </w:tc>
         <w:tc>
           <w:tcPr>
-            <w:tcW w:type="dxa" w:w="2160"/>
+            <w:tcW w:type="dxa" w:w="1728"/>
             <w:tcMar>
               <w:top w:w="100" w:type="dxa"/>
               <w:bottom w:w="100" w:type="dxa"/>
@@ -2693,7 +3093,7 @@
         </w:tc>
         <w:tc>
           <w:tcPr>
-            <w:tcW w:type="dxa" w:w="2160"/>
+            <w:tcW w:type="dxa" w:w="1728"/>
             <w:tcMar>
               <w:top w:w="100" w:type="dxa"/>
               <w:bottom w:w="100" w:type="dxa"/>
@@ -2718,7 +3118,29 @@
       <w:tr>
         <w:tc>
           <w:tcPr>
-            <w:tcW w:type="dxa" w:w="2160"/>
+            <w:tcW w:type="dxa" w:w="1728"/>
+            <w:tcMar>
+              <w:top w:w="80" w:type="dxa"/>
+              <w:bottom w:w="80" w:type="dxa"/>
+              <w:left w:w="100" w:type="dxa"/>
+              <w:right w:w="100" w:type="dxa"/>
+            </w:tcMar>
+            <w:shd w:fill="FFFFFF"/>
+          </w:tcPr>
+          <w:p>
+            <w:r>
+              <w:rPr>
+                <w:rFonts w:ascii="Arial" w:hAnsi="Arial"/>
+                <w:color w:val="334155"/>
+                <w:sz w:val="17"/>
+              </w:rPr>
+              <w:t>☑</w:t>
+            </w:r>
+          </w:p>
+        </w:tc>
+        <w:tc>
+          <w:tcPr>
+            <w:tcW w:type="dxa" w:w="1728"/>
             <w:tcMar>
               <w:top w:w="80" w:type="dxa"/>
               <w:bottom w:w="80" w:type="dxa"/>
@@ -2740,7 +3162,7 @@
         </w:tc>
         <w:tc>
           <w:tcPr>
-            <w:tcW w:type="dxa" w:w="2160"/>
+            <w:tcW w:type="dxa" w:w="1728"/>
             <w:tcMar>
               <w:top w:w="80" w:type="dxa"/>
               <w:bottom w:w="80" w:type="dxa"/>
@@ -2762,7 +3184,7 @@
         </w:tc>
         <w:tc>
           <w:tcPr>
-            <w:tcW w:type="dxa" w:w="2160"/>
+            <w:tcW w:type="dxa" w:w="1728"/>
             <w:tcMar>
               <w:top w:w="80" w:type="dxa"/>
               <w:bottom w:w="80" w:type="dxa"/>
@@ -2784,7 +3206,7 @@
         </w:tc>
         <w:tc>
           <w:tcPr>
-            <w:tcW w:type="dxa" w:w="2160"/>
+            <w:tcW w:type="dxa" w:w="1728"/>
             <w:tcMar>
               <w:top w:w="80" w:type="dxa"/>
               <w:bottom w:w="80" w:type="dxa"/>
@@ -2800,7 +3222,7 @@
                 <w:color w:val="334155"/>
                 <w:sz w:val="17"/>
               </w:rPr>
-              <w:t>✅ Completed</w:t>
+              <w:t>☑ Completed</w:t>
             </w:r>
           </w:p>
         </w:tc>
@@ -2808,7 +3230,29 @@
       <w:tr>
         <w:tc>
           <w:tcPr>
-            <w:tcW w:type="dxa" w:w="2160"/>
+            <w:tcW w:type="dxa" w:w="1728"/>
+            <w:tcMar>
+              <w:top w:w="80" w:type="dxa"/>
+              <w:bottom w:w="80" w:type="dxa"/>
+              <w:left w:w="100" w:type="dxa"/>
+              <w:right w:w="100" w:type="dxa"/>
+            </w:tcMar>
+            <w:shd w:fill="F8FAFC"/>
+          </w:tcPr>
+          <w:p>
+            <w:r>
+              <w:rPr>
+                <w:rFonts w:ascii="Arial" w:hAnsi="Arial"/>
+                <w:color w:val="334155"/>
+                <w:sz w:val="17"/>
+              </w:rPr>
+              <w:t>☑</w:t>
+            </w:r>
+          </w:p>
+        </w:tc>
+        <w:tc>
+          <w:tcPr>
+            <w:tcW w:type="dxa" w:w="1728"/>
             <w:tcMar>
               <w:top w:w="80" w:type="dxa"/>
               <w:bottom w:w="80" w:type="dxa"/>
@@ -2830,7 +3274,7 @@
         </w:tc>
         <w:tc>
           <w:tcPr>
-            <w:tcW w:type="dxa" w:w="2160"/>
+            <w:tcW w:type="dxa" w:w="1728"/>
             <w:tcMar>
               <w:top w:w="80" w:type="dxa"/>
               <w:bottom w:w="80" w:type="dxa"/>
@@ -2852,7 +3296,7 @@
         </w:tc>
         <w:tc>
           <w:tcPr>
-            <w:tcW w:type="dxa" w:w="2160"/>
+            <w:tcW w:type="dxa" w:w="1728"/>
             <w:tcMar>
               <w:top w:w="80" w:type="dxa"/>
               <w:bottom w:w="80" w:type="dxa"/>
@@ -2874,7 +3318,7 @@
         </w:tc>
         <w:tc>
           <w:tcPr>
-            <w:tcW w:type="dxa" w:w="2160"/>
+            <w:tcW w:type="dxa" w:w="1728"/>
             <w:tcMar>
               <w:top w:w="80" w:type="dxa"/>
               <w:bottom w:w="80" w:type="dxa"/>
@@ -2890,7 +3334,7 @@
                 <w:color w:val="334155"/>
                 <w:sz w:val="17"/>
               </w:rPr>
-              <w:t>✅ Completed</w:t>
+              <w:t>☑ Completed</w:t>
             </w:r>
           </w:p>
         </w:tc>
@@ -2898,7 +3342,29 @@
       <w:tr>
         <w:tc>
           <w:tcPr>
-            <w:tcW w:type="dxa" w:w="2160"/>
+            <w:tcW w:type="dxa" w:w="1728"/>
+            <w:tcMar>
+              <w:top w:w="80" w:type="dxa"/>
+              <w:bottom w:w="80" w:type="dxa"/>
+              <w:left w:w="100" w:type="dxa"/>
+              <w:right w:w="100" w:type="dxa"/>
+            </w:tcMar>
+            <w:shd w:fill="FFFFFF"/>
+          </w:tcPr>
+          <w:p>
+            <w:r>
+              <w:rPr>
+                <w:rFonts w:ascii="Arial" w:hAnsi="Arial"/>
+                <w:color w:val="334155"/>
+                <w:sz w:val="17"/>
+              </w:rPr>
+              <w:t>☑</w:t>
+            </w:r>
+          </w:p>
+        </w:tc>
+        <w:tc>
+          <w:tcPr>
+            <w:tcW w:type="dxa" w:w="1728"/>
             <w:tcMar>
               <w:top w:w="80" w:type="dxa"/>
               <w:bottom w:w="80" w:type="dxa"/>
@@ -2920,7 +3386,7 @@
         </w:tc>
         <w:tc>
           <w:tcPr>
-            <w:tcW w:type="dxa" w:w="2160"/>
+            <w:tcW w:type="dxa" w:w="1728"/>
             <w:tcMar>
               <w:top w:w="80" w:type="dxa"/>
               <w:bottom w:w="80" w:type="dxa"/>
@@ -2942,7 +3408,7 @@
         </w:tc>
         <w:tc>
           <w:tcPr>
-            <w:tcW w:type="dxa" w:w="2160"/>
+            <w:tcW w:type="dxa" w:w="1728"/>
             <w:tcMar>
               <w:top w:w="80" w:type="dxa"/>
               <w:bottom w:w="80" w:type="dxa"/>
@@ -2964,7 +3430,7 @@
         </w:tc>
         <w:tc>
           <w:tcPr>
-            <w:tcW w:type="dxa" w:w="2160"/>
+            <w:tcW w:type="dxa" w:w="1728"/>
             <w:tcMar>
               <w:top w:w="80" w:type="dxa"/>
               <w:bottom w:w="80" w:type="dxa"/>
@@ -2980,7 +3446,7 @@
                 <w:color w:val="334155"/>
                 <w:sz w:val="17"/>
               </w:rPr>
-              <w:t>✅ Completed</w:t>
+              <w:t>☑ Completed</w:t>
             </w:r>
           </w:p>
         </w:tc>
@@ -2988,7 +3454,29 @@
       <w:tr>
         <w:tc>
           <w:tcPr>
-            <w:tcW w:type="dxa" w:w="2160"/>
+            <w:tcW w:type="dxa" w:w="1728"/>
+            <w:tcMar>
+              <w:top w:w="80" w:type="dxa"/>
+              <w:bottom w:w="80" w:type="dxa"/>
+              <w:left w:w="100" w:type="dxa"/>
+              <w:right w:w="100" w:type="dxa"/>
+            </w:tcMar>
+            <w:shd w:fill="F8FAFC"/>
+          </w:tcPr>
+          <w:p>
+            <w:r>
+              <w:rPr>
+                <w:rFonts w:ascii="Arial" w:hAnsi="Arial"/>
+                <w:color w:val="334155"/>
+                <w:sz w:val="17"/>
+              </w:rPr>
+              <w:t>☑</w:t>
+            </w:r>
+          </w:p>
+        </w:tc>
+        <w:tc>
+          <w:tcPr>
+            <w:tcW w:type="dxa" w:w="1728"/>
             <w:tcMar>
               <w:top w:w="80" w:type="dxa"/>
               <w:bottom w:w="80" w:type="dxa"/>
@@ -3010,7 +3498,7 @@
         </w:tc>
         <w:tc>
           <w:tcPr>
-            <w:tcW w:type="dxa" w:w="2160"/>
+            <w:tcW w:type="dxa" w:w="1728"/>
             <w:tcMar>
               <w:top w:w="80" w:type="dxa"/>
               <w:bottom w:w="80" w:type="dxa"/>
@@ -3032,7 +3520,7 @@
         </w:tc>
         <w:tc>
           <w:tcPr>
-            <w:tcW w:type="dxa" w:w="2160"/>
+            <w:tcW w:type="dxa" w:w="1728"/>
             <w:tcMar>
               <w:top w:w="80" w:type="dxa"/>
               <w:bottom w:w="80" w:type="dxa"/>
@@ -3054,7 +3542,7 @@
         </w:tc>
         <w:tc>
           <w:tcPr>
-            <w:tcW w:type="dxa" w:w="2160"/>
+            <w:tcW w:type="dxa" w:w="1728"/>
             <w:tcMar>
               <w:top w:w="80" w:type="dxa"/>
               <w:bottom w:w="80" w:type="dxa"/>
@@ -3070,7 +3558,7 @@
                 <w:color w:val="334155"/>
                 <w:sz w:val="17"/>
               </w:rPr>
-              <w:t>✅ Completed</w:t>
+              <w:t>☑ Completed</w:t>
             </w:r>
           </w:p>
         </w:tc>
@@ -3078,7 +3566,29 @@
       <w:tr>
         <w:tc>
           <w:tcPr>
-            <w:tcW w:type="dxa" w:w="2160"/>
+            <w:tcW w:type="dxa" w:w="1728"/>
+            <w:tcMar>
+              <w:top w:w="80" w:type="dxa"/>
+              <w:bottom w:w="80" w:type="dxa"/>
+              <w:left w:w="100" w:type="dxa"/>
+              <w:right w:w="100" w:type="dxa"/>
+            </w:tcMar>
+            <w:shd w:fill="FFFFFF"/>
+          </w:tcPr>
+          <w:p>
+            <w:r>
+              <w:rPr>
+                <w:rFonts w:ascii="Arial" w:hAnsi="Arial"/>
+                <w:color w:val="334155"/>
+                <w:sz w:val="17"/>
+              </w:rPr>
+              <w:t>☑</w:t>
+            </w:r>
+          </w:p>
+        </w:tc>
+        <w:tc>
+          <w:tcPr>
+            <w:tcW w:type="dxa" w:w="1728"/>
             <w:tcMar>
               <w:top w:w="80" w:type="dxa"/>
               <w:bottom w:w="80" w:type="dxa"/>
@@ -3100,7 +3610,7 @@
         </w:tc>
         <w:tc>
           <w:tcPr>
-            <w:tcW w:type="dxa" w:w="2160"/>
+            <w:tcW w:type="dxa" w:w="1728"/>
             <w:tcMar>
               <w:top w:w="80" w:type="dxa"/>
               <w:bottom w:w="80" w:type="dxa"/>
@@ -3122,7 +3632,7 @@
         </w:tc>
         <w:tc>
           <w:tcPr>
-            <w:tcW w:type="dxa" w:w="2160"/>
+            <w:tcW w:type="dxa" w:w="1728"/>
             <w:tcMar>
               <w:top w:w="80" w:type="dxa"/>
               <w:bottom w:w="80" w:type="dxa"/>
@@ -3144,7 +3654,7 @@
         </w:tc>
         <w:tc>
           <w:tcPr>
-            <w:tcW w:type="dxa" w:w="2160"/>
+            <w:tcW w:type="dxa" w:w="1728"/>
             <w:tcMar>
               <w:top w:w="80" w:type="dxa"/>
               <w:bottom w:w="80" w:type="dxa"/>
@@ -3160,7 +3670,7 @@
                 <w:color w:val="334155"/>
                 <w:sz w:val="17"/>
               </w:rPr>
-              <w:t>✅ Completed</w:t>
+              <w:t>☑ Completed</w:t>
             </w:r>
           </w:p>
         </w:tc>
@@ -3168,7 +3678,29 @@
       <w:tr>
         <w:tc>
           <w:tcPr>
-            <w:tcW w:type="dxa" w:w="2160"/>
+            <w:tcW w:type="dxa" w:w="1728"/>
+            <w:tcMar>
+              <w:top w:w="80" w:type="dxa"/>
+              <w:bottom w:w="80" w:type="dxa"/>
+              <w:left w:w="100" w:type="dxa"/>
+              <w:right w:w="100" w:type="dxa"/>
+            </w:tcMar>
+            <w:shd w:fill="F8FAFC"/>
+          </w:tcPr>
+          <w:p>
+            <w:r>
+              <w:rPr>
+                <w:rFonts w:ascii="Arial" w:hAnsi="Arial"/>
+                <w:color w:val="334155"/>
+                <w:sz w:val="17"/>
+              </w:rPr>
+              <w:t>☑</w:t>
+            </w:r>
+          </w:p>
+        </w:tc>
+        <w:tc>
+          <w:tcPr>
+            <w:tcW w:type="dxa" w:w="1728"/>
             <w:tcMar>
               <w:top w:w="80" w:type="dxa"/>
               <w:bottom w:w="80" w:type="dxa"/>
@@ -3190,7 +3722,7 @@
         </w:tc>
         <w:tc>
           <w:tcPr>
-            <w:tcW w:type="dxa" w:w="2160"/>
+            <w:tcW w:type="dxa" w:w="1728"/>
             <w:tcMar>
               <w:top w:w="80" w:type="dxa"/>
               <w:bottom w:w="80" w:type="dxa"/>
@@ -3212,7 +3744,7 @@
         </w:tc>
         <w:tc>
           <w:tcPr>
-            <w:tcW w:type="dxa" w:w="2160"/>
+            <w:tcW w:type="dxa" w:w="1728"/>
             <w:tcMar>
               <w:top w:w="80" w:type="dxa"/>
               <w:bottom w:w="80" w:type="dxa"/>
@@ -3234,7 +3766,7 @@
         </w:tc>
         <w:tc>
           <w:tcPr>
-            <w:tcW w:type="dxa" w:w="2160"/>
+            <w:tcW w:type="dxa" w:w="1728"/>
             <w:tcMar>
               <w:top w:w="80" w:type="dxa"/>
               <w:bottom w:w="80" w:type="dxa"/>
@@ -3250,7 +3782,7 @@
                 <w:color w:val="334155"/>
                 <w:sz w:val="17"/>
               </w:rPr>
-              <w:t>✅ Completed</w:t>
+              <w:t>☑ Completed</w:t>
             </w:r>
           </w:p>
         </w:tc>
@@ -3258,7 +3790,29 @@
       <w:tr>
         <w:tc>
           <w:tcPr>
-            <w:tcW w:type="dxa" w:w="2160"/>
+            <w:tcW w:type="dxa" w:w="1728"/>
+            <w:tcMar>
+              <w:top w:w="80" w:type="dxa"/>
+              <w:bottom w:w="80" w:type="dxa"/>
+              <w:left w:w="100" w:type="dxa"/>
+              <w:right w:w="100" w:type="dxa"/>
+            </w:tcMar>
+            <w:shd w:fill="FFFFFF"/>
+          </w:tcPr>
+          <w:p>
+            <w:r>
+              <w:rPr>
+                <w:rFonts w:ascii="Arial" w:hAnsi="Arial"/>
+                <w:color w:val="334155"/>
+                <w:sz w:val="17"/>
+              </w:rPr>
+              <w:t>☑</w:t>
+            </w:r>
+          </w:p>
+        </w:tc>
+        <w:tc>
+          <w:tcPr>
+            <w:tcW w:type="dxa" w:w="1728"/>
             <w:tcMar>
               <w:top w:w="80" w:type="dxa"/>
               <w:bottom w:w="80" w:type="dxa"/>
@@ -3280,7 +3834,7 @@
         </w:tc>
         <w:tc>
           <w:tcPr>
-            <w:tcW w:type="dxa" w:w="2160"/>
+            <w:tcW w:type="dxa" w:w="1728"/>
             <w:tcMar>
               <w:top w:w="80" w:type="dxa"/>
               <w:bottom w:w="80" w:type="dxa"/>
@@ -3302,7 +3856,7 @@
         </w:tc>
         <w:tc>
           <w:tcPr>
-            <w:tcW w:type="dxa" w:w="2160"/>
+            <w:tcW w:type="dxa" w:w="1728"/>
             <w:tcMar>
               <w:top w:w="80" w:type="dxa"/>
               <w:bottom w:w="80" w:type="dxa"/>
@@ -3324,7 +3878,7 @@
         </w:tc>
         <w:tc>
           <w:tcPr>
-            <w:tcW w:type="dxa" w:w="2160"/>
+            <w:tcW w:type="dxa" w:w="1728"/>
             <w:tcMar>
               <w:top w:w="80" w:type="dxa"/>
               <w:bottom w:w="80" w:type="dxa"/>
@@ -3340,7 +3894,7 @@
                 <w:color w:val="334155"/>
                 <w:sz w:val="17"/>
               </w:rPr>
-              <w:t>✅ Completed</w:t>
+              <w:t>☑ Completed</w:t>
             </w:r>
           </w:p>
         </w:tc>
@@ -3348,7 +3902,29 @@
       <w:tr>
         <w:tc>
           <w:tcPr>
-            <w:tcW w:type="dxa" w:w="2160"/>
+            <w:tcW w:type="dxa" w:w="1728"/>
+            <w:tcMar>
+              <w:top w:w="80" w:type="dxa"/>
+              <w:bottom w:w="80" w:type="dxa"/>
+              <w:left w:w="100" w:type="dxa"/>
+              <w:right w:w="100" w:type="dxa"/>
+            </w:tcMar>
+            <w:shd w:fill="F8FAFC"/>
+          </w:tcPr>
+          <w:p>
+            <w:r>
+              <w:rPr>
+                <w:rFonts w:ascii="Arial" w:hAnsi="Arial"/>
+                <w:color w:val="334155"/>
+                <w:sz w:val="17"/>
+              </w:rPr>
+              <w:t>☑</w:t>
+            </w:r>
+          </w:p>
+        </w:tc>
+        <w:tc>
+          <w:tcPr>
+            <w:tcW w:type="dxa" w:w="1728"/>
             <w:tcMar>
               <w:top w:w="80" w:type="dxa"/>
               <w:bottom w:w="80" w:type="dxa"/>
@@ -3370,7 +3946,7 @@
         </w:tc>
         <w:tc>
           <w:tcPr>
-            <w:tcW w:type="dxa" w:w="2160"/>
+            <w:tcW w:type="dxa" w:w="1728"/>
             <w:tcMar>
               <w:top w:w="80" w:type="dxa"/>
               <w:bottom w:w="80" w:type="dxa"/>
@@ -3392,7 +3968,7 @@
         </w:tc>
         <w:tc>
           <w:tcPr>
-            <w:tcW w:type="dxa" w:w="2160"/>
+            <w:tcW w:type="dxa" w:w="1728"/>
             <w:tcMar>
               <w:top w:w="80" w:type="dxa"/>
               <w:bottom w:w="80" w:type="dxa"/>
@@ -3414,7 +3990,7 @@
         </w:tc>
         <w:tc>
           <w:tcPr>
-            <w:tcW w:type="dxa" w:w="2160"/>
+            <w:tcW w:type="dxa" w:w="1728"/>
             <w:tcMar>
               <w:top w:w="80" w:type="dxa"/>
               <w:bottom w:w="80" w:type="dxa"/>
@@ -3430,7 +4006,7 @@
                 <w:color w:val="334155"/>
                 <w:sz w:val="17"/>
               </w:rPr>
-              <w:t>✅ Completed (Till Video 29)</w:t>
+              <w:t>☑ Completed (Till Video 29)</w:t>
             </w:r>
           </w:p>
         </w:tc>

</xml_diff>

<commit_message>
Update master Word study roadmap to map each of the 56 standalone playlist videos, setting Video 30 Views as completed and Video 31 CTAS as current target
</commit_message>
<xml_diff>
--- a/docs/DA_COMPLETE_STUDY_ROADMAP.docx
+++ b/docs/DA_COMPLETE_STUDY_ROADMAP.docx
@@ -14,7 +14,7 @@
           <w:color w:val="0F172A"/>
           <w:sz w:val="44"/>
         </w:rPr>
-        <w:t>Data Analyst Master Execution Roadmap &amp; Interactive Checklist</w:t>
+        <w:t>Data Analyst Master Execution Roadmap &amp; Checklist</w:t>
       </w:r>
     </w:p>
     <w:p>
@@ -28,7 +28,7 @@
           <w:color w:val="0EA5E9"/>
           <w:sz w:val="22"/>
         </w:rPr>
-        <w:t>Interactive Checkbox Tracker (☐ / ☑) | Multi-Module App Acceleration | DataLemur Strategy</w:t>
+        <w:t>Standalone Playlist Video Mapping | 5 Daily HackerRank Quota | DataLemur First Strategy</w:t>
       </w:r>
     </w:p>
     <w:p>
@@ -43,7 +43,7 @@
           <w:color w:val="0EA5E9"/>
           <w:sz w:val="36"/>
         </w:rPr>
-        <w:t>1. Executive Status &amp; Progress Checklist</w:t>
+        <w:t>1. Executive Status &amp; Current Video Progress</w:t>
       </w:r>
     </w:p>
     <w:p>
@@ -61,20 +61,30 @@
         <w:rPr>
           <w:b/>
         </w:rPr>
-        <w:t xml:space="preserve">• Completed Video Archive: </w:t>
+        <w:t xml:space="preserve">• Completed Videos Archive: </w:t>
       </w:r>
       <w:r>
-        <w:t>Videos #1 to #29 (SQL Basics up to CTEs WITH clause) [☑ COMPLETED]</w:t>
+        <w:t>Playlist Videos #1 to #30 (SQL Basics up to 'SQL Views | #SQL Course 29') [☑ COMPLETED]</w:t>
         <w:br/>
       </w:r>
       <w:r>
         <w:rPr>
           <w:b/>
         </w:rPr>
-        <w:t xml:space="preserve">• TODAY's Video Target: </w:t>
+        <w:t xml:space="preserve">• TODAY'S CURRENT TARGET: </w:t>
       </w:r>
       <w:r>
-        <w:t>Video #30 — SQL Views (6 Top Use Cases) [☐ TODAY's TARGET]</w:t>
+        <w:t>Playlist Video #31: 'SQL CTAS | How to Create SQL Tables From a Query | #SQL Course 30' [🎯 DOING TODAY JULY 24]</w:t>
+        <w:br/>
+      </w:r>
+      <w:r>
+        <w:rPr>
+          <w:b/>
+        </w:rPr>
+        <w:t xml:space="preserve">• Playlist Mapping Mode: </w:t>
+      </w:r>
+      <w:r>
+        <w:t>Mapped directly to the 56 standalone YouTube videos in playlist PLNcg_FV9n7qZY_2eAtUzEUulNjTJREhQe.</w:t>
         <w:br/>
       </w:r>
       <w:r>
@@ -84,7 +94,7 @@
         <w:t xml:space="preserve">• Filtered Non-DA Topics: </w:t>
       </w:r>
       <w:r>
-        <w:t>Skipped 11 Data Engineering / DBA videos (Stored Procedures, Triggers, DWH ETL Pipeline Videos 46–54) to focus 100% on Data Analyst competencies.</w:t>
+        <w:t>Bypassed 11 Data Engineering / DBA videos (Stored Procedures, Triggers, DWH ETL Pipeline Videos 46–54) to focus 100% on Data Analyst competencies.</w:t>
         <w:br/>
       </w:r>
       <w:r>
@@ -109,7 +119,7 @@
           <w:color w:val="0EA5E9"/>
           <w:sz w:val="36"/>
         </w:rPr>
-        <w:t>2. Interactive Day-by-Day Execution Checklist (☐ / ☑)</w:t>
+        <w:t>2. Standalone Playlist Day-by-Day Execution Plan (Upcoming First)</w:t>
       </w:r>
     </w:p>
     <w:tbl>
@@ -192,7 +202,7 @@
                 <w:color w:val="FFFFFF"/>
                 <w:sz w:val="19"/>
               </w:rPr>
-              <w:t>DA Essential YouTube Video Target</w:t>
+              <w:t>Standalone YouTube Video Target (Playlist Title)</w:t>
             </w:r>
           </w:p>
         </w:tc>
@@ -331,9 +341,7 @@
                 <w:color w:val="334155"/>
                 <w:sz w:val="17"/>
               </w:rPr>
-              <w:t>Video #30: SQL Views (6 Top Use Cases)</w:t>
-              <w:br/>
-              <w:t>[Timestamp 15:35:02]</w:t>
+              <w:t>Playlist Video #31: 'SQL CTAS | How to Create SQL Tables From a Query | #SQL Course 30'</w:t>
             </w:r>
           </w:p>
         </w:tc>
@@ -399,7 +407,7 @@
                 <w:color w:val="334155"/>
                 <w:sz w:val="17"/>
               </w:rPr>
-              <w:t>🎯 TODAY's TARGET</w:t>
+              <w:t>🎯 TODAY's CURRENT TARGET</w:t>
             </w:r>
           </w:p>
         </w:tc>
@@ -469,9 +477,9 @@
                 <w:color w:val="334155"/>
                 <w:sz w:val="17"/>
               </w:rPr>
-              <w:t>Video #31: SQL CTAS &amp; Video #32: Temp Tables &amp; Video #33: Subquery vs CTE vs Views vs CTAS vs Temp</w:t>
+              <w:t>Playlist Video #32: 'SQL Temp Tables (Global &amp; Local) | #SQL Course 31'</w:t>
               <w:br/>
-              <w:t>[Timestamp 16:36:40 - 17:17:31]</w:t>
+              <w:t>Playlist Video #33: 'SQL Subquery vs CTE vs Views vs CTAS vs TEMP | #SQL Course 32'</w:t>
             </w:r>
           </w:p>
         </w:tc>
@@ -537,7 +545,7 @@
                 <w:color w:val="334155"/>
                 <w:sz w:val="17"/>
               </w:rPr>
-              <w:t>⏳ Watch &amp; Solve</w:t>
+              <w:t>⏳ Watch 2 Videos &amp; Code</w:t>
             </w:r>
           </w:p>
         </w:tc>
@@ -607,9 +615,11 @@
                 <w:color w:val="334155"/>
                 <w:sz w:val="17"/>
               </w:rPr>
-              <w:t>Video #34: Clustered vs Nonclustered Indexes &amp; Video #35: Columnstore &amp; Video #36: Unique/Filtered Indexes</w:t>
+              <w:t>Playlist Video #34: 'SQL Indexes | Clustered vs Nonclustered | #SQL Course 33'</w:t>
               <w:br/>
-              <w:t>[Timestamp 18:23:42]</w:t>
+              <w:t>Playlist Video #35: 'SQL Columnstore Index | #SQL Course 34'</w:t>
+              <w:br/>
+              <w:t>Playlist Video #36: 'SQL Unique &amp; Filtered Indexes | #SQL Course 35'</w:t>
             </w:r>
           </w:p>
         </w:tc>
@@ -675,7 +685,7 @@
                 <w:color w:val="334155"/>
                 <w:sz w:val="17"/>
               </w:rPr>
-              <w:t>⏳ Watch &amp; Solve</w:t>
+              <w:t>⏳ Watch 3 Videos &amp; Code</w:t>
             </w:r>
           </w:p>
         </w:tc>
@@ -745,9 +755,11 @@
                 <w:color w:val="334155"/>
                 <w:sz w:val="17"/>
               </w:rPr>
-              <w:t>Video #37: Choose Right Index &amp; Video #39: Execution Plans &amp; Video #40: Indexing Strategy</w:t>
+              <w:t>Playlist Video #37: 'How to Choose the Right Index | #SQL Course 36'</w:t>
               <w:br/>
-              <w:t>[Timestamp 20:20:31]</w:t>
+              <w:t>Playlist Video #39: 'SQL Execution Plans | SQL Hints | #SQL Course 38'</w:t>
+              <w:br/>
+              <w:t>Playlist Video #40: 'My Indexing Strategy for Every Project | #SQL Course 39'</w:t>
             </w:r>
           </w:p>
         </w:tc>
@@ -813,7 +825,7 @@
                 <w:color w:val="334155"/>
                 <w:sz w:val="17"/>
               </w:rPr>
-              <w:t>⏳ Watch &amp; Solve</w:t>
+              <w:t>⏳ Watch 3 Videos &amp; Code</w:t>
             </w:r>
           </w:p>
         </w:tc>
@@ -883,9 +895,9 @@
                 <w:color w:val="334155"/>
                 <w:sz w:val="17"/>
               </w:rPr>
-              <w:t>Video #42: 30 SQL Performance Tips from 18 Yrs Experience &amp; Video #45: ChatGPT / Copilot AI Workflow</w:t>
+              <w:t>Playlist Video #42: '30 SQL Tips and Tricks From 18 Years Exp | #SQL Course 41'</w:t>
               <w:br/>
-              <w:t>[Timestamp 21:43:39 - 22:24:25]</w:t>
+              <w:t>Playlist Video #45: 'How I Use ChatGPT &amp; GitHub Copilot in My Projects | #SQL Course 44'</w:t>
             </w:r>
           </w:p>
         </w:tc>
@@ -951,7 +963,7 @@
                 <w:color w:val="334155"/>
                 <w:sz w:val="17"/>
               </w:rPr>
-              <w:t>⏳ Watch &amp; Solve</w:t>
+              <w:t>⏳ Watch 2 Videos &amp; Code</w:t>
             </w:r>
           </w:p>
         </w:tc>
@@ -1021,9 +1033,7 @@
                 <w:color w:val="334155"/>
                 <w:sz w:val="17"/>
               </w:rPr>
-              <w:t>🎯 Video #55: SQL Exploratory Data Analysis (EDA) Project</w:t>
-              <w:br/>
-              <w:t>[Timestamp 27:41:51]</w:t>
+              <w:t>🎯 Playlist Video #55: 'SQL Exploratory Data Analysis (EDA) Project | Full Hands-On'</w:t>
             </w:r>
           </w:p>
         </w:tc>
@@ -1159,9 +1169,7 @@
                 <w:color w:val="334155"/>
                 <w:sz w:val="17"/>
               </w:rPr>
-              <w:t>🎯 Video #56: SQL Data Analyst Portfolio Project</w:t>
-              <w:br/>
-              <w:t>[Timestamp 28:30:38]</w:t>
+              <w:t>🎯 Playlist Video #56: 'SQL Data Analyst Portfolio Project | Like I Do in Real Projects'</w:t>
             </w:r>
           </w:p>
         </w:tc>
@@ -2474,7 +2482,7 @@
     </w:p>
     <w:p>
       <w:r>
-        <w:t>The following 11 videos from the playlist cover specialized Data Engineering &amp; Database Administration (DBA) topics that are NOT required for Data Analyst interviews. They have been bypassed in your study plan to accelerate your job readiness:</w:t>
+        <w:t>The following 11 videos from the 56-video playlist cover specialized Data Engineering &amp; Database Administration (DBA) topics that are NOT required for Data Analyst interviews. They have been bypassed in your study plan to accelerate your job readiness:</w:t>
         <w:br/>
         <w:br/>
       </w:r>
@@ -2510,7 +2518,7 @@
                 <w:color w:val="FFFFFF"/>
                 <w:sz w:val="19"/>
               </w:rPr>
-              <w:t>Video #</w:t>
+              <w:t>Playlist Video #</w:t>
             </w:r>
           </w:p>
         </w:tc>
@@ -2602,7 +2610,7 @@
                 <w:color w:val="334155"/>
                 <w:sz w:val="17"/>
               </w:rPr>
-              <w:t>SQL Index Maintenance (5 Things to Do)</w:t>
+              <w:t>SQL Index Maintenance | 5 Things to Do after Creating Indexes | #SQL Course 37</w:t>
             </w:r>
           </w:p>
         </w:tc>
@@ -2670,7 +2678,7 @@
                 <w:color w:val="334155"/>
                 <w:sz w:val="17"/>
               </w:rPr>
-              <w:t>SQL Table Partitioning</w:t>
+              <w:t>SQL Table Partitioning | Optimize Big Table Performance | #SQL Course 40</w:t>
             </w:r>
           </w:p>
         </w:tc>
@@ -2738,7 +2746,7 @@
                 <w:color w:val="334155"/>
                 <w:sz w:val="17"/>
               </w:rPr>
-              <w:t>SQL Stored Procedure (Comprehensive Guide)</w:t>
+              <w:t>SQL Stored Procedure | Comprehensive Guide | #SQL Course 42</w:t>
             </w:r>
           </w:p>
         </w:tc>
@@ -2806,7 +2814,7 @@
                 <w:color w:val="334155"/>
                 <w:sz w:val="17"/>
               </w:rPr>
-              <w:t>SQL Triggers (Audit Logs Use Case)</w:t>
+              <w:t>SQL Triggers | Audit Logs Use Case | #SQL Course 43</w:t>
             </w:r>
           </w:p>
         </w:tc>
@@ -2992,16 +3000,15 @@
         <w:tblLook w:firstColumn="1" w:firstRow="1" w:lastColumn="0" w:lastRow="0" w:noHBand="0" w:noVBand="1" w:val="04A0"/>
       </w:tblPr>
       <w:tblGrid>
-        <w:gridCol w:w="1728"/>
-        <w:gridCol w:w="1728"/>
-        <w:gridCol w:w="1728"/>
-        <w:gridCol w:w="1728"/>
-        <w:gridCol w:w="1728"/>
+        <w:gridCol w:w="2160"/>
+        <w:gridCol w:w="2160"/>
+        <w:gridCol w:w="2160"/>
+        <w:gridCol w:w="2160"/>
       </w:tblGrid>
       <w:tr>
         <w:tc>
           <w:tcPr>
-            <w:tcW w:type="dxa" w:w="1728"/>
+            <w:tcW w:type="dxa" w:w="2160"/>
             <w:tcMar>
               <w:top w:w="100" w:type="dxa"/>
               <w:bottom w:w="100" w:type="dxa"/>
@@ -3024,7 +3031,7 @@
         </w:tc>
         <w:tc>
           <w:tcPr>
-            <w:tcW w:type="dxa" w:w="1728"/>
+            <w:tcW w:type="dxa" w:w="2160"/>
             <w:tcMar>
               <w:top w:w="100" w:type="dxa"/>
               <w:bottom w:w="100" w:type="dxa"/>
@@ -3041,13 +3048,13 @@
                 <w:color w:val="FFFFFF"/>
                 <w:sz w:val="19"/>
               </w:rPr>
-              <w:t>Video #</w:t>
+              <w:t>Playlist Video #</w:t>
             </w:r>
           </w:p>
         </w:tc>
         <w:tc>
           <w:tcPr>
-            <w:tcW w:type="dxa" w:w="1728"/>
+            <w:tcW w:type="dxa" w:w="2160"/>
             <w:tcMar>
               <w:top w:w="100" w:type="dxa"/>
               <w:bottom w:w="100" w:type="dxa"/>
@@ -3064,36 +3071,13 @@
                 <w:color w:val="FFFFFF"/>
                 <w:sz w:val="19"/>
               </w:rPr>
-              <w:t>Video Title &amp; Topic</w:t>
+              <w:t>Standalone Video Title in Playlist</w:t>
             </w:r>
           </w:p>
         </w:tc>
         <w:tc>
           <w:tcPr>
-            <w:tcW w:type="dxa" w:w="1728"/>
-            <w:tcMar>
-              <w:top w:w="100" w:type="dxa"/>
-              <w:bottom w:w="100" w:type="dxa"/>
-              <w:left w:w="100" w:type="dxa"/>
-              <w:right w:w="100" w:type="dxa"/>
-            </w:tcMar>
-            <w:shd w:fill="0F172A"/>
-          </w:tcPr>
-          <w:p>
-            <w:r>
-              <w:rPr>
-                <w:rFonts w:ascii="Arial" w:hAnsi="Arial"/>
-                <w:b/>
-                <w:color w:val="FFFFFF"/>
-                <w:sz w:val="19"/>
-              </w:rPr>
-              <w:t>Timestamp</w:t>
-            </w:r>
-          </w:p>
-        </w:tc>
-        <w:tc>
-          <w:tcPr>
-            <w:tcW w:type="dxa" w:w="1728"/>
+            <w:tcW w:type="dxa" w:w="2160"/>
             <w:tcMar>
               <w:top w:w="100" w:type="dxa"/>
               <w:bottom w:w="100" w:type="dxa"/>
@@ -3118,7 +3102,7 @@
       <w:tr>
         <w:tc>
           <w:tcPr>
-            <w:tcW w:type="dxa" w:w="1728"/>
+            <w:tcW w:type="dxa" w:w="2160"/>
             <w:tcMar>
               <w:top w:w="80" w:type="dxa"/>
               <w:bottom w:w="80" w:type="dxa"/>
@@ -3140,7 +3124,7 @@
         </w:tc>
         <w:tc>
           <w:tcPr>
-            <w:tcW w:type="dxa" w:w="1728"/>
+            <w:tcW w:type="dxa" w:w="2160"/>
             <w:tcMar>
               <w:top w:w="80" w:type="dxa"/>
               <w:bottom w:w="80" w:type="dxa"/>
@@ -3162,7 +3146,7 @@
         </w:tc>
         <w:tc>
           <w:tcPr>
-            <w:tcW w:type="dxa" w:w="1728"/>
+            <w:tcW w:type="dxa" w:w="2160"/>
             <w:tcMar>
               <w:top w:w="80" w:type="dxa"/>
               <w:bottom w:w="80" w:type="dxa"/>
@@ -3184,29 +3168,7 @@
         </w:tc>
         <w:tc>
           <w:tcPr>
-            <w:tcW w:type="dxa" w:w="1728"/>
-            <w:tcMar>
-              <w:top w:w="80" w:type="dxa"/>
-              <w:bottom w:w="80" w:type="dxa"/>
-              <w:left w:w="100" w:type="dxa"/>
-              <w:right w:w="100" w:type="dxa"/>
-            </w:tcMar>
-            <w:shd w:fill="FFFFFF"/>
-          </w:tcPr>
-          <w:p>
-            <w:r>
-              <w:rPr>
-                <w:rFonts w:ascii="Arial" w:hAnsi="Arial"/>
-                <w:color w:val="334155"/>
-                <w:sz w:val="17"/>
-              </w:rPr>
-              <w:t>00:00 - 34:01</w:t>
-            </w:r>
-          </w:p>
-        </w:tc>
-        <w:tc>
-          <w:tcPr>
-            <w:tcW w:type="dxa" w:w="1728"/>
+            <w:tcW w:type="dxa" w:w="2160"/>
             <w:tcMar>
               <w:top w:w="80" w:type="dxa"/>
               <w:bottom w:w="80" w:type="dxa"/>
@@ -3230,7 +3192,7 @@
       <w:tr>
         <w:tc>
           <w:tcPr>
-            <w:tcW w:type="dxa" w:w="1728"/>
+            <w:tcW w:type="dxa" w:w="2160"/>
             <w:tcMar>
               <w:top w:w="80" w:type="dxa"/>
               <w:bottom w:w="80" w:type="dxa"/>
@@ -3252,7 +3214,7 @@
         </w:tc>
         <w:tc>
           <w:tcPr>
-            <w:tcW w:type="dxa" w:w="1728"/>
+            <w:tcW w:type="dxa" w:w="2160"/>
             <w:tcMar>
               <w:top w:w="80" w:type="dxa"/>
               <w:bottom w:w="80" w:type="dxa"/>
@@ -3274,7 +3236,7 @@
         </w:tc>
         <w:tc>
           <w:tcPr>
-            <w:tcW w:type="dxa" w:w="1728"/>
+            <w:tcW w:type="dxa" w:w="2160"/>
             <w:tcMar>
               <w:top w:w="80" w:type="dxa"/>
               <w:bottom w:w="80" w:type="dxa"/>
@@ -3296,29 +3258,7 @@
         </w:tc>
         <w:tc>
           <w:tcPr>
-            <w:tcW w:type="dxa" w:w="1728"/>
-            <w:tcMar>
-              <w:top w:w="80" w:type="dxa"/>
-              <w:bottom w:w="80" w:type="dxa"/>
-              <w:left w:w="100" w:type="dxa"/>
-              <w:right w:w="100" w:type="dxa"/>
-            </w:tcMar>
-            <w:shd w:fill="F8FAFC"/>
-          </w:tcPr>
-          <w:p>
-            <w:r>
-              <w:rPr>
-                <w:rFonts w:ascii="Arial" w:hAnsi="Arial"/>
-                <w:color w:val="334155"/>
-                <w:sz w:val="17"/>
-              </w:rPr>
-              <w:t>34:01 - 02:47:57</w:t>
-            </w:r>
-          </w:p>
-        </w:tc>
-        <w:tc>
-          <w:tcPr>
-            <w:tcW w:type="dxa" w:w="1728"/>
+            <w:tcW w:type="dxa" w:w="2160"/>
             <w:tcMar>
               <w:top w:w="80" w:type="dxa"/>
               <w:bottom w:w="80" w:type="dxa"/>
@@ -3342,7 +3282,7 @@
       <w:tr>
         <w:tc>
           <w:tcPr>
-            <w:tcW w:type="dxa" w:w="1728"/>
+            <w:tcW w:type="dxa" w:w="2160"/>
             <w:tcMar>
               <w:top w:w="80" w:type="dxa"/>
               <w:bottom w:w="80" w:type="dxa"/>
@@ -3364,7 +3304,7 @@
         </w:tc>
         <w:tc>
           <w:tcPr>
-            <w:tcW w:type="dxa" w:w="1728"/>
+            <w:tcW w:type="dxa" w:w="2160"/>
             <w:tcMar>
               <w:top w:w="80" w:type="dxa"/>
               <w:bottom w:w="80" w:type="dxa"/>
@@ -3386,7 +3326,7 @@
         </w:tc>
         <w:tc>
           <w:tcPr>
-            <w:tcW w:type="dxa" w:w="1728"/>
+            <w:tcW w:type="dxa" w:w="2160"/>
             <w:tcMar>
               <w:top w:w="80" w:type="dxa"/>
               <w:bottom w:w="80" w:type="dxa"/>
@@ -3408,29 +3348,7 @@
         </w:tc>
         <w:tc>
           <w:tcPr>
-            <w:tcW w:type="dxa" w:w="1728"/>
-            <w:tcMar>
-              <w:top w:w="80" w:type="dxa"/>
-              <w:bottom w:w="80" w:type="dxa"/>
-              <w:left w:w="100" w:type="dxa"/>
-              <w:right w:w="100" w:type="dxa"/>
-            </w:tcMar>
-            <w:shd w:fill="FFFFFF"/>
-          </w:tcPr>
-          <w:p>
-            <w:r>
-              <w:rPr>
-                <w:rFonts w:ascii="Arial" w:hAnsi="Arial"/>
-                <w:color w:val="334155"/>
-                <w:sz w:val="17"/>
-              </w:rPr>
-              <w:t>02:47:57 - 04:02:09</w:t>
-            </w:r>
-          </w:p>
-        </w:tc>
-        <w:tc>
-          <w:tcPr>
-            <w:tcW w:type="dxa" w:w="1728"/>
+            <w:tcW w:type="dxa" w:w="2160"/>
             <w:tcMar>
               <w:top w:w="80" w:type="dxa"/>
               <w:bottom w:w="80" w:type="dxa"/>
@@ -3454,7 +3372,7 @@
       <w:tr>
         <w:tc>
           <w:tcPr>
-            <w:tcW w:type="dxa" w:w="1728"/>
+            <w:tcW w:type="dxa" w:w="2160"/>
             <w:tcMar>
               <w:top w:w="80" w:type="dxa"/>
               <w:bottom w:w="80" w:type="dxa"/>
@@ -3476,7 +3394,7 @@
         </w:tc>
         <w:tc>
           <w:tcPr>
-            <w:tcW w:type="dxa" w:w="1728"/>
+            <w:tcW w:type="dxa" w:w="2160"/>
             <w:tcMar>
               <w:top w:w="80" w:type="dxa"/>
               <w:bottom w:w="80" w:type="dxa"/>
@@ -3498,7 +3416,7 @@
         </w:tc>
         <w:tc>
           <w:tcPr>
-            <w:tcW w:type="dxa" w:w="1728"/>
+            <w:tcW w:type="dxa" w:w="2160"/>
             <w:tcMar>
               <w:top w:w="80" w:type="dxa"/>
               <w:bottom w:w="80" w:type="dxa"/>
@@ -3520,29 +3438,7 @@
         </w:tc>
         <w:tc>
           <w:tcPr>
-            <w:tcW w:type="dxa" w:w="1728"/>
-            <w:tcMar>
-              <w:top w:w="80" w:type="dxa"/>
-              <w:bottom w:w="80" w:type="dxa"/>
-              <w:left w:w="100" w:type="dxa"/>
-              <w:right w:w="100" w:type="dxa"/>
-            </w:tcMar>
-            <w:shd w:fill="F8FAFC"/>
-          </w:tcPr>
-          <w:p>
-            <w:r>
-              <w:rPr>
-                <w:rFonts w:ascii="Arial" w:hAnsi="Arial"/>
-                <w:color w:val="334155"/>
-                <w:sz w:val="17"/>
-              </w:rPr>
-              <w:t>04:02:09 - 05:22:48</w:t>
-            </w:r>
-          </w:p>
-        </w:tc>
-        <w:tc>
-          <w:tcPr>
-            <w:tcW w:type="dxa" w:w="1728"/>
+            <w:tcW w:type="dxa" w:w="2160"/>
             <w:tcMar>
               <w:top w:w="80" w:type="dxa"/>
               <w:bottom w:w="80" w:type="dxa"/>
@@ -3566,7 +3462,7 @@
       <w:tr>
         <w:tc>
           <w:tcPr>
-            <w:tcW w:type="dxa" w:w="1728"/>
+            <w:tcW w:type="dxa" w:w="2160"/>
             <w:tcMar>
               <w:top w:w="80" w:type="dxa"/>
               <w:bottom w:w="80" w:type="dxa"/>
@@ -3588,7 +3484,7 @@
         </w:tc>
         <w:tc>
           <w:tcPr>
-            <w:tcW w:type="dxa" w:w="1728"/>
+            <w:tcW w:type="dxa" w:w="2160"/>
             <w:tcMar>
               <w:top w:w="80" w:type="dxa"/>
               <w:bottom w:w="80" w:type="dxa"/>
@@ -3610,7 +3506,7 @@
         </w:tc>
         <w:tc>
           <w:tcPr>
-            <w:tcW w:type="dxa" w:w="1728"/>
+            <w:tcW w:type="dxa" w:w="2160"/>
             <w:tcMar>
               <w:top w:w="80" w:type="dxa"/>
               <w:bottom w:w="80" w:type="dxa"/>
@@ -3632,29 +3528,7 @@
         </w:tc>
         <w:tc>
           <w:tcPr>
-            <w:tcW w:type="dxa" w:w="1728"/>
-            <w:tcMar>
-              <w:top w:w="80" w:type="dxa"/>
-              <w:bottom w:w="80" w:type="dxa"/>
-              <w:left w:w="100" w:type="dxa"/>
-              <w:right w:w="100" w:type="dxa"/>
-            </w:tcMar>
-            <w:shd w:fill="FFFFFF"/>
-          </w:tcPr>
-          <w:p>
-            <w:r>
-              <w:rPr>
-                <w:rFonts w:ascii="Arial" w:hAnsi="Arial"/>
-                <w:color w:val="334155"/>
-                <w:sz w:val="17"/>
-              </w:rPr>
-              <w:t>05:22:48 - 08:07:50</w:t>
-            </w:r>
-          </w:p>
-        </w:tc>
-        <w:tc>
-          <w:tcPr>
-            <w:tcW w:type="dxa" w:w="1728"/>
+            <w:tcW w:type="dxa" w:w="2160"/>
             <w:tcMar>
               <w:top w:w="80" w:type="dxa"/>
               <w:bottom w:w="80" w:type="dxa"/>
@@ -3678,7 +3552,7 @@
       <w:tr>
         <w:tc>
           <w:tcPr>
-            <w:tcW w:type="dxa" w:w="1728"/>
+            <w:tcW w:type="dxa" w:w="2160"/>
             <w:tcMar>
               <w:top w:w="80" w:type="dxa"/>
               <w:bottom w:w="80" w:type="dxa"/>
@@ -3700,7 +3574,7 @@
         </w:tc>
         <w:tc>
           <w:tcPr>
-            <w:tcW w:type="dxa" w:w="1728"/>
+            <w:tcW w:type="dxa" w:w="2160"/>
             <w:tcMar>
               <w:top w:w="80" w:type="dxa"/>
               <w:bottom w:w="80" w:type="dxa"/>
@@ -3722,7 +3596,7 @@
         </w:tc>
         <w:tc>
           <w:tcPr>
-            <w:tcW w:type="dxa" w:w="1728"/>
+            <w:tcW w:type="dxa" w:w="2160"/>
             <w:tcMar>
               <w:top w:w="80" w:type="dxa"/>
               <w:bottom w:w="80" w:type="dxa"/>
@@ -3744,29 +3618,7 @@
         </w:tc>
         <w:tc>
           <w:tcPr>
-            <w:tcW w:type="dxa" w:w="1728"/>
-            <w:tcMar>
-              <w:top w:w="80" w:type="dxa"/>
-              <w:bottom w:w="80" w:type="dxa"/>
-              <w:left w:w="100" w:type="dxa"/>
-              <w:right w:w="100" w:type="dxa"/>
-            </w:tcMar>
-            <w:shd w:fill="F8FAFC"/>
-          </w:tcPr>
-          <w:p>
-            <w:r>
-              <w:rPr>
-                <w:rFonts w:ascii="Arial" w:hAnsi="Arial"/>
-                <w:color w:val="334155"/>
-                <w:sz w:val="17"/>
-              </w:rPr>
-              <w:t>08:07:50 - 08:50:11</w:t>
-            </w:r>
-          </w:p>
-        </w:tc>
-        <w:tc>
-          <w:tcPr>
-            <w:tcW w:type="dxa" w:w="1728"/>
+            <w:tcW w:type="dxa" w:w="2160"/>
             <w:tcMar>
               <w:top w:w="80" w:type="dxa"/>
               <w:bottom w:w="80" w:type="dxa"/>
@@ -3790,7 +3642,7 @@
       <w:tr>
         <w:tc>
           <w:tcPr>
-            <w:tcW w:type="dxa" w:w="1728"/>
+            <w:tcW w:type="dxa" w:w="2160"/>
             <w:tcMar>
               <w:top w:w="80" w:type="dxa"/>
               <w:bottom w:w="80" w:type="dxa"/>
@@ -3812,7 +3664,7 @@
         </w:tc>
         <w:tc>
           <w:tcPr>
-            <w:tcW w:type="dxa" w:w="1728"/>
+            <w:tcW w:type="dxa" w:w="2160"/>
             <w:tcMar>
               <w:top w:w="80" w:type="dxa"/>
               <w:bottom w:w="80" w:type="dxa"/>
@@ -3834,7 +3686,7 @@
         </w:tc>
         <w:tc>
           <w:tcPr>
-            <w:tcW w:type="dxa" w:w="1728"/>
+            <w:tcW w:type="dxa" w:w="2160"/>
             <w:tcMar>
               <w:top w:w="80" w:type="dxa"/>
               <w:bottom w:w="80" w:type="dxa"/>
@@ -3856,29 +3708,7 @@
         </w:tc>
         <w:tc>
           <w:tcPr>
-            <w:tcW w:type="dxa" w:w="1728"/>
-            <w:tcMar>
-              <w:top w:w="80" w:type="dxa"/>
-              <w:bottom w:w="80" w:type="dxa"/>
-              <w:left w:w="100" w:type="dxa"/>
-              <w:right w:w="100" w:type="dxa"/>
-            </w:tcMar>
-            <w:shd w:fill="FFFFFF"/>
-          </w:tcPr>
-          <w:p>
-            <w:r>
-              <w:rPr>
-                <w:rFonts w:ascii="Arial" w:hAnsi="Arial"/>
-                <w:color w:val="334155"/>
-                <w:sz w:val="17"/>
-              </w:rPr>
-              <w:t>08:50:11 - 12:58:04</w:t>
-            </w:r>
-          </w:p>
-        </w:tc>
-        <w:tc>
-          <w:tcPr>
-            <w:tcW w:type="dxa" w:w="1728"/>
+            <w:tcW w:type="dxa" w:w="2160"/>
             <w:tcMar>
               <w:top w:w="80" w:type="dxa"/>
               <w:bottom w:w="80" w:type="dxa"/>
@@ -3902,7 +3732,7 @@
       <w:tr>
         <w:tc>
           <w:tcPr>
-            <w:tcW w:type="dxa" w:w="1728"/>
+            <w:tcW w:type="dxa" w:w="2160"/>
             <w:tcMar>
               <w:top w:w="80" w:type="dxa"/>
               <w:bottom w:w="80" w:type="dxa"/>
@@ -3924,7 +3754,7 @@
         </w:tc>
         <w:tc>
           <w:tcPr>
-            <w:tcW w:type="dxa" w:w="1728"/>
+            <w:tcW w:type="dxa" w:w="2160"/>
             <w:tcMar>
               <w:top w:w="80" w:type="dxa"/>
               <w:bottom w:w="80" w:type="dxa"/>
@@ -3946,7 +3776,7 @@
         </w:tc>
         <w:tc>
           <w:tcPr>
-            <w:tcW w:type="dxa" w:w="1728"/>
+            <w:tcW w:type="dxa" w:w="2160"/>
             <w:tcMar>
               <w:top w:w="80" w:type="dxa"/>
               <w:bottom w:w="80" w:type="dxa"/>
@@ -3968,7 +3798,7 @@
         </w:tc>
         <w:tc>
           <w:tcPr>
-            <w:tcW w:type="dxa" w:w="1728"/>
+            <w:tcW w:type="dxa" w:w="2160"/>
             <w:tcMar>
               <w:top w:w="80" w:type="dxa"/>
               <w:bottom w:w="80" w:type="dxa"/>
@@ -3984,20 +3814,22 @@
                 <w:color w:val="334155"/>
                 <w:sz w:val="17"/>
               </w:rPr>
-              <w:t>12:58:04 - 15:35:02</w:t>
+              <w:t>☑ Completed</w:t>
             </w:r>
           </w:p>
         </w:tc>
+      </w:tr>
+      <w:tr>
         <w:tc>
           <w:tcPr>
-            <w:tcW w:type="dxa" w:w="1728"/>
+            <w:tcW w:type="dxa" w:w="2160"/>
             <w:tcMar>
               <w:top w:w="80" w:type="dxa"/>
               <w:bottom w:w="80" w:type="dxa"/>
               <w:left w:w="100" w:type="dxa"/>
               <w:right w:w="100" w:type="dxa"/>
             </w:tcMar>
-            <w:shd w:fill="F8FAFC"/>
+            <w:shd w:fill="FFFFFF"/>
           </w:tcPr>
           <w:p>
             <w:r>
@@ -4006,7 +3838,73 @@
                 <w:color w:val="334155"/>
                 <w:sz w:val="17"/>
               </w:rPr>
-              <w:t>☑ Completed (Till Video 29)</w:t>
+              <w:t>☑</w:t>
+            </w:r>
+          </w:p>
+        </w:tc>
+        <w:tc>
+          <w:tcPr>
+            <w:tcW w:type="dxa" w:w="2160"/>
+            <w:tcMar>
+              <w:top w:w="80" w:type="dxa"/>
+              <w:bottom w:w="80" w:type="dxa"/>
+              <w:left w:w="100" w:type="dxa"/>
+              <w:right w:w="100" w:type="dxa"/>
+            </w:tcMar>
+            <w:shd w:fill="FFFFFF"/>
+          </w:tcPr>
+          <w:p>
+            <w:r>
+              <w:rPr>
+                <w:rFonts w:ascii="Arial" w:hAnsi="Arial"/>
+                <w:color w:val="334155"/>
+                <w:sz w:val="17"/>
+              </w:rPr>
+              <w:t>Video 30</w:t>
+            </w:r>
+          </w:p>
+        </w:tc>
+        <w:tc>
+          <w:tcPr>
+            <w:tcW w:type="dxa" w:w="2160"/>
+            <w:tcMar>
+              <w:top w:w="80" w:type="dxa"/>
+              <w:bottom w:w="80" w:type="dxa"/>
+              <w:left w:w="100" w:type="dxa"/>
+              <w:right w:w="100" w:type="dxa"/>
+            </w:tcMar>
+            <w:shd w:fill="FFFFFF"/>
+          </w:tcPr>
+          <w:p>
+            <w:r>
+              <w:rPr>
+                <w:rFonts w:ascii="Arial" w:hAnsi="Arial"/>
+                <w:color w:val="334155"/>
+                <w:sz w:val="17"/>
+              </w:rPr>
+              <w:t>SQL Views (Visually Explained) | 6 Top Use Cases | #SQL Course 29</w:t>
+            </w:r>
+          </w:p>
+        </w:tc>
+        <w:tc>
+          <w:tcPr>
+            <w:tcW w:type="dxa" w:w="2160"/>
+            <w:tcMar>
+              <w:top w:w="80" w:type="dxa"/>
+              <w:bottom w:w="80" w:type="dxa"/>
+              <w:left w:w="100" w:type="dxa"/>
+              <w:right w:w="100" w:type="dxa"/>
+            </w:tcMar>
+            <w:shd w:fill="FFFFFF"/>
+          </w:tcPr>
+          <w:p>
+            <w:r>
+              <w:rPr>
+                <w:rFonts w:ascii="Arial" w:hAnsi="Arial"/>
+                <w:color w:val="334155"/>
+                <w:sz w:val="17"/>
+              </w:rPr>
+              <w:t>☑ Completed (Done Today!)</w:t>
             </w:r>
           </w:p>
         </w:tc>

</xml_diff>